<commit_message>
report: align PSU section with D-trigger sample
</commit_message>
<xml_diff>
--- a/deliverables/Курсовая_Блинов_текущая.docx
+++ b/deliverables/Курсовая_Блинов_текущая.docx
@@ -4607,12 +4607,14 @@
     <w:p>
       <w:pPr>
         <w:pStyle w:val="a4"/>
-        <w:spacing w:after="120"/>
+        <w:pageBreakBefore/>
+        <w:spacing w:line="360" w:lineRule="auto"/>
         <w:ind w:firstLine="709"/>
         <w:jc w:val="both"/>
       </w:pPr>
       <w:r>
-        <w:t>Количество используемых триггеров определяется разрядностью кодов состояний. Для модуля счета M = 14 необходимое число триггеров вычисляется по формуле:</w:t>
+        <w:lastRenderedPageBreak/>
+        <w:t>Количество триггеров, необходимых для работы устройства, определяется разрядностью кодов состояний. Для модуля счета M = 14 необходимое число триггеров вычисляется по формуле N = log₂M. Подставив в формулу (1.1) значение M и округлив результат вверх, рассчитаем N:</w:t>
       </w:r>
     </w:p>
     <w:tbl>
@@ -4640,76 +4642,18 @@
           <w:p>
             <w:pPr>
               <w:pStyle w:val="a4"/>
-              <w:spacing w:after="120"/>
+              <w:spacing w:before="160" w:after="240"/>
               <w:ind w:right="281"/>
               <w:jc w:val="center"/>
               <w:rPr>
                 <w:rFonts w:ascii="Cambria Math" w:hAnsi="Cambria Math"/>
-                <w:sz w:val="24"/>
               </w:rPr>
             </w:pPr>
             <w:r>
               <w:rPr>
                 <w:rFonts w:ascii="Cambria Math" w:hAnsi="Cambria Math"/>
-                <w:sz w:val="24"/>
-              </w:rPr>
-              <w:t xml:space="preserve">n = </w:t>
-            </w:r>
-            <w:r>
-              <w:rPr>
-                <w:rFonts w:ascii="Cambria Math" w:hAnsi="Cambria Math" w:cs="Cambria Math"/>
-                <w:sz w:val="24"/>
-              </w:rPr>
-              <w:t>⌈</w:t>
-            </w:r>
-            <w:r>
-              <w:rPr>
-                <w:rFonts w:ascii="Cambria Math" w:hAnsi="Cambria Math"/>
-                <w:sz w:val="24"/>
-              </w:rPr>
-              <w:t>log₂M</w:t>
-            </w:r>
-            <w:r>
-              <w:rPr>
-                <w:rFonts w:ascii="Cambria Math" w:hAnsi="Cambria Math" w:cs="Cambria Math"/>
-                <w:sz w:val="24"/>
-              </w:rPr>
-              <w:t>⌉</w:t>
-            </w:r>
-            <w:r>
-              <w:rPr>
-                <w:rFonts w:ascii="Cambria Math" w:hAnsi="Cambria Math"/>
-                <w:sz w:val="24"/>
-              </w:rPr>
-              <w:t xml:space="preserve"> = </w:t>
-            </w:r>
-            <w:r>
-              <w:rPr>
-                <w:rFonts w:ascii="Cambria Math" w:hAnsi="Cambria Math" w:cs="Cambria Math"/>
-                <w:sz w:val="24"/>
-              </w:rPr>
-              <w:t>⌈</w:t>
-            </w:r>
-            <w:r>
-              <w:rPr>
-                <w:rFonts w:ascii="Cambria Math" w:hAnsi="Cambria Math"/>
-                <w:sz w:val="24"/>
-              </w:rPr>
-              <w:t>log₂14</w:t>
-            </w:r>
-            <w:r>
-              <w:rPr>
-                <w:rFonts w:ascii="Cambria Math" w:hAnsi="Cambria Math" w:cs="Cambria Math"/>
-                <w:sz w:val="24"/>
-              </w:rPr>
-              <w:t>⌉</w:t>
-            </w:r>
-            <w:r>
-              <w:rPr>
-                <w:rFonts w:ascii="Cambria Math" w:hAnsi="Cambria Math"/>
-                <w:sz w:val="24"/>
-              </w:rPr>
-              <w:t xml:space="preserve"> = 4</w:t>
+              </w:rPr>
+              <w:t>N = log₂14 ≈ 3,8 ≈ 4</w:t>
             </w:r>
           </w:p>
         </w:tc>
@@ -4721,17 +4665,11 @@
           <w:p>
             <w:pPr>
               <w:pStyle w:val="a4"/>
-              <w:spacing w:after="120"/>
+              <w:spacing w:before="160" w:after="240"/>
               <w:ind w:right="281"/>
               <w:jc w:val="right"/>
-              <w:rPr>
-                <w:sz w:val="24"/>
-              </w:rPr>
-            </w:pPr>
-            <w:r>
-              <w:rPr>
-                <w:sz w:val="24"/>
-              </w:rPr>
+            </w:pPr>
+            <w:r>
               <w:t>(1.1)</w:t>
             </w:r>
           </w:p>
@@ -4741,28 +4679,116 @@
     <w:p>
       <w:pPr>
         <w:pStyle w:val="a4"/>
+        <w:spacing w:line="360" w:lineRule="auto"/>
       </w:pPr>
     </w:p>
     <w:p>
       <w:pPr>
         <w:pStyle w:val="a4"/>
+        <w:spacing w:line="360" w:lineRule="auto"/>
         <w:ind w:firstLine="709"/>
         <w:jc w:val="both"/>
       </w:pPr>
       <w:r>
-        <w:lastRenderedPageBreak/>
-        <w:t>Таким образом, при построении ПСУ будет использовано четыре D-триггера. Поскольку одна микросхема 74AS74 содержит два триггера, для реализации регистра состояния потребуются две микросхемы.</w:t>
+        <w:t>Таким образом, при построении ПСУ будет использовано четыре D-триггера.</w:t>
       </w:r>
     </w:p>
     <w:p>
       <w:pPr>
         <w:pStyle w:val="a4"/>
-        <w:spacing w:after="120"/>
+        <w:spacing w:after="120" w:line="360" w:lineRule="auto"/>
         <w:ind w:firstLine="709"/>
         <w:jc w:val="both"/>
       </w:pPr>
       <w:r>
-        <w:t>Микросхема 74AS74 представляет собой два D-триггера, переключающихся по положительному фронту тактового сигнала. Каждый триггер имеет вход данных D, вход синхронизации CLK, асинхронные входы установки /PRE и сброса /CLR, а также прямой Q и инверсный /Q выходы. Распиновка микросхемы представлена на рисунке 1.2.</w:t>
+        <w:t>Микросхема 74AS74 (SN74AS74A) представляет собой два D-триггера с переключением по положительному фронту тактового сигнала. Каждый триггер имеет отдельные входы D и CLK, асинхронные входы установки PRE и сброса CLR, прямой выход Q и инверсный выход Q̅. Распиновка микросхемы 74AS74 представлена на рисунке 1.2.</w:t>
+      </w:r>
+    </w:p>
+    <w:p>
+      <w:pPr>
+        <w:pStyle w:val="a4"/>
+        <w:spacing w:before="80" w:after="80" w:line="360" w:lineRule="auto"/>
+        <w:jc w:val="center"/>
+      </w:pPr>
+      <w:r>
+        <w:rPr>
+          <w:noProof/>
+        </w:rPr>
+        <w:drawing>
+          <wp:inline distT="0" distB="0" distL="0" distR="0" wp14:anchorId="3F38D771" wp14:editId="6172ACA9">
+            <wp:extent cx="3240000" cy="2441408"/>
+            <wp:effectExtent l="0" t="0" r="0" b="0"/>
+            <wp:docPr id="918597013" name="Рисунок 5" descr="Распиновка корпуса D/N микросхем SN74AS74A по данным Texas Instruments."/>
+            <wp:cNvGraphicFramePr>
+              <a:graphicFrameLocks xmlns:a="http://schemas.openxmlformats.org/drawingml/2006/main" noChangeAspect="1"/>
+            </wp:cNvGraphicFramePr>
+            <a:graphic xmlns:a="http://schemas.openxmlformats.org/drawingml/2006/main">
+              <a:graphicData uri="http://schemas.openxmlformats.org/drawingml/2006/picture">
+                <pic:pic xmlns:pic="http://schemas.openxmlformats.org/drawingml/2006/picture">
+                  <pic:nvPicPr>
+                    <pic:cNvPr id="918597013" name="Рисунок 5" descr="Распиновка корпуса D/N микросхем SN74AS74A по данным Texas Instruments."/>
+                    <pic:cNvPicPr/>
+                  </pic:nvPicPr>
+                  <pic:blipFill>
+                    <a:blip r:embed="rId14">
+                      <a:extLst>
+                        <a:ext uri="{28A0092B-C50C-407E-A947-70E740481C1C}">
+                          <a14:useLocalDpi xmlns:a14="http://schemas.microsoft.com/office/drawing/2010/main" val="0"/>
+                        </a:ext>
+                      </a:extLst>
+                    </a:blip>
+                    <a:stretch>
+                      <a:fillRect/>
+                    </a:stretch>
+                  </pic:blipFill>
+                  <pic:spPr>
+                    <a:xfrm>
+                      <a:off x="0" y="0"/>
+                      <a:ext cx="3240000" cy="2441408"/>
+                    </a:xfrm>
+                    <a:prstGeom prst="rect">
+                      <a:avLst/>
+                    </a:prstGeom>
+                  </pic:spPr>
+                </pic:pic>
+              </a:graphicData>
+            </a:graphic>
+          </wp:inline>
+        </w:drawing>
+      </w:r>
+    </w:p>
+    <w:p>
+      <w:pPr>
+        <w:pStyle w:val="a4"/>
+        <w:spacing w:after="160" w:line="360" w:lineRule="auto"/>
+        <w:jc w:val="center"/>
+      </w:pPr>
+      <w:r>
+        <w:t>Рисунок 1.2 – Распиновка микросхемы 74AS74</w:t>
+      </w:r>
+    </w:p>
+    <w:p>
+      <w:pPr>
+        <w:pStyle w:val="a4"/>
+        <w:spacing w:after="160" w:line="360" w:lineRule="auto"/>
+        <w:ind w:firstLine="709"/>
+        <w:jc w:val="both"/>
+      </w:pPr>
+      <w:r>
+        <w:t>Для D-триггера сигнал на входе D определяет состояние прямого выхода после активного фронта тактового импульса: D(t) = Q(t+1). В таблице 1.1 представлены переходы D-триггера 74AS74.</w:t>
+      </w:r>
+    </w:p>
+    <w:p>
+      <w:pPr>
+        <w:pStyle w:val="a4"/>
+        <w:keepNext/>
+        <w:pageBreakBefore/>
+        <w:spacing w:line="360" w:lineRule="auto"/>
+        <w:jc w:val="center"/>
+      </w:pPr>
+      <w:r>
+        <w:lastRenderedPageBreak/>
+        <w:t>Таблица 1.1 – Таблица переходов D-триггера 74AS74</w:t>
       </w:r>
     </w:p>
     <w:tbl>
@@ -4770,20 +4796,20 @@
         <w:tblW w:w="0" w:type="auto"/>
         <w:jc w:val="center"/>
         <w:tblBorders>
-          <w:top w:val="single" w:sz="4" w:space="0" w:color="auto"/>
-          <w:left w:val="single" w:sz="4" w:space="0" w:color="auto"/>
-          <w:bottom w:val="single" w:sz="4" w:space="0" w:color="auto"/>
-          <w:right w:val="single" w:sz="4" w:space="0" w:color="auto"/>
-          <w:insideH w:val="single" w:sz="4" w:space="0" w:color="auto"/>
-          <w:insideV w:val="single" w:sz="4" w:space="0" w:color="auto"/>
+          <w:top w:val="single" w:sz="4" w:space="0" w:color="000000"/>
+          <w:left w:val="single" w:sz="4" w:space="0" w:color="000000"/>
+          <w:bottom w:val="single" w:sz="4" w:space="0" w:color="000000"/>
+          <w:right w:val="single" w:sz="4" w:space="0" w:color="000000"/>
+          <w:insideH w:val="single" w:sz="4" w:space="0" w:color="000000"/>
+          <w:insideV w:val="single" w:sz="4" w:space="0" w:color="000000"/>
         </w:tblBorders>
         <w:tblLayout w:type="fixed"/>
         <w:tblLook w:val="0000" w:firstRow="0" w:lastRow="0" w:firstColumn="0" w:lastColumn="0" w:noHBand="0" w:noVBand="0"/>
       </w:tblPr>
       <w:tblGrid>
-        <w:gridCol w:w="2891"/>
-        <w:gridCol w:w="2268"/>
-        <w:gridCol w:w="2891"/>
+        <w:gridCol w:w="1361"/>
+        <w:gridCol w:w="1361"/>
+        <w:gridCol w:w="1361"/>
       </w:tblGrid>
       <w:tr>
         <w:tblPrEx>
@@ -4797,7 +4823,7 @@
         </w:trPr>
         <w:tc>
           <w:tcPr>
-            <w:tcW w:w="2891" w:type="dxa"/>
+            <w:tcW w:w="1361" w:type="dxa"/>
             <w:vAlign w:val="center"/>
           </w:tcPr>
           <w:p>
@@ -4813,57 +4839,13 @@
               <w:rPr>
                 <w:sz w:val="22"/>
               </w:rPr>
-              <w:t>1 /1CLR</w:t>
-            </w:r>
-          </w:p>
-        </w:tc>
-        <w:tc>
-          <w:tcPr>
-            <w:tcW w:w="2268" w:type="dxa"/>
-            <w:vMerge w:val="restart"/>
-            <w:shd w:val="clear" w:color="auto" w:fill="E6E6E6"/>
-            <w:vAlign w:val="center"/>
-          </w:tcPr>
-          <w:p>
-            <w:pPr>
-              <w:pStyle w:val="a4"/>
-              <w:ind w:right="281"/>
-              <w:jc w:val="center"/>
-              <w:rPr>
-                <w:b/>
-                <w:sz w:val="24"/>
-              </w:rPr>
-            </w:pPr>
-            <w:r>
-              <w:rPr>
-                <w:b/>
-                <w:sz w:val="24"/>
-              </w:rPr>
-              <w:t>74AS74</w:t>
-            </w:r>
-          </w:p>
-          <w:p>
-            <w:pPr>
-              <w:pStyle w:val="a4"/>
-              <w:ind w:right="281"/>
-              <w:jc w:val="center"/>
-              <w:rPr>
-                <w:b/>
-                <w:sz w:val="24"/>
-              </w:rPr>
-            </w:pPr>
-            <w:r>
-              <w:rPr>
-                <w:b/>
-                <w:sz w:val="24"/>
-              </w:rPr>
-              <w:t>DIP-14</w:t>
-            </w:r>
-          </w:p>
-        </w:tc>
-        <w:tc>
-          <w:tcPr>
-            <w:tcW w:w="2891" w:type="dxa"/>
+              <w:t>Q(t)</w:t>
+            </w:r>
+          </w:p>
+        </w:tc>
+        <w:tc>
+          <w:tcPr>
+            <w:tcW w:w="1361" w:type="dxa"/>
             <w:vAlign w:val="center"/>
           </w:tcPr>
           <w:p>
@@ -4879,7 +4861,29 @@
               <w:rPr>
                 <w:sz w:val="22"/>
               </w:rPr>
-              <w:t>VCC 14</w:t>
+              <w:t>Q(t+1)</w:t>
+            </w:r>
+          </w:p>
+        </w:tc>
+        <w:tc>
+          <w:tcPr>
+            <w:tcW w:w="1361" w:type="dxa"/>
+            <w:vAlign w:val="center"/>
+          </w:tcPr>
+          <w:p>
+            <w:pPr>
+              <w:pStyle w:val="a4"/>
+              <w:ind w:right="281"/>
+              <w:jc w:val="center"/>
+              <w:rPr>
+                <w:sz w:val="22"/>
+              </w:rPr>
+            </w:pPr>
+            <w:r>
+              <w:rPr>
+                <w:sz w:val="22"/>
+              </w:rPr>
+              <w:t>D(t)</w:t>
             </w:r>
           </w:p>
         </w:tc>
@@ -4896,7 +4900,7 @@
         </w:trPr>
         <w:tc>
           <w:tcPr>
-            <w:tcW w:w="2891" w:type="dxa"/>
+            <w:tcW w:w="1361" w:type="dxa"/>
             <w:vAlign w:val="center"/>
           </w:tcPr>
           <w:p>
@@ -4912,29 +4916,13 @@
               <w:rPr>
                 <w:sz w:val="22"/>
               </w:rPr>
-              <w:t>2 1D</w:t>
-            </w:r>
-          </w:p>
-        </w:tc>
-        <w:tc>
-          <w:tcPr>
-            <w:tcW w:w="2268" w:type="dxa"/>
-            <w:vMerge/>
-            <w:shd w:val="clear" w:color="auto" w:fill="E6E6E6"/>
-            <w:vAlign w:val="center"/>
-          </w:tcPr>
-          <w:p>
-            <w:pPr>
-              <w:pStyle w:val="a4"/>
-              <w:spacing w:before="161"/>
-              <w:ind w:right="281"/>
-              <w:jc w:val="center"/>
-            </w:pPr>
-          </w:p>
-        </w:tc>
-        <w:tc>
-          <w:tcPr>
-            <w:tcW w:w="2891" w:type="dxa"/>
+              <w:t>0</w:t>
+            </w:r>
+          </w:p>
+        </w:tc>
+        <w:tc>
+          <w:tcPr>
+            <w:tcW w:w="1361" w:type="dxa"/>
             <w:vAlign w:val="center"/>
           </w:tcPr>
           <w:p>
@@ -4950,7 +4938,29 @@
               <w:rPr>
                 <w:sz w:val="22"/>
               </w:rPr>
-              <w:t>/2CLR 13</w:t>
+              <w:t>0</w:t>
+            </w:r>
+          </w:p>
+        </w:tc>
+        <w:tc>
+          <w:tcPr>
+            <w:tcW w:w="1361" w:type="dxa"/>
+            <w:vAlign w:val="center"/>
+          </w:tcPr>
+          <w:p>
+            <w:pPr>
+              <w:pStyle w:val="a4"/>
+              <w:ind w:right="281"/>
+              <w:jc w:val="center"/>
+              <w:rPr>
+                <w:sz w:val="22"/>
+              </w:rPr>
+            </w:pPr>
+            <w:r>
+              <w:rPr>
+                <w:sz w:val="22"/>
+              </w:rPr>
+              <w:t>0</w:t>
             </w:r>
           </w:p>
         </w:tc>
@@ -4967,7 +4977,7 @@
         </w:trPr>
         <w:tc>
           <w:tcPr>
-            <w:tcW w:w="2891" w:type="dxa"/>
+            <w:tcW w:w="1361" w:type="dxa"/>
             <w:vAlign w:val="center"/>
           </w:tcPr>
           <w:p>
@@ -4983,29 +4993,13 @@
               <w:rPr>
                 <w:sz w:val="22"/>
               </w:rPr>
-              <w:t>3 1CLK</w:t>
-            </w:r>
-          </w:p>
-        </w:tc>
-        <w:tc>
-          <w:tcPr>
-            <w:tcW w:w="2268" w:type="dxa"/>
-            <w:vMerge/>
-            <w:shd w:val="clear" w:color="auto" w:fill="E6E6E6"/>
-            <w:vAlign w:val="center"/>
-          </w:tcPr>
-          <w:p>
-            <w:pPr>
-              <w:pStyle w:val="a4"/>
-              <w:spacing w:before="161"/>
-              <w:ind w:right="281"/>
-              <w:jc w:val="center"/>
-            </w:pPr>
-          </w:p>
-        </w:tc>
-        <w:tc>
-          <w:tcPr>
-            <w:tcW w:w="2891" w:type="dxa"/>
+              <w:t>0</w:t>
+            </w:r>
+          </w:p>
+        </w:tc>
+        <w:tc>
+          <w:tcPr>
+            <w:tcW w:w="1361" w:type="dxa"/>
             <w:vAlign w:val="center"/>
           </w:tcPr>
           <w:p>
@@ -5021,7 +5015,29 @@
               <w:rPr>
                 <w:sz w:val="22"/>
               </w:rPr>
-              <w:t>2D 12</w:t>
+              <w:t>1</w:t>
+            </w:r>
+          </w:p>
+        </w:tc>
+        <w:tc>
+          <w:tcPr>
+            <w:tcW w:w="1361" w:type="dxa"/>
+            <w:vAlign w:val="center"/>
+          </w:tcPr>
+          <w:p>
+            <w:pPr>
+              <w:pStyle w:val="a4"/>
+              <w:ind w:right="281"/>
+              <w:jc w:val="center"/>
+              <w:rPr>
+                <w:sz w:val="22"/>
+              </w:rPr>
+            </w:pPr>
+            <w:r>
+              <w:rPr>
+                <w:sz w:val="22"/>
+              </w:rPr>
+              <w:t>1</w:t>
             </w:r>
           </w:p>
         </w:tc>
@@ -5038,7 +5054,7 @@
         </w:trPr>
         <w:tc>
           <w:tcPr>
-            <w:tcW w:w="2891" w:type="dxa"/>
+            <w:tcW w:w="1361" w:type="dxa"/>
             <w:vAlign w:val="center"/>
           </w:tcPr>
           <w:p>
@@ -5054,29 +5070,13 @@
               <w:rPr>
                 <w:sz w:val="22"/>
               </w:rPr>
-              <w:t>4 /1PRE</w:t>
-            </w:r>
-          </w:p>
-        </w:tc>
-        <w:tc>
-          <w:tcPr>
-            <w:tcW w:w="2268" w:type="dxa"/>
-            <w:vMerge/>
-            <w:shd w:val="clear" w:color="auto" w:fill="E6E6E6"/>
-            <w:vAlign w:val="center"/>
-          </w:tcPr>
-          <w:p>
-            <w:pPr>
-              <w:pStyle w:val="a4"/>
-              <w:spacing w:before="161"/>
-              <w:ind w:right="281"/>
-              <w:jc w:val="center"/>
-            </w:pPr>
-          </w:p>
-        </w:tc>
-        <w:tc>
-          <w:tcPr>
-            <w:tcW w:w="2891" w:type="dxa"/>
+              <w:t>1</w:t>
+            </w:r>
+          </w:p>
+        </w:tc>
+        <w:tc>
+          <w:tcPr>
+            <w:tcW w:w="1361" w:type="dxa"/>
             <w:vAlign w:val="center"/>
           </w:tcPr>
           <w:p>
@@ -5092,7 +5092,29 @@
               <w:rPr>
                 <w:sz w:val="22"/>
               </w:rPr>
-              <w:t>2CLK 11</w:t>
+              <w:t>0</w:t>
+            </w:r>
+          </w:p>
+        </w:tc>
+        <w:tc>
+          <w:tcPr>
+            <w:tcW w:w="1361" w:type="dxa"/>
+            <w:vAlign w:val="center"/>
+          </w:tcPr>
+          <w:p>
+            <w:pPr>
+              <w:pStyle w:val="a4"/>
+              <w:ind w:right="281"/>
+              <w:jc w:val="center"/>
+              <w:rPr>
+                <w:sz w:val="22"/>
+              </w:rPr>
+            </w:pPr>
+            <w:r>
+              <w:rPr>
+                <w:sz w:val="22"/>
+              </w:rPr>
+              <w:t>0</w:t>
             </w:r>
           </w:p>
         </w:tc>
@@ -5109,7 +5131,7 @@
         </w:trPr>
         <w:tc>
           <w:tcPr>
-            <w:tcW w:w="2891" w:type="dxa"/>
+            <w:tcW w:w="1361" w:type="dxa"/>
             <w:vAlign w:val="center"/>
           </w:tcPr>
           <w:p>
@@ -5125,29 +5147,13 @@
               <w:rPr>
                 <w:sz w:val="22"/>
               </w:rPr>
-              <w:t>5 1Q</w:t>
-            </w:r>
-          </w:p>
-        </w:tc>
-        <w:tc>
-          <w:tcPr>
-            <w:tcW w:w="2268" w:type="dxa"/>
-            <w:vMerge/>
-            <w:shd w:val="clear" w:color="auto" w:fill="E6E6E6"/>
-            <w:vAlign w:val="center"/>
-          </w:tcPr>
-          <w:p>
-            <w:pPr>
-              <w:pStyle w:val="a4"/>
-              <w:spacing w:before="161"/>
-              <w:ind w:right="281"/>
-              <w:jc w:val="center"/>
-            </w:pPr>
-          </w:p>
-        </w:tc>
-        <w:tc>
-          <w:tcPr>
-            <w:tcW w:w="2891" w:type="dxa"/>
+              <w:t>1</w:t>
+            </w:r>
+          </w:p>
+        </w:tc>
+        <w:tc>
+          <w:tcPr>
+            <w:tcW w:w="1361" w:type="dxa"/>
             <w:vAlign w:val="center"/>
           </w:tcPr>
           <w:p>
@@ -5163,24 +5169,13 @@
               <w:rPr>
                 <w:sz w:val="22"/>
               </w:rPr>
-              <w:t>/2PRE 10</w:t>
-            </w:r>
-          </w:p>
-        </w:tc>
-      </w:tr>
-      <w:tr>
-        <w:tblPrEx>
-          <w:tblCellMar>
-            <w:top w:w="0" w:type="dxa"/>
-            <w:bottom w:w="0" w:type="dxa"/>
-          </w:tblCellMar>
-        </w:tblPrEx>
-        <w:trPr>
-          <w:jc w:val="center"/>
-        </w:trPr>
-        <w:tc>
-          <w:tcPr>
-            <w:tcW w:w="2891" w:type="dxa"/>
+              <w:t>1</w:t>
+            </w:r>
+          </w:p>
+        </w:tc>
+        <w:tc>
+          <w:tcPr>
+            <w:tcW w:w="1361" w:type="dxa"/>
             <w:vAlign w:val="center"/>
           </w:tcPr>
           <w:p>
@@ -5196,116 +5191,7 @@
               <w:rPr>
                 <w:sz w:val="22"/>
               </w:rPr>
-              <w:t>6 /1Q</w:t>
-            </w:r>
-          </w:p>
-        </w:tc>
-        <w:tc>
-          <w:tcPr>
-            <w:tcW w:w="2268" w:type="dxa"/>
-            <w:vMerge/>
-            <w:shd w:val="clear" w:color="auto" w:fill="E6E6E6"/>
-            <w:vAlign w:val="center"/>
-          </w:tcPr>
-          <w:p>
-            <w:pPr>
-              <w:pStyle w:val="a4"/>
-              <w:spacing w:before="161"/>
-              <w:ind w:right="281"/>
-              <w:jc w:val="center"/>
-            </w:pPr>
-          </w:p>
-        </w:tc>
-        <w:tc>
-          <w:tcPr>
-            <w:tcW w:w="2891" w:type="dxa"/>
-            <w:vAlign w:val="center"/>
-          </w:tcPr>
-          <w:p>
-            <w:pPr>
-              <w:pStyle w:val="a4"/>
-              <w:ind w:right="281"/>
-              <w:jc w:val="center"/>
-              <w:rPr>
-                <w:sz w:val="22"/>
-              </w:rPr>
-            </w:pPr>
-            <w:r>
-              <w:rPr>
-                <w:sz w:val="22"/>
-              </w:rPr>
-              <w:t>2Q 9</w:t>
-            </w:r>
-          </w:p>
-        </w:tc>
-      </w:tr>
-      <w:tr>
-        <w:tblPrEx>
-          <w:tblCellMar>
-            <w:top w:w="0" w:type="dxa"/>
-            <w:bottom w:w="0" w:type="dxa"/>
-          </w:tblCellMar>
-        </w:tblPrEx>
-        <w:trPr>
-          <w:jc w:val="center"/>
-        </w:trPr>
-        <w:tc>
-          <w:tcPr>
-            <w:tcW w:w="2891" w:type="dxa"/>
-            <w:vAlign w:val="center"/>
-          </w:tcPr>
-          <w:p>
-            <w:pPr>
-              <w:pStyle w:val="a4"/>
-              <w:ind w:right="281"/>
-              <w:jc w:val="center"/>
-              <w:rPr>
-                <w:sz w:val="22"/>
-              </w:rPr>
-            </w:pPr>
-            <w:r>
-              <w:rPr>
-                <w:sz w:val="22"/>
-              </w:rPr>
-              <w:t>7 GND</w:t>
-            </w:r>
-          </w:p>
-        </w:tc>
-        <w:tc>
-          <w:tcPr>
-            <w:tcW w:w="2268" w:type="dxa"/>
-            <w:vMerge/>
-            <w:shd w:val="clear" w:color="auto" w:fill="E6E6E6"/>
-            <w:vAlign w:val="center"/>
-          </w:tcPr>
-          <w:p>
-            <w:pPr>
-              <w:pStyle w:val="a4"/>
-              <w:spacing w:before="161"/>
-              <w:ind w:right="281"/>
-              <w:jc w:val="center"/>
-            </w:pPr>
-          </w:p>
-        </w:tc>
-        <w:tc>
-          <w:tcPr>
-            <w:tcW w:w="2891" w:type="dxa"/>
-            <w:vAlign w:val="center"/>
-          </w:tcPr>
-          <w:p>
-            <w:pPr>
-              <w:pStyle w:val="a4"/>
-              <w:ind w:right="281"/>
-              <w:jc w:val="center"/>
-              <w:rPr>
-                <w:sz w:val="22"/>
-              </w:rPr>
-            </w:pPr>
-            <w:r>
-              <w:rPr>
-                <w:sz w:val="22"/>
-              </w:rPr>
-              <w:t>/2Q 8</w:t>
+              <w:t>1</w:t>
             </w:r>
           </w:p>
         </w:tc>
@@ -5314,506 +5200,56 @@
     <w:p>
       <w:pPr>
         <w:pStyle w:val="a4"/>
+        <w:spacing w:line="360" w:lineRule="auto"/>
       </w:pPr>
     </w:p>
     <w:p>
       <w:pPr>
         <w:pStyle w:val="a4"/>
-        <w:spacing w:after="120"/>
-        <w:jc w:val="center"/>
-      </w:pPr>
-      <w:r>
-        <w:t>Рисунок 1.2 – Распиновка микросхемы 74AS74</w:t>
+        <w:spacing w:line="360" w:lineRule="auto"/>
+        <w:ind w:firstLine="709"/>
+        <w:jc w:val="both"/>
+      </w:pPr>
+      <w:r>
+        <w:t>После построения таблицы переходов D-триггера составим таблицу выходных состояний ПСУ Q3…Q0 и входов триггеров D3…D0. Значения D3…D0 совпадают с двоичным кодом следующего состояния. Для неиспользуемых кодов 1 (0001) и 15 (1111) назначен безопасный переход в состояние 13 (1101).</w:t>
       </w:r>
     </w:p>
     <w:p>
       <w:pPr>
         <w:pStyle w:val="a4"/>
-        <w:spacing w:after="120"/>
+        <w:spacing w:after="160" w:line="360" w:lineRule="auto"/>
         <w:ind w:firstLine="709"/>
         <w:jc w:val="both"/>
       </w:pPr>
       <w:r>
-        <w:t>Для D-триггера сигнал на входе D непосредственно определяет состояние прямого выхода после активного фронта тактового импульса: D(t) = Q(t+1). Таблица переходов D-триггера представлена в таблице 1.1.</w:t>
-      </w:r>
-    </w:p>
-    <w:p>
-      <w:pPr>
-        <w:pStyle w:val="a4"/>
-        <w:keepNext/>
-        <w:jc w:val="center"/>
-      </w:pPr>
-      <w:r>
-        <w:t>Таблица 1.1 – Таблица переходов D-триггера</w:t>
+        <w:t>Таблица выходных состояний ПСУ и входов триггеров представлена на рисунке 2.1.</w:t>
       </w:r>
     </w:p>
     <w:tbl>
       <w:tblPr>
-        <w:tblW w:w="0" w:type="auto"/>
+        <w:tblW w:w="8048" w:type="dxa"/>
         <w:jc w:val="center"/>
         <w:tblBorders>
-          <w:top w:val="single" w:sz="4" w:space="0" w:color="auto"/>
-          <w:left w:val="single" w:sz="4" w:space="0" w:color="auto"/>
-          <w:bottom w:val="single" w:sz="4" w:space="0" w:color="auto"/>
-          <w:right w:val="single" w:sz="4" w:space="0" w:color="auto"/>
-          <w:insideH w:val="single" w:sz="4" w:space="0" w:color="auto"/>
-          <w:insideV w:val="single" w:sz="4" w:space="0" w:color="auto"/>
+          <w:top w:val="single" w:sz="4" w:space="0" w:color="000000"/>
+          <w:left w:val="single" w:sz="4" w:space="0" w:color="000000"/>
+          <w:bottom w:val="single" w:sz="4" w:space="0" w:color="000000"/>
+          <w:right w:val="single" w:sz="4" w:space="0" w:color="000000"/>
+          <w:insideH w:val="single" w:sz="4" w:space="0" w:color="000000"/>
+          <w:insideV w:val="single" w:sz="4" w:space="0" w:color="000000"/>
         </w:tblBorders>
         <w:tblLayout w:type="fixed"/>
         <w:tblLook w:val="0000" w:firstRow="0" w:lastRow="0" w:firstColumn="0" w:lastColumn="0" w:noHBand="0" w:noVBand="0"/>
       </w:tblPr>
       <w:tblGrid>
-        <w:gridCol w:w="1701"/>
-        <w:gridCol w:w="1701"/>
-        <w:gridCol w:w="1701"/>
-      </w:tblGrid>
-      <w:tr>
-        <w:tblPrEx>
-          <w:tblCellMar>
-            <w:top w:w="0" w:type="dxa"/>
-            <w:bottom w:w="0" w:type="dxa"/>
-          </w:tblCellMar>
-        </w:tblPrEx>
-        <w:trPr>
-          <w:jc w:val="center"/>
-        </w:trPr>
-        <w:tc>
-          <w:tcPr>
-            <w:tcW w:w="1701" w:type="dxa"/>
-            <w:vAlign w:val="center"/>
-          </w:tcPr>
-          <w:p>
-            <w:pPr>
-              <w:pStyle w:val="a4"/>
-              <w:ind w:right="281"/>
-              <w:jc w:val="center"/>
-              <w:rPr>
-                <w:b/>
-                <w:sz w:val="22"/>
-              </w:rPr>
-            </w:pPr>
-            <w:r>
-              <w:rPr>
-                <w:b/>
-                <w:sz w:val="22"/>
-              </w:rPr>
-              <w:t>Q(t)</w:t>
-            </w:r>
-          </w:p>
-        </w:tc>
-        <w:tc>
-          <w:tcPr>
-            <w:tcW w:w="1701" w:type="dxa"/>
-            <w:vAlign w:val="center"/>
-          </w:tcPr>
-          <w:p>
-            <w:pPr>
-              <w:pStyle w:val="a4"/>
-              <w:ind w:right="281"/>
-              <w:jc w:val="center"/>
-              <w:rPr>
-                <w:b/>
-                <w:sz w:val="22"/>
-              </w:rPr>
-            </w:pPr>
-            <w:r>
-              <w:rPr>
-                <w:b/>
-                <w:sz w:val="22"/>
-              </w:rPr>
-              <w:t>Q(t+1)</w:t>
-            </w:r>
-          </w:p>
-        </w:tc>
-        <w:tc>
-          <w:tcPr>
-            <w:tcW w:w="1701" w:type="dxa"/>
-            <w:vAlign w:val="center"/>
-          </w:tcPr>
-          <w:p>
-            <w:pPr>
-              <w:pStyle w:val="a4"/>
-              <w:ind w:right="281"/>
-              <w:jc w:val="center"/>
-              <w:rPr>
-                <w:b/>
-                <w:sz w:val="22"/>
-              </w:rPr>
-            </w:pPr>
-            <w:r>
-              <w:rPr>
-                <w:b/>
-                <w:sz w:val="22"/>
-              </w:rPr>
-              <w:t>D(t)</w:t>
-            </w:r>
-          </w:p>
-        </w:tc>
-      </w:tr>
-      <w:tr>
-        <w:tblPrEx>
-          <w:tblCellMar>
-            <w:top w:w="0" w:type="dxa"/>
-            <w:bottom w:w="0" w:type="dxa"/>
-          </w:tblCellMar>
-        </w:tblPrEx>
-        <w:trPr>
-          <w:jc w:val="center"/>
-        </w:trPr>
-        <w:tc>
-          <w:tcPr>
-            <w:tcW w:w="1701" w:type="dxa"/>
-            <w:vAlign w:val="center"/>
-          </w:tcPr>
-          <w:p>
-            <w:pPr>
-              <w:pStyle w:val="a4"/>
-              <w:ind w:right="281"/>
-              <w:jc w:val="center"/>
-              <w:rPr>
-                <w:sz w:val="22"/>
-              </w:rPr>
-            </w:pPr>
-            <w:r>
-              <w:rPr>
-                <w:sz w:val="22"/>
-              </w:rPr>
-              <w:t>0</w:t>
-            </w:r>
-          </w:p>
-        </w:tc>
-        <w:tc>
-          <w:tcPr>
-            <w:tcW w:w="1701" w:type="dxa"/>
-            <w:vAlign w:val="center"/>
-          </w:tcPr>
-          <w:p>
-            <w:pPr>
-              <w:pStyle w:val="a4"/>
-              <w:ind w:right="281"/>
-              <w:jc w:val="center"/>
-              <w:rPr>
-                <w:sz w:val="22"/>
-              </w:rPr>
-            </w:pPr>
-            <w:r>
-              <w:rPr>
-                <w:sz w:val="22"/>
-              </w:rPr>
-              <w:t>0</w:t>
-            </w:r>
-          </w:p>
-        </w:tc>
-        <w:tc>
-          <w:tcPr>
-            <w:tcW w:w="1701" w:type="dxa"/>
-            <w:vAlign w:val="center"/>
-          </w:tcPr>
-          <w:p>
-            <w:pPr>
-              <w:pStyle w:val="a4"/>
-              <w:ind w:right="281"/>
-              <w:jc w:val="center"/>
-              <w:rPr>
-                <w:sz w:val="22"/>
-              </w:rPr>
-            </w:pPr>
-            <w:r>
-              <w:rPr>
-                <w:sz w:val="22"/>
-              </w:rPr>
-              <w:t>0</w:t>
-            </w:r>
-          </w:p>
-        </w:tc>
-      </w:tr>
-      <w:tr>
-        <w:tblPrEx>
-          <w:tblCellMar>
-            <w:top w:w="0" w:type="dxa"/>
-            <w:bottom w:w="0" w:type="dxa"/>
-          </w:tblCellMar>
-        </w:tblPrEx>
-        <w:trPr>
-          <w:jc w:val="center"/>
-        </w:trPr>
-        <w:tc>
-          <w:tcPr>
-            <w:tcW w:w="1701" w:type="dxa"/>
-            <w:vAlign w:val="center"/>
-          </w:tcPr>
-          <w:p>
-            <w:pPr>
-              <w:pStyle w:val="a4"/>
-              <w:ind w:right="281"/>
-              <w:jc w:val="center"/>
-              <w:rPr>
-                <w:sz w:val="22"/>
-              </w:rPr>
-            </w:pPr>
-            <w:r>
-              <w:rPr>
-                <w:sz w:val="22"/>
-              </w:rPr>
-              <w:t>0</w:t>
-            </w:r>
-          </w:p>
-        </w:tc>
-        <w:tc>
-          <w:tcPr>
-            <w:tcW w:w="1701" w:type="dxa"/>
-            <w:vAlign w:val="center"/>
-          </w:tcPr>
-          <w:p>
-            <w:pPr>
-              <w:pStyle w:val="a4"/>
-              <w:ind w:right="281"/>
-              <w:jc w:val="center"/>
-              <w:rPr>
-                <w:sz w:val="22"/>
-              </w:rPr>
-            </w:pPr>
-            <w:r>
-              <w:rPr>
-                <w:sz w:val="22"/>
-              </w:rPr>
-              <w:t>1</w:t>
-            </w:r>
-          </w:p>
-        </w:tc>
-        <w:tc>
-          <w:tcPr>
-            <w:tcW w:w="1701" w:type="dxa"/>
-            <w:vAlign w:val="center"/>
-          </w:tcPr>
-          <w:p>
-            <w:pPr>
-              <w:pStyle w:val="a4"/>
-              <w:ind w:right="281"/>
-              <w:jc w:val="center"/>
-              <w:rPr>
-                <w:sz w:val="22"/>
-              </w:rPr>
-            </w:pPr>
-            <w:r>
-              <w:rPr>
-                <w:sz w:val="22"/>
-              </w:rPr>
-              <w:t>1</w:t>
-            </w:r>
-          </w:p>
-        </w:tc>
-      </w:tr>
-      <w:tr>
-        <w:tblPrEx>
-          <w:tblCellMar>
-            <w:top w:w="0" w:type="dxa"/>
-            <w:bottom w:w="0" w:type="dxa"/>
-          </w:tblCellMar>
-        </w:tblPrEx>
-        <w:trPr>
-          <w:jc w:val="center"/>
-        </w:trPr>
-        <w:tc>
-          <w:tcPr>
-            <w:tcW w:w="1701" w:type="dxa"/>
-            <w:vAlign w:val="center"/>
-          </w:tcPr>
-          <w:p>
-            <w:pPr>
-              <w:pStyle w:val="a4"/>
-              <w:ind w:right="281"/>
-              <w:jc w:val="center"/>
-              <w:rPr>
-                <w:sz w:val="22"/>
-              </w:rPr>
-            </w:pPr>
-            <w:r>
-              <w:rPr>
-                <w:sz w:val="22"/>
-              </w:rPr>
-              <w:t>1</w:t>
-            </w:r>
-          </w:p>
-        </w:tc>
-        <w:tc>
-          <w:tcPr>
-            <w:tcW w:w="1701" w:type="dxa"/>
-            <w:vAlign w:val="center"/>
-          </w:tcPr>
-          <w:p>
-            <w:pPr>
-              <w:pStyle w:val="a4"/>
-              <w:ind w:right="281"/>
-              <w:jc w:val="center"/>
-              <w:rPr>
-                <w:sz w:val="22"/>
-              </w:rPr>
-            </w:pPr>
-            <w:r>
-              <w:rPr>
-                <w:sz w:val="22"/>
-              </w:rPr>
-              <w:t>0</w:t>
-            </w:r>
-          </w:p>
-        </w:tc>
-        <w:tc>
-          <w:tcPr>
-            <w:tcW w:w="1701" w:type="dxa"/>
-            <w:vAlign w:val="center"/>
-          </w:tcPr>
-          <w:p>
-            <w:pPr>
-              <w:pStyle w:val="a4"/>
-              <w:ind w:right="281"/>
-              <w:jc w:val="center"/>
-              <w:rPr>
-                <w:sz w:val="22"/>
-              </w:rPr>
-            </w:pPr>
-            <w:r>
-              <w:rPr>
-                <w:sz w:val="22"/>
-              </w:rPr>
-              <w:t>0</w:t>
-            </w:r>
-          </w:p>
-        </w:tc>
-      </w:tr>
-      <w:tr>
-        <w:tblPrEx>
-          <w:tblCellMar>
-            <w:top w:w="0" w:type="dxa"/>
-            <w:bottom w:w="0" w:type="dxa"/>
-          </w:tblCellMar>
-        </w:tblPrEx>
-        <w:trPr>
-          <w:jc w:val="center"/>
-        </w:trPr>
-        <w:tc>
-          <w:tcPr>
-            <w:tcW w:w="1701" w:type="dxa"/>
-            <w:vAlign w:val="center"/>
-          </w:tcPr>
-          <w:p>
-            <w:pPr>
-              <w:pStyle w:val="a4"/>
-              <w:ind w:right="281"/>
-              <w:jc w:val="center"/>
-              <w:rPr>
-                <w:sz w:val="22"/>
-              </w:rPr>
-            </w:pPr>
-            <w:r>
-              <w:rPr>
-                <w:sz w:val="22"/>
-              </w:rPr>
-              <w:t>1</w:t>
-            </w:r>
-          </w:p>
-        </w:tc>
-        <w:tc>
-          <w:tcPr>
-            <w:tcW w:w="1701" w:type="dxa"/>
-            <w:vAlign w:val="center"/>
-          </w:tcPr>
-          <w:p>
-            <w:pPr>
-              <w:pStyle w:val="a4"/>
-              <w:ind w:right="281"/>
-              <w:jc w:val="center"/>
-              <w:rPr>
-                <w:sz w:val="22"/>
-              </w:rPr>
-            </w:pPr>
-            <w:r>
-              <w:rPr>
-                <w:sz w:val="22"/>
-              </w:rPr>
-              <w:t>1</w:t>
-            </w:r>
-          </w:p>
-        </w:tc>
-        <w:tc>
-          <w:tcPr>
-            <w:tcW w:w="1701" w:type="dxa"/>
-            <w:vAlign w:val="center"/>
-          </w:tcPr>
-          <w:p>
-            <w:pPr>
-              <w:pStyle w:val="a4"/>
-              <w:ind w:right="281"/>
-              <w:jc w:val="center"/>
-              <w:rPr>
-                <w:sz w:val="22"/>
-              </w:rPr>
-            </w:pPr>
-            <w:r>
-              <w:rPr>
-                <w:sz w:val="22"/>
-              </w:rPr>
-              <w:t>1</w:t>
-            </w:r>
-          </w:p>
-        </w:tc>
-      </w:tr>
-    </w:tbl>
-    <w:p>
-      <w:pPr>
-        <w:pStyle w:val="a4"/>
-      </w:pPr>
-    </w:p>
-    <w:p>
-      <w:pPr>
-        <w:pStyle w:val="a4"/>
-        <w:pageBreakBefore/>
-        <w:spacing w:after="120"/>
-        <w:ind w:firstLine="709"/>
-        <w:jc w:val="both"/>
-      </w:pPr>
-      <w:r>
-        <w:lastRenderedPageBreak/>
-        <w:t>На основании заданной последовательности составим таблицу текущих состояний ПСУ Q3…Q0 и сигналов на входах D3…D0. Значения D3…D0 совпадают с двоичным кодом следующего состояния. Для неиспользуемых кодов 1 (0001) и 15 (1111) назначен безопасный переход в начальное состояние 13 (1101), поэтому ПСУ самостоятельно возвращается в рабочий цикл за один такт.</w:t>
-      </w:r>
-    </w:p>
-    <w:p>
-      <w:pPr>
-        <w:pStyle w:val="a4"/>
-        <w:spacing w:after="120"/>
-        <w:ind w:firstLine="709"/>
-        <w:jc w:val="both"/>
-      </w:pPr>
-      <w:r>
-        <w:t>Таблица выходных состояний ПСУ и входов D-триггеров представлена на рисунке 2.1.</w:t>
-      </w:r>
-    </w:p>
-    <w:tbl>
-      <w:tblPr>
-        <w:tblW w:w="7934" w:type="dxa"/>
-        <w:jc w:val="center"/>
-        <w:tblBorders>
-          <w:top w:val="single" w:sz="4" w:space="0" w:color="auto"/>
-          <w:left w:val="single" w:sz="4" w:space="0" w:color="auto"/>
-          <w:bottom w:val="single" w:sz="4" w:space="0" w:color="auto"/>
-          <w:right w:val="single" w:sz="4" w:space="0" w:color="auto"/>
-          <w:insideH w:val="single" w:sz="4" w:space="0" w:color="auto"/>
-          <w:insideV w:val="single" w:sz="4" w:space="0" w:color="auto"/>
-        </w:tblBorders>
-        <w:tblLayout w:type="fixed"/>
-        <w:tblLook w:val="0000" w:firstRow="0" w:lastRow="0" w:firstColumn="0" w:lastColumn="0" w:noHBand="0" w:noVBand="0"/>
-      </w:tblPr>
-      <w:tblGrid>
-        <w:gridCol w:w="1587"/>
-        <w:gridCol w:w="595"/>
-        <w:gridCol w:w="595"/>
-        <w:gridCol w:w="595"/>
-        <w:gridCol w:w="595"/>
-        <w:gridCol w:w="1587"/>
-        <w:gridCol w:w="595"/>
-        <w:gridCol w:w="595"/>
-        <w:gridCol w:w="595"/>
-        <w:gridCol w:w="595"/>
+        <w:gridCol w:w="1928"/>
+        <w:gridCol w:w="765"/>
+        <w:gridCol w:w="765"/>
+        <w:gridCol w:w="765"/>
+        <w:gridCol w:w="765"/>
+        <w:gridCol w:w="765"/>
+        <w:gridCol w:w="765"/>
+        <w:gridCol w:w="765"/>
+        <w:gridCol w:w="765"/>
       </w:tblGrid>
       <w:tr>
         <w:tblPrEx>
@@ -5829,8 +5265,8 @@
         </w:trPr>
         <w:tc>
           <w:tcPr>
-            <w:tcW w:w="1587" w:type="dxa"/>
-            <w:shd w:val="clear" w:color="auto" w:fill="D9D9D9"/>
+            <w:tcW w:w="1928" w:type="dxa"/>
+            <w:shd w:val="clear" w:color="auto" w:fill="00B0F0"/>
             <w:vAlign w:val="center"/>
           </w:tcPr>
           <w:p>
@@ -5840,15 +5276,15 @@
               <w:jc w:val="center"/>
               <w:rPr>
                 <w:b/>
-                <w:sz w:val="18"/>
+                <w:sz w:val="20"/>
               </w:rPr>
             </w:pPr>
             <w:r>
               <w:rPr>
                 <w:b/>
-                <w:sz w:val="18"/>
-              </w:rPr>
-              <w:t>Текущее</w:t>
+                <w:sz w:val="20"/>
+              </w:rPr>
+              <w:t>Десятичный</w:t>
             </w:r>
           </w:p>
           <w:p>
@@ -5858,22 +5294,22 @@
               <w:jc w:val="center"/>
               <w:rPr>
                 <w:b/>
-                <w:sz w:val="18"/>
+                <w:sz w:val="20"/>
               </w:rPr>
             </w:pPr>
             <w:r>
               <w:rPr>
                 <w:b/>
-                <w:sz w:val="18"/>
-              </w:rPr>
-              <w:t>состояние</w:t>
-            </w:r>
-          </w:p>
-        </w:tc>
-        <w:tc>
-          <w:tcPr>
-            <w:tcW w:w="595" w:type="dxa"/>
-            <w:shd w:val="clear" w:color="auto" w:fill="D9D9D9"/>
+                <w:sz w:val="20"/>
+              </w:rPr>
+              <w:t>эквивалент</w:t>
+            </w:r>
+          </w:p>
+        </w:tc>
+        <w:tc>
+          <w:tcPr>
+            <w:tcW w:w="765" w:type="dxa"/>
+            <w:shd w:val="clear" w:color="auto" w:fill="00B0F0"/>
             <w:vAlign w:val="center"/>
           </w:tcPr>
           <w:p>
@@ -5883,22 +5319,22 @@
               <w:jc w:val="center"/>
               <w:rPr>
                 <w:b/>
-                <w:sz w:val="18"/>
+                <w:sz w:val="20"/>
               </w:rPr>
             </w:pPr>
             <w:r>
               <w:rPr>
                 <w:b/>
-                <w:sz w:val="18"/>
-              </w:rPr>
-              <w:t>Q₃</w:t>
-            </w:r>
-          </w:p>
-        </w:tc>
-        <w:tc>
-          <w:tcPr>
-            <w:tcW w:w="595" w:type="dxa"/>
-            <w:shd w:val="clear" w:color="auto" w:fill="D9D9D9"/>
+                <w:sz w:val="20"/>
+              </w:rPr>
+              <w:t>Q3</w:t>
+            </w:r>
+          </w:p>
+        </w:tc>
+        <w:tc>
+          <w:tcPr>
+            <w:tcW w:w="765" w:type="dxa"/>
+            <w:shd w:val="clear" w:color="auto" w:fill="00B0F0"/>
             <w:vAlign w:val="center"/>
           </w:tcPr>
           <w:p>
@@ -5908,22 +5344,22 @@
               <w:jc w:val="center"/>
               <w:rPr>
                 <w:b/>
-                <w:sz w:val="18"/>
+                <w:sz w:val="20"/>
               </w:rPr>
             </w:pPr>
             <w:r>
               <w:rPr>
                 <w:b/>
-                <w:sz w:val="18"/>
-              </w:rPr>
-              <w:t>Q₂</w:t>
-            </w:r>
-          </w:p>
-        </w:tc>
-        <w:tc>
-          <w:tcPr>
-            <w:tcW w:w="595" w:type="dxa"/>
-            <w:shd w:val="clear" w:color="auto" w:fill="D9D9D9"/>
+                <w:sz w:val="20"/>
+              </w:rPr>
+              <w:t>Q2</w:t>
+            </w:r>
+          </w:p>
+        </w:tc>
+        <w:tc>
+          <w:tcPr>
+            <w:tcW w:w="765" w:type="dxa"/>
+            <w:shd w:val="clear" w:color="auto" w:fill="00B0F0"/>
             <w:vAlign w:val="center"/>
           </w:tcPr>
           <w:p>
@@ -5933,22 +5369,22 @@
               <w:jc w:val="center"/>
               <w:rPr>
                 <w:b/>
-                <w:sz w:val="18"/>
+                <w:sz w:val="20"/>
               </w:rPr>
             </w:pPr>
             <w:r>
               <w:rPr>
                 <w:b/>
-                <w:sz w:val="18"/>
-              </w:rPr>
-              <w:t>Q₁</w:t>
-            </w:r>
-          </w:p>
-        </w:tc>
-        <w:tc>
-          <w:tcPr>
-            <w:tcW w:w="595" w:type="dxa"/>
-            <w:shd w:val="clear" w:color="auto" w:fill="D9D9D9"/>
+                <w:sz w:val="20"/>
+              </w:rPr>
+              <w:t>Q1</w:t>
+            </w:r>
+          </w:p>
+        </w:tc>
+        <w:tc>
+          <w:tcPr>
+            <w:tcW w:w="765" w:type="dxa"/>
+            <w:shd w:val="clear" w:color="auto" w:fill="00B0F0"/>
             <w:vAlign w:val="center"/>
           </w:tcPr>
           <w:p>
@@ -5958,22 +5394,22 @@
               <w:jc w:val="center"/>
               <w:rPr>
                 <w:b/>
-                <w:sz w:val="18"/>
+                <w:sz w:val="20"/>
               </w:rPr>
             </w:pPr>
             <w:r>
               <w:rPr>
                 <w:b/>
-                <w:sz w:val="18"/>
-              </w:rPr>
-              <w:t>Q₀</w:t>
-            </w:r>
-          </w:p>
-        </w:tc>
-        <w:tc>
-          <w:tcPr>
-            <w:tcW w:w="1587" w:type="dxa"/>
-            <w:shd w:val="clear" w:color="auto" w:fill="D9D9D9"/>
+                <w:sz w:val="20"/>
+              </w:rPr>
+              <w:t>Q0</w:t>
+            </w:r>
+          </w:p>
+        </w:tc>
+        <w:tc>
+          <w:tcPr>
+            <w:tcW w:w="765" w:type="dxa"/>
+            <w:shd w:val="clear" w:color="auto" w:fill="00B0F0"/>
             <w:vAlign w:val="center"/>
           </w:tcPr>
           <w:p>
@@ -5983,17 +5419,24 @@
               <w:jc w:val="center"/>
               <w:rPr>
                 <w:b/>
-                <w:sz w:val="18"/>
+                <w:sz w:val="20"/>
               </w:rPr>
             </w:pPr>
             <w:r>
               <w:rPr>
                 <w:b/>
-                <w:sz w:val="18"/>
-              </w:rPr>
-              <w:t>Следующее</w:t>
-            </w:r>
-          </w:p>
+                <w:sz w:val="20"/>
+              </w:rPr>
+              <w:t>D3</w:t>
+            </w:r>
+          </w:p>
+        </w:tc>
+        <w:tc>
+          <w:tcPr>
+            <w:tcW w:w="765" w:type="dxa"/>
+            <w:shd w:val="clear" w:color="auto" w:fill="00B0F0"/>
+            <w:vAlign w:val="center"/>
+          </w:tcPr>
           <w:p>
             <w:pPr>
               <w:pStyle w:val="a4"/>
@@ -6001,22 +5444,22 @@
               <w:jc w:val="center"/>
               <w:rPr>
                 <w:b/>
-                <w:sz w:val="18"/>
+                <w:sz w:val="20"/>
               </w:rPr>
             </w:pPr>
             <w:r>
               <w:rPr>
                 <w:b/>
-                <w:sz w:val="18"/>
-              </w:rPr>
-              <w:t>состояние</w:t>
-            </w:r>
-          </w:p>
-        </w:tc>
-        <w:tc>
-          <w:tcPr>
-            <w:tcW w:w="595" w:type="dxa"/>
-            <w:shd w:val="clear" w:color="auto" w:fill="D9D9D9"/>
+                <w:sz w:val="20"/>
+              </w:rPr>
+              <w:t>D2</w:t>
+            </w:r>
+          </w:p>
+        </w:tc>
+        <w:tc>
+          <w:tcPr>
+            <w:tcW w:w="765" w:type="dxa"/>
+            <w:shd w:val="clear" w:color="auto" w:fill="00B0F0"/>
             <w:vAlign w:val="center"/>
           </w:tcPr>
           <w:p>
@@ -6026,22 +5469,22 @@
               <w:jc w:val="center"/>
               <w:rPr>
                 <w:b/>
-                <w:sz w:val="18"/>
+                <w:sz w:val="20"/>
               </w:rPr>
             </w:pPr>
             <w:r>
               <w:rPr>
                 <w:b/>
-                <w:sz w:val="18"/>
-              </w:rPr>
-              <w:t>D₃</w:t>
-            </w:r>
-          </w:p>
-        </w:tc>
-        <w:tc>
-          <w:tcPr>
-            <w:tcW w:w="595" w:type="dxa"/>
-            <w:shd w:val="clear" w:color="auto" w:fill="D9D9D9"/>
+                <w:sz w:val="20"/>
+              </w:rPr>
+              <w:t>D1</w:t>
+            </w:r>
+          </w:p>
+        </w:tc>
+        <w:tc>
+          <w:tcPr>
+            <w:tcW w:w="765" w:type="dxa"/>
+            <w:shd w:val="clear" w:color="auto" w:fill="00B0F0"/>
             <w:vAlign w:val="center"/>
           </w:tcPr>
           <w:p>
@@ -6051,65 +5494,15 @@
               <w:jc w:val="center"/>
               <w:rPr>
                 <w:b/>
-                <w:sz w:val="18"/>
+                <w:sz w:val="20"/>
               </w:rPr>
             </w:pPr>
             <w:r>
               <w:rPr>
                 <w:b/>
-                <w:sz w:val="18"/>
-              </w:rPr>
-              <w:t>D₂</w:t>
-            </w:r>
-          </w:p>
-        </w:tc>
-        <w:tc>
-          <w:tcPr>
-            <w:tcW w:w="595" w:type="dxa"/>
-            <w:shd w:val="clear" w:color="auto" w:fill="D9D9D9"/>
-            <w:vAlign w:val="center"/>
-          </w:tcPr>
-          <w:p>
-            <w:pPr>
-              <w:pStyle w:val="a4"/>
-              <w:ind w:right="281"/>
-              <w:jc w:val="center"/>
-              <w:rPr>
-                <w:b/>
-                <w:sz w:val="18"/>
-              </w:rPr>
-            </w:pPr>
-            <w:r>
-              <w:rPr>
-                <w:b/>
-                <w:sz w:val="18"/>
-              </w:rPr>
-              <w:t>D₁</w:t>
-            </w:r>
-          </w:p>
-        </w:tc>
-        <w:tc>
-          <w:tcPr>
-            <w:tcW w:w="595" w:type="dxa"/>
-            <w:shd w:val="clear" w:color="auto" w:fill="D9D9D9"/>
-            <w:vAlign w:val="center"/>
-          </w:tcPr>
-          <w:p>
-            <w:pPr>
-              <w:pStyle w:val="a4"/>
-              <w:ind w:right="281"/>
-              <w:jc w:val="center"/>
-              <w:rPr>
-                <w:b/>
-                <w:sz w:val="18"/>
-              </w:rPr>
-            </w:pPr>
-            <w:r>
-              <w:rPr>
-                <w:b/>
-                <w:sz w:val="18"/>
-              </w:rPr>
-              <w:t>D₀</w:t>
+                <w:sz w:val="20"/>
+              </w:rPr>
+              <w:t>D0</w:t>
             </w:r>
           </w:p>
         </w:tc>
@@ -6127,7 +5520,7 @@
         </w:trPr>
         <w:tc>
           <w:tcPr>
-            <w:tcW w:w="1587" w:type="dxa"/>
+            <w:tcW w:w="1928" w:type="dxa"/>
             <w:vAlign w:val="center"/>
           </w:tcPr>
           <w:p>
@@ -6149,7 +5542,7 @@
         </w:tc>
         <w:tc>
           <w:tcPr>
-            <w:tcW w:w="595" w:type="dxa"/>
+            <w:tcW w:w="765" w:type="dxa"/>
             <w:vAlign w:val="center"/>
           </w:tcPr>
           <w:p>
@@ -6171,7 +5564,7 @@
         </w:tc>
         <w:tc>
           <w:tcPr>
-            <w:tcW w:w="595" w:type="dxa"/>
+            <w:tcW w:w="765" w:type="dxa"/>
             <w:vAlign w:val="center"/>
           </w:tcPr>
           <w:p>
@@ -6193,7 +5586,7 @@
         </w:tc>
         <w:tc>
           <w:tcPr>
-            <w:tcW w:w="595" w:type="dxa"/>
+            <w:tcW w:w="765" w:type="dxa"/>
             <w:vAlign w:val="center"/>
           </w:tcPr>
           <w:p>
@@ -6215,7 +5608,7 @@
         </w:tc>
         <w:tc>
           <w:tcPr>
-            <w:tcW w:w="595" w:type="dxa"/>
+            <w:tcW w:w="765" w:type="dxa"/>
             <w:vAlign w:val="center"/>
           </w:tcPr>
           <w:p>
@@ -6237,29 +5630,7 @@
         </w:tc>
         <w:tc>
           <w:tcPr>
-            <w:tcW w:w="1587" w:type="dxa"/>
-            <w:vAlign w:val="center"/>
-          </w:tcPr>
-          <w:p>
-            <w:pPr>
-              <w:pStyle w:val="a4"/>
-              <w:ind w:right="281"/>
-              <w:jc w:val="center"/>
-              <w:rPr>
-                <w:sz w:val="20"/>
-              </w:rPr>
-            </w:pPr>
-            <w:r>
-              <w:rPr>
-                <w:sz w:val="20"/>
-              </w:rPr>
-              <w:t>2</w:t>
-            </w:r>
-          </w:p>
-        </w:tc>
-        <w:tc>
-          <w:tcPr>
-            <w:tcW w:w="595" w:type="dxa"/>
+            <w:tcW w:w="765" w:type="dxa"/>
             <w:vAlign w:val="center"/>
           </w:tcPr>
           <w:p>
@@ -6281,7 +5652,7 @@
         </w:tc>
         <w:tc>
           <w:tcPr>
-            <w:tcW w:w="595" w:type="dxa"/>
+            <w:tcW w:w="765" w:type="dxa"/>
             <w:vAlign w:val="center"/>
           </w:tcPr>
           <w:p>
@@ -6303,7 +5674,7 @@
         </w:tc>
         <w:tc>
           <w:tcPr>
-            <w:tcW w:w="595" w:type="dxa"/>
+            <w:tcW w:w="765" w:type="dxa"/>
             <w:vAlign w:val="center"/>
           </w:tcPr>
           <w:p>
@@ -6325,7 +5696,7 @@
         </w:tc>
         <w:tc>
           <w:tcPr>
-            <w:tcW w:w="595" w:type="dxa"/>
+            <w:tcW w:w="765" w:type="dxa"/>
             <w:vAlign w:val="center"/>
           </w:tcPr>
           <w:p>
@@ -6359,7 +5730,7 @@
         </w:trPr>
         <w:tc>
           <w:tcPr>
-            <w:tcW w:w="1587" w:type="dxa"/>
+            <w:tcW w:w="1928" w:type="dxa"/>
             <w:vAlign w:val="center"/>
           </w:tcPr>
           <w:p>
@@ -6381,7 +5752,7 @@
         </w:tc>
         <w:tc>
           <w:tcPr>
-            <w:tcW w:w="595" w:type="dxa"/>
+            <w:tcW w:w="765" w:type="dxa"/>
             <w:vAlign w:val="center"/>
           </w:tcPr>
           <w:p>
@@ -6403,7 +5774,7 @@
         </w:tc>
         <w:tc>
           <w:tcPr>
-            <w:tcW w:w="595" w:type="dxa"/>
+            <w:tcW w:w="765" w:type="dxa"/>
             <w:vAlign w:val="center"/>
           </w:tcPr>
           <w:p>
@@ -6425,7 +5796,7 @@
         </w:tc>
         <w:tc>
           <w:tcPr>
-            <w:tcW w:w="595" w:type="dxa"/>
+            <w:tcW w:w="765" w:type="dxa"/>
             <w:vAlign w:val="center"/>
           </w:tcPr>
           <w:p>
@@ -6447,7 +5818,7 @@
         </w:tc>
         <w:tc>
           <w:tcPr>
-            <w:tcW w:w="595" w:type="dxa"/>
+            <w:tcW w:w="765" w:type="dxa"/>
             <w:vAlign w:val="center"/>
           </w:tcPr>
           <w:p>
@@ -6469,29 +5840,7 @@
         </w:tc>
         <w:tc>
           <w:tcPr>
-            <w:tcW w:w="1587" w:type="dxa"/>
-            <w:vAlign w:val="center"/>
-          </w:tcPr>
-          <w:p>
-            <w:pPr>
-              <w:pStyle w:val="a4"/>
-              <w:ind w:right="281"/>
-              <w:jc w:val="center"/>
-              <w:rPr>
-                <w:sz w:val="20"/>
-              </w:rPr>
-            </w:pPr>
-            <w:r>
-              <w:rPr>
-                <w:sz w:val="20"/>
-              </w:rPr>
-              <w:t>14</w:t>
-            </w:r>
-          </w:p>
-        </w:tc>
-        <w:tc>
-          <w:tcPr>
-            <w:tcW w:w="595" w:type="dxa"/>
+            <w:tcW w:w="765" w:type="dxa"/>
             <w:vAlign w:val="center"/>
           </w:tcPr>
           <w:p>
@@ -6513,7 +5862,7 @@
         </w:tc>
         <w:tc>
           <w:tcPr>
-            <w:tcW w:w="595" w:type="dxa"/>
+            <w:tcW w:w="765" w:type="dxa"/>
             <w:vAlign w:val="center"/>
           </w:tcPr>
           <w:p>
@@ -6535,7 +5884,7 @@
         </w:tc>
         <w:tc>
           <w:tcPr>
-            <w:tcW w:w="595" w:type="dxa"/>
+            <w:tcW w:w="765" w:type="dxa"/>
             <w:vAlign w:val="center"/>
           </w:tcPr>
           <w:p>
@@ -6557,7 +5906,7 @@
         </w:tc>
         <w:tc>
           <w:tcPr>
-            <w:tcW w:w="595" w:type="dxa"/>
+            <w:tcW w:w="765" w:type="dxa"/>
             <w:vAlign w:val="center"/>
           </w:tcPr>
           <w:p>
@@ -6591,7 +5940,7 @@
         </w:trPr>
         <w:tc>
           <w:tcPr>
-            <w:tcW w:w="1587" w:type="dxa"/>
+            <w:tcW w:w="1928" w:type="dxa"/>
             <w:vAlign w:val="center"/>
           </w:tcPr>
           <w:p>
@@ -6613,7 +5962,7 @@
         </w:tc>
         <w:tc>
           <w:tcPr>
-            <w:tcW w:w="595" w:type="dxa"/>
+            <w:tcW w:w="765" w:type="dxa"/>
             <w:vAlign w:val="center"/>
           </w:tcPr>
           <w:p>
@@ -6635,7 +5984,7 @@
         </w:tc>
         <w:tc>
           <w:tcPr>
-            <w:tcW w:w="595" w:type="dxa"/>
+            <w:tcW w:w="765" w:type="dxa"/>
             <w:vAlign w:val="center"/>
           </w:tcPr>
           <w:p>
@@ -6657,7 +6006,7 @@
         </w:tc>
         <w:tc>
           <w:tcPr>
-            <w:tcW w:w="595" w:type="dxa"/>
+            <w:tcW w:w="765" w:type="dxa"/>
             <w:vAlign w:val="center"/>
           </w:tcPr>
           <w:p>
@@ -6679,7 +6028,7 @@
         </w:tc>
         <w:tc>
           <w:tcPr>
-            <w:tcW w:w="595" w:type="dxa"/>
+            <w:tcW w:w="765" w:type="dxa"/>
             <w:vAlign w:val="center"/>
           </w:tcPr>
           <w:p>
@@ -6701,29 +6050,7 @@
         </w:tc>
         <w:tc>
           <w:tcPr>
-            <w:tcW w:w="1587" w:type="dxa"/>
-            <w:vAlign w:val="center"/>
-          </w:tcPr>
-          <w:p>
-            <w:pPr>
-              <w:pStyle w:val="a4"/>
-              <w:ind w:right="281"/>
-              <w:jc w:val="center"/>
-              <w:rPr>
-                <w:sz w:val="20"/>
-              </w:rPr>
-            </w:pPr>
-            <w:r>
-              <w:rPr>
-                <w:sz w:val="20"/>
-              </w:rPr>
-              <w:t>11</w:t>
-            </w:r>
-          </w:p>
-        </w:tc>
-        <w:tc>
-          <w:tcPr>
-            <w:tcW w:w="595" w:type="dxa"/>
+            <w:tcW w:w="765" w:type="dxa"/>
             <w:vAlign w:val="center"/>
           </w:tcPr>
           <w:p>
@@ -6745,7 +6072,7 @@
         </w:tc>
         <w:tc>
           <w:tcPr>
-            <w:tcW w:w="595" w:type="dxa"/>
+            <w:tcW w:w="765" w:type="dxa"/>
             <w:vAlign w:val="center"/>
           </w:tcPr>
           <w:p>
@@ -6767,7 +6094,7 @@
         </w:tc>
         <w:tc>
           <w:tcPr>
-            <w:tcW w:w="595" w:type="dxa"/>
+            <w:tcW w:w="765" w:type="dxa"/>
             <w:vAlign w:val="center"/>
           </w:tcPr>
           <w:p>
@@ -6789,7 +6116,7 @@
         </w:tc>
         <w:tc>
           <w:tcPr>
-            <w:tcW w:w="595" w:type="dxa"/>
+            <w:tcW w:w="765" w:type="dxa"/>
             <w:vAlign w:val="center"/>
           </w:tcPr>
           <w:p>
@@ -6823,7 +6150,7 @@
         </w:trPr>
         <w:tc>
           <w:tcPr>
-            <w:tcW w:w="1587" w:type="dxa"/>
+            <w:tcW w:w="1928" w:type="dxa"/>
             <w:vAlign w:val="center"/>
           </w:tcPr>
           <w:p>
@@ -6845,7 +6172,7 @@
         </w:tc>
         <w:tc>
           <w:tcPr>
-            <w:tcW w:w="595" w:type="dxa"/>
+            <w:tcW w:w="765" w:type="dxa"/>
             <w:vAlign w:val="center"/>
           </w:tcPr>
           <w:p>
@@ -6867,7 +6194,7 @@
         </w:tc>
         <w:tc>
           <w:tcPr>
-            <w:tcW w:w="595" w:type="dxa"/>
+            <w:tcW w:w="765" w:type="dxa"/>
             <w:vAlign w:val="center"/>
           </w:tcPr>
           <w:p>
@@ -6889,7 +6216,7 @@
         </w:tc>
         <w:tc>
           <w:tcPr>
-            <w:tcW w:w="595" w:type="dxa"/>
+            <w:tcW w:w="765" w:type="dxa"/>
             <w:vAlign w:val="center"/>
           </w:tcPr>
           <w:p>
@@ -6911,7 +6238,7 @@
         </w:tc>
         <w:tc>
           <w:tcPr>
-            <w:tcW w:w="595" w:type="dxa"/>
+            <w:tcW w:w="765" w:type="dxa"/>
             <w:vAlign w:val="center"/>
           </w:tcPr>
           <w:p>
@@ -6933,7 +6260,7 @@
         </w:tc>
         <w:tc>
           <w:tcPr>
-            <w:tcW w:w="1587" w:type="dxa"/>
+            <w:tcW w:w="765" w:type="dxa"/>
             <w:vAlign w:val="center"/>
           </w:tcPr>
           <w:p>
@@ -6955,7 +6282,7 @@
         </w:tc>
         <w:tc>
           <w:tcPr>
-            <w:tcW w:w="595" w:type="dxa"/>
+            <w:tcW w:w="765" w:type="dxa"/>
             <w:vAlign w:val="center"/>
           </w:tcPr>
           <w:p>
@@ -6977,7 +6304,7 @@
         </w:tc>
         <w:tc>
           <w:tcPr>
-            <w:tcW w:w="595" w:type="dxa"/>
+            <w:tcW w:w="765" w:type="dxa"/>
             <w:vAlign w:val="center"/>
           </w:tcPr>
           <w:p>
@@ -6999,29 +6326,7 @@
         </w:tc>
         <w:tc>
           <w:tcPr>
-            <w:tcW w:w="595" w:type="dxa"/>
-            <w:vAlign w:val="center"/>
-          </w:tcPr>
-          <w:p>
-            <w:pPr>
-              <w:pStyle w:val="a4"/>
-              <w:ind w:right="281"/>
-              <w:jc w:val="center"/>
-              <w:rPr>
-                <w:sz w:val="20"/>
-              </w:rPr>
-            </w:pPr>
-            <w:r>
-              <w:rPr>
-                <w:sz w:val="20"/>
-              </w:rPr>
-              <w:t>0</w:t>
-            </w:r>
-          </w:p>
-        </w:tc>
-        <w:tc>
-          <w:tcPr>
-            <w:tcW w:w="595" w:type="dxa"/>
+            <w:tcW w:w="765" w:type="dxa"/>
             <w:vAlign w:val="center"/>
           </w:tcPr>
           <w:p>
@@ -7055,7 +6360,7 @@
         </w:trPr>
         <w:tc>
           <w:tcPr>
-            <w:tcW w:w="1587" w:type="dxa"/>
+            <w:tcW w:w="1928" w:type="dxa"/>
             <w:vAlign w:val="center"/>
           </w:tcPr>
           <w:p>
@@ -7077,7 +6382,7 @@
         </w:tc>
         <w:tc>
           <w:tcPr>
-            <w:tcW w:w="595" w:type="dxa"/>
+            <w:tcW w:w="765" w:type="dxa"/>
             <w:vAlign w:val="center"/>
           </w:tcPr>
           <w:p>
@@ -7099,7 +6404,7 @@
         </w:tc>
         <w:tc>
           <w:tcPr>
-            <w:tcW w:w="595" w:type="dxa"/>
+            <w:tcW w:w="765" w:type="dxa"/>
             <w:vAlign w:val="center"/>
           </w:tcPr>
           <w:p>
@@ -7121,7 +6426,7 @@
         </w:tc>
         <w:tc>
           <w:tcPr>
-            <w:tcW w:w="595" w:type="dxa"/>
+            <w:tcW w:w="765" w:type="dxa"/>
             <w:vAlign w:val="center"/>
           </w:tcPr>
           <w:p>
@@ -7143,7 +6448,7 @@
         </w:tc>
         <w:tc>
           <w:tcPr>
-            <w:tcW w:w="595" w:type="dxa"/>
+            <w:tcW w:w="765" w:type="dxa"/>
             <w:vAlign w:val="center"/>
           </w:tcPr>
           <w:p>
@@ -7165,29 +6470,7 @@
         </w:tc>
         <w:tc>
           <w:tcPr>
-            <w:tcW w:w="1587" w:type="dxa"/>
-            <w:vAlign w:val="center"/>
-          </w:tcPr>
-          <w:p>
-            <w:pPr>
-              <w:pStyle w:val="a4"/>
-              <w:ind w:right="281"/>
-              <w:jc w:val="center"/>
-              <w:rPr>
-                <w:sz w:val="20"/>
-              </w:rPr>
-            </w:pPr>
-            <w:r>
-              <w:rPr>
-                <w:sz w:val="20"/>
-              </w:rPr>
-              <w:t>12</w:t>
-            </w:r>
-          </w:p>
-        </w:tc>
-        <w:tc>
-          <w:tcPr>
-            <w:tcW w:w="595" w:type="dxa"/>
+            <w:tcW w:w="765" w:type="dxa"/>
             <w:vAlign w:val="center"/>
           </w:tcPr>
           <w:p>
@@ -7209,7 +6492,7 @@
         </w:tc>
         <w:tc>
           <w:tcPr>
-            <w:tcW w:w="595" w:type="dxa"/>
+            <w:tcW w:w="765" w:type="dxa"/>
             <w:vAlign w:val="center"/>
           </w:tcPr>
           <w:p>
@@ -7231,7 +6514,7 @@
         </w:tc>
         <w:tc>
           <w:tcPr>
-            <w:tcW w:w="595" w:type="dxa"/>
+            <w:tcW w:w="765" w:type="dxa"/>
             <w:vAlign w:val="center"/>
           </w:tcPr>
           <w:p>
@@ -7253,7 +6536,7 @@
         </w:tc>
         <w:tc>
           <w:tcPr>
-            <w:tcW w:w="595" w:type="dxa"/>
+            <w:tcW w:w="765" w:type="dxa"/>
             <w:vAlign w:val="center"/>
           </w:tcPr>
           <w:p>
@@ -7287,7 +6570,7 @@
         </w:trPr>
         <w:tc>
           <w:tcPr>
-            <w:tcW w:w="1587" w:type="dxa"/>
+            <w:tcW w:w="1928" w:type="dxa"/>
             <w:vAlign w:val="center"/>
           </w:tcPr>
           <w:p>
@@ -7309,7 +6592,7 @@
         </w:tc>
         <w:tc>
           <w:tcPr>
-            <w:tcW w:w="595" w:type="dxa"/>
+            <w:tcW w:w="765" w:type="dxa"/>
             <w:vAlign w:val="center"/>
           </w:tcPr>
           <w:p>
@@ -7331,7 +6614,7 @@
         </w:tc>
         <w:tc>
           <w:tcPr>
-            <w:tcW w:w="595" w:type="dxa"/>
+            <w:tcW w:w="765" w:type="dxa"/>
             <w:vAlign w:val="center"/>
           </w:tcPr>
           <w:p>
@@ -7353,7 +6636,7 @@
         </w:tc>
         <w:tc>
           <w:tcPr>
-            <w:tcW w:w="595" w:type="dxa"/>
+            <w:tcW w:w="765" w:type="dxa"/>
             <w:vAlign w:val="center"/>
           </w:tcPr>
           <w:p>
@@ -7375,7 +6658,7 @@
         </w:tc>
         <w:tc>
           <w:tcPr>
-            <w:tcW w:w="595" w:type="dxa"/>
+            <w:tcW w:w="765" w:type="dxa"/>
             <w:vAlign w:val="center"/>
           </w:tcPr>
           <w:p>
@@ -7397,29 +6680,7 @@
         </w:tc>
         <w:tc>
           <w:tcPr>
-            <w:tcW w:w="1587" w:type="dxa"/>
-            <w:vAlign w:val="center"/>
-          </w:tcPr>
-          <w:p>
-            <w:pPr>
-              <w:pStyle w:val="a4"/>
-              <w:ind w:right="281"/>
-              <w:jc w:val="center"/>
-              <w:rPr>
-                <w:sz w:val="20"/>
-              </w:rPr>
-            </w:pPr>
-            <w:r>
-              <w:rPr>
-                <w:sz w:val="20"/>
-              </w:rPr>
-              <w:t>9</w:t>
-            </w:r>
-          </w:p>
-        </w:tc>
-        <w:tc>
-          <w:tcPr>
-            <w:tcW w:w="595" w:type="dxa"/>
+            <w:tcW w:w="765" w:type="dxa"/>
             <w:vAlign w:val="center"/>
           </w:tcPr>
           <w:p>
@@ -7441,7 +6702,7 @@
         </w:tc>
         <w:tc>
           <w:tcPr>
-            <w:tcW w:w="595" w:type="dxa"/>
+            <w:tcW w:w="765" w:type="dxa"/>
             <w:vAlign w:val="center"/>
           </w:tcPr>
           <w:p>
@@ -7463,7 +6724,7 @@
         </w:tc>
         <w:tc>
           <w:tcPr>
-            <w:tcW w:w="595" w:type="dxa"/>
+            <w:tcW w:w="765" w:type="dxa"/>
             <w:vAlign w:val="center"/>
           </w:tcPr>
           <w:p>
@@ -7485,7 +6746,7 @@
         </w:tc>
         <w:tc>
           <w:tcPr>
-            <w:tcW w:w="595" w:type="dxa"/>
+            <w:tcW w:w="765" w:type="dxa"/>
             <w:vAlign w:val="center"/>
           </w:tcPr>
           <w:p>
@@ -7519,7 +6780,7 @@
         </w:trPr>
         <w:tc>
           <w:tcPr>
-            <w:tcW w:w="1587" w:type="dxa"/>
+            <w:tcW w:w="1928" w:type="dxa"/>
             <w:vAlign w:val="center"/>
           </w:tcPr>
           <w:p>
@@ -7541,7 +6802,7 @@
         </w:tc>
         <w:tc>
           <w:tcPr>
-            <w:tcW w:w="595" w:type="dxa"/>
+            <w:tcW w:w="765" w:type="dxa"/>
             <w:vAlign w:val="center"/>
           </w:tcPr>
           <w:p>
@@ -7563,7 +6824,7 @@
         </w:tc>
         <w:tc>
           <w:tcPr>
-            <w:tcW w:w="595" w:type="dxa"/>
+            <w:tcW w:w="765" w:type="dxa"/>
             <w:vAlign w:val="center"/>
           </w:tcPr>
           <w:p>
@@ -7585,7 +6846,7 @@
         </w:tc>
         <w:tc>
           <w:tcPr>
-            <w:tcW w:w="595" w:type="dxa"/>
+            <w:tcW w:w="765" w:type="dxa"/>
             <w:vAlign w:val="center"/>
           </w:tcPr>
           <w:p>
@@ -7607,7 +6868,7 @@
         </w:tc>
         <w:tc>
           <w:tcPr>
-            <w:tcW w:w="595" w:type="dxa"/>
+            <w:tcW w:w="765" w:type="dxa"/>
             <w:vAlign w:val="center"/>
           </w:tcPr>
           <w:p>
@@ -7629,29 +6890,7 @@
         </w:tc>
         <w:tc>
           <w:tcPr>
-            <w:tcW w:w="1587" w:type="dxa"/>
-            <w:vAlign w:val="center"/>
-          </w:tcPr>
-          <w:p>
-            <w:pPr>
-              <w:pStyle w:val="a4"/>
-              <w:ind w:right="281"/>
-              <w:jc w:val="center"/>
-              <w:rPr>
-                <w:sz w:val="20"/>
-              </w:rPr>
-            </w:pPr>
-            <w:r>
-              <w:rPr>
-                <w:sz w:val="20"/>
-              </w:rPr>
-              <w:t>5</w:t>
-            </w:r>
-          </w:p>
-        </w:tc>
-        <w:tc>
-          <w:tcPr>
-            <w:tcW w:w="595" w:type="dxa"/>
+            <w:tcW w:w="765" w:type="dxa"/>
             <w:vAlign w:val="center"/>
           </w:tcPr>
           <w:p>
@@ -7673,7 +6912,7 @@
         </w:tc>
         <w:tc>
           <w:tcPr>
-            <w:tcW w:w="595" w:type="dxa"/>
+            <w:tcW w:w="765" w:type="dxa"/>
             <w:vAlign w:val="center"/>
           </w:tcPr>
           <w:p>
@@ -7695,7 +6934,7 @@
         </w:tc>
         <w:tc>
           <w:tcPr>
-            <w:tcW w:w="595" w:type="dxa"/>
+            <w:tcW w:w="765" w:type="dxa"/>
             <w:vAlign w:val="center"/>
           </w:tcPr>
           <w:p>
@@ -7717,7 +6956,7 @@
         </w:tc>
         <w:tc>
           <w:tcPr>
-            <w:tcW w:w="595" w:type="dxa"/>
+            <w:tcW w:w="765" w:type="dxa"/>
             <w:vAlign w:val="center"/>
           </w:tcPr>
           <w:p>
@@ -7751,7 +6990,7 @@
         </w:trPr>
         <w:tc>
           <w:tcPr>
-            <w:tcW w:w="1587" w:type="dxa"/>
+            <w:tcW w:w="1928" w:type="dxa"/>
             <w:vAlign w:val="center"/>
           </w:tcPr>
           <w:p>
@@ -7773,7 +7012,7 @@
         </w:tc>
         <w:tc>
           <w:tcPr>
-            <w:tcW w:w="595" w:type="dxa"/>
+            <w:tcW w:w="765" w:type="dxa"/>
             <w:vAlign w:val="center"/>
           </w:tcPr>
           <w:p>
@@ -7795,7 +7034,7 @@
         </w:tc>
         <w:tc>
           <w:tcPr>
-            <w:tcW w:w="595" w:type="dxa"/>
+            <w:tcW w:w="765" w:type="dxa"/>
             <w:vAlign w:val="center"/>
           </w:tcPr>
           <w:p>
@@ -7817,7 +7056,7 @@
         </w:tc>
         <w:tc>
           <w:tcPr>
-            <w:tcW w:w="595" w:type="dxa"/>
+            <w:tcW w:w="765" w:type="dxa"/>
             <w:vAlign w:val="center"/>
           </w:tcPr>
           <w:p>
@@ -7839,7 +7078,7 @@
         </w:tc>
         <w:tc>
           <w:tcPr>
-            <w:tcW w:w="595" w:type="dxa"/>
+            <w:tcW w:w="765" w:type="dxa"/>
             <w:vAlign w:val="center"/>
           </w:tcPr>
           <w:p>
@@ -7861,29 +7100,7 @@
         </w:tc>
         <w:tc>
           <w:tcPr>
-            <w:tcW w:w="1587" w:type="dxa"/>
-            <w:vAlign w:val="center"/>
-          </w:tcPr>
-          <w:p>
-            <w:pPr>
-              <w:pStyle w:val="a4"/>
-              <w:ind w:right="281"/>
-              <w:jc w:val="center"/>
-              <w:rPr>
-                <w:sz w:val="20"/>
-              </w:rPr>
-            </w:pPr>
-            <w:r>
-              <w:rPr>
-                <w:sz w:val="20"/>
-              </w:rPr>
-              <w:t>7</w:t>
-            </w:r>
-          </w:p>
-        </w:tc>
-        <w:tc>
-          <w:tcPr>
-            <w:tcW w:w="595" w:type="dxa"/>
+            <w:tcW w:w="765" w:type="dxa"/>
             <w:vAlign w:val="center"/>
           </w:tcPr>
           <w:p>
@@ -7905,7 +7122,7 @@
         </w:tc>
         <w:tc>
           <w:tcPr>
-            <w:tcW w:w="595" w:type="dxa"/>
+            <w:tcW w:w="765" w:type="dxa"/>
             <w:vAlign w:val="center"/>
           </w:tcPr>
           <w:p>
@@ -7927,7 +7144,7 @@
         </w:tc>
         <w:tc>
           <w:tcPr>
-            <w:tcW w:w="595" w:type="dxa"/>
+            <w:tcW w:w="765" w:type="dxa"/>
             <w:vAlign w:val="center"/>
           </w:tcPr>
           <w:p>
@@ -7949,7 +7166,7 @@
         </w:tc>
         <w:tc>
           <w:tcPr>
-            <w:tcW w:w="595" w:type="dxa"/>
+            <w:tcW w:w="765" w:type="dxa"/>
             <w:vAlign w:val="center"/>
           </w:tcPr>
           <w:p>
@@ -7983,7 +7200,7 @@
         </w:trPr>
         <w:tc>
           <w:tcPr>
-            <w:tcW w:w="1587" w:type="dxa"/>
+            <w:tcW w:w="1928" w:type="dxa"/>
             <w:vAlign w:val="center"/>
           </w:tcPr>
           <w:p>
@@ -8005,7 +7222,7 @@
         </w:tc>
         <w:tc>
           <w:tcPr>
-            <w:tcW w:w="595" w:type="dxa"/>
+            <w:tcW w:w="765" w:type="dxa"/>
             <w:vAlign w:val="center"/>
           </w:tcPr>
           <w:p>
@@ -8027,7 +7244,7 @@
         </w:tc>
         <w:tc>
           <w:tcPr>
-            <w:tcW w:w="595" w:type="dxa"/>
+            <w:tcW w:w="765" w:type="dxa"/>
             <w:vAlign w:val="center"/>
           </w:tcPr>
           <w:p>
@@ -8049,7 +7266,7 @@
         </w:tc>
         <w:tc>
           <w:tcPr>
-            <w:tcW w:w="595" w:type="dxa"/>
+            <w:tcW w:w="765" w:type="dxa"/>
             <w:vAlign w:val="center"/>
           </w:tcPr>
           <w:p>
@@ -8071,7 +7288,7 @@
         </w:tc>
         <w:tc>
           <w:tcPr>
-            <w:tcW w:w="595" w:type="dxa"/>
+            <w:tcW w:w="765" w:type="dxa"/>
             <w:vAlign w:val="center"/>
           </w:tcPr>
           <w:p>
@@ -8093,29 +7310,7 @@
         </w:tc>
         <w:tc>
           <w:tcPr>
-            <w:tcW w:w="1587" w:type="dxa"/>
-            <w:vAlign w:val="center"/>
-          </w:tcPr>
-          <w:p>
-            <w:pPr>
-              <w:pStyle w:val="a4"/>
-              <w:ind w:right="281"/>
-              <w:jc w:val="center"/>
-              <w:rPr>
-                <w:sz w:val="20"/>
-              </w:rPr>
-            </w:pPr>
-            <w:r>
-              <w:rPr>
-                <w:sz w:val="20"/>
-              </w:rPr>
-              <w:t>8</w:t>
-            </w:r>
-          </w:p>
-        </w:tc>
-        <w:tc>
-          <w:tcPr>
-            <w:tcW w:w="595" w:type="dxa"/>
+            <w:tcW w:w="765" w:type="dxa"/>
             <w:vAlign w:val="center"/>
           </w:tcPr>
           <w:p>
@@ -8137,7 +7332,7 @@
         </w:tc>
         <w:tc>
           <w:tcPr>
-            <w:tcW w:w="595" w:type="dxa"/>
+            <w:tcW w:w="765" w:type="dxa"/>
             <w:vAlign w:val="center"/>
           </w:tcPr>
           <w:p>
@@ -8159,7 +7354,7 @@
         </w:tc>
         <w:tc>
           <w:tcPr>
-            <w:tcW w:w="595" w:type="dxa"/>
+            <w:tcW w:w="765" w:type="dxa"/>
             <w:vAlign w:val="center"/>
           </w:tcPr>
           <w:p>
@@ -8181,7 +7376,7 @@
         </w:tc>
         <w:tc>
           <w:tcPr>
-            <w:tcW w:w="595" w:type="dxa"/>
+            <w:tcW w:w="765" w:type="dxa"/>
             <w:vAlign w:val="center"/>
           </w:tcPr>
           <w:p>
@@ -8215,7 +7410,7 @@
         </w:trPr>
         <w:tc>
           <w:tcPr>
-            <w:tcW w:w="1587" w:type="dxa"/>
+            <w:tcW w:w="1928" w:type="dxa"/>
             <w:vAlign w:val="center"/>
           </w:tcPr>
           <w:p>
@@ -8237,7 +7432,7 @@
         </w:tc>
         <w:tc>
           <w:tcPr>
-            <w:tcW w:w="595" w:type="dxa"/>
+            <w:tcW w:w="765" w:type="dxa"/>
             <w:vAlign w:val="center"/>
           </w:tcPr>
           <w:p>
@@ -8259,7 +7454,7 @@
         </w:tc>
         <w:tc>
           <w:tcPr>
-            <w:tcW w:w="595" w:type="dxa"/>
+            <w:tcW w:w="765" w:type="dxa"/>
             <w:vAlign w:val="center"/>
           </w:tcPr>
           <w:p>
@@ -8281,7 +7476,7 @@
         </w:tc>
         <w:tc>
           <w:tcPr>
-            <w:tcW w:w="595" w:type="dxa"/>
+            <w:tcW w:w="765" w:type="dxa"/>
             <w:vAlign w:val="center"/>
           </w:tcPr>
           <w:p>
@@ -8303,7 +7498,7 @@
         </w:tc>
         <w:tc>
           <w:tcPr>
-            <w:tcW w:w="595" w:type="dxa"/>
+            <w:tcW w:w="765" w:type="dxa"/>
             <w:vAlign w:val="center"/>
           </w:tcPr>
           <w:p>
@@ -8325,29 +7520,7 @@
         </w:tc>
         <w:tc>
           <w:tcPr>
-            <w:tcW w:w="1587" w:type="dxa"/>
-            <w:vAlign w:val="center"/>
-          </w:tcPr>
-          <w:p>
-            <w:pPr>
-              <w:pStyle w:val="a4"/>
-              <w:ind w:right="281"/>
-              <w:jc w:val="center"/>
-              <w:rPr>
-                <w:sz w:val="20"/>
-              </w:rPr>
-            </w:pPr>
-            <w:r>
-              <w:rPr>
-                <w:sz w:val="20"/>
-              </w:rPr>
-              <w:t>4</w:t>
-            </w:r>
-          </w:p>
-        </w:tc>
-        <w:tc>
-          <w:tcPr>
-            <w:tcW w:w="595" w:type="dxa"/>
+            <w:tcW w:w="765" w:type="dxa"/>
             <w:vAlign w:val="center"/>
           </w:tcPr>
           <w:p>
@@ -8369,7 +7542,7 @@
         </w:tc>
         <w:tc>
           <w:tcPr>
-            <w:tcW w:w="595" w:type="dxa"/>
+            <w:tcW w:w="765" w:type="dxa"/>
             <w:vAlign w:val="center"/>
           </w:tcPr>
           <w:p>
@@ -8391,7 +7564,7 @@
         </w:tc>
         <w:tc>
           <w:tcPr>
-            <w:tcW w:w="595" w:type="dxa"/>
+            <w:tcW w:w="765" w:type="dxa"/>
             <w:vAlign w:val="center"/>
           </w:tcPr>
           <w:p>
@@ -8413,7 +7586,7 @@
         </w:tc>
         <w:tc>
           <w:tcPr>
-            <w:tcW w:w="595" w:type="dxa"/>
+            <w:tcW w:w="765" w:type="dxa"/>
             <w:vAlign w:val="center"/>
           </w:tcPr>
           <w:p>
@@ -8447,7 +7620,7 @@
         </w:trPr>
         <w:tc>
           <w:tcPr>
-            <w:tcW w:w="1587" w:type="dxa"/>
+            <w:tcW w:w="1928" w:type="dxa"/>
             <w:vAlign w:val="center"/>
           </w:tcPr>
           <w:p>
@@ -8469,7 +7642,7 @@
         </w:tc>
         <w:tc>
           <w:tcPr>
-            <w:tcW w:w="595" w:type="dxa"/>
+            <w:tcW w:w="765" w:type="dxa"/>
             <w:vAlign w:val="center"/>
           </w:tcPr>
           <w:p>
@@ -8491,7 +7664,7 @@
         </w:tc>
         <w:tc>
           <w:tcPr>
-            <w:tcW w:w="595" w:type="dxa"/>
+            <w:tcW w:w="765" w:type="dxa"/>
             <w:vAlign w:val="center"/>
           </w:tcPr>
           <w:p>
@@ -8513,7 +7686,7 @@
         </w:tc>
         <w:tc>
           <w:tcPr>
-            <w:tcW w:w="595" w:type="dxa"/>
+            <w:tcW w:w="765" w:type="dxa"/>
             <w:vAlign w:val="center"/>
           </w:tcPr>
           <w:p>
@@ -8535,7 +7708,7 @@
         </w:tc>
         <w:tc>
           <w:tcPr>
-            <w:tcW w:w="595" w:type="dxa"/>
+            <w:tcW w:w="765" w:type="dxa"/>
             <w:vAlign w:val="center"/>
           </w:tcPr>
           <w:p>
@@ -8557,29 +7730,7 @@
         </w:tc>
         <w:tc>
           <w:tcPr>
-            <w:tcW w:w="1587" w:type="dxa"/>
-            <w:vAlign w:val="center"/>
-          </w:tcPr>
-          <w:p>
-            <w:pPr>
-              <w:pStyle w:val="a4"/>
-              <w:ind w:right="281"/>
-              <w:jc w:val="center"/>
-              <w:rPr>
-                <w:sz w:val="20"/>
-              </w:rPr>
-            </w:pPr>
-            <w:r>
-              <w:rPr>
-                <w:sz w:val="20"/>
-              </w:rPr>
-              <w:t>3</w:t>
-            </w:r>
-          </w:p>
-        </w:tc>
-        <w:tc>
-          <w:tcPr>
-            <w:tcW w:w="595" w:type="dxa"/>
+            <w:tcW w:w="765" w:type="dxa"/>
             <w:vAlign w:val="center"/>
           </w:tcPr>
           <w:p>
@@ -8601,7 +7752,7 @@
         </w:tc>
         <w:tc>
           <w:tcPr>
-            <w:tcW w:w="595" w:type="dxa"/>
+            <w:tcW w:w="765" w:type="dxa"/>
             <w:vAlign w:val="center"/>
           </w:tcPr>
           <w:p>
@@ -8623,7 +7774,7 @@
         </w:tc>
         <w:tc>
           <w:tcPr>
-            <w:tcW w:w="595" w:type="dxa"/>
+            <w:tcW w:w="765" w:type="dxa"/>
             <w:vAlign w:val="center"/>
           </w:tcPr>
           <w:p>
@@ -8645,7 +7796,7 @@
         </w:tc>
         <w:tc>
           <w:tcPr>
-            <w:tcW w:w="595" w:type="dxa"/>
+            <w:tcW w:w="765" w:type="dxa"/>
             <w:vAlign w:val="center"/>
           </w:tcPr>
           <w:p>
@@ -8679,7 +7830,7 @@
         </w:trPr>
         <w:tc>
           <w:tcPr>
-            <w:tcW w:w="1587" w:type="dxa"/>
+            <w:tcW w:w="1928" w:type="dxa"/>
             <w:vAlign w:val="center"/>
           </w:tcPr>
           <w:p>
@@ -8701,7 +7852,7 @@
         </w:tc>
         <w:tc>
           <w:tcPr>
-            <w:tcW w:w="595" w:type="dxa"/>
+            <w:tcW w:w="765" w:type="dxa"/>
             <w:vAlign w:val="center"/>
           </w:tcPr>
           <w:p>
@@ -8723,7 +7874,7 @@
         </w:tc>
         <w:tc>
           <w:tcPr>
-            <w:tcW w:w="595" w:type="dxa"/>
+            <w:tcW w:w="765" w:type="dxa"/>
             <w:vAlign w:val="center"/>
           </w:tcPr>
           <w:p>
@@ -8745,7 +7896,7 @@
         </w:tc>
         <w:tc>
           <w:tcPr>
-            <w:tcW w:w="595" w:type="dxa"/>
+            <w:tcW w:w="765" w:type="dxa"/>
             <w:vAlign w:val="center"/>
           </w:tcPr>
           <w:p>
@@ -8767,7 +7918,7 @@
         </w:tc>
         <w:tc>
           <w:tcPr>
-            <w:tcW w:w="595" w:type="dxa"/>
+            <w:tcW w:w="765" w:type="dxa"/>
             <w:vAlign w:val="center"/>
           </w:tcPr>
           <w:p>
@@ -8789,29 +7940,7 @@
         </w:tc>
         <w:tc>
           <w:tcPr>
-            <w:tcW w:w="1587" w:type="dxa"/>
-            <w:vAlign w:val="center"/>
-          </w:tcPr>
-          <w:p>
-            <w:pPr>
-              <w:pStyle w:val="a4"/>
-              <w:ind w:right="281"/>
-              <w:jc w:val="center"/>
-              <w:rPr>
-                <w:sz w:val="20"/>
-              </w:rPr>
-            </w:pPr>
-            <w:r>
-              <w:rPr>
-                <w:sz w:val="20"/>
-              </w:rPr>
-              <w:t>10</w:t>
-            </w:r>
-          </w:p>
-        </w:tc>
-        <w:tc>
-          <w:tcPr>
-            <w:tcW w:w="595" w:type="dxa"/>
+            <w:tcW w:w="765" w:type="dxa"/>
             <w:vAlign w:val="center"/>
           </w:tcPr>
           <w:p>
@@ -8833,7 +7962,7 @@
         </w:tc>
         <w:tc>
           <w:tcPr>
-            <w:tcW w:w="595" w:type="dxa"/>
+            <w:tcW w:w="765" w:type="dxa"/>
             <w:vAlign w:val="center"/>
           </w:tcPr>
           <w:p>
@@ -8855,7 +7984,7 @@
         </w:tc>
         <w:tc>
           <w:tcPr>
-            <w:tcW w:w="595" w:type="dxa"/>
+            <w:tcW w:w="765" w:type="dxa"/>
             <w:vAlign w:val="center"/>
           </w:tcPr>
           <w:p>
@@ -8877,7 +8006,7 @@
         </w:tc>
         <w:tc>
           <w:tcPr>
-            <w:tcW w:w="595" w:type="dxa"/>
+            <w:tcW w:w="765" w:type="dxa"/>
             <w:vAlign w:val="center"/>
           </w:tcPr>
           <w:p>
@@ -8911,7 +8040,7 @@
         </w:trPr>
         <w:tc>
           <w:tcPr>
-            <w:tcW w:w="1587" w:type="dxa"/>
+            <w:tcW w:w="1928" w:type="dxa"/>
             <w:vAlign w:val="center"/>
           </w:tcPr>
           <w:p>
@@ -8933,7 +8062,7 @@
         </w:tc>
         <w:tc>
           <w:tcPr>
-            <w:tcW w:w="595" w:type="dxa"/>
+            <w:tcW w:w="765" w:type="dxa"/>
             <w:vAlign w:val="center"/>
           </w:tcPr>
           <w:p>
@@ -8955,7 +8084,7 @@
         </w:tc>
         <w:tc>
           <w:tcPr>
-            <w:tcW w:w="595" w:type="dxa"/>
+            <w:tcW w:w="765" w:type="dxa"/>
             <w:vAlign w:val="center"/>
           </w:tcPr>
           <w:p>
@@ -8977,7 +8106,7 @@
         </w:tc>
         <w:tc>
           <w:tcPr>
-            <w:tcW w:w="595" w:type="dxa"/>
+            <w:tcW w:w="765" w:type="dxa"/>
             <w:vAlign w:val="center"/>
           </w:tcPr>
           <w:p>
@@ -8999,7 +8128,7 @@
         </w:tc>
         <w:tc>
           <w:tcPr>
-            <w:tcW w:w="595" w:type="dxa"/>
+            <w:tcW w:w="765" w:type="dxa"/>
             <w:vAlign w:val="center"/>
           </w:tcPr>
           <w:p>
@@ -9021,29 +8150,7 @@
         </w:tc>
         <w:tc>
           <w:tcPr>
-            <w:tcW w:w="1587" w:type="dxa"/>
-            <w:vAlign w:val="center"/>
-          </w:tcPr>
-          <w:p>
-            <w:pPr>
-              <w:pStyle w:val="a4"/>
-              <w:ind w:right="281"/>
-              <w:jc w:val="center"/>
-              <w:rPr>
-                <w:sz w:val="20"/>
-              </w:rPr>
-            </w:pPr>
-            <w:r>
-              <w:rPr>
-                <w:sz w:val="20"/>
-              </w:rPr>
-              <w:t>6</w:t>
-            </w:r>
-          </w:p>
-        </w:tc>
-        <w:tc>
-          <w:tcPr>
-            <w:tcW w:w="595" w:type="dxa"/>
+            <w:tcW w:w="765" w:type="dxa"/>
             <w:vAlign w:val="center"/>
           </w:tcPr>
           <w:p>
@@ -9065,7 +8172,7 @@
         </w:tc>
         <w:tc>
           <w:tcPr>
-            <w:tcW w:w="595" w:type="dxa"/>
+            <w:tcW w:w="765" w:type="dxa"/>
             <w:vAlign w:val="center"/>
           </w:tcPr>
           <w:p>
@@ -9087,7 +8194,7 @@
         </w:tc>
         <w:tc>
           <w:tcPr>
-            <w:tcW w:w="595" w:type="dxa"/>
+            <w:tcW w:w="765" w:type="dxa"/>
             <w:vAlign w:val="center"/>
           </w:tcPr>
           <w:p>
@@ -9109,7 +8216,7 @@
         </w:tc>
         <w:tc>
           <w:tcPr>
-            <w:tcW w:w="595" w:type="dxa"/>
+            <w:tcW w:w="765" w:type="dxa"/>
             <w:vAlign w:val="center"/>
           </w:tcPr>
           <w:p>
@@ -9143,9 +8250,9 @@
         </w:trPr>
         <w:tc>
           <w:tcPr>
-            <w:tcW w:w="1587" w:type="dxa"/>
+            <w:tcW w:w="1928" w:type="dxa"/>
             <w:tcBorders>
-              <w:bottom w:val="single" w:sz="4" w:space="0" w:color="auto"/>
+              <w:bottom w:val="single" w:sz="4" w:space="0" w:color="000000"/>
             </w:tcBorders>
             <w:vAlign w:val="center"/>
           </w:tcPr>
@@ -9168,9 +8275,9 @@
         </w:tc>
         <w:tc>
           <w:tcPr>
-            <w:tcW w:w="595" w:type="dxa"/>
+            <w:tcW w:w="765" w:type="dxa"/>
             <w:tcBorders>
-              <w:bottom w:val="single" w:sz="4" w:space="0" w:color="auto"/>
+              <w:bottom w:val="single" w:sz="4" w:space="0" w:color="000000"/>
             </w:tcBorders>
             <w:vAlign w:val="center"/>
           </w:tcPr>
@@ -9193,9 +8300,9 @@
         </w:tc>
         <w:tc>
           <w:tcPr>
-            <w:tcW w:w="595" w:type="dxa"/>
+            <w:tcW w:w="765" w:type="dxa"/>
             <w:tcBorders>
-              <w:bottom w:val="single" w:sz="4" w:space="0" w:color="auto"/>
+              <w:bottom w:val="single" w:sz="4" w:space="0" w:color="000000"/>
             </w:tcBorders>
             <w:vAlign w:val="center"/>
           </w:tcPr>
@@ -9218,9 +8325,9 @@
         </w:tc>
         <w:tc>
           <w:tcPr>
-            <w:tcW w:w="595" w:type="dxa"/>
+            <w:tcW w:w="765" w:type="dxa"/>
             <w:tcBorders>
-              <w:bottom w:val="single" w:sz="4" w:space="0" w:color="auto"/>
+              <w:bottom w:val="single" w:sz="4" w:space="0" w:color="000000"/>
             </w:tcBorders>
             <w:vAlign w:val="center"/>
           </w:tcPr>
@@ -9243,9 +8350,9 @@
         </w:tc>
         <w:tc>
           <w:tcPr>
-            <w:tcW w:w="595" w:type="dxa"/>
+            <w:tcW w:w="765" w:type="dxa"/>
             <w:tcBorders>
-              <w:bottom w:val="single" w:sz="4" w:space="0" w:color="auto"/>
+              <w:bottom w:val="single" w:sz="4" w:space="0" w:color="000000"/>
             </w:tcBorders>
             <w:vAlign w:val="center"/>
           </w:tcPr>
@@ -9268,9 +8375,9 @@
         </w:tc>
         <w:tc>
           <w:tcPr>
-            <w:tcW w:w="1587" w:type="dxa"/>
+            <w:tcW w:w="765" w:type="dxa"/>
             <w:tcBorders>
-              <w:bottom w:val="single" w:sz="4" w:space="0" w:color="auto"/>
+              <w:bottom w:val="single" w:sz="4" w:space="0" w:color="000000"/>
             </w:tcBorders>
             <w:vAlign w:val="center"/>
           </w:tcPr>
@@ -9287,15 +8394,15 @@
               <w:rPr>
                 <w:sz w:val="20"/>
               </w:rPr>
-              <w:t>13</w:t>
-            </w:r>
-          </w:p>
-        </w:tc>
-        <w:tc>
-          <w:tcPr>
-            <w:tcW w:w="595" w:type="dxa"/>
+              <w:t>1</w:t>
+            </w:r>
+          </w:p>
+        </w:tc>
+        <w:tc>
+          <w:tcPr>
+            <w:tcW w:w="765" w:type="dxa"/>
             <w:tcBorders>
-              <w:bottom w:val="single" w:sz="4" w:space="0" w:color="auto"/>
+              <w:bottom w:val="single" w:sz="4" w:space="0" w:color="000000"/>
             </w:tcBorders>
             <w:vAlign w:val="center"/>
           </w:tcPr>
@@ -9318,9 +8425,9 @@
         </w:tc>
         <w:tc>
           <w:tcPr>
-            <w:tcW w:w="595" w:type="dxa"/>
+            <w:tcW w:w="765" w:type="dxa"/>
             <w:tcBorders>
-              <w:bottom w:val="single" w:sz="4" w:space="0" w:color="auto"/>
+              <w:bottom w:val="single" w:sz="4" w:space="0" w:color="000000"/>
             </w:tcBorders>
             <w:vAlign w:val="center"/>
           </w:tcPr>
@@ -9337,40 +8444,15 @@
               <w:rPr>
                 <w:sz w:val="20"/>
               </w:rPr>
-              <w:t>1</w:t>
-            </w:r>
-          </w:p>
-        </w:tc>
-        <w:tc>
-          <w:tcPr>
-            <w:tcW w:w="595" w:type="dxa"/>
+              <w:t>0</w:t>
+            </w:r>
+          </w:p>
+        </w:tc>
+        <w:tc>
+          <w:tcPr>
+            <w:tcW w:w="765" w:type="dxa"/>
             <w:tcBorders>
-              <w:bottom w:val="single" w:sz="4" w:space="0" w:color="auto"/>
-            </w:tcBorders>
-            <w:vAlign w:val="center"/>
-          </w:tcPr>
-          <w:p>
-            <w:pPr>
-              <w:pStyle w:val="a4"/>
-              <w:ind w:right="281"/>
-              <w:jc w:val="center"/>
-              <w:rPr>
-                <w:sz w:val="20"/>
-              </w:rPr>
-            </w:pPr>
-            <w:r>
-              <w:rPr>
-                <w:sz w:val="20"/>
-              </w:rPr>
-              <w:t>0</w:t>
-            </w:r>
-          </w:p>
-        </w:tc>
-        <w:tc>
-          <w:tcPr>
-            <w:tcW w:w="595" w:type="dxa"/>
-            <w:tcBorders>
-              <w:bottom w:val="single" w:sz="4" w:space="0" w:color="auto"/>
+              <w:bottom w:val="single" w:sz="4" w:space="0" w:color="000000"/>
             </w:tcBorders>
             <w:vAlign w:val="center"/>
           </w:tcPr>
@@ -9405,9 +8487,9 @@
         </w:trPr>
         <w:tc>
           <w:tcPr>
-            <w:tcW w:w="1587" w:type="dxa"/>
+            <w:tcW w:w="1928" w:type="dxa"/>
             <w:tcBorders>
-              <w:bottom w:val="single" w:sz="4" w:space="0" w:color="auto"/>
+              <w:bottom w:val="single" w:sz="4" w:space="0" w:color="000000"/>
             </w:tcBorders>
             <w:shd w:val="clear" w:color="auto" w:fill="E7E7E7"/>
             <w:vAlign w:val="center"/>
@@ -9431,9 +8513,9 @@
         </w:tc>
         <w:tc>
           <w:tcPr>
-            <w:tcW w:w="595" w:type="dxa"/>
+            <w:tcW w:w="765" w:type="dxa"/>
             <w:tcBorders>
-              <w:bottom w:val="single" w:sz="4" w:space="0" w:color="auto"/>
+              <w:bottom w:val="single" w:sz="4" w:space="0" w:color="000000"/>
             </w:tcBorders>
             <w:shd w:val="clear" w:color="auto" w:fill="E7E7E7"/>
             <w:vAlign w:val="center"/>
@@ -9457,9 +8539,9 @@
         </w:tc>
         <w:tc>
           <w:tcPr>
-            <w:tcW w:w="595" w:type="dxa"/>
+            <w:tcW w:w="765" w:type="dxa"/>
             <w:tcBorders>
-              <w:bottom w:val="single" w:sz="4" w:space="0" w:color="auto"/>
+              <w:bottom w:val="single" w:sz="4" w:space="0" w:color="000000"/>
             </w:tcBorders>
             <w:shd w:val="clear" w:color="auto" w:fill="E7E7E7"/>
             <w:vAlign w:val="center"/>
@@ -9483,9 +8565,9 @@
         </w:tc>
         <w:tc>
           <w:tcPr>
-            <w:tcW w:w="595" w:type="dxa"/>
+            <w:tcW w:w="765" w:type="dxa"/>
             <w:tcBorders>
-              <w:bottom w:val="single" w:sz="4" w:space="0" w:color="auto"/>
+              <w:bottom w:val="single" w:sz="4" w:space="0" w:color="000000"/>
             </w:tcBorders>
             <w:shd w:val="clear" w:color="auto" w:fill="E7E7E7"/>
             <w:vAlign w:val="center"/>
@@ -9509,9 +8591,9 @@
         </w:tc>
         <w:tc>
           <w:tcPr>
-            <w:tcW w:w="595" w:type="dxa"/>
+            <w:tcW w:w="765" w:type="dxa"/>
             <w:tcBorders>
-              <w:bottom w:val="single" w:sz="4" w:space="0" w:color="auto"/>
+              <w:bottom w:val="single" w:sz="4" w:space="0" w:color="000000"/>
             </w:tcBorders>
             <w:shd w:val="clear" w:color="auto" w:fill="E7E7E7"/>
             <w:vAlign w:val="center"/>
@@ -9535,9 +8617,9 @@
         </w:tc>
         <w:tc>
           <w:tcPr>
-            <w:tcW w:w="1587" w:type="dxa"/>
+            <w:tcW w:w="765" w:type="dxa"/>
             <w:tcBorders>
-              <w:bottom w:val="single" w:sz="4" w:space="0" w:color="auto"/>
+              <w:bottom w:val="single" w:sz="4" w:space="0" w:color="000000"/>
             </w:tcBorders>
             <w:shd w:val="clear" w:color="auto" w:fill="E7E7E7"/>
             <w:vAlign w:val="center"/>
@@ -9555,15 +8637,15 @@
               <w:rPr>
                 <w:sz w:val="20"/>
               </w:rPr>
-              <w:t>13</w:t>
-            </w:r>
-          </w:p>
-        </w:tc>
-        <w:tc>
-          <w:tcPr>
-            <w:tcW w:w="595" w:type="dxa"/>
+              <w:t>1</w:t>
+            </w:r>
+          </w:p>
+        </w:tc>
+        <w:tc>
+          <w:tcPr>
+            <w:tcW w:w="765" w:type="dxa"/>
             <w:tcBorders>
-              <w:bottom w:val="single" w:sz="4" w:space="0" w:color="auto"/>
+              <w:bottom w:val="single" w:sz="4" w:space="0" w:color="000000"/>
             </w:tcBorders>
             <w:shd w:val="clear" w:color="auto" w:fill="E7E7E7"/>
             <w:vAlign w:val="center"/>
@@ -9587,9 +8669,9 @@
         </w:tc>
         <w:tc>
           <w:tcPr>
-            <w:tcW w:w="595" w:type="dxa"/>
+            <w:tcW w:w="765" w:type="dxa"/>
             <w:tcBorders>
-              <w:bottom w:val="single" w:sz="4" w:space="0" w:color="auto"/>
+              <w:bottom w:val="single" w:sz="4" w:space="0" w:color="000000"/>
             </w:tcBorders>
             <w:shd w:val="clear" w:color="auto" w:fill="E7E7E7"/>
             <w:vAlign w:val="center"/>
@@ -9607,41 +8689,15 @@
               <w:rPr>
                 <w:sz w:val="20"/>
               </w:rPr>
-              <w:t>1</w:t>
-            </w:r>
-          </w:p>
-        </w:tc>
-        <w:tc>
-          <w:tcPr>
-            <w:tcW w:w="595" w:type="dxa"/>
+              <w:t>0</w:t>
+            </w:r>
+          </w:p>
+        </w:tc>
+        <w:tc>
+          <w:tcPr>
+            <w:tcW w:w="765" w:type="dxa"/>
             <w:tcBorders>
-              <w:bottom w:val="single" w:sz="4" w:space="0" w:color="auto"/>
-            </w:tcBorders>
-            <w:shd w:val="clear" w:color="auto" w:fill="E7E7E7"/>
-            <w:vAlign w:val="center"/>
-          </w:tcPr>
-          <w:p>
-            <w:pPr>
-              <w:pStyle w:val="a4"/>
-              <w:ind w:right="281"/>
-              <w:jc w:val="center"/>
-              <w:rPr>
-                <w:sz w:val="20"/>
-              </w:rPr>
-            </w:pPr>
-            <w:r>
-              <w:rPr>
-                <w:sz w:val="20"/>
-              </w:rPr>
-              <w:t>0</w:t>
-            </w:r>
-          </w:p>
-        </w:tc>
-        <w:tc>
-          <w:tcPr>
-            <w:tcW w:w="595" w:type="dxa"/>
-            <w:tcBorders>
-              <w:bottom w:val="single" w:sz="4" w:space="0" w:color="auto"/>
+              <w:bottom w:val="single" w:sz="4" w:space="0" w:color="000000"/>
             </w:tcBorders>
             <w:shd w:val="clear" w:color="auto" w:fill="E7E7E7"/>
             <w:vAlign w:val="center"/>
@@ -9677,7 +8733,7 @@
         </w:trPr>
         <w:tc>
           <w:tcPr>
-            <w:tcW w:w="1587" w:type="dxa"/>
+            <w:tcW w:w="1928" w:type="dxa"/>
             <w:shd w:val="clear" w:color="auto" w:fill="E7E7E7"/>
             <w:vAlign w:val="center"/>
           </w:tcPr>
@@ -9700,7 +8756,7 @@
         </w:tc>
         <w:tc>
           <w:tcPr>
-            <w:tcW w:w="595" w:type="dxa"/>
+            <w:tcW w:w="765" w:type="dxa"/>
             <w:shd w:val="clear" w:color="auto" w:fill="E7E7E7"/>
             <w:vAlign w:val="center"/>
           </w:tcPr>
@@ -9723,7 +8779,7 @@
         </w:tc>
         <w:tc>
           <w:tcPr>
-            <w:tcW w:w="595" w:type="dxa"/>
+            <w:tcW w:w="765" w:type="dxa"/>
             <w:shd w:val="clear" w:color="auto" w:fill="E7E7E7"/>
             <w:vAlign w:val="center"/>
           </w:tcPr>
@@ -9746,7 +8802,7 @@
         </w:tc>
         <w:tc>
           <w:tcPr>
-            <w:tcW w:w="595" w:type="dxa"/>
+            <w:tcW w:w="765" w:type="dxa"/>
             <w:shd w:val="clear" w:color="auto" w:fill="E7E7E7"/>
             <w:vAlign w:val="center"/>
           </w:tcPr>
@@ -9769,7 +8825,7 @@
         </w:tc>
         <w:tc>
           <w:tcPr>
-            <w:tcW w:w="595" w:type="dxa"/>
+            <w:tcW w:w="765" w:type="dxa"/>
             <w:shd w:val="clear" w:color="auto" w:fill="E7E7E7"/>
             <w:vAlign w:val="center"/>
           </w:tcPr>
@@ -9792,7 +8848,7 @@
         </w:tc>
         <w:tc>
           <w:tcPr>
-            <w:tcW w:w="1587" w:type="dxa"/>
+            <w:tcW w:w="765" w:type="dxa"/>
             <w:shd w:val="clear" w:color="auto" w:fill="E7E7E7"/>
             <w:vAlign w:val="center"/>
           </w:tcPr>
@@ -9809,13 +8865,13 @@
               <w:rPr>
                 <w:sz w:val="20"/>
               </w:rPr>
-              <w:t>13</w:t>
-            </w:r>
-          </w:p>
-        </w:tc>
-        <w:tc>
-          <w:tcPr>
-            <w:tcW w:w="595" w:type="dxa"/>
+              <w:t>1</w:t>
+            </w:r>
+          </w:p>
+        </w:tc>
+        <w:tc>
+          <w:tcPr>
+            <w:tcW w:w="765" w:type="dxa"/>
             <w:shd w:val="clear" w:color="auto" w:fill="E7E7E7"/>
             <w:vAlign w:val="center"/>
           </w:tcPr>
@@ -9838,7 +8894,7 @@
         </w:tc>
         <w:tc>
           <w:tcPr>
-            <w:tcW w:w="595" w:type="dxa"/>
+            <w:tcW w:w="765" w:type="dxa"/>
             <w:shd w:val="clear" w:color="auto" w:fill="E7E7E7"/>
             <w:vAlign w:val="center"/>
           </w:tcPr>
@@ -9855,36 +8911,13 @@
               <w:rPr>
                 <w:sz w:val="20"/>
               </w:rPr>
-              <w:t>1</w:t>
-            </w:r>
-          </w:p>
-        </w:tc>
-        <w:tc>
-          <w:tcPr>
-            <w:tcW w:w="595" w:type="dxa"/>
-            <w:shd w:val="clear" w:color="auto" w:fill="E7E7E7"/>
-            <w:vAlign w:val="center"/>
-          </w:tcPr>
-          <w:p>
-            <w:pPr>
-              <w:pStyle w:val="a4"/>
-              <w:ind w:right="281"/>
-              <w:jc w:val="center"/>
-              <w:rPr>
-                <w:sz w:val="20"/>
-              </w:rPr>
-            </w:pPr>
-            <w:r>
-              <w:rPr>
-                <w:sz w:val="20"/>
-              </w:rPr>
               <w:t>0</w:t>
             </w:r>
           </w:p>
         </w:tc>
         <w:tc>
           <w:tcPr>
-            <w:tcW w:w="595" w:type="dxa"/>
+            <w:tcW w:w="765" w:type="dxa"/>
             <w:shd w:val="clear" w:color="auto" w:fill="E7E7E7"/>
             <w:vAlign w:val="center"/>
           </w:tcPr>
@@ -9910,11 +8943,13 @@
     <w:p>
       <w:pPr>
         <w:pStyle w:val="a4"/>
+        <w:spacing w:line="360" w:lineRule="auto"/>
       </w:pPr>
     </w:p>
     <w:p>
       <w:pPr>
         <w:pStyle w:val="a4"/>
+        <w:spacing w:line="360" w:lineRule="auto"/>
         <w:jc w:val="center"/>
       </w:pPr>
       <w:r>

</xml_diff>

<commit_message>
report: add D-input Karnaugh maps
</commit_message>
<xml_diff>
--- a/deliverables/Курсовая_Блинов_текущая.docx
+++ b/deliverables/Курсовая_Блинов_текущая.docx
@@ -145,6 +145,7 @@
           <w:sz w:val="24"/>
         </w:rPr>
       </w:pPr>
+      <w:proofErr w:type="gramStart"/>
       <w:r>
         <w:rPr>
           <w:b/>
@@ -167,6 +168,7 @@
         </w:rPr>
         <w:t>Н</w:t>
       </w:r>
+      <w:proofErr w:type="gramEnd"/>
       <w:r>
         <w:rPr>
           <w:b/>
@@ -198,6 +200,7 @@
         </w:rPr>
         <w:t>У</w:t>
       </w:r>
+      <w:proofErr w:type="gramStart"/>
       <w:r>
         <w:rPr>
           <w:b/>
@@ -221,6 +224,7 @@
         </w:rPr>
         <w:t>Б</w:t>
       </w:r>
+      <w:proofErr w:type="gramEnd"/>
       <w:r>
         <w:rPr>
           <w:b/>
@@ -274,6 +278,7 @@
         </w:rPr>
         <w:t xml:space="preserve"> </w:t>
       </w:r>
+      <w:proofErr w:type="gramStart"/>
       <w:r>
         <w:rPr>
           <w:b/>
@@ -296,6 +301,7 @@
         </w:rPr>
         <w:t>»</w:t>
       </w:r>
+      <w:proofErr w:type="gramEnd"/>
       <w:r>
         <w:rPr>
           <w:b/>
@@ -388,6 +394,7 @@
         <w:ind w:right="285"/>
         <w:jc w:val="center"/>
       </w:pPr>
+      <w:proofErr w:type="gramStart"/>
       <w:r>
         <w:rPr>
           <w:b/>
@@ -414,6 +421,7 @@
         </w:rPr>
         <w:t>информационных</w:t>
       </w:r>
+      <w:proofErr w:type="gramEnd"/>
       <w:r>
         <w:rPr>
           <w:spacing w:val="-5"/>
@@ -483,7 +491,23 @@
         <w:jc w:val="center"/>
       </w:pPr>
       <w:r>
-        <w:t>СИНТЕЗ ПЕРЕСЧЕТНОГО УСТРОЙСТВА 13-2-14-11-0-12-9-5-7-8-4-3-10-6 НА ТРИГГЕРАХ 74AS74</w:t>
+        <w:t>СИНТЕЗ ПЕРЕСЧЕТНОГО УСТРОЙСТВА 13-2-14-</w:t>
+      </w:r>
+      <w:proofErr w:type="gramStart"/>
+      <w:r>
+        <w:t>11-0</w:t>
+      </w:r>
+      <w:proofErr w:type="gramEnd"/>
+      <w:r>
+        <w:t>-12-9-5-</w:t>
+      </w:r>
+      <w:proofErr w:type="gramStart"/>
+      <w:r>
+        <w:t>7-8</w:t>
+      </w:r>
+      <w:proofErr w:type="gramEnd"/>
+      <w:r>
+        <w:t>-4-3-10-6 НА ТРИГГЕРАХ 74AS74</w:t>
       </w:r>
     </w:p>
     <w:p>
@@ -1298,7 +1322,23 @@
         <w:jc w:val="center"/>
       </w:pPr>
       <w:r>
-        <w:t>на тему «Синтез пересчетного устройства 13-2-14-11-0-12-9-5-7-8-4-3-10-6 на триггерах 74AS74»</w:t>
+        <w:t>на тему «Синтез пересчетного устройства 13-2-14-</w:t>
+      </w:r>
+      <w:proofErr w:type="gramStart"/>
+      <w:r>
+        <w:t>11-0</w:t>
+      </w:r>
+      <w:proofErr w:type="gramEnd"/>
+      <w:r>
+        <w:t>-12-9-5-</w:t>
+      </w:r>
+      <w:proofErr w:type="gramStart"/>
+      <w:r>
+        <w:t>7-8</w:t>
+      </w:r>
+      <w:proofErr w:type="gramEnd"/>
+      <w:r>
+        <w:t>-4-3-10-6 на триггерах 74AS74»</w:t>
       </w:r>
     </w:p>
     <w:p>
@@ -1545,12 +1585,21 @@
         </w:rPr>
         <w:t xml:space="preserve"> </w:t>
       </w:r>
+      <w:proofErr w:type="spellStart"/>
       <w:r>
         <w:rPr>
           <w:spacing w:val="-2"/>
           <w:sz w:val="28"/>
         </w:rPr>
-        <w:t>Multisim.</w:t>
+        <w:t>Multisim</w:t>
+      </w:r>
+      <w:proofErr w:type="spellEnd"/>
+      <w:r>
+        <w:rPr>
+          <w:spacing w:val="-2"/>
+          <w:sz w:val="28"/>
+        </w:rPr>
+        <w:t>.</w:t>
       </w:r>
     </w:p>
     <w:p>
@@ -1723,12 +1772,21 @@
         </w:rPr>
         <w:t xml:space="preserve"> </w:t>
       </w:r>
+      <w:proofErr w:type="spellStart"/>
       <w:r>
         <w:rPr>
           <w:spacing w:val="-2"/>
           <w:sz w:val="28"/>
         </w:rPr>
-        <w:t>Multisim.</w:t>
+        <w:t>Multisim</w:t>
+      </w:r>
+      <w:proofErr w:type="spellEnd"/>
+      <w:r>
+        <w:rPr>
+          <w:spacing w:val="-2"/>
+          <w:sz w:val="28"/>
+        </w:rPr>
+        <w:t>.</w:t>
       </w:r>
     </w:p>
     <w:p>
@@ -1868,8 +1926,17 @@
                 <w:rFonts w:ascii="Times New Roman" w:hAnsi="Times New Roman"/>
                 <w:sz w:val="28"/>
               </w:rPr>
-              <w:t>Блинов К.И.</w:t>
-            </w:r>
+              <w:t xml:space="preserve">Блинов </w:t>
+            </w:r>
+            <w:proofErr w:type="gramStart"/>
+            <w:r>
+              <w:rPr>
+                <w:rFonts w:ascii="Times New Roman" w:hAnsi="Times New Roman"/>
+                <w:sz w:val="28"/>
+              </w:rPr>
+              <w:t>К.И.</w:t>
+            </w:r>
+            <w:proofErr w:type="gramEnd"/>
           </w:p>
         </w:tc>
       </w:tr>
@@ -2008,7 +2075,6 @@
           <w:docPartUnique/>
         </w:docPartObj>
       </w:sdtPr>
-      <w:sdtEndPr/>
       <w:sdtContent>
         <w:p>
           <w:pPr>
@@ -2650,7 +2716,14 @@
             <w:rPr>
               <w:sz w:val="28"/>
             </w:rPr>
-            <w:t>выполнить синтез дешифратора (DC) выходных состояний, формирующего управляющие сигналы Y</w:t>
+            <w:t xml:space="preserve">выполнить синтез дешифратора (DC) выходных состояний, формирующего управляющие сигналы </w:t>
+          </w:r>
+          <w:proofErr w:type="spellStart"/>
+          <w:r>
+            <w:rPr>
+              <w:sz w:val="28"/>
+            </w:rPr>
+            <w:t>Y</w:t>
           </w:r>
           <w:r>
             <w:rPr>
@@ -2659,6 +2732,7 @@
             </w:rPr>
             <w:t>i</w:t>
           </w:r>
+          <w:proofErr w:type="spellEnd"/>
           <w:r>
             <w:rPr>
               <w:sz w:val="28"/>
@@ -3251,7 +3325,43 @@
                 <w:spacing w:val="-2"/>
                 <w:sz w:val="24"/>
               </w:rPr>
-              <w:t>13-2-14-11-0-12-9-5-7-8-4-3-10-6</w:t>
+              <w:t>13-2-14-</w:t>
+            </w:r>
+            <w:proofErr w:type="gramStart"/>
+            <w:r>
+              <w:rPr>
+                <w:rFonts w:ascii="Times New Roman" w:hAnsi="Times New Roman"/>
+                <w:spacing w:val="-2"/>
+                <w:sz w:val="24"/>
+              </w:rPr>
+              <w:t>11-0</w:t>
+            </w:r>
+            <w:proofErr w:type="gramEnd"/>
+            <w:r>
+              <w:rPr>
+                <w:rFonts w:ascii="Times New Roman" w:hAnsi="Times New Roman"/>
+                <w:spacing w:val="-2"/>
+                <w:sz w:val="24"/>
+              </w:rPr>
+              <w:t>-12-9-5-</w:t>
+            </w:r>
+            <w:proofErr w:type="gramStart"/>
+            <w:r>
+              <w:rPr>
+                <w:rFonts w:ascii="Times New Roman" w:hAnsi="Times New Roman"/>
+                <w:spacing w:val="-2"/>
+                <w:sz w:val="24"/>
+              </w:rPr>
+              <w:t>7-8</w:t>
+            </w:r>
+            <w:proofErr w:type="gramEnd"/>
+            <w:r>
+              <w:rPr>
+                <w:rFonts w:ascii="Times New Roman" w:hAnsi="Times New Roman"/>
+                <w:spacing w:val="-2"/>
+                <w:sz w:val="24"/>
+              </w:rPr>
+              <w:t>-4-3-10-6</w:t>
             </w:r>
           </w:p>
         </w:tc>
@@ -4180,7 +4290,23 @@
                 <w:rFonts w:ascii="Times New Roman" w:hAnsi="Times New Roman"/>
                 <w:sz w:val="24"/>
               </w:rPr>
-              <w:t>цифровая (шестнадцатеричный код) светодиодная (probes)</w:t>
+              <w:t>цифровая (шестнадцатеричный код) светодиодная (</w:t>
+            </w:r>
+            <w:proofErr w:type="spellStart"/>
+            <w:r>
+              <w:rPr>
+                <w:rFonts w:ascii="Times New Roman" w:hAnsi="Times New Roman"/>
+                <w:sz w:val="24"/>
+              </w:rPr>
+              <w:t>probes</w:t>
+            </w:r>
+            <w:proofErr w:type="spellEnd"/>
+            <w:r>
+              <w:rPr>
+                <w:rFonts w:ascii="Times New Roman" w:hAnsi="Times New Roman"/>
+                <w:sz w:val="24"/>
+              </w:rPr>
+              <w:t>)</w:t>
             </w:r>
           </w:p>
         </w:tc>
@@ -4374,7 +4500,35 @@
         <w:rPr>
           <w:sz w:val="28"/>
         </w:rPr>
-        <w:t>Последовательность смены состояний - 13-2-14-11-0-12-9-5-7-8-4-3-10-6</w:t>
+        <w:t>Последовательность смены состояний - 13-2-14-</w:t>
+      </w:r>
+      <w:proofErr w:type="gramStart"/>
+      <w:r>
+        <w:rPr>
+          <w:sz w:val="28"/>
+        </w:rPr>
+        <w:t>11-0</w:t>
+      </w:r>
+      <w:proofErr w:type="gramEnd"/>
+      <w:r>
+        <w:rPr>
+          <w:sz w:val="28"/>
+        </w:rPr>
+        <w:t>-12-9-5-</w:t>
+      </w:r>
+      <w:proofErr w:type="gramStart"/>
+      <w:r>
+        <w:rPr>
+          <w:sz w:val="28"/>
+        </w:rPr>
+        <w:t>7-8</w:t>
+      </w:r>
+      <w:proofErr w:type="gramEnd"/>
+      <w:r>
+        <w:rPr>
+          <w:sz w:val="28"/>
+        </w:rPr>
+        <w:t>-4-3-10-6</w:t>
       </w:r>
     </w:p>
     <w:p>
@@ -4539,6 +4693,7 @@
     <w:p>
       <w:pPr>
         <w:pStyle w:val="a4"/>
+        <w:jc w:val="center"/>
         <w:rPr>
           <w:spacing w:val="-5"/>
         </w:rPr>
@@ -4609,31 +4764,33 @@
         <w:pStyle w:val="a4"/>
         <w:pageBreakBefore/>
         <w:spacing w:line="360" w:lineRule="auto"/>
-        <w:ind w:firstLine="709"/>
+        <w:ind w:right="283" w:firstLine="709"/>
         <w:jc w:val="both"/>
       </w:pPr>
       <w:r>
         <w:lastRenderedPageBreak/>
-        <w:t>Количество триггеров, необходимых для работы устройства, определяется разрядностью кодов состояний. Для модуля счета M = 14 необходимое число триггеров вычисляется по формуле N = log₂M. Подставив в формулу (1.1) значение M и округлив результат вверх, рассчитаем N:</w:t>
+        <w:t xml:space="preserve">Количество триггеров, необходимых для работы устройства, определяется разрядностью кодов состояний. Для модуля счета M = 14 необходимое число триггеров вычисляется по формуле N = </w:t>
+      </w:r>
+      <w:proofErr w:type="spellStart"/>
+      <w:r>
+        <w:t>log₂M</w:t>
+      </w:r>
+      <w:proofErr w:type="spellEnd"/>
+      <w:r>
+        <w:t>. Подставив в формулу (1.1) значение M и округлив результат вверх, рассчитаем N:</w:t>
       </w:r>
     </w:p>
     <w:tbl>
       <w:tblPr>
-        <w:tblW w:w="8788" w:type="dxa"/>
+        <w:tblW w:w="10173" w:type="dxa"/>
         <w:tblLayout w:type="fixed"/>
         <w:tblLook w:val="0000" w:firstRow="0" w:lastRow="0" w:firstColumn="0" w:lastColumn="0" w:noHBand="0" w:noVBand="0"/>
       </w:tblPr>
       <w:tblGrid>
         <w:gridCol w:w="7654"/>
-        <w:gridCol w:w="1134"/>
+        <w:gridCol w:w="2519"/>
       </w:tblGrid>
       <w:tr>
-        <w:tblPrEx>
-          <w:tblCellMar>
-            <w:top w:w="0" w:type="dxa"/>
-            <w:bottom w:w="0" w:type="dxa"/>
-          </w:tblCellMar>
-        </w:tblPrEx>
         <w:tc>
           <w:tcPr>
             <w:tcW w:w="7654" w:type="dxa"/>
@@ -4643,7 +4800,7 @@
             <w:pPr>
               <w:pStyle w:val="a4"/>
               <w:spacing w:before="160" w:after="240"/>
-              <w:ind w:right="281"/>
+              <w:ind w:left="2552" w:right="283"/>
               <w:jc w:val="center"/>
               <w:rPr>
                 <w:rFonts w:ascii="Cambria Math" w:hAnsi="Cambria Math"/>
@@ -4659,14 +4816,14 @@
         </w:tc>
         <w:tc>
           <w:tcPr>
-            <w:tcW w:w="1134" w:type="dxa"/>
+            <w:tcW w:w="2519" w:type="dxa"/>
             <w:vAlign w:val="center"/>
           </w:tcPr>
           <w:p>
             <w:pPr>
               <w:pStyle w:val="a4"/>
               <w:spacing w:before="160" w:after="240"/>
-              <w:ind w:right="281"/>
+              <w:ind w:right="35"/>
               <w:jc w:val="right"/>
             </w:pPr>
             <w:r>
@@ -4686,7 +4843,7 @@
       <w:pPr>
         <w:pStyle w:val="a4"/>
         <w:spacing w:line="360" w:lineRule="auto"/>
-        <w:ind w:firstLine="709"/>
+        <w:ind w:right="283" w:firstLine="709"/>
         <w:jc w:val="both"/>
       </w:pPr>
       <w:r>
@@ -4697,11 +4854,19 @@
       <w:pPr>
         <w:pStyle w:val="a4"/>
         <w:spacing w:after="120" w:line="360" w:lineRule="auto"/>
-        <w:ind w:firstLine="709"/>
+        <w:ind w:right="283" w:firstLine="709"/>
         <w:jc w:val="both"/>
       </w:pPr>
       <w:r>
-        <w:t>Микросхема 74AS74 (SN74AS74A) представляет собой два D-триггера с переключением по положительному фронту тактового сигнала. Каждый триггер имеет отдельные входы D и CLK, асинхронные входы установки PRE и сброса CLR, прямой выход Q и инверсный выход Q̅. Распиновка микросхемы 74AS74 представлена на рисунке 1.2.</w:t>
+        <w:t xml:space="preserve">Микросхема 74AS74 (SN74AS74A) представляет собой два D-триггера с переключением по положительному фронту тактового сигнала. Каждый триггер имеет отдельные входы D и CLK, асинхронные входы установки PRE и сброса CLR, прямой выход Q и инверсный выход Q̅. </w:t>
+      </w:r>
+      <w:proofErr w:type="spellStart"/>
+      <w:r>
+        <w:t>Распиновка</w:t>
+      </w:r>
+      <w:proofErr w:type="spellEnd"/>
+      <w:r>
+        <w:t xml:space="preserve"> микросхемы 74AS74 представлена на рисунке 1.2.</w:t>
       </w:r>
     </w:p>
     <w:p>
@@ -4764,32 +4929,48 @@
         <w:jc w:val="center"/>
       </w:pPr>
       <w:r>
-        <w:t>Рисунок 1.2 – Распиновка микросхемы 74AS74</w:t>
+        <w:t xml:space="preserve">Рисунок 1.2 – </w:t>
+      </w:r>
+      <w:proofErr w:type="spellStart"/>
+      <w:r>
+        <w:t>Распиновка</w:t>
+      </w:r>
+      <w:proofErr w:type="spellEnd"/>
+      <w:r>
+        <w:t xml:space="preserve"> микросхемы 74AS74</w:t>
       </w:r>
     </w:p>
     <w:p>
       <w:pPr>
         <w:pStyle w:val="a4"/>
         <w:spacing w:after="160" w:line="360" w:lineRule="auto"/>
-        <w:ind w:firstLine="709"/>
-        <w:jc w:val="both"/>
-      </w:pPr>
-      <w:r>
-        <w:t>Для D-триггера сигнал на входе D определяет состояние прямого выхода после активного фронта тактового импульса: D(t) = Q(t+1). В таблице 1.1 представлены переходы D-триггера 74AS74.</w:t>
-      </w:r>
+        <w:jc w:val="center"/>
+      </w:pPr>
     </w:p>
     <w:p>
       <w:pPr>
         <w:pStyle w:val="a4"/>
-        <w:keepNext/>
-        <w:pageBreakBefore/>
-        <w:spacing w:line="360" w:lineRule="auto"/>
-        <w:jc w:val="center"/>
-      </w:pPr>
-      <w:r>
-        <w:lastRenderedPageBreak/>
-        <w:t>Таблица 1.1 – Таблица переходов D-триггера 74AS74</w:t>
-      </w:r>
+        <w:spacing w:after="160" w:line="360" w:lineRule="auto"/>
+        <w:ind w:right="283" w:firstLine="709"/>
+        <w:jc w:val="both"/>
+        <w:rPr>
+          <w:lang w:val="en-US"/>
+        </w:rPr>
+      </w:pPr>
+      <w:r>
+        <w:t>Для D-триггера сигнал на входе D определяет состояние прямого выхода после активного фронта тактового импульса: D(t) = Q(t+1). В таблице 1.1 представлены переходы D-триггера 74AS74.</w:t>
+      </w:r>
+    </w:p>
+    <w:p>
+      <w:pPr>
+        <w:pStyle w:val="a4"/>
+        <w:spacing w:after="160" w:line="360" w:lineRule="auto"/>
+        <w:ind w:right="283" w:firstLine="709"/>
+        <w:jc w:val="both"/>
+        <w:rPr>
+          <w:lang w:val="en-US"/>
+        </w:rPr>
+      </w:pPr>
     </w:p>
     <w:tbl>
       <w:tblPr>
@@ -4807,29 +4988,23 @@
         <w:tblLook w:val="0000" w:firstRow="0" w:lastRow="0" w:firstColumn="0" w:lastColumn="0" w:noHBand="0" w:noVBand="0"/>
       </w:tblPr>
       <w:tblGrid>
-        <w:gridCol w:w="1361"/>
-        <w:gridCol w:w="1361"/>
-        <w:gridCol w:w="1361"/>
+        <w:gridCol w:w="850"/>
+        <w:gridCol w:w="993"/>
+        <w:gridCol w:w="807"/>
       </w:tblGrid>
       <w:tr>
-        <w:tblPrEx>
-          <w:tblCellMar>
-            <w:top w:w="0" w:type="dxa"/>
-            <w:bottom w:w="0" w:type="dxa"/>
-          </w:tblCellMar>
-        </w:tblPrEx>
         <w:trPr>
           <w:jc w:val="center"/>
         </w:trPr>
         <w:tc>
           <w:tcPr>
-            <w:tcW w:w="1361" w:type="dxa"/>
-            <w:vAlign w:val="center"/>
-          </w:tcPr>
-          <w:p>
-            <w:pPr>
-              <w:pStyle w:val="a4"/>
-              <w:ind w:right="281"/>
+            <w:tcW w:w="850" w:type="dxa"/>
+            <w:shd w:val="clear" w:color="auto" w:fill="F2F2F2" w:themeFill="background1" w:themeFillShade="F2"/>
+            <w:vAlign w:val="center"/>
+          </w:tcPr>
+          <w:p>
+            <w:pPr>
+              <w:pStyle w:val="a4"/>
               <w:jc w:val="center"/>
               <w:rPr>
                 <w:sz w:val="22"/>
@@ -4839,19 +5014,20 @@
               <w:rPr>
                 <w:sz w:val="22"/>
               </w:rPr>
+              <w:lastRenderedPageBreak/>
               <w:t>Q(t)</w:t>
             </w:r>
           </w:p>
         </w:tc>
         <w:tc>
           <w:tcPr>
-            <w:tcW w:w="1361" w:type="dxa"/>
-            <w:vAlign w:val="center"/>
-          </w:tcPr>
-          <w:p>
-            <w:pPr>
-              <w:pStyle w:val="a4"/>
-              <w:ind w:right="281"/>
+            <w:tcW w:w="993" w:type="dxa"/>
+            <w:shd w:val="clear" w:color="auto" w:fill="F2F2F2" w:themeFill="background1" w:themeFillShade="F2"/>
+            <w:vAlign w:val="center"/>
+          </w:tcPr>
+          <w:p>
+            <w:pPr>
+              <w:pStyle w:val="a4"/>
               <w:jc w:val="center"/>
               <w:rPr>
                 <w:sz w:val="22"/>
@@ -4867,13 +5043,13 @@
         </w:tc>
         <w:tc>
           <w:tcPr>
-            <w:tcW w:w="1361" w:type="dxa"/>
-            <w:vAlign w:val="center"/>
-          </w:tcPr>
-          <w:p>
-            <w:pPr>
-              <w:pStyle w:val="a4"/>
-              <w:ind w:right="281"/>
+            <w:tcW w:w="807" w:type="dxa"/>
+            <w:shd w:val="clear" w:color="auto" w:fill="F2F2F2" w:themeFill="background1" w:themeFillShade="F2"/>
+            <w:vAlign w:val="center"/>
+          </w:tcPr>
+          <w:p>
+            <w:pPr>
+              <w:pStyle w:val="a4"/>
               <w:jc w:val="center"/>
               <w:rPr>
                 <w:sz w:val="22"/>
@@ -4889,24 +5065,17 @@
         </w:tc>
       </w:tr>
       <w:tr>
-        <w:tblPrEx>
-          <w:tblCellMar>
-            <w:top w:w="0" w:type="dxa"/>
-            <w:bottom w:w="0" w:type="dxa"/>
-          </w:tblCellMar>
-        </w:tblPrEx>
         <w:trPr>
           <w:jc w:val="center"/>
         </w:trPr>
         <w:tc>
           <w:tcPr>
-            <w:tcW w:w="1361" w:type="dxa"/>
-            <w:vAlign w:val="center"/>
-          </w:tcPr>
-          <w:p>
-            <w:pPr>
-              <w:pStyle w:val="a4"/>
-              <w:ind w:right="281"/>
+            <w:tcW w:w="850" w:type="dxa"/>
+            <w:vAlign w:val="center"/>
+          </w:tcPr>
+          <w:p>
+            <w:pPr>
+              <w:pStyle w:val="a4"/>
               <w:jc w:val="center"/>
               <w:rPr>
                 <w:sz w:val="22"/>
@@ -4922,13 +5091,12 @@
         </w:tc>
         <w:tc>
           <w:tcPr>
-            <w:tcW w:w="1361" w:type="dxa"/>
-            <w:vAlign w:val="center"/>
-          </w:tcPr>
-          <w:p>
-            <w:pPr>
-              <w:pStyle w:val="a4"/>
-              <w:ind w:right="281"/>
+            <w:tcW w:w="993" w:type="dxa"/>
+            <w:vAlign w:val="center"/>
+          </w:tcPr>
+          <w:p>
+            <w:pPr>
+              <w:pStyle w:val="a4"/>
               <w:jc w:val="center"/>
               <w:rPr>
                 <w:sz w:val="22"/>
@@ -4944,13 +5112,12 @@
         </w:tc>
         <w:tc>
           <w:tcPr>
-            <w:tcW w:w="1361" w:type="dxa"/>
-            <w:vAlign w:val="center"/>
-          </w:tcPr>
-          <w:p>
-            <w:pPr>
-              <w:pStyle w:val="a4"/>
-              <w:ind w:right="281"/>
+            <w:tcW w:w="807" w:type="dxa"/>
+            <w:vAlign w:val="center"/>
+          </w:tcPr>
+          <w:p>
+            <w:pPr>
+              <w:pStyle w:val="a4"/>
               <w:jc w:val="center"/>
               <w:rPr>
                 <w:sz w:val="22"/>
@@ -4966,24 +5133,17 @@
         </w:tc>
       </w:tr>
       <w:tr>
-        <w:tblPrEx>
-          <w:tblCellMar>
-            <w:top w:w="0" w:type="dxa"/>
-            <w:bottom w:w="0" w:type="dxa"/>
-          </w:tblCellMar>
-        </w:tblPrEx>
         <w:trPr>
           <w:jc w:val="center"/>
         </w:trPr>
         <w:tc>
           <w:tcPr>
-            <w:tcW w:w="1361" w:type="dxa"/>
-            <w:vAlign w:val="center"/>
-          </w:tcPr>
-          <w:p>
-            <w:pPr>
-              <w:pStyle w:val="a4"/>
-              <w:ind w:right="281"/>
+            <w:tcW w:w="850" w:type="dxa"/>
+            <w:vAlign w:val="center"/>
+          </w:tcPr>
+          <w:p>
+            <w:pPr>
+              <w:pStyle w:val="a4"/>
               <w:jc w:val="center"/>
               <w:rPr>
                 <w:sz w:val="22"/>
@@ -4999,13 +5159,12 @@
         </w:tc>
         <w:tc>
           <w:tcPr>
-            <w:tcW w:w="1361" w:type="dxa"/>
-            <w:vAlign w:val="center"/>
-          </w:tcPr>
-          <w:p>
-            <w:pPr>
-              <w:pStyle w:val="a4"/>
-              <w:ind w:right="281"/>
+            <w:tcW w:w="993" w:type="dxa"/>
+            <w:vAlign w:val="center"/>
+          </w:tcPr>
+          <w:p>
+            <w:pPr>
+              <w:pStyle w:val="a4"/>
               <w:jc w:val="center"/>
               <w:rPr>
                 <w:sz w:val="22"/>
@@ -5021,13 +5180,12 @@
         </w:tc>
         <w:tc>
           <w:tcPr>
-            <w:tcW w:w="1361" w:type="dxa"/>
-            <w:vAlign w:val="center"/>
-          </w:tcPr>
-          <w:p>
-            <w:pPr>
-              <w:pStyle w:val="a4"/>
-              <w:ind w:right="281"/>
+            <w:tcW w:w="807" w:type="dxa"/>
+            <w:vAlign w:val="center"/>
+          </w:tcPr>
+          <w:p>
+            <w:pPr>
+              <w:pStyle w:val="a4"/>
               <w:jc w:val="center"/>
               <w:rPr>
                 <w:sz w:val="22"/>
@@ -5043,24 +5201,17 @@
         </w:tc>
       </w:tr>
       <w:tr>
-        <w:tblPrEx>
-          <w:tblCellMar>
-            <w:top w:w="0" w:type="dxa"/>
-            <w:bottom w:w="0" w:type="dxa"/>
-          </w:tblCellMar>
-        </w:tblPrEx>
         <w:trPr>
           <w:jc w:val="center"/>
         </w:trPr>
         <w:tc>
           <w:tcPr>
-            <w:tcW w:w="1361" w:type="dxa"/>
-            <w:vAlign w:val="center"/>
-          </w:tcPr>
-          <w:p>
-            <w:pPr>
-              <w:pStyle w:val="a4"/>
-              <w:ind w:right="281"/>
+            <w:tcW w:w="850" w:type="dxa"/>
+            <w:vAlign w:val="center"/>
+          </w:tcPr>
+          <w:p>
+            <w:pPr>
+              <w:pStyle w:val="a4"/>
               <w:jc w:val="center"/>
               <w:rPr>
                 <w:sz w:val="22"/>
@@ -5076,13 +5227,12 @@
         </w:tc>
         <w:tc>
           <w:tcPr>
-            <w:tcW w:w="1361" w:type="dxa"/>
-            <w:vAlign w:val="center"/>
-          </w:tcPr>
-          <w:p>
-            <w:pPr>
-              <w:pStyle w:val="a4"/>
-              <w:ind w:right="281"/>
+            <w:tcW w:w="993" w:type="dxa"/>
+            <w:vAlign w:val="center"/>
+          </w:tcPr>
+          <w:p>
+            <w:pPr>
+              <w:pStyle w:val="a4"/>
               <w:jc w:val="center"/>
               <w:rPr>
                 <w:sz w:val="22"/>
@@ -5098,13 +5248,12 @@
         </w:tc>
         <w:tc>
           <w:tcPr>
-            <w:tcW w:w="1361" w:type="dxa"/>
-            <w:vAlign w:val="center"/>
-          </w:tcPr>
-          <w:p>
-            <w:pPr>
-              <w:pStyle w:val="a4"/>
-              <w:ind w:right="281"/>
+            <w:tcW w:w="807" w:type="dxa"/>
+            <w:vAlign w:val="center"/>
+          </w:tcPr>
+          <w:p>
+            <w:pPr>
+              <w:pStyle w:val="a4"/>
               <w:jc w:val="center"/>
               <w:rPr>
                 <w:sz w:val="22"/>
@@ -5120,24 +5269,17 @@
         </w:tc>
       </w:tr>
       <w:tr>
-        <w:tblPrEx>
-          <w:tblCellMar>
-            <w:top w:w="0" w:type="dxa"/>
-            <w:bottom w:w="0" w:type="dxa"/>
-          </w:tblCellMar>
-        </w:tblPrEx>
         <w:trPr>
           <w:jc w:val="center"/>
         </w:trPr>
         <w:tc>
           <w:tcPr>
-            <w:tcW w:w="1361" w:type="dxa"/>
-            <w:vAlign w:val="center"/>
-          </w:tcPr>
-          <w:p>
-            <w:pPr>
-              <w:pStyle w:val="a4"/>
-              <w:ind w:right="281"/>
+            <w:tcW w:w="850" w:type="dxa"/>
+            <w:vAlign w:val="center"/>
+          </w:tcPr>
+          <w:p>
+            <w:pPr>
+              <w:pStyle w:val="a4"/>
               <w:jc w:val="center"/>
               <w:rPr>
                 <w:sz w:val="22"/>
@@ -5153,13 +5295,12 @@
         </w:tc>
         <w:tc>
           <w:tcPr>
-            <w:tcW w:w="1361" w:type="dxa"/>
-            <w:vAlign w:val="center"/>
-          </w:tcPr>
-          <w:p>
-            <w:pPr>
-              <w:pStyle w:val="a4"/>
-              <w:ind w:right="281"/>
+            <w:tcW w:w="993" w:type="dxa"/>
+            <w:vAlign w:val="center"/>
+          </w:tcPr>
+          <w:p>
+            <w:pPr>
+              <w:pStyle w:val="a4"/>
               <w:jc w:val="center"/>
               <w:rPr>
                 <w:sz w:val="22"/>
@@ -5175,13 +5316,12 @@
         </w:tc>
         <w:tc>
           <w:tcPr>
-            <w:tcW w:w="1361" w:type="dxa"/>
-            <w:vAlign w:val="center"/>
-          </w:tcPr>
-          <w:p>
-            <w:pPr>
-              <w:pStyle w:val="a4"/>
-              <w:ind w:right="281"/>
+            <w:tcW w:w="807" w:type="dxa"/>
+            <w:vAlign w:val="center"/>
+          </w:tcPr>
+          <w:p>
+            <w:pPr>
+              <w:pStyle w:val="a4"/>
               <w:jc w:val="center"/>
               <w:rPr>
                 <w:sz w:val="22"/>
@@ -5201,29 +5341,60 @@
       <w:pPr>
         <w:pStyle w:val="a4"/>
         <w:spacing w:line="360" w:lineRule="auto"/>
-      </w:pPr>
+        <w:jc w:val="center"/>
+      </w:pPr>
+      <w:r>
+        <w:t>Таблица 1.1 – Таблица переходов D-триггера 74AS74</w:t>
+      </w:r>
     </w:p>
     <w:p>
       <w:pPr>
         <w:pStyle w:val="a4"/>
         <w:spacing w:line="360" w:lineRule="auto"/>
-        <w:ind w:firstLine="709"/>
-        <w:jc w:val="both"/>
-      </w:pPr>
-      <w:r>
-        <w:t>После построения таблицы переходов D-триггера составим таблицу выходных состояний ПСУ Q3…Q0 и входов триггеров D3…D0. Значения D3…D0 совпадают с двоичным кодом следующего состояния. Для неиспользуемых кодов 1 (0001) и 15 (1111) назначен безопасный переход в состояние 13 (1101).</w:t>
-      </w:r>
+        <w:jc w:val="center"/>
+      </w:pPr>
     </w:p>
     <w:p>
       <w:pPr>
         <w:pStyle w:val="a4"/>
+        <w:spacing w:line="360" w:lineRule="auto" w:before="0" w:after="0"/>
+        <w:ind w:right="0" w:firstLine="709" w:left="0"/>
+        <w:jc w:val="both"/>
+      </w:pPr>
+      <w:r>
+        <w:rPr>
+          <w:rFonts w:ascii="Times New Roman" w:hAnsi="Times New Roman" w:eastAsia="Times New Roman" w:cs="Times New Roman"/>
+          <w:b w:val="0"/>
+          <w:i w:val="0"/>
+          <w:sz w:val="28"/>
+        </w:rPr>
+        <w:t>После построения таблицы переходов D-триггера составим таблицу выходных состояний ПСУ Q3…Q0 и входов триггеров D3…D0. Значения D3…D0 совпадают с двоичным кодом следующего состояния. Неиспользуемые коды 1 (0001) и 15 (1111) не входят в рабочий цикл и при минимизации обозначаются символом X.</w:t>
+      </w:r>
+    </w:p>
+    <w:p>
+      <w:pPr>
+        <w:pStyle w:val="a4"/>
         <w:spacing w:after="160" w:line="360" w:lineRule="auto"/>
-        <w:ind w:firstLine="709"/>
+        <w:ind w:right="283" w:firstLine="709"/>
         <w:jc w:val="both"/>
+        <w:rPr>
+          <w:lang w:val="en-US"/>
+        </w:rPr>
       </w:pPr>
       <w:r>
         <w:t>Таблица выходных состояний ПСУ и входов триггеров представлена на рисунке 2.1.</w:t>
       </w:r>
+    </w:p>
+    <w:p>
+      <w:pPr>
+        <w:pStyle w:val="a4"/>
+        <w:spacing w:after="160" w:line="360" w:lineRule="auto"/>
+        <w:ind w:right="283" w:firstLine="709"/>
+        <w:jc w:val="both"/>
+        <w:rPr>
+          <w:lang w:val="en-US"/>
+        </w:rPr>
+      </w:pPr>
     </w:p>
     <w:tbl>
       <w:tblPr>
@@ -5252,12 +5423,6 @@
         <w:gridCol w:w="765"/>
       </w:tblGrid>
       <w:tr>
-        <w:tblPrEx>
-          <w:tblCellMar>
-            <w:top w:w="0" w:type="dxa"/>
-            <w:bottom w:w="0" w:type="dxa"/>
-          </w:tblCellMar>
-        </w:tblPrEx>
         <w:trPr>
           <w:cantSplit/>
           <w:tblHeader/>
@@ -5272,7 +5437,6 @@
           <w:p>
             <w:pPr>
               <w:pStyle w:val="a4"/>
-              <w:ind w:right="281"/>
               <w:jc w:val="center"/>
               <w:rPr>
                 <w:b/>
@@ -5290,7 +5454,6 @@
           <w:p>
             <w:pPr>
               <w:pStyle w:val="a4"/>
-              <w:ind w:right="281"/>
               <w:jc w:val="center"/>
               <w:rPr>
                 <w:b/>
@@ -5315,7 +5478,6 @@
           <w:p>
             <w:pPr>
               <w:pStyle w:val="a4"/>
-              <w:ind w:right="281"/>
               <w:jc w:val="center"/>
               <w:rPr>
                 <w:b/>
@@ -5340,7 +5502,6 @@
           <w:p>
             <w:pPr>
               <w:pStyle w:val="a4"/>
-              <w:ind w:right="281"/>
               <w:jc w:val="center"/>
               <w:rPr>
                 <w:b/>
@@ -5365,7 +5526,6 @@
           <w:p>
             <w:pPr>
               <w:pStyle w:val="a4"/>
-              <w:ind w:right="281"/>
               <w:jc w:val="center"/>
               <w:rPr>
                 <w:b/>
@@ -5390,7 +5550,6 @@
           <w:p>
             <w:pPr>
               <w:pStyle w:val="a4"/>
-              <w:ind w:right="281"/>
               <w:jc w:val="center"/>
               <w:rPr>
                 <w:b/>
@@ -5415,7 +5574,6 @@
           <w:p>
             <w:pPr>
               <w:pStyle w:val="a4"/>
-              <w:ind w:right="281"/>
               <w:jc w:val="center"/>
               <w:rPr>
                 <w:b/>
@@ -5440,7 +5598,6 @@
           <w:p>
             <w:pPr>
               <w:pStyle w:val="a4"/>
-              <w:ind w:right="281"/>
               <w:jc w:val="center"/>
               <w:rPr>
                 <w:b/>
@@ -5465,7 +5622,6 @@
           <w:p>
             <w:pPr>
               <w:pStyle w:val="a4"/>
-              <w:ind w:right="281"/>
               <w:jc w:val="center"/>
               <w:rPr>
                 <w:b/>
@@ -5490,7 +5646,6 @@
           <w:p>
             <w:pPr>
               <w:pStyle w:val="a4"/>
-              <w:ind w:right="281"/>
               <w:jc w:val="center"/>
               <w:rPr>
                 <w:b/>
@@ -5508,12 +5663,6 @@
         </w:tc>
       </w:tr>
       <w:tr>
-        <w:tblPrEx>
-          <w:tblCellMar>
-            <w:top w:w="0" w:type="dxa"/>
-            <w:bottom w:w="0" w:type="dxa"/>
-          </w:tblCellMar>
-        </w:tblPrEx>
         <w:trPr>
           <w:cantSplit/>
           <w:jc w:val="center"/>
@@ -5526,7 +5675,6 @@
           <w:p>
             <w:pPr>
               <w:pStyle w:val="a4"/>
-              <w:ind w:right="281"/>
               <w:jc w:val="center"/>
               <w:rPr>
                 <w:sz w:val="20"/>
@@ -5548,7 +5696,6 @@
           <w:p>
             <w:pPr>
               <w:pStyle w:val="a4"/>
-              <w:ind w:right="281"/>
               <w:jc w:val="center"/>
               <w:rPr>
                 <w:sz w:val="20"/>
@@ -5570,7 +5717,6 @@
           <w:p>
             <w:pPr>
               <w:pStyle w:val="a4"/>
-              <w:ind w:right="281"/>
               <w:jc w:val="center"/>
               <w:rPr>
                 <w:sz w:val="20"/>
@@ -5592,7 +5738,6 @@
           <w:p>
             <w:pPr>
               <w:pStyle w:val="a4"/>
-              <w:ind w:right="281"/>
               <w:jc w:val="center"/>
               <w:rPr>
                 <w:sz w:val="20"/>
@@ -5614,7 +5759,6 @@
           <w:p>
             <w:pPr>
               <w:pStyle w:val="a4"/>
-              <w:ind w:right="281"/>
               <w:jc w:val="center"/>
               <w:rPr>
                 <w:sz w:val="20"/>
@@ -5636,7 +5780,6 @@
           <w:p>
             <w:pPr>
               <w:pStyle w:val="a4"/>
-              <w:ind w:right="281"/>
               <w:jc w:val="center"/>
               <w:rPr>
                 <w:sz w:val="20"/>
@@ -5658,7 +5801,6 @@
           <w:p>
             <w:pPr>
               <w:pStyle w:val="a4"/>
-              <w:ind w:right="281"/>
               <w:jc w:val="center"/>
               <w:rPr>
                 <w:sz w:val="20"/>
@@ -5680,7 +5822,6 @@
           <w:p>
             <w:pPr>
               <w:pStyle w:val="a4"/>
-              <w:ind w:right="281"/>
               <w:jc w:val="center"/>
               <w:rPr>
                 <w:sz w:val="20"/>
@@ -5702,7 +5843,6 @@
           <w:p>
             <w:pPr>
               <w:pStyle w:val="a4"/>
-              <w:ind w:right="281"/>
               <w:jc w:val="center"/>
               <w:rPr>
                 <w:sz w:val="20"/>
@@ -5718,12 +5858,6 @@
         </w:tc>
       </w:tr>
       <w:tr>
-        <w:tblPrEx>
-          <w:tblCellMar>
-            <w:top w:w="0" w:type="dxa"/>
-            <w:bottom w:w="0" w:type="dxa"/>
-          </w:tblCellMar>
-        </w:tblPrEx>
         <w:trPr>
           <w:cantSplit/>
           <w:jc w:val="center"/>
@@ -5736,7 +5870,6 @@
           <w:p>
             <w:pPr>
               <w:pStyle w:val="a4"/>
-              <w:ind w:right="281"/>
               <w:jc w:val="center"/>
               <w:rPr>
                 <w:sz w:val="20"/>
@@ -5758,7 +5891,6 @@
           <w:p>
             <w:pPr>
               <w:pStyle w:val="a4"/>
-              <w:ind w:right="281"/>
               <w:jc w:val="center"/>
               <w:rPr>
                 <w:sz w:val="20"/>
@@ -5780,7 +5912,6 @@
           <w:p>
             <w:pPr>
               <w:pStyle w:val="a4"/>
-              <w:ind w:right="281"/>
               <w:jc w:val="center"/>
               <w:rPr>
                 <w:sz w:val="20"/>
@@ -5802,7 +5933,6 @@
           <w:p>
             <w:pPr>
               <w:pStyle w:val="a4"/>
-              <w:ind w:right="281"/>
               <w:jc w:val="center"/>
               <w:rPr>
                 <w:sz w:val="20"/>
@@ -5824,7 +5954,6 @@
           <w:p>
             <w:pPr>
               <w:pStyle w:val="a4"/>
-              <w:ind w:right="281"/>
               <w:jc w:val="center"/>
               <w:rPr>
                 <w:sz w:val="20"/>
@@ -5846,7 +5975,6 @@
           <w:p>
             <w:pPr>
               <w:pStyle w:val="a4"/>
-              <w:ind w:right="281"/>
               <w:jc w:val="center"/>
               <w:rPr>
                 <w:sz w:val="20"/>
@@ -5868,7 +5996,6 @@
           <w:p>
             <w:pPr>
               <w:pStyle w:val="a4"/>
-              <w:ind w:right="281"/>
               <w:jc w:val="center"/>
               <w:rPr>
                 <w:sz w:val="20"/>
@@ -5890,7 +6017,6 @@
           <w:p>
             <w:pPr>
               <w:pStyle w:val="a4"/>
-              <w:ind w:right="281"/>
               <w:jc w:val="center"/>
               <w:rPr>
                 <w:sz w:val="20"/>
@@ -5912,7 +6038,6 @@
           <w:p>
             <w:pPr>
               <w:pStyle w:val="a4"/>
-              <w:ind w:right="281"/>
               <w:jc w:val="center"/>
               <w:rPr>
                 <w:sz w:val="20"/>
@@ -5928,12 +6053,6 @@
         </w:tc>
       </w:tr>
       <w:tr>
-        <w:tblPrEx>
-          <w:tblCellMar>
-            <w:top w:w="0" w:type="dxa"/>
-            <w:bottom w:w="0" w:type="dxa"/>
-          </w:tblCellMar>
-        </w:tblPrEx>
         <w:trPr>
           <w:cantSplit/>
           <w:jc w:val="center"/>
@@ -5946,7 +6065,6 @@
           <w:p>
             <w:pPr>
               <w:pStyle w:val="a4"/>
-              <w:ind w:right="281"/>
               <w:jc w:val="center"/>
               <w:rPr>
                 <w:sz w:val="20"/>
@@ -5968,7 +6086,6 @@
           <w:p>
             <w:pPr>
               <w:pStyle w:val="a4"/>
-              <w:ind w:right="281"/>
               <w:jc w:val="center"/>
               <w:rPr>
                 <w:sz w:val="20"/>
@@ -5990,7 +6107,6 @@
           <w:p>
             <w:pPr>
               <w:pStyle w:val="a4"/>
-              <w:ind w:right="281"/>
               <w:jc w:val="center"/>
               <w:rPr>
                 <w:sz w:val="20"/>
@@ -6012,7 +6128,6 @@
           <w:p>
             <w:pPr>
               <w:pStyle w:val="a4"/>
-              <w:ind w:right="281"/>
               <w:jc w:val="center"/>
               <w:rPr>
                 <w:sz w:val="20"/>
@@ -6034,7 +6149,6 @@
           <w:p>
             <w:pPr>
               <w:pStyle w:val="a4"/>
-              <w:ind w:right="281"/>
               <w:jc w:val="center"/>
               <w:rPr>
                 <w:sz w:val="20"/>
@@ -6056,7 +6170,6 @@
           <w:p>
             <w:pPr>
               <w:pStyle w:val="a4"/>
-              <w:ind w:right="281"/>
               <w:jc w:val="center"/>
               <w:rPr>
                 <w:sz w:val="20"/>
@@ -6078,7 +6191,6 @@
           <w:p>
             <w:pPr>
               <w:pStyle w:val="a4"/>
-              <w:ind w:right="281"/>
               <w:jc w:val="center"/>
               <w:rPr>
                 <w:sz w:val="20"/>
@@ -6100,7 +6212,6 @@
           <w:p>
             <w:pPr>
               <w:pStyle w:val="a4"/>
-              <w:ind w:right="281"/>
               <w:jc w:val="center"/>
               <w:rPr>
                 <w:sz w:val="20"/>
@@ -6122,7 +6233,6 @@
           <w:p>
             <w:pPr>
               <w:pStyle w:val="a4"/>
-              <w:ind w:right="281"/>
               <w:jc w:val="center"/>
               <w:rPr>
                 <w:sz w:val="20"/>
@@ -6138,12 +6248,6 @@
         </w:tc>
       </w:tr>
       <w:tr>
-        <w:tblPrEx>
-          <w:tblCellMar>
-            <w:top w:w="0" w:type="dxa"/>
-            <w:bottom w:w="0" w:type="dxa"/>
-          </w:tblCellMar>
-        </w:tblPrEx>
         <w:trPr>
           <w:cantSplit/>
           <w:jc w:val="center"/>
@@ -6156,7 +6260,6 @@
           <w:p>
             <w:pPr>
               <w:pStyle w:val="a4"/>
-              <w:ind w:right="281"/>
               <w:jc w:val="center"/>
               <w:rPr>
                 <w:sz w:val="20"/>
@@ -6178,7 +6281,6 @@
           <w:p>
             <w:pPr>
               <w:pStyle w:val="a4"/>
-              <w:ind w:right="281"/>
               <w:jc w:val="center"/>
               <w:rPr>
                 <w:sz w:val="20"/>
@@ -6200,7 +6302,6 @@
           <w:p>
             <w:pPr>
               <w:pStyle w:val="a4"/>
-              <w:ind w:right="281"/>
               <w:jc w:val="center"/>
               <w:rPr>
                 <w:sz w:val="20"/>
@@ -6222,7 +6323,6 @@
           <w:p>
             <w:pPr>
               <w:pStyle w:val="a4"/>
-              <w:ind w:right="281"/>
               <w:jc w:val="center"/>
               <w:rPr>
                 <w:sz w:val="20"/>
@@ -6244,7 +6344,6 @@
           <w:p>
             <w:pPr>
               <w:pStyle w:val="a4"/>
-              <w:ind w:right="281"/>
               <w:jc w:val="center"/>
               <w:rPr>
                 <w:sz w:val="20"/>
@@ -6266,7 +6365,6 @@
           <w:p>
             <w:pPr>
               <w:pStyle w:val="a4"/>
-              <w:ind w:right="281"/>
               <w:jc w:val="center"/>
               <w:rPr>
                 <w:sz w:val="20"/>
@@ -6288,7 +6386,6 @@
           <w:p>
             <w:pPr>
               <w:pStyle w:val="a4"/>
-              <w:ind w:right="281"/>
               <w:jc w:val="center"/>
               <w:rPr>
                 <w:sz w:val="20"/>
@@ -6310,7 +6407,6 @@
           <w:p>
             <w:pPr>
               <w:pStyle w:val="a4"/>
-              <w:ind w:right="281"/>
               <w:jc w:val="center"/>
               <w:rPr>
                 <w:sz w:val="20"/>
@@ -6332,7 +6428,6 @@
           <w:p>
             <w:pPr>
               <w:pStyle w:val="a4"/>
-              <w:ind w:right="281"/>
               <w:jc w:val="center"/>
               <w:rPr>
                 <w:sz w:val="20"/>
@@ -6348,12 +6443,6 @@
         </w:tc>
       </w:tr>
       <w:tr>
-        <w:tblPrEx>
-          <w:tblCellMar>
-            <w:top w:w="0" w:type="dxa"/>
-            <w:bottom w:w="0" w:type="dxa"/>
-          </w:tblCellMar>
-        </w:tblPrEx>
         <w:trPr>
           <w:cantSplit/>
           <w:jc w:val="center"/>
@@ -6366,7 +6455,6 @@
           <w:p>
             <w:pPr>
               <w:pStyle w:val="a4"/>
-              <w:ind w:right="281"/>
               <w:jc w:val="center"/>
               <w:rPr>
                 <w:sz w:val="20"/>
@@ -6388,7 +6476,6 @@
           <w:p>
             <w:pPr>
               <w:pStyle w:val="a4"/>
-              <w:ind w:right="281"/>
               <w:jc w:val="center"/>
               <w:rPr>
                 <w:sz w:val="20"/>
@@ -6410,7 +6497,6 @@
           <w:p>
             <w:pPr>
               <w:pStyle w:val="a4"/>
-              <w:ind w:right="281"/>
               <w:jc w:val="center"/>
               <w:rPr>
                 <w:sz w:val="20"/>
@@ -6432,7 +6518,6 @@
           <w:p>
             <w:pPr>
               <w:pStyle w:val="a4"/>
-              <w:ind w:right="281"/>
               <w:jc w:val="center"/>
               <w:rPr>
                 <w:sz w:val="20"/>
@@ -6454,7 +6539,6 @@
           <w:p>
             <w:pPr>
               <w:pStyle w:val="a4"/>
-              <w:ind w:right="281"/>
               <w:jc w:val="center"/>
               <w:rPr>
                 <w:sz w:val="20"/>
@@ -6476,7 +6560,6 @@
           <w:p>
             <w:pPr>
               <w:pStyle w:val="a4"/>
-              <w:ind w:right="281"/>
               <w:jc w:val="center"/>
               <w:rPr>
                 <w:sz w:val="20"/>
@@ -6498,7 +6581,6 @@
           <w:p>
             <w:pPr>
               <w:pStyle w:val="a4"/>
-              <w:ind w:right="281"/>
               <w:jc w:val="center"/>
               <w:rPr>
                 <w:sz w:val="20"/>
@@ -6520,7 +6602,6 @@
           <w:p>
             <w:pPr>
               <w:pStyle w:val="a4"/>
-              <w:ind w:right="281"/>
               <w:jc w:val="center"/>
               <w:rPr>
                 <w:sz w:val="20"/>
@@ -6542,7 +6623,6 @@
           <w:p>
             <w:pPr>
               <w:pStyle w:val="a4"/>
-              <w:ind w:right="281"/>
               <w:jc w:val="center"/>
               <w:rPr>
                 <w:sz w:val="20"/>
@@ -6558,12 +6638,6 @@
         </w:tc>
       </w:tr>
       <w:tr>
-        <w:tblPrEx>
-          <w:tblCellMar>
-            <w:top w:w="0" w:type="dxa"/>
-            <w:bottom w:w="0" w:type="dxa"/>
-          </w:tblCellMar>
-        </w:tblPrEx>
         <w:trPr>
           <w:cantSplit/>
           <w:jc w:val="center"/>
@@ -6576,7 +6650,6 @@
           <w:p>
             <w:pPr>
               <w:pStyle w:val="a4"/>
-              <w:ind w:right="281"/>
               <w:jc w:val="center"/>
               <w:rPr>
                 <w:sz w:val="20"/>
@@ -6598,7 +6671,6 @@
           <w:p>
             <w:pPr>
               <w:pStyle w:val="a4"/>
-              <w:ind w:right="281"/>
               <w:jc w:val="center"/>
               <w:rPr>
                 <w:sz w:val="20"/>
@@ -6620,7 +6692,6 @@
           <w:p>
             <w:pPr>
               <w:pStyle w:val="a4"/>
-              <w:ind w:right="281"/>
               <w:jc w:val="center"/>
               <w:rPr>
                 <w:sz w:val="20"/>
@@ -6642,7 +6713,6 @@
           <w:p>
             <w:pPr>
               <w:pStyle w:val="a4"/>
-              <w:ind w:right="281"/>
               <w:jc w:val="center"/>
               <w:rPr>
                 <w:sz w:val="20"/>
@@ -6664,7 +6734,6 @@
           <w:p>
             <w:pPr>
               <w:pStyle w:val="a4"/>
-              <w:ind w:right="281"/>
               <w:jc w:val="center"/>
               <w:rPr>
                 <w:sz w:val="20"/>
@@ -6686,7 +6755,6 @@
           <w:p>
             <w:pPr>
               <w:pStyle w:val="a4"/>
-              <w:ind w:right="281"/>
               <w:jc w:val="center"/>
               <w:rPr>
                 <w:sz w:val="20"/>
@@ -6708,7 +6776,6 @@
           <w:p>
             <w:pPr>
               <w:pStyle w:val="a4"/>
-              <w:ind w:right="281"/>
               <w:jc w:val="center"/>
               <w:rPr>
                 <w:sz w:val="20"/>
@@ -6730,7 +6797,6 @@
           <w:p>
             <w:pPr>
               <w:pStyle w:val="a4"/>
-              <w:ind w:right="281"/>
               <w:jc w:val="center"/>
               <w:rPr>
                 <w:sz w:val="20"/>
@@ -6752,7 +6818,6 @@
           <w:p>
             <w:pPr>
               <w:pStyle w:val="a4"/>
-              <w:ind w:right="281"/>
               <w:jc w:val="center"/>
               <w:rPr>
                 <w:sz w:val="20"/>
@@ -6768,12 +6833,6 @@
         </w:tc>
       </w:tr>
       <w:tr>
-        <w:tblPrEx>
-          <w:tblCellMar>
-            <w:top w:w="0" w:type="dxa"/>
-            <w:bottom w:w="0" w:type="dxa"/>
-          </w:tblCellMar>
-        </w:tblPrEx>
         <w:trPr>
           <w:cantSplit/>
           <w:jc w:val="center"/>
@@ -6786,7 +6845,6 @@
           <w:p>
             <w:pPr>
               <w:pStyle w:val="a4"/>
-              <w:ind w:right="281"/>
               <w:jc w:val="center"/>
               <w:rPr>
                 <w:sz w:val="20"/>
@@ -6808,7 +6866,6 @@
           <w:p>
             <w:pPr>
               <w:pStyle w:val="a4"/>
-              <w:ind w:right="281"/>
               <w:jc w:val="center"/>
               <w:rPr>
                 <w:sz w:val="20"/>
@@ -6830,7 +6887,6 @@
           <w:p>
             <w:pPr>
               <w:pStyle w:val="a4"/>
-              <w:ind w:right="281"/>
               <w:jc w:val="center"/>
               <w:rPr>
                 <w:sz w:val="20"/>
@@ -6852,7 +6908,6 @@
           <w:p>
             <w:pPr>
               <w:pStyle w:val="a4"/>
-              <w:ind w:right="281"/>
               <w:jc w:val="center"/>
               <w:rPr>
                 <w:sz w:val="20"/>
@@ -6874,7 +6929,6 @@
           <w:p>
             <w:pPr>
               <w:pStyle w:val="a4"/>
-              <w:ind w:right="281"/>
               <w:jc w:val="center"/>
               <w:rPr>
                 <w:sz w:val="20"/>
@@ -6896,7 +6950,6 @@
           <w:p>
             <w:pPr>
               <w:pStyle w:val="a4"/>
-              <w:ind w:right="281"/>
               <w:jc w:val="center"/>
               <w:rPr>
                 <w:sz w:val="20"/>
@@ -6918,7 +6971,6 @@
           <w:p>
             <w:pPr>
               <w:pStyle w:val="a4"/>
-              <w:ind w:right="281"/>
               <w:jc w:val="center"/>
               <w:rPr>
                 <w:sz w:val="20"/>
@@ -6940,7 +6992,6 @@
           <w:p>
             <w:pPr>
               <w:pStyle w:val="a4"/>
-              <w:ind w:right="281"/>
               <w:jc w:val="center"/>
               <w:rPr>
                 <w:sz w:val="20"/>
@@ -6962,7 +7013,6 @@
           <w:p>
             <w:pPr>
               <w:pStyle w:val="a4"/>
-              <w:ind w:right="281"/>
               <w:jc w:val="center"/>
               <w:rPr>
                 <w:sz w:val="20"/>
@@ -6978,12 +7028,6 @@
         </w:tc>
       </w:tr>
       <w:tr>
-        <w:tblPrEx>
-          <w:tblCellMar>
-            <w:top w:w="0" w:type="dxa"/>
-            <w:bottom w:w="0" w:type="dxa"/>
-          </w:tblCellMar>
-        </w:tblPrEx>
         <w:trPr>
           <w:cantSplit/>
           <w:jc w:val="center"/>
@@ -6996,7 +7040,6 @@
           <w:p>
             <w:pPr>
               <w:pStyle w:val="a4"/>
-              <w:ind w:right="281"/>
               <w:jc w:val="center"/>
               <w:rPr>
                 <w:sz w:val="20"/>
@@ -7018,7 +7061,6 @@
           <w:p>
             <w:pPr>
               <w:pStyle w:val="a4"/>
-              <w:ind w:right="281"/>
               <w:jc w:val="center"/>
               <w:rPr>
                 <w:sz w:val="20"/>
@@ -7040,7 +7082,6 @@
           <w:p>
             <w:pPr>
               <w:pStyle w:val="a4"/>
-              <w:ind w:right="281"/>
               <w:jc w:val="center"/>
               <w:rPr>
                 <w:sz w:val="20"/>
@@ -7062,7 +7103,6 @@
           <w:p>
             <w:pPr>
               <w:pStyle w:val="a4"/>
-              <w:ind w:right="281"/>
               <w:jc w:val="center"/>
               <w:rPr>
                 <w:sz w:val="20"/>
@@ -7084,7 +7124,6 @@
           <w:p>
             <w:pPr>
               <w:pStyle w:val="a4"/>
-              <w:ind w:right="281"/>
               <w:jc w:val="center"/>
               <w:rPr>
                 <w:sz w:val="20"/>
@@ -7106,7 +7145,6 @@
           <w:p>
             <w:pPr>
               <w:pStyle w:val="a4"/>
-              <w:ind w:right="281"/>
               <w:jc w:val="center"/>
               <w:rPr>
                 <w:sz w:val="20"/>
@@ -7128,7 +7166,6 @@
           <w:p>
             <w:pPr>
               <w:pStyle w:val="a4"/>
-              <w:ind w:right="281"/>
               <w:jc w:val="center"/>
               <w:rPr>
                 <w:sz w:val="20"/>
@@ -7150,7 +7187,6 @@
           <w:p>
             <w:pPr>
               <w:pStyle w:val="a4"/>
-              <w:ind w:right="281"/>
               <w:jc w:val="center"/>
               <w:rPr>
                 <w:sz w:val="20"/>
@@ -7172,7 +7208,6 @@
           <w:p>
             <w:pPr>
               <w:pStyle w:val="a4"/>
-              <w:ind w:right="281"/>
               <w:jc w:val="center"/>
               <w:rPr>
                 <w:sz w:val="20"/>
@@ -7188,12 +7223,6 @@
         </w:tc>
       </w:tr>
       <w:tr>
-        <w:tblPrEx>
-          <w:tblCellMar>
-            <w:top w:w="0" w:type="dxa"/>
-            <w:bottom w:w="0" w:type="dxa"/>
-          </w:tblCellMar>
-        </w:tblPrEx>
         <w:trPr>
           <w:cantSplit/>
           <w:jc w:val="center"/>
@@ -7206,7 +7235,6 @@
           <w:p>
             <w:pPr>
               <w:pStyle w:val="a4"/>
-              <w:ind w:right="281"/>
               <w:jc w:val="center"/>
               <w:rPr>
                 <w:sz w:val="20"/>
@@ -7228,7 +7256,6 @@
           <w:p>
             <w:pPr>
               <w:pStyle w:val="a4"/>
-              <w:ind w:right="281"/>
               <w:jc w:val="center"/>
               <w:rPr>
                 <w:sz w:val="20"/>
@@ -7250,7 +7277,6 @@
           <w:p>
             <w:pPr>
               <w:pStyle w:val="a4"/>
-              <w:ind w:right="281"/>
               <w:jc w:val="center"/>
               <w:rPr>
                 <w:sz w:val="20"/>
@@ -7272,7 +7298,6 @@
           <w:p>
             <w:pPr>
               <w:pStyle w:val="a4"/>
-              <w:ind w:right="281"/>
               <w:jc w:val="center"/>
               <w:rPr>
                 <w:sz w:val="20"/>
@@ -7294,7 +7319,6 @@
           <w:p>
             <w:pPr>
               <w:pStyle w:val="a4"/>
-              <w:ind w:right="281"/>
               <w:jc w:val="center"/>
               <w:rPr>
                 <w:sz w:val="20"/>
@@ -7316,7 +7340,6 @@
           <w:p>
             <w:pPr>
               <w:pStyle w:val="a4"/>
-              <w:ind w:right="281"/>
               <w:jc w:val="center"/>
               <w:rPr>
                 <w:sz w:val="20"/>
@@ -7338,7 +7361,6 @@
           <w:p>
             <w:pPr>
               <w:pStyle w:val="a4"/>
-              <w:ind w:right="281"/>
               <w:jc w:val="center"/>
               <w:rPr>
                 <w:sz w:val="20"/>
@@ -7360,7 +7382,6 @@
           <w:p>
             <w:pPr>
               <w:pStyle w:val="a4"/>
-              <w:ind w:right="281"/>
               <w:jc w:val="center"/>
               <w:rPr>
                 <w:sz w:val="20"/>
@@ -7382,7 +7403,6 @@
           <w:p>
             <w:pPr>
               <w:pStyle w:val="a4"/>
-              <w:ind w:right="281"/>
               <w:jc w:val="center"/>
               <w:rPr>
                 <w:sz w:val="20"/>
@@ -7398,12 +7418,6 @@
         </w:tc>
       </w:tr>
       <w:tr>
-        <w:tblPrEx>
-          <w:tblCellMar>
-            <w:top w:w="0" w:type="dxa"/>
-            <w:bottom w:w="0" w:type="dxa"/>
-          </w:tblCellMar>
-        </w:tblPrEx>
         <w:trPr>
           <w:cantSplit/>
           <w:jc w:val="center"/>
@@ -7416,7 +7430,6 @@
           <w:p>
             <w:pPr>
               <w:pStyle w:val="a4"/>
-              <w:ind w:right="281"/>
               <w:jc w:val="center"/>
               <w:rPr>
                 <w:sz w:val="20"/>
@@ -7438,7 +7451,6 @@
           <w:p>
             <w:pPr>
               <w:pStyle w:val="a4"/>
-              <w:ind w:right="281"/>
               <w:jc w:val="center"/>
               <w:rPr>
                 <w:sz w:val="20"/>
@@ -7460,7 +7472,6 @@
           <w:p>
             <w:pPr>
               <w:pStyle w:val="a4"/>
-              <w:ind w:right="281"/>
               <w:jc w:val="center"/>
               <w:rPr>
                 <w:sz w:val="20"/>
@@ -7482,7 +7493,6 @@
           <w:p>
             <w:pPr>
               <w:pStyle w:val="a4"/>
-              <w:ind w:right="281"/>
               <w:jc w:val="center"/>
               <w:rPr>
                 <w:sz w:val="20"/>
@@ -7504,7 +7514,6 @@
           <w:p>
             <w:pPr>
               <w:pStyle w:val="a4"/>
-              <w:ind w:right="281"/>
               <w:jc w:val="center"/>
               <w:rPr>
                 <w:sz w:val="20"/>
@@ -7526,7 +7535,6 @@
           <w:p>
             <w:pPr>
               <w:pStyle w:val="a4"/>
-              <w:ind w:right="281"/>
               <w:jc w:val="center"/>
               <w:rPr>
                 <w:sz w:val="20"/>
@@ -7548,7 +7556,6 @@
           <w:p>
             <w:pPr>
               <w:pStyle w:val="a4"/>
-              <w:ind w:right="281"/>
               <w:jc w:val="center"/>
               <w:rPr>
                 <w:sz w:val="20"/>
@@ -7570,7 +7577,6 @@
           <w:p>
             <w:pPr>
               <w:pStyle w:val="a4"/>
-              <w:ind w:right="281"/>
               <w:jc w:val="center"/>
               <w:rPr>
                 <w:sz w:val="20"/>
@@ -7592,7 +7598,6 @@
           <w:p>
             <w:pPr>
               <w:pStyle w:val="a4"/>
-              <w:ind w:right="281"/>
               <w:jc w:val="center"/>
               <w:rPr>
                 <w:sz w:val="20"/>
@@ -7608,12 +7613,6 @@
         </w:tc>
       </w:tr>
       <w:tr>
-        <w:tblPrEx>
-          <w:tblCellMar>
-            <w:top w:w="0" w:type="dxa"/>
-            <w:bottom w:w="0" w:type="dxa"/>
-          </w:tblCellMar>
-        </w:tblPrEx>
         <w:trPr>
           <w:cantSplit/>
           <w:jc w:val="center"/>
@@ -7626,7 +7625,6 @@
           <w:p>
             <w:pPr>
               <w:pStyle w:val="a4"/>
-              <w:ind w:right="281"/>
               <w:jc w:val="center"/>
               <w:rPr>
                 <w:sz w:val="20"/>
@@ -7648,7 +7646,6 @@
           <w:p>
             <w:pPr>
               <w:pStyle w:val="a4"/>
-              <w:ind w:right="281"/>
               <w:jc w:val="center"/>
               <w:rPr>
                 <w:sz w:val="20"/>
@@ -7670,7 +7667,6 @@
           <w:p>
             <w:pPr>
               <w:pStyle w:val="a4"/>
-              <w:ind w:right="281"/>
               <w:jc w:val="center"/>
               <w:rPr>
                 <w:sz w:val="20"/>
@@ -7692,7 +7688,6 @@
           <w:p>
             <w:pPr>
               <w:pStyle w:val="a4"/>
-              <w:ind w:right="281"/>
               <w:jc w:val="center"/>
               <w:rPr>
                 <w:sz w:val="20"/>
@@ -7714,7 +7709,6 @@
           <w:p>
             <w:pPr>
               <w:pStyle w:val="a4"/>
-              <w:ind w:right="281"/>
               <w:jc w:val="center"/>
               <w:rPr>
                 <w:sz w:val="20"/>
@@ -7736,7 +7730,6 @@
           <w:p>
             <w:pPr>
               <w:pStyle w:val="a4"/>
-              <w:ind w:right="281"/>
               <w:jc w:val="center"/>
               <w:rPr>
                 <w:sz w:val="20"/>
@@ -7758,7 +7751,6 @@
           <w:p>
             <w:pPr>
               <w:pStyle w:val="a4"/>
-              <w:ind w:right="281"/>
               <w:jc w:val="center"/>
               <w:rPr>
                 <w:sz w:val="20"/>
@@ -7780,7 +7772,6 @@
           <w:p>
             <w:pPr>
               <w:pStyle w:val="a4"/>
-              <w:ind w:right="281"/>
               <w:jc w:val="center"/>
               <w:rPr>
                 <w:sz w:val="20"/>
@@ -7802,7 +7793,6 @@
           <w:p>
             <w:pPr>
               <w:pStyle w:val="a4"/>
-              <w:ind w:right="281"/>
               <w:jc w:val="center"/>
               <w:rPr>
                 <w:sz w:val="20"/>
@@ -7818,12 +7808,6 @@
         </w:tc>
       </w:tr>
       <w:tr>
-        <w:tblPrEx>
-          <w:tblCellMar>
-            <w:top w:w="0" w:type="dxa"/>
-            <w:bottom w:w="0" w:type="dxa"/>
-          </w:tblCellMar>
-        </w:tblPrEx>
         <w:trPr>
           <w:cantSplit/>
           <w:jc w:val="center"/>
@@ -7836,7 +7820,6 @@
           <w:p>
             <w:pPr>
               <w:pStyle w:val="a4"/>
-              <w:ind w:right="281"/>
               <w:jc w:val="center"/>
               <w:rPr>
                 <w:sz w:val="20"/>
@@ -7858,7 +7841,6 @@
           <w:p>
             <w:pPr>
               <w:pStyle w:val="a4"/>
-              <w:ind w:right="281"/>
               <w:jc w:val="center"/>
               <w:rPr>
                 <w:sz w:val="20"/>
@@ -7880,7 +7862,6 @@
           <w:p>
             <w:pPr>
               <w:pStyle w:val="a4"/>
-              <w:ind w:right="281"/>
               <w:jc w:val="center"/>
               <w:rPr>
                 <w:sz w:val="20"/>
@@ -7902,7 +7883,6 @@
           <w:p>
             <w:pPr>
               <w:pStyle w:val="a4"/>
-              <w:ind w:right="281"/>
               <w:jc w:val="center"/>
               <w:rPr>
                 <w:sz w:val="20"/>
@@ -7924,7 +7904,6 @@
           <w:p>
             <w:pPr>
               <w:pStyle w:val="a4"/>
-              <w:ind w:right="281"/>
               <w:jc w:val="center"/>
               <w:rPr>
                 <w:sz w:val="20"/>
@@ -7946,7 +7925,6 @@
           <w:p>
             <w:pPr>
               <w:pStyle w:val="a4"/>
-              <w:ind w:right="281"/>
               <w:jc w:val="center"/>
               <w:rPr>
                 <w:sz w:val="20"/>
@@ -7968,7 +7946,6 @@
           <w:p>
             <w:pPr>
               <w:pStyle w:val="a4"/>
-              <w:ind w:right="281"/>
               <w:jc w:val="center"/>
               <w:rPr>
                 <w:sz w:val="20"/>
@@ -7990,7 +7967,6 @@
           <w:p>
             <w:pPr>
               <w:pStyle w:val="a4"/>
-              <w:ind w:right="281"/>
               <w:jc w:val="center"/>
               <w:rPr>
                 <w:sz w:val="20"/>
@@ -8012,7 +7988,6 @@
           <w:p>
             <w:pPr>
               <w:pStyle w:val="a4"/>
-              <w:ind w:right="281"/>
               <w:jc w:val="center"/>
               <w:rPr>
                 <w:sz w:val="20"/>
@@ -8028,12 +8003,6 @@
         </w:tc>
       </w:tr>
       <w:tr>
-        <w:tblPrEx>
-          <w:tblCellMar>
-            <w:top w:w="0" w:type="dxa"/>
-            <w:bottom w:w="0" w:type="dxa"/>
-          </w:tblCellMar>
-        </w:tblPrEx>
         <w:trPr>
           <w:cantSplit/>
           <w:jc w:val="center"/>
@@ -8046,7 +8015,6 @@
           <w:p>
             <w:pPr>
               <w:pStyle w:val="a4"/>
-              <w:ind w:right="281"/>
               <w:jc w:val="center"/>
               <w:rPr>
                 <w:sz w:val="20"/>
@@ -8068,7 +8036,6 @@
           <w:p>
             <w:pPr>
               <w:pStyle w:val="a4"/>
-              <w:ind w:right="281"/>
               <w:jc w:val="center"/>
               <w:rPr>
                 <w:sz w:val="20"/>
@@ -8090,7 +8057,6 @@
           <w:p>
             <w:pPr>
               <w:pStyle w:val="a4"/>
-              <w:ind w:right="281"/>
               <w:jc w:val="center"/>
               <w:rPr>
                 <w:sz w:val="20"/>
@@ -8112,7 +8078,6 @@
           <w:p>
             <w:pPr>
               <w:pStyle w:val="a4"/>
-              <w:ind w:right="281"/>
               <w:jc w:val="center"/>
               <w:rPr>
                 <w:sz w:val="20"/>
@@ -8134,7 +8099,6 @@
           <w:p>
             <w:pPr>
               <w:pStyle w:val="a4"/>
-              <w:ind w:right="281"/>
               <w:jc w:val="center"/>
               <w:rPr>
                 <w:sz w:val="20"/>
@@ -8156,7 +8120,6 @@
           <w:p>
             <w:pPr>
               <w:pStyle w:val="a4"/>
-              <w:ind w:right="281"/>
               <w:jc w:val="center"/>
               <w:rPr>
                 <w:sz w:val="20"/>
@@ -8178,7 +8141,6 @@
           <w:p>
             <w:pPr>
               <w:pStyle w:val="a4"/>
-              <w:ind w:right="281"/>
               <w:jc w:val="center"/>
               <w:rPr>
                 <w:sz w:val="20"/>
@@ -8200,7 +8162,6 @@
           <w:p>
             <w:pPr>
               <w:pStyle w:val="a4"/>
-              <w:ind w:right="281"/>
               <w:jc w:val="center"/>
               <w:rPr>
                 <w:sz w:val="20"/>
@@ -8222,7 +8183,6 @@
           <w:p>
             <w:pPr>
               <w:pStyle w:val="a4"/>
-              <w:ind w:right="281"/>
               <w:jc w:val="center"/>
               <w:rPr>
                 <w:sz w:val="20"/>
@@ -8238,12 +8198,6 @@
         </w:tc>
       </w:tr>
       <w:tr>
-        <w:tblPrEx>
-          <w:tblCellMar>
-            <w:top w:w="0" w:type="dxa"/>
-            <w:bottom w:w="0" w:type="dxa"/>
-          </w:tblCellMar>
-        </w:tblPrEx>
         <w:trPr>
           <w:cantSplit/>
           <w:jc w:val="center"/>
@@ -8259,7 +8213,6 @@
           <w:p>
             <w:pPr>
               <w:pStyle w:val="a4"/>
-              <w:ind w:right="281"/>
               <w:jc w:val="center"/>
               <w:rPr>
                 <w:sz w:val="20"/>
@@ -8284,7 +8237,6 @@
           <w:p>
             <w:pPr>
               <w:pStyle w:val="a4"/>
-              <w:ind w:right="281"/>
               <w:jc w:val="center"/>
               <w:rPr>
                 <w:sz w:val="20"/>
@@ -8309,7 +8261,6 @@
           <w:p>
             <w:pPr>
               <w:pStyle w:val="a4"/>
-              <w:ind w:right="281"/>
               <w:jc w:val="center"/>
               <w:rPr>
                 <w:sz w:val="20"/>
@@ -8334,7 +8285,6 @@
           <w:p>
             <w:pPr>
               <w:pStyle w:val="a4"/>
-              <w:ind w:right="281"/>
               <w:jc w:val="center"/>
               <w:rPr>
                 <w:sz w:val="20"/>
@@ -8359,7 +8309,6 @@
           <w:p>
             <w:pPr>
               <w:pStyle w:val="a4"/>
-              <w:ind w:right="281"/>
               <w:jc w:val="center"/>
               <w:rPr>
                 <w:sz w:val="20"/>
@@ -8384,7 +8333,6 @@
           <w:p>
             <w:pPr>
               <w:pStyle w:val="a4"/>
-              <w:ind w:right="281"/>
               <w:jc w:val="center"/>
               <w:rPr>
                 <w:sz w:val="20"/>
@@ -8409,7 +8357,6 @@
           <w:p>
             <w:pPr>
               <w:pStyle w:val="a4"/>
-              <w:ind w:right="281"/>
               <w:jc w:val="center"/>
               <w:rPr>
                 <w:sz w:val="20"/>
@@ -8434,7 +8381,6 @@
           <w:p>
             <w:pPr>
               <w:pStyle w:val="a4"/>
-              <w:ind w:right="281"/>
               <w:jc w:val="center"/>
               <w:rPr>
                 <w:sz w:val="20"/>
@@ -8459,472 +8405,6 @@
           <w:p>
             <w:pPr>
               <w:pStyle w:val="a4"/>
-              <w:ind w:right="281"/>
-              <w:jc w:val="center"/>
-              <w:rPr>
-                <w:sz w:val="20"/>
-              </w:rPr>
-            </w:pPr>
-            <w:r>
-              <w:rPr>
-                <w:sz w:val="20"/>
-              </w:rPr>
-              <w:t>1</w:t>
-            </w:r>
-          </w:p>
-        </w:tc>
-      </w:tr>
-      <w:tr>
-        <w:tblPrEx>
-          <w:tblCellMar>
-            <w:top w:w="0" w:type="dxa"/>
-            <w:bottom w:w="0" w:type="dxa"/>
-          </w:tblCellMar>
-        </w:tblPrEx>
-        <w:trPr>
-          <w:cantSplit/>
-          <w:jc w:val="center"/>
-        </w:trPr>
-        <w:tc>
-          <w:tcPr>
-            <w:tcW w:w="1928" w:type="dxa"/>
-            <w:tcBorders>
-              <w:bottom w:val="single" w:sz="4" w:space="0" w:color="000000"/>
-            </w:tcBorders>
-            <w:shd w:val="clear" w:color="auto" w:fill="E7E7E7"/>
-            <w:vAlign w:val="center"/>
-          </w:tcPr>
-          <w:p>
-            <w:pPr>
-              <w:pStyle w:val="a4"/>
-              <w:ind w:right="281"/>
-              <w:jc w:val="center"/>
-              <w:rPr>
-                <w:sz w:val="20"/>
-              </w:rPr>
-            </w:pPr>
-            <w:r>
-              <w:rPr>
-                <w:sz w:val="20"/>
-              </w:rPr>
-              <w:t>1</w:t>
-            </w:r>
-          </w:p>
-        </w:tc>
-        <w:tc>
-          <w:tcPr>
-            <w:tcW w:w="765" w:type="dxa"/>
-            <w:tcBorders>
-              <w:bottom w:val="single" w:sz="4" w:space="0" w:color="000000"/>
-            </w:tcBorders>
-            <w:shd w:val="clear" w:color="auto" w:fill="E7E7E7"/>
-            <w:vAlign w:val="center"/>
-          </w:tcPr>
-          <w:p>
-            <w:pPr>
-              <w:pStyle w:val="a4"/>
-              <w:ind w:right="281"/>
-              <w:jc w:val="center"/>
-              <w:rPr>
-                <w:sz w:val="20"/>
-              </w:rPr>
-            </w:pPr>
-            <w:r>
-              <w:rPr>
-                <w:sz w:val="20"/>
-              </w:rPr>
-              <w:t>0</w:t>
-            </w:r>
-          </w:p>
-        </w:tc>
-        <w:tc>
-          <w:tcPr>
-            <w:tcW w:w="765" w:type="dxa"/>
-            <w:tcBorders>
-              <w:bottom w:val="single" w:sz="4" w:space="0" w:color="000000"/>
-            </w:tcBorders>
-            <w:shd w:val="clear" w:color="auto" w:fill="E7E7E7"/>
-            <w:vAlign w:val="center"/>
-          </w:tcPr>
-          <w:p>
-            <w:pPr>
-              <w:pStyle w:val="a4"/>
-              <w:ind w:right="281"/>
-              <w:jc w:val="center"/>
-              <w:rPr>
-                <w:sz w:val="20"/>
-              </w:rPr>
-            </w:pPr>
-            <w:r>
-              <w:rPr>
-                <w:sz w:val="20"/>
-              </w:rPr>
-              <w:t>0</w:t>
-            </w:r>
-          </w:p>
-        </w:tc>
-        <w:tc>
-          <w:tcPr>
-            <w:tcW w:w="765" w:type="dxa"/>
-            <w:tcBorders>
-              <w:bottom w:val="single" w:sz="4" w:space="0" w:color="000000"/>
-            </w:tcBorders>
-            <w:shd w:val="clear" w:color="auto" w:fill="E7E7E7"/>
-            <w:vAlign w:val="center"/>
-          </w:tcPr>
-          <w:p>
-            <w:pPr>
-              <w:pStyle w:val="a4"/>
-              <w:ind w:right="281"/>
-              <w:jc w:val="center"/>
-              <w:rPr>
-                <w:sz w:val="20"/>
-              </w:rPr>
-            </w:pPr>
-            <w:r>
-              <w:rPr>
-                <w:sz w:val="20"/>
-              </w:rPr>
-              <w:t>0</w:t>
-            </w:r>
-          </w:p>
-        </w:tc>
-        <w:tc>
-          <w:tcPr>
-            <w:tcW w:w="765" w:type="dxa"/>
-            <w:tcBorders>
-              <w:bottom w:val="single" w:sz="4" w:space="0" w:color="000000"/>
-            </w:tcBorders>
-            <w:shd w:val="clear" w:color="auto" w:fill="E7E7E7"/>
-            <w:vAlign w:val="center"/>
-          </w:tcPr>
-          <w:p>
-            <w:pPr>
-              <w:pStyle w:val="a4"/>
-              <w:ind w:right="281"/>
-              <w:jc w:val="center"/>
-              <w:rPr>
-                <w:sz w:val="20"/>
-              </w:rPr>
-            </w:pPr>
-            <w:r>
-              <w:rPr>
-                <w:sz w:val="20"/>
-              </w:rPr>
-              <w:t>1</w:t>
-            </w:r>
-          </w:p>
-        </w:tc>
-        <w:tc>
-          <w:tcPr>
-            <w:tcW w:w="765" w:type="dxa"/>
-            <w:tcBorders>
-              <w:bottom w:val="single" w:sz="4" w:space="0" w:color="000000"/>
-            </w:tcBorders>
-            <w:shd w:val="clear" w:color="auto" w:fill="E7E7E7"/>
-            <w:vAlign w:val="center"/>
-          </w:tcPr>
-          <w:p>
-            <w:pPr>
-              <w:pStyle w:val="a4"/>
-              <w:ind w:right="281"/>
-              <w:jc w:val="center"/>
-              <w:rPr>
-                <w:sz w:val="20"/>
-              </w:rPr>
-            </w:pPr>
-            <w:r>
-              <w:rPr>
-                <w:sz w:val="20"/>
-              </w:rPr>
-              <w:t>1</w:t>
-            </w:r>
-          </w:p>
-        </w:tc>
-        <w:tc>
-          <w:tcPr>
-            <w:tcW w:w="765" w:type="dxa"/>
-            <w:tcBorders>
-              <w:bottom w:val="single" w:sz="4" w:space="0" w:color="000000"/>
-            </w:tcBorders>
-            <w:shd w:val="clear" w:color="auto" w:fill="E7E7E7"/>
-            <w:vAlign w:val="center"/>
-          </w:tcPr>
-          <w:p>
-            <w:pPr>
-              <w:pStyle w:val="a4"/>
-              <w:ind w:right="281"/>
-              <w:jc w:val="center"/>
-              <w:rPr>
-                <w:sz w:val="20"/>
-              </w:rPr>
-            </w:pPr>
-            <w:r>
-              <w:rPr>
-                <w:sz w:val="20"/>
-              </w:rPr>
-              <w:t>1</w:t>
-            </w:r>
-          </w:p>
-        </w:tc>
-        <w:tc>
-          <w:tcPr>
-            <w:tcW w:w="765" w:type="dxa"/>
-            <w:tcBorders>
-              <w:bottom w:val="single" w:sz="4" w:space="0" w:color="000000"/>
-            </w:tcBorders>
-            <w:shd w:val="clear" w:color="auto" w:fill="E7E7E7"/>
-            <w:vAlign w:val="center"/>
-          </w:tcPr>
-          <w:p>
-            <w:pPr>
-              <w:pStyle w:val="a4"/>
-              <w:ind w:right="281"/>
-              <w:jc w:val="center"/>
-              <w:rPr>
-                <w:sz w:val="20"/>
-              </w:rPr>
-            </w:pPr>
-            <w:r>
-              <w:rPr>
-                <w:sz w:val="20"/>
-              </w:rPr>
-              <w:t>0</w:t>
-            </w:r>
-          </w:p>
-        </w:tc>
-        <w:tc>
-          <w:tcPr>
-            <w:tcW w:w="765" w:type="dxa"/>
-            <w:tcBorders>
-              <w:bottom w:val="single" w:sz="4" w:space="0" w:color="000000"/>
-            </w:tcBorders>
-            <w:shd w:val="clear" w:color="auto" w:fill="E7E7E7"/>
-            <w:vAlign w:val="center"/>
-          </w:tcPr>
-          <w:p>
-            <w:pPr>
-              <w:pStyle w:val="a4"/>
-              <w:ind w:right="281"/>
-              <w:jc w:val="center"/>
-              <w:rPr>
-                <w:sz w:val="20"/>
-              </w:rPr>
-            </w:pPr>
-            <w:r>
-              <w:rPr>
-                <w:sz w:val="20"/>
-              </w:rPr>
-              <w:t>1</w:t>
-            </w:r>
-          </w:p>
-        </w:tc>
-      </w:tr>
-      <w:tr>
-        <w:tblPrEx>
-          <w:tblCellMar>
-            <w:top w:w="0" w:type="dxa"/>
-            <w:bottom w:w="0" w:type="dxa"/>
-          </w:tblCellMar>
-        </w:tblPrEx>
-        <w:trPr>
-          <w:cantSplit/>
-          <w:jc w:val="center"/>
-        </w:trPr>
-        <w:tc>
-          <w:tcPr>
-            <w:tcW w:w="1928" w:type="dxa"/>
-            <w:shd w:val="clear" w:color="auto" w:fill="E7E7E7"/>
-            <w:vAlign w:val="center"/>
-          </w:tcPr>
-          <w:p>
-            <w:pPr>
-              <w:pStyle w:val="a4"/>
-              <w:ind w:right="281"/>
-              <w:jc w:val="center"/>
-              <w:rPr>
-                <w:sz w:val="20"/>
-              </w:rPr>
-            </w:pPr>
-            <w:r>
-              <w:rPr>
-                <w:sz w:val="20"/>
-              </w:rPr>
-              <w:t>15</w:t>
-            </w:r>
-          </w:p>
-        </w:tc>
-        <w:tc>
-          <w:tcPr>
-            <w:tcW w:w="765" w:type="dxa"/>
-            <w:shd w:val="clear" w:color="auto" w:fill="E7E7E7"/>
-            <w:vAlign w:val="center"/>
-          </w:tcPr>
-          <w:p>
-            <w:pPr>
-              <w:pStyle w:val="a4"/>
-              <w:ind w:right="281"/>
-              <w:jc w:val="center"/>
-              <w:rPr>
-                <w:sz w:val="20"/>
-              </w:rPr>
-            </w:pPr>
-            <w:r>
-              <w:rPr>
-                <w:sz w:val="20"/>
-              </w:rPr>
-              <w:t>1</w:t>
-            </w:r>
-          </w:p>
-        </w:tc>
-        <w:tc>
-          <w:tcPr>
-            <w:tcW w:w="765" w:type="dxa"/>
-            <w:shd w:val="clear" w:color="auto" w:fill="E7E7E7"/>
-            <w:vAlign w:val="center"/>
-          </w:tcPr>
-          <w:p>
-            <w:pPr>
-              <w:pStyle w:val="a4"/>
-              <w:ind w:right="281"/>
-              <w:jc w:val="center"/>
-              <w:rPr>
-                <w:sz w:val="20"/>
-              </w:rPr>
-            </w:pPr>
-            <w:r>
-              <w:rPr>
-                <w:sz w:val="20"/>
-              </w:rPr>
-              <w:t>1</w:t>
-            </w:r>
-          </w:p>
-        </w:tc>
-        <w:tc>
-          <w:tcPr>
-            <w:tcW w:w="765" w:type="dxa"/>
-            <w:shd w:val="clear" w:color="auto" w:fill="E7E7E7"/>
-            <w:vAlign w:val="center"/>
-          </w:tcPr>
-          <w:p>
-            <w:pPr>
-              <w:pStyle w:val="a4"/>
-              <w:ind w:right="281"/>
-              <w:jc w:val="center"/>
-              <w:rPr>
-                <w:sz w:val="20"/>
-              </w:rPr>
-            </w:pPr>
-            <w:r>
-              <w:rPr>
-                <w:sz w:val="20"/>
-              </w:rPr>
-              <w:t>1</w:t>
-            </w:r>
-          </w:p>
-        </w:tc>
-        <w:tc>
-          <w:tcPr>
-            <w:tcW w:w="765" w:type="dxa"/>
-            <w:shd w:val="clear" w:color="auto" w:fill="E7E7E7"/>
-            <w:vAlign w:val="center"/>
-          </w:tcPr>
-          <w:p>
-            <w:pPr>
-              <w:pStyle w:val="a4"/>
-              <w:ind w:right="281"/>
-              <w:jc w:val="center"/>
-              <w:rPr>
-                <w:sz w:val="20"/>
-              </w:rPr>
-            </w:pPr>
-            <w:r>
-              <w:rPr>
-                <w:sz w:val="20"/>
-              </w:rPr>
-              <w:t>1</w:t>
-            </w:r>
-          </w:p>
-        </w:tc>
-        <w:tc>
-          <w:tcPr>
-            <w:tcW w:w="765" w:type="dxa"/>
-            <w:shd w:val="clear" w:color="auto" w:fill="E7E7E7"/>
-            <w:vAlign w:val="center"/>
-          </w:tcPr>
-          <w:p>
-            <w:pPr>
-              <w:pStyle w:val="a4"/>
-              <w:ind w:right="281"/>
-              <w:jc w:val="center"/>
-              <w:rPr>
-                <w:sz w:val="20"/>
-              </w:rPr>
-            </w:pPr>
-            <w:r>
-              <w:rPr>
-                <w:sz w:val="20"/>
-              </w:rPr>
-              <w:t>1</w:t>
-            </w:r>
-          </w:p>
-        </w:tc>
-        <w:tc>
-          <w:tcPr>
-            <w:tcW w:w="765" w:type="dxa"/>
-            <w:shd w:val="clear" w:color="auto" w:fill="E7E7E7"/>
-            <w:vAlign w:val="center"/>
-          </w:tcPr>
-          <w:p>
-            <w:pPr>
-              <w:pStyle w:val="a4"/>
-              <w:ind w:right="281"/>
-              <w:jc w:val="center"/>
-              <w:rPr>
-                <w:sz w:val="20"/>
-              </w:rPr>
-            </w:pPr>
-            <w:r>
-              <w:rPr>
-                <w:sz w:val="20"/>
-              </w:rPr>
-              <w:t>1</w:t>
-            </w:r>
-          </w:p>
-        </w:tc>
-        <w:tc>
-          <w:tcPr>
-            <w:tcW w:w="765" w:type="dxa"/>
-            <w:shd w:val="clear" w:color="auto" w:fill="E7E7E7"/>
-            <w:vAlign w:val="center"/>
-          </w:tcPr>
-          <w:p>
-            <w:pPr>
-              <w:pStyle w:val="a4"/>
-              <w:ind w:right="281"/>
-              <w:jc w:val="center"/>
-              <w:rPr>
-                <w:sz w:val="20"/>
-              </w:rPr>
-            </w:pPr>
-            <w:r>
-              <w:rPr>
-                <w:sz w:val="20"/>
-              </w:rPr>
-              <w:t>0</w:t>
-            </w:r>
-          </w:p>
-        </w:tc>
-        <w:tc>
-          <w:tcPr>
-            <w:tcW w:w="765" w:type="dxa"/>
-            <w:shd w:val="clear" w:color="auto" w:fill="E7E7E7"/>
-            <w:vAlign w:val="center"/>
-          </w:tcPr>
-          <w:p>
-            <w:pPr>
-              <w:pStyle w:val="a4"/>
-              <w:ind w:right="281"/>
               <w:jc w:val="center"/>
               <w:rPr>
                 <w:sz w:val="20"/>
@@ -8940,12 +8420,6 @@
         </w:tc>
       </w:tr>
     </w:tbl>
-    <w:p>
-      <w:pPr>
-        <w:pStyle w:val="a4"/>
-        <w:spacing w:line="360" w:lineRule="auto"/>
-      </w:pPr>
-    </w:p>
     <w:p>
       <w:pPr>
         <w:pStyle w:val="a4"/>
@@ -8963,6 +8437,103 @@
         <w:ind w:right="281"/>
         <w:jc w:val="center"/>
       </w:pPr>
+    </w:p>
+    <w:p>
+      <w:r>
+        <w:br w:type="page"/>
+      </w:r>
+    </w:p>
+    <w:p>
+      <w:pPr>
+        <w:spacing w:before="0" w:after="0" w:line="360" w:lineRule="auto"/>
+        <w:ind w:firstLine="709" w:left="0" w:right="0"/>
+        <w:jc w:val="both"/>
+      </w:pPr>
+      <w:r>
+        <w:rPr>
+          <w:rFonts w:ascii="Times New Roman" w:hAnsi="Times New Roman" w:eastAsia="Times New Roman" w:cs="Times New Roman"/>
+          <w:b w:val="0"/>
+          <w:i w:val="0"/>
+          <w:sz w:val="28"/>
+        </w:rPr>
+        <w:t>Далее необходимо минимизировать функции входов D3…D0 для упрощения дальнейшего построения схемы. Для этого применим карты Карно. В строках и столбцах карт используется порядок кодов Грея 00, 01, 11, 10. Неиспользуемые состояния 1 (0001) и 15 (1111) обозначены символом X и рассматриваются как факультативные наборы.</w:t>
+      </w:r>
+    </w:p>
+    <w:p>
+      <w:pPr>
+        <w:keepNext/>
+        <w:spacing w:before="0" w:after="0" w:line="360" w:lineRule="auto"/>
+        <w:ind w:firstLine="709" w:left="0" w:right="0"/>
+        <w:jc w:val="both"/>
+      </w:pPr>
+      <w:r>
+        <w:rPr>
+          <w:rFonts w:ascii="Times New Roman" w:hAnsi="Times New Roman" w:eastAsia="Times New Roman" w:cs="Times New Roman"/>
+          <w:b w:val="0"/>
+          <w:i w:val="0"/>
+          <w:sz w:val="28"/>
+        </w:rPr>
+        <w:t>На рисунке 2.2 представлены карты Карно для входов D3…D0.</w:t>
+      </w:r>
+    </w:p>
+    <w:p>
+      <w:pPr>
+        <w:keepNext/>
+        <w:spacing w:before="120" w:after="60"/>
+        <w:ind w:firstLine="0"/>
+        <w:jc w:val="center"/>
+      </w:pPr>
+      <w:r>
+        <w:drawing>
+          <wp:inline xmlns:a="http://schemas.openxmlformats.org/drawingml/2006/main" xmlns:pic="http://schemas.openxmlformats.org/drawingml/2006/picture">
+            <wp:extent cx="5760000" cy="4107097"/>
+            <wp:docPr id="918597014" name="Picture 918597014" descr="Карты Карно для входов D3, D2, D1 и D0"/>
+            <wp:cNvGraphicFramePr>
+              <a:graphicFrameLocks noChangeAspect="1"/>
+            </wp:cNvGraphicFramePr>
+            <a:graphic>
+              <a:graphicData uri="http://schemas.openxmlformats.org/drawingml/2006/picture">
+                <pic:pic>
+                  <pic:nvPicPr>
+                    <pic:cNvPr id="0" name="karnaugh_maps_clean.png"/>
+                    <pic:cNvPicPr/>
+                  </pic:nvPicPr>
+                  <pic:blipFill>
+                    <a:blip r:embed="rId17"/>
+                    <a:stretch>
+                      <a:fillRect/>
+                    </a:stretch>
+                  </pic:blipFill>
+                  <pic:spPr>
+                    <a:xfrm>
+                      <a:off x="0" y="0"/>
+                      <a:ext cx="5760000" cy="4107097"/>
+                    </a:xfrm>
+                    <a:prstGeom prst="rect"/>
+                  </pic:spPr>
+                </pic:pic>
+              </a:graphicData>
+            </a:graphic>
+          </wp:inline>
+        </w:drawing>
+      </w:r>
+    </w:p>
+    <w:p>
+      <w:pPr>
+        <w:keepLines/>
+        <w:spacing w:before="60" w:after="0" w:line="240" w:lineRule="auto"/>
+        <w:ind w:firstLine="0"/>
+        <w:jc w:val="center"/>
+      </w:pPr>
+      <w:r>
+        <w:rPr>
+          <w:rFonts w:ascii="Times New Roman" w:hAnsi="Times New Roman" w:eastAsia="Times New Roman" w:cs="Times New Roman"/>
+          <w:b w:val="0"/>
+          <w:i w:val="0"/>
+          <w:sz w:val="28"/>
+        </w:rPr>
+        <w:t>Рисунок 2.2 – Карты Карно: а) – для входа D3; б) – для входа D2; в) – для входа D1; г) – для входа D0</w:t>
+      </w:r>
     </w:p>
     <w:sectPr>
       <w:type w:val="continuous"/>
@@ -9120,28 +8691,21 @@
             </wp:anchor>
           </w:drawing>
         </mc:Choice>
-        <mc:Fallback xmlns:pic="http://schemas.openxmlformats.org/drawingml/2006/picture">
+        <mc:Fallback>
           <w:pict>
-            <v:rect id="shape_0" stroked="f" o:allowincell="f" style="position:absolute;margin-left:319.6pt;margin-top:756.05pt;width:13pt;height:14.2pt;mso-wrap-style:square;v-text-anchor:top;mso-position-horizontal-relative:page;mso-position-vertical-relative:page">
-              <v:fill o:detectmouseclick="t" on="false"/>
-              <v:stroke color="#3465a4" joinstyle="round" endcap="flat"/>
-              <v:textbox>
+            <v:rect w14:anchorId="76B83B2D" id="Textbox 1" o:spid="_x0000_s1026" style="position:absolute;margin-left:319.6pt;margin-top:756.05pt;width:13.05pt;height:14.25pt;z-index:-251660288;visibility:visible;mso-wrap-style:square;mso-wrap-distance-left:0;mso-wrap-distance-top:0;mso-wrap-distance-right:0;mso-wrap-distance-bottom:0;mso-position-horizontal:absolute;mso-position-horizontal-relative:page;mso-position-vertical:absolute;mso-position-vertical-relative:page;v-text-anchor:top" o:gfxdata="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" o:allowincell="f" filled="f" stroked="f" strokeweight="0">
+              <v:textbox inset="0,0,0,0">
                 <w:txbxContent>
                   <w:p>
                     <w:pPr>
                       <w:pStyle w:val="FrameContentsuser"/>
-                      <w:spacing w:before="11" w:after="0"/>
-                      <w:ind w:hanging="0" w:start="20" w:end="0"/>
-                      <w:jc w:val="start"/>
-                      <w:rPr>
-                        <w:sz w:val="22"/>
-                      </w:rPr>
+                      <w:spacing w:before="11"/>
+                      <w:ind w:left="20"/>
                     </w:pPr>
                     <w:r>
                       <w:rPr>
                         <w:color w:val="000000"/>
                         <w:spacing w:val="-5"/>
-                        <w:sz w:val="22"/>
                       </w:rPr>
                       <w:fldChar w:fldCharType="begin"/>
                     </w:r>
@@ -9149,7 +8713,6 @@
                       <w:rPr>
                         <w:color w:val="000000"/>
                         <w:spacing w:val="-5"/>
-                        <w:sz w:val="22"/>
                       </w:rPr>
                       <w:instrText xml:space="preserve"> PAGE </w:instrText>
                     </w:r>
@@ -9157,7 +8720,6 @@
                       <w:rPr>
                         <w:color w:val="000000"/>
                         <w:spacing w:val="-5"/>
-                        <w:sz w:val="22"/>
                       </w:rPr>
                       <w:fldChar w:fldCharType="separate"/>
                     </w:r>
@@ -9165,7 +8727,6 @@
                       <w:rPr>
                         <w:color w:val="000000"/>
                         <w:spacing w:val="-5"/>
-                        <w:sz w:val="22"/>
                       </w:rPr>
                       <w:t>2</w:t>
                     </w:r>
@@ -9173,14 +8734,13 @@
                       <w:rPr>
                         <w:color w:val="000000"/>
                         <w:spacing w:val="-5"/>
-                        <w:sz w:val="22"/>
                       </w:rPr>
                       <w:fldChar w:fldCharType="end"/>
                     </w:r>
                   </w:p>
                 </w:txbxContent>
               </v:textbox>
-              <w10:wrap type="none"/>
+              <w10:wrap anchorx="page" anchory="page"/>
             </v:rect>
           </w:pict>
         </mc:Fallback>
@@ -9305,28 +8865,21 @@
             </wp:anchor>
           </w:drawing>
         </mc:Choice>
-        <mc:Fallback xmlns:pic="http://schemas.openxmlformats.org/drawingml/2006/picture">
+        <mc:Fallback>
           <w:pict>
-            <v:rect id="shape_0" stroked="f" o:allowincell="f" style="position:absolute;margin-left:319.6pt;margin-top:756.05pt;width:13pt;height:14.2pt;mso-wrap-style:square;v-text-anchor:top;mso-position-horizontal-relative:page;mso-position-vertical-relative:page">
-              <v:fill o:detectmouseclick="t" on="false"/>
-              <v:stroke color="#3465a4" joinstyle="round" endcap="flat"/>
-              <v:textbox>
+            <v:rect w14:anchorId="1AF1776D" id="_x0000_s1027" style="position:absolute;margin-left:319.6pt;margin-top:756.05pt;width:13.05pt;height:14.25pt;z-index:-251659264;visibility:visible;mso-wrap-style:square;mso-wrap-distance-left:0;mso-wrap-distance-top:0;mso-wrap-distance-right:0;mso-wrap-distance-bottom:0;mso-position-horizontal:absolute;mso-position-horizontal-relative:page;mso-position-vertical:absolute;mso-position-vertical-relative:page;v-text-anchor:top" o:gfxdata="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" o:allowincell="f" filled="f" stroked="f" strokeweight="0">
+              <v:textbox inset="0,0,0,0">
                 <w:txbxContent>
                   <w:p>
                     <w:pPr>
                       <w:pStyle w:val="FrameContentsuser"/>
-                      <w:spacing w:before="11" w:after="0"/>
-                      <w:ind w:hanging="0" w:start="20" w:end="0"/>
-                      <w:jc w:val="start"/>
-                      <w:rPr>
-                        <w:sz w:val="22"/>
-                      </w:rPr>
+                      <w:spacing w:before="11"/>
+                      <w:ind w:left="20"/>
                     </w:pPr>
                     <w:r>
                       <w:rPr>
                         <w:color w:val="000000"/>
                         <w:spacing w:val="-5"/>
-                        <w:sz w:val="22"/>
                       </w:rPr>
                       <w:fldChar w:fldCharType="begin"/>
                     </w:r>
@@ -9334,7 +8887,6 @@
                       <w:rPr>
                         <w:color w:val="000000"/>
                         <w:spacing w:val="-5"/>
-                        <w:sz w:val="22"/>
                       </w:rPr>
                       <w:instrText xml:space="preserve"> PAGE </w:instrText>
                     </w:r>
@@ -9342,7 +8894,6 @@
                       <w:rPr>
                         <w:color w:val="000000"/>
                         <w:spacing w:val="-5"/>
-                        <w:sz w:val="22"/>
                       </w:rPr>
                       <w:fldChar w:fldCharType="separate"/>
                     </w:r>
@@ -9350,7 +8901,6 @@
                       <w:rPr>
                         <w:color w:val="000000"/>
                         <w:spacing w:val="-5"/>
-                        <w:sz w:val="22"/>
                       </w:rPr>
                       <w:t>2</w:t>
                     </w:r>
@@ -9358,14 +8908,13 @@
                       <w:rPr>
                         <w:color w:val="000000"/>
                         <w:spacing w:val="-5"/>
-                        <w:sz w:val="22"/>
                       </w:rPr>
                       <w:fldChar w:fldCharType="end"/>
                     </w:r>
                   </w:p>
                 </w:txbxContent>
               </v:textbox>
-              <w10:wrap type="none"/>
+              <w10:wrap anchorx="page" anchory="page"/>
             </v:rect>
           </w:pict>
         </mc:Fallback>
@@ -9500,28 +9049,21 @@
             </wp:anchor>
           </w:drawing>
         </mc:Choice>
-        <mc:Fallback xmlns:pic="http://schemas.openxmlformats.org/drawingml/2006/picture">
+        <mc:Fallback>
           <w:pict>
-            <v:rect id="shape_0" stroked="f" o:allowincell="f" style="position:absolute;margin-left:319.6pt;margin-top:756.05pt;width:13pt;height:14.2pt;mso-wrap-style:square;v-text-anchor:top;mso-position-horizontal-relative:page;mso-position-vertical-relative:page">
-              <v:fill o:detectmouseclick="t" on="false"/>
-              <v:stroke color="#3465a4" joinstyle="round" endcap="flat"/>
-              <v:textbox>
+            <v:rect w14:anchorId="7AE76D1D" id="Textbox 3" o:spid="_x0000_s1028" style="position:absolute;margin-left:319.6pt;margin-top:756.05pt;width:13.05pt;height:14.25pt;z-index:-251658240;visibility:visible;mso-wrap-style:square;mso-wrap-distance-left:0;mso-wrap-distance-top:0;mso-wrap-distance-right:0;mso-wrap-distance-bottom:0;mso-position-horizontal:absolute;mso-position-horizontal-relative:page;mso-position-vertical:absolute;mso-position-vertical-relative:page;v-text-anchor:top" o:gfxdata="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" o:allowincell="f" filled="f" stroked="f" strokeweight="0">
+              <v:textbox inset="0,0,0,0">
                 <w:txbxContent>
                   <w:p>
                     <w:pPr>
                       <w:pStyle w:val="FrameContentsuser"/>
-                      <w:spacing w:before="11" w:after="0"/>
-                      <w:ind w:hanging="0" w:start="20" w:end="0"/>
-                      <w:jc w:val="start"/>
-                      <w:rPr>
-                        <w:sz w:val="22"/>
-                      </w:rPr>
+                      <w:spacing w:before="11"/>
+                      <w:ind w:left="20"/>
                     </w:pPr>
                     <w:r>
                       <w:rPr>
                         <w:color w:val="000000"/>
                         <w:spacing w:val="-5"/>
-                        <w:sz w:val="22"/>
                       </w:rPr>
                       <w:fldChar w:fldCharType="begin"/>
                     </w:r>
@@ -9529,7 +9071,6 @@
                       <w:rPr>
                         <w:color w:val="000000"/>
                         <w:spacing w:val="-5"/>
-                        <w:sz w:val="22"/>
                       </w:rPr>
                       <w:instrText xml:space="preserve"> PAGE </w:instrText>
                     </w:r>
@@ -9537,7 +9078,6 @@
                       <w:rPr>
                         <w:color w:val="000000"/>
                         <w:spacing w:val="-5"/>
-                        <w:sz w:val="22"/>
                       </w:rPr>
                       <w:fldChar w:fldCharType="separate"/>
                     </w:r>
@@ -9545,7 +9085,6 @@
                       <w:rPr>
                         <w:color w:val="000000"/>
                         <w:spacing w:val="-5"/>
-                        <w:sz w:val="22"/>
                       </w:rPr>
                       <w:t>5</w:t>
                     </w:r>
@@ -9553,14 +9092,13 @@
                       <w:rPr>
                         <w:color w:val="000000"/>
                         <w:spacing w:val="-5"/>
-                        <w:sz w:val="22"/>
                       </w:rPr>
                       <w:fldChar w:fldCharType="end"/>
                     </w:r>
                   </w:p>
                 </w:txbxContent>
               </v:textbox>
-              <w10:wrap type="none"/>
+              <w10:wrap anchorx="page" anchory="page"/>
             </v:rect>
           </w:pict>
         </mc:Fallback>
@@ -9685,28 +9223,21 @@
             </wp:anchor>
           </w:drawing>
         </mc:Choice>
-        <mc:Fallback xmlns:pic="http://schemas.openxmlformats.org/drawingml/2006/picture">
+        <mc:Fallback>
           <w:pict>
-            <v:rect id="shape_0" stroked="f" o:allowincell="f" style="position:absolute;margin-left:319.6pt;margin-top:756.05pt;width:13pt;height:14.2pt;mso-wrap-style:square;v-text-anchor:top;mso-position-horizontal-relative:page;mso-position-vertical-relative:page">
-              <v:fill o:detectmouseclick="t" on="false"/>
-              <v:stroke color="#3465a4" joinstyle="round" endcap="flat"/>
-              <v:textbox>
+            <v:rect w14:anchorId="2EBFB359" id="_x0000_s1029" style="position:absolute;margin-left:319.6pt;margin-top:756.05pt;width:13.05pt;height:14.25pt;z-index:-251657216;visibility:visible;mso-wrap-style:square;mso-wrap-distance-left:0;mso-wrap-distance-top:0;mso-wrap-distance-right:0;mso-wrap-distance-bottom:0;mso-position-horizontal:absolute;mso-position-horizontal-relative:page;mso-position-vertical:absolute;mso-position-vertical-relative:page;v-text-anchor:top" o:gfxdata="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" o:allowincell="f" filled="f" stroked="f" strokeweight="0">
+              <v:textbox inset="0,0,0,0">
                 <w:txbxContent>
                   <w:p>
                     <w:pPr>
                       <w:pStyle w:val="FrameContentsuser"/>
-                      <w:spacing w:before="11" w:after="0"/>
-                      <w:ind w:hanging="0" w:start="20" w:end="0"/>
-                      <w:jc w:val="start"/>
-                      <w:rPr>
-                        <w:sz w:val="22"/>
-                      </w:rPr>
+                      <w:spacing w:before="11"/>
+                      <w:ind w:left="20"/>
                     </w:pPr>
                     <w:r>
                       <w:rPr>
                         <w:color w:val="000000"/>
                         <w:spacing w:val="-5"/>
-                        <w:sz w:val="22"/>
                       </w:rPr>
                       <w:fldChar w:fldCharType="begin"/>
                     </w:r>
@@ -9714,7 +9245,6 @@
                       <w:rPr>
                         <w:color w:val="000000"/>
                         <w:spacing w:val="-5"/>
-                        <w:sz w:val="22"/>
                       </w:rPr>
                       <w:instrText xml:space="preserve"> PAGE </w:instrText>
                     </w:r>
@@ -9722,7 +9252,6 @@
                       <w:rPr>
                         <w:color w:val="000000"/>
                         <w:spacing w:val="-5"/>
-                        <w:sz w:val="22"/>
                       </w:rPr>
                       <w:fldChar w:fldCharType="separate"/>
                     </w:r>
@@ -9730,7 +9259,6 @@
                       <w:rPr>
                         <w:color w:val="000000"/>
                         <w:spacing w:val="-5"/>
-                        <w:sz w:val="22"/>
                       </w:rPr>
                       <w:t>5</w:t>
                     </w:r>
@@ -9738,14 +9266,13 @@
                       <w:rPr>
                         <w:color w:val="000000"/>
                         <w:spacing w:val="-5"/>
-                        <w:sz w:val="22"/>
                       </w:rPr>
                       <w:fldChar w:fldCharType="end"/>
                     </w:r>
                   </w:p>
                 </w:txbxContent>
               </v:textbox>
-              <w10:wrap type="none"/>
+              <w10:wrap anchorx="page" anchory="page"/>
             </v:rect>
           </w:pict>
         </mc:Fallback>

</xml_diff>

<commit_message>
report: add Karnaugh map groupings
</commit_message>
<xml_diff>
--- a/deliverables/Курсовая_Блинов_текущая.docx
+++ b/deliverables/Курсовая_Блинов_текущая.docx
@@ -4331,7 +4331,7 @@
         <w:tabs>
           <w:tab w:val="left" w:pos="1130"/>
         </w:tabs>
-        <w:ind w:left="1130" w:hanging="279"/>
+        <w:ind w:left="1130" w:right="283" w:hanging="279"/>
       </w:pPr>
       <w:bookmarkStart w:id="3" w:name="_bookmark3"/>
       <w:bookmarkEnd w:id="3"/>
@@ -4380,7 +4380,7 @@
           <w:tab w:val="left" w:pos="1269"/>
         </w:tabs>
         <w:spacing w:before="163"/>
-        <w:ind w:left="1269" w:hanging="418"/>
+        <w:ind w:left="1269" w:right="283" w:hanging="418"/>
       </w:pPr>
       <w:bookmarkStart w:id="4" w:name="_bookmark4"/>
       <w:bookmarkEnd w:id="4"/>
@@ -4421,6 +4421,7 @@
     <w:p>
       <w:pPr>
         <w:pStyle w:val="a4"/>
+        <w:ind w:right="283"/>
         <w:rPr>
           <w:b/>
         </w:rPr>
@@ -4430,6 +4431,7 @@
       <w:pPr>
         <w:pStyle w:val="a4"/>
         <w:spacing w:before="26"/>
+        <w:ind w:right="283"/>
         <w:rPr>
           <w:b/>
         </w:rPr>
@@ -4445,7 +4447,7 @@
         <w:tabs>
           <w:tab w:val="left" w:pos="1130"/>
         </w:tabs>
-        <w:ind w:left="1130" w:hanging="279"/>
+        <w:ind w:left="1130" w:right="283" w:hanging="279"/>
         <w:rPr>
           <w:sz w:val="28"/>
         </w:rPr>
@@ -4468,7 +4470,7 @@
           <w:tab w:val="left" w:pos="1130"/>
         </w:tabs>
         <w:spacing w:before="160"/>
-        <w:ind w:left="1130" w:hanging="279"/>
+        <w:ind w:left="1130" w:right="283" w:hanging="279"/>
         <w:rPr>
           <w:sz w:val="28"/>
         </w:rPr>
@@ -4491,7 +4493,7 @@
           <w:tab w:val="left" w:pos="1130"/>
         </w:tabs>
         <w:spacing w:before="163"/>
-        <w:ind w:left="1130" w:hanging="279"/>
+        <w:ind w:left="1130" w:right="283" w:hanging="279"/>
         <w:rPr>
           <w:sz w:val="28"/>
         </w:rPr>
@@ -4542,7 +4544,7 @@
           <w:tab w:val="left" w:pos="1130"/>
         </w:tabs>
         <w:spacing w:before="161"/>
-        <w:ind w:left="1130" w:hanging="279"/>
+        <w:ind w:left="1130" w:right="283" w:hanging="279"/>
         <w:rPr>
           <w:sz w:val="28"/>
         </w:rPr>
@@ -4565,7 +4567,7 @@
           <w:tab w:val="left" w:pos="1130"/>
         </w:tabs>
         <w:spacing w:before="160"/>
-        <w:ind w:left="1130" w:hanging="279"/>
+        <w:ind w:left="1130" w:right="283" w:hanging="279"/>
         <w:rPr>
           <w:sz w:val="28"/>
         </w:rPr>
@@ -4580,12 +4582,14 @@
     <w:p>
       <w:pPr>
         <w:pStyle w:val="a4"/>
+        <w:ind w:right="283"/>
       </w:pPr>
     </w:p>
     <w:p>
       <w:pPr>
         <w:pStyle w:val="a4"/>
         <w:spacing w:before="25"/>
+        <w:ind w:right="283"/>
       </w:pPr>
     </w:p>
     <w:p>
@@ -4598,7 +4602,7 @@
         <w:tabs>
           <w:tab w:val="left" w:pos="1480"/>
         </w:tabs>
-        <w:ind w:left="1480" w:hanging="629"/>
+        <w:ind w:left="1480" w:right="283" w:hanging="629"/>
       </w:pPr>
       <w:r>
         <w:t>Порядок синтеза</w:t>
@@ -4607,6 +4611,7 @@
     <w:p>
       <w:pPr>
         <w:pStyle w:val="a4"/>
+        <w:ind w:right="283"/>
         <w:rPr>
           <w:b/>
         </w:rPr>
@@ -4616,6 +4621,7 @@
       <w:pPr>
         <w:pStyle w:val="a4"/>
         <w:spacing w:before="26"/>
+        <w:ind w:right="283"/>
         <w:rPr>
           <w:b/>
         </w:rPr>
@@ -4625,7 +4631,7 @@
       <w:pPr>
         <w:pStyle w:val="a4"/>
         <w:spacing w:line="360" w:lineRule="auto"/>
-        <w:ind w:left="143" w:right="419" w:firstLine="707"/>
+        <w:ind w:left="143" w:right="283" w:firstLine="707"/>
         <w:jc w:val="both"/>
       </w:pPr>
       <w:r>
@@ -4635,6 +4641,7 @@
     <w:p>
       <w:pPr>
         <w:pStyle w:val="a4"/>
+        <w:ind w:right="283"/>
         <w:rPr>
           <w:sz w:val="20"/>
         </w:rPr>
@@ -4644,6 +4651,7 @@
       <w:pPr>
         <w:pStyle w:val="a4"/>
         <w:spacing w:before="33"/>
+        <w:ind w:right="283"/>
         <w:jc w:val="center"/>
         <w:rPr>
           <w:sz w:val="20"/>
@@ -4693,6 +4701,7 @@
     <w:p>
       <w:pPr>
         <w:pStyle w:val="a4"/>
+        <w:ind w:right="283"/>
         <w:jc w:val="center"/>
         <w:rPr>
           <w:spacing w:val="-5"/>
@@ -4823,7 +4832,7 @@
             <w:pPr>
               <w:pStyle w:val="a4"/>
               <w:spacing w:before="160" w:after="240"/>
-              <w:ind w:right="35"/>
+              <w:ind w:right="283"/>
               <w:jc w:val="right"/>
             </w:pPr>
             <w:r>
@@ -4837,6 +4846,7 @@
       <w:pPr>
         <w:pStyle w:val="a4"/>
         <w:spacing w:line="360" w:lineRule="auto"/>
+        <w:ind w:right="283"/>
       </w:pPr>
     </w:p>
     <w:p>
@@ -4873,6 +4883,7 @@
       <w:pPr>
         <w:pStyle w:val="a4"/>
         <w:spacing w:before="80" w:after="80" w:line="360" w:lineRule="auto"/>
+        <w:ind w:right="283"/>
         <w:jc w:val="center"/>
       </w:pPr>
       <w:r>
@@ -4926,6 +4937,7 @@
       <w:pPr>
         <w:pStyle w:val="a4"/>
         <w:spacing w:after="160" w:line="360" w:lineRule="auto"/>
+        <w:ind w:right="283"/>
         <w:jc w:val="center"/>
       </w:pPr>
       <w:r>
@@ -4944,6 +4956,7 @@
       <w:pPr>
         <w:pStyle w:val="a4"/>
         <w:spacing w:after="160" w:line="360" w:lineRule="auto"/>
+        <w:ind w:right="283"/>
         <w:jc w:val="center"/>
       </w:pPr>
     </w:p>
@@ -5341,6 +5354,7 @@
       <w:pPr>
         <w:pStyle w:val="a4"/>
         <w:spacing w:line="360" w:lineRule="auto"/>
+        <w:ind w:right="283"/>
         <w:jc w:val="center"/>
       </w:pPr>
       <w:r>
@@ -5357,17 +5371,11 @@
     <w:p>
       <w:pPr>
         <w:pStyle w:val="a4"/>
-        <w:spacing w:line="360" w:lineRule="auto" w:before="0" w:after="0"/>
-        <w:ind w:right="0" w:firstLine="709" w:left="0"/>
+        <w:spacing w:line="360" w:lineRule="auto"/>
+        <w:ind w:right="283" w:firstLine="709"/>
         <w:jc w:val="both"/>
       </w:pPr>
       <w:r>
-        <w:rPr>
-          <w:rFonts w:ascii="Times New Roman" w:hAnsi="Times New Roman" w:eastAsia="Times New Roman" w:cs="Times New Roman"/>
-          <w:b w:val="0"/>
-          <w:i w:val="0"/>
-          <w:sz w:val="28"/>
-        </w:rPr>
         <w:t>После построения таблицы переходов D-триггера составим таблицу выходных состояний ПСУ Q3…Q0 и входов триггеров D3…D0. Значения D3…D0 совпадают с двоичным кодом следующего состояния. Неиспользуемые коды 1 (0001) и 15 (1111) не входят в рабочий цикл и при минимизации обозначаются символом X.</w:t>
       </w:r>
     </w:p>
@@ -5377,9 +5385,6 @@
         <w:spacing w:after="160" w:line="360" w:lineRule="auto"/>
         <w:ind w:right="283" w:firstLine="709"/>
         <w:jc w:val="both"/>
-        <w:rPr>
-          <w:lang w:val="en-US"/>
-        </w:rPr>
       </w:pPr>
       <w:r>
         <w:t>Таблица выходных состояний ПСУ и входов триггеров представлена на рисунке 2.1.</w:t>
@@ -5391,9 +5396,6 @@
         <w:spacing w:after="160" w:line="360" w:lineRule="auto"/>
         <w:ind w:right="283" w:firstLine="709"/>
         <w:jc w:val="both"/>
-        <w:rPr>
-          <w:lang w:val="en-US"/>
-        </w:rPr>
       </w:pPr>
     </w:p>
     <w:tbl>
@@ -8424,6 +8426,7 @@
       <w:pPr>
         <w:pStyle w:val="a4"/>
         <w:spacing w:line="360" w:lineRule="auto"/>
+        <w:ind w:right="283"/>
         <w:jc w:val="center"/>
       </w:pPr>
       <w:r>
@@ -8445,32 +8448,27 @@
     </w:p>
     <w:p>
       <w:pPr>
-        <w:spacing w:before="0" w:after="0" w:line="360" w:lineRule="auto"/>
-        <w:ind w:firstLine="709" w:left="0" w:right="0"/>
+        <w:spacing w:line="360" w:lineRule="auto"/>
+        <w:ind w:right="283" w:firstLine="709"/>
         <w:jc w:val="both"/>
       </w:pPr>
       <w:r>
         <w:rPr>
-          <w:rFonts w:ascii="Times New Roman" w:hAnsi="Times New Roman" w:eastAsia="Times New Roman" w:cs="Times New Roman"/>
-          <w:b w:val="0"/>
-          <w:i w:val="0"/>
           <w:sz w:val="28"/>
         </w:rPr>
+        <w:lastRenderedPageBreak/>
         <w:t>Далее необходимо минимизировать функции входов D3…D0 для упрощения дальнейшего построения схемы. Для этого применим карты Карно. В строках и столбцах карт используется порядок кодов Грея 00, 01, 11, 10. Неиспользуемые состояния 1 (0001) и 15 (1111) обозначены символом X и рассматриваются как факультативные наборы.</w:t>
       </w:r>
     </w:p>
     <w:p>
       <w:pPr>
         <w:keepNext/>
-        <w:spacing w:before="0" w:after="0" w:line="360" w:lineRule="auto"/>
-        <w:ind w:firstLine="709" w:left="0" w:right="0"/>
+        <w:spacing w:line="360" w:lineRule="auto"/>
+        <w:ind w:right="283" w:firstLine="709"/>
         <w:jc w:val="both"/>
       </w:pPr>
       <w:r>
         <w:rPr>
-          <w:rFonts w:ascii="Times New Roman" w:hAnsi="Times New Roman" w:eastAsia="Times New Roman" w:cs="Times New Roman"/>
-          <w:b w:val="0"/>
-          <w:i w:val="0"/>
           <w:sz w:val="28"/>
         </w:rPr>
         <w:t>На рисунке 2.2 представлены карты Карно для входов D3…D0.</w:t>
@@ -8480,14 +8478,13 @@
       <w:pPr>
         <w:keepNext/>
         <w:spacing w:before="120" w:after="60"/>
-        <w:ind w:firstLine="0"/>
         <w:jc w:val="center"/>
       </w:pPr>
       <w:r>
         <w:drawing>
           <wp:inline xmlns:a="http://schemas.openxmlformats.org/drawingml/2006/main" xmlns:pic="http://schemas.openxmlformats.org/drawingml/2006/picture">
-            <wp:extent cx="5760000" cy="4107097"/>
-            <wp:docPr id="918597014" name="Picture 918597014" descr="Карты Карно для входов D3, D2, D1 и D0"/>
+            <wp:extent cx="5760000" cy="4532903"/>
+            <wp:docPr id="918597014" name="Picture 918597014" descr="Карты Карно D3…D0 с овальными группами"/>
             <wp:cNvGraphicFramePr>
               <a:graphicFrameLocks noChangeAspect="1"/>
             </wp:cNvGraphicFramePr>
@@ -8495,11 +8492,11 @@
               <a:graphicData uri="http://schemas.openxmlformats.org/drawingml/2006/picture">
                 <pic:pic>
                   <pic:nvPicPr>
-                    <pic:cNvPr id="0" name="karnaugh_maps_clean.png"/>
+                    <pic:cNvPr id="0" name="Карты_Карно_с_овалами_Word.png"/>
                     <pic:cNvPicPr/>
                   </pic:nvPicPr>
                   <pic:blipFill>
-                    <a:blip r:embed="rId17"/>
+                    <a:blip r:embed="rId18"/>
                     <a:stretch>
                       <a:fillRect/>
                     </a:stretch>
@@ -8507,7 +8504,7 @@
                   <pic:spPr>
                     <a:xfrm>
                       <a:off x="0" y="0"/>
-                      <a:ext cx="5760000" cy="4107097"/>
+                      <a:ext cx="5760000" cy="4532903"/>
                     </a:xfrm>
                     <a:prstGeom prst="rect"/>
                   </pic:spPr>
@@ -8521,15 +8518,12 @@
     <w:p>
       <w:pPr>
         <w:keepLines/>
-        <w:spacing w:before="60" w:after="0" w:line="240" w:lineRule="auto"/>
-        <w:ind w:firstLine="0"/>
+        <w:spacing w:before="60"/>
+        <w:ind w:right="283"/>
         <w:jc w:val="center"/>
       </w:pPr>
       <w:r>
         <w:rPr>
-          <w:rFonts w:ascii="Times New Roman" w:hAnsi="Times New Roman" w:eastAsia="Times New Roman" w:cs="Times New Roman"/>
-          <w:b w:val="0"/>
-          <w:i w:val="0"/>
           <w:sz w:val="28"/>
         </w:rPr>
         <w:t>Рисунок 2.2 – Карты Карно: а) – для входа D3; б) – для входа D2; в) – для входа D1; г) – для входа D0</w:t>

</xml_diff>

<commit_message>
report: refine Karnaugh map figure layout
</commit_message>
<xml_diff>
--- a/deliverables/Курсовая_Блинов_текущая.docx
+++ b/deliverables/Курсовая_Блинов_текущая.docx
@@ -394,7 +394,6 @@
         <w:ind w:right="285"/>
         <w:jc w:val="center"/>
       </w:pPr>
-      <w:proofErr w:type="gramStart"/>
       <w:r>
         <w:rPr>
           <w:b/>
@@ -421,7 +420,6 @@
         </w:rPr>
         <w:t>информационных</w:t>
       </w:r>
-      <w:proofErr w:type="gramEnd"/>
       <w:r>
         <w:rPr>
           <w:spacing w:val="-5"/>
@@ -491,23 +489,7 @@
         <w:jc w:val="center"/>
       </w:pPr>
       <w:r>
-        <w:t>СИНТЕЗ ПЕРЕСЧЕТНОГО УСТРОЙСТВА 13-2-14-</w:t>
-      </w:r>
-      <w:proofErr w:type="gramStart"/>
-      <w:r>
-        <w:t>11-0</w:t>
-      </w:r>
-      <w:proofErr w:type="gramEnd"/>
-      <w:r>
-        <w:t>-12-9-5-</w:t>
-      </w:r>
-      <w:proofErr w:type="gramStart"/>
-      <w:r>
-        <w:t>7-8</w:t>
-      </w:r>
-      <w:proofErr w:type="gramEnd"/>
-      <w:r>
-        <w:t>-4-3-10-6 НА ТРИГГЕРАХ 74AS74</w:t>
+        <w:t>СИНТЕЗ ПЕРЕСЧЕТНОГО УСТРОЙСТВА 13-2-14-11-0-12-9-5-7-8-4-3-10-6 НА ТРИГГЕРАХ 74AS74</w:t>
       </w:r>
     </w:p>
     <w:p>
@@ -1322,23 +1304,7 @@
         <w:jc w:val="center"/>
       </w:pPr>
       <w:r>
-        <w:t>на тему «Синтез пересчетного устройства 13-2-14-</w:t>
-      </w:r>
-      <w:proofErr w:type="gramStart"/>
-      <w:r>
-        <w:t>11-0</w:t>
-      </w:r>
-      <w:proofErr w:type="gramEnd"/>
-      <w:r>
-        <w:t>-12-9-5-</w:t>
-      </w:r>
-      <w:proofErr w:type="gramStart"/>
-      <w:r>
-        <w:t>7-8</w:t>
-      </w:r>
-      <w:proofErr w:type="gramEnd"/>
-      <w:r>
-        <w:t>-4-3-10-6 на триггерах 74AS74»</w:t>
+        <w:t>на тему «Синтез пересчетного устройства 13-2-14-11-0-12-9-5-7-8-4-3-10-6 на триггерах 74AS74»</w:t>
       </w:r>
     </w:p>
     <w:p>
@@ -1926,17 +1892,8 @@
                 <w:rFonts w:ascii="Times New Roman" w:hAnsi="Times New Roman"/>
                 <w:sz w:val="28"/>
               </w:rPr>
-              <w:t xml:space="preserve">Блинов </w:t>
-            </w:r>
-            <w:proofErr w:type="gramStart"/>
-            <w:r>
-              <w:rPr>
-                <w:rFonts w:ascii="Times New Roman" w:hAnsi="Times New Roman"/>
-                <w:sz w:val="28"/>
-              </w:rPr>
-              <w:t>К.И.</w:t>
-            </w:r>
-            <w:proofErr w:type="gramEnd"/>
+              <w:t>Блинов К.И.</w:t>
+            </w:r>
           </w:p>
         </w:tc>
       </w:tr>
@@ -3325,43 +3282,7 @@
                 <w:spacing w:val="-2"/>
                 <w:sz w:val="24"/>
               </w:rPr>
-              <w:t>13-2-14-</w:t>
-            </w:r>
-            <w:proofErr w:type="gramStart"/>
-            <w:r>
-              <w:rPr>
-                <w:rFonts w:ascii="Times New Roman" w:hAnsi="Times New Roman"/>
-                <w:spacing w:val="-2"/>
-                <w:sz w:val="24"/>
-              </w:rPr>
-              <w:t>11-0</w:t>
-            </w:r>
-            <w:proofErr w:type="gramEnd"/>
-            <w:r>
-              <w:rPr>
-                <w:rFonts w:ascii="Times New Roman" w:hAnsi="Times New Roman"/>
-                <w:spacing w:val="-2"/>
-                <w:sz w:val="24"/>
-              </w:rPr>
-              <w:t>-12-9-5-</w:t>
-            </w:r>
-            <w:proofErr w:type="gramStart"/>
-            <w:r>
-              <w:rPr>
-                <w:rFonts w:ascii="Times New Roman" w:hAnsi="Times New Roman"/>
-                <w:spacing w:val="-2"/>
-                <w:sz w:val="24"/>
-              </w:rPr>
-              <w:t>7-8</w:t>
-            </w:r>
-            <w:proofErr w:type="gramEnd"/>
-            <w:r>
-              <w:rPr>
-                <w:rFonts w:ascii="Times New Roman" w:hAnsi="Times New Roman"/>
-                <w:spacing w:val="-2"/>
-                <w:sz w:val="24"/>
-              </w:rPr>
-              <w:t>-4-3-10-6</w:t>
+              <w:t>13-2-14-11-0-12-9-5-7-8-4-3-10-6</w:t>
             </w:r>
           </w:p>
         </w:tc>
@@ -4502,35 +4423,7 @@
         <w:rPr>
           <w:sz w:val="28"/>
         </w:rPr>
-        <w:t>Последовательность смены состояний - 13-2-14-</w:t>
-      </w:r>
-      <w:proofErr w:type="gramStart"/>
-      <w:r>
-        <w:rPr>
-          <w:sz w:val="28"/>
-        </w:rPr>
-        <w:t>11-0</w:t>
-      </w:r>
-      <w:proofErr w:type="gramEnd"/>
-      <w:r>
-        <w:rPr>
-          <w:sz w:val="28"/>
-        </w:rPr>
-        <w:t>-12-9-5-</w:t>
-      </w:r>
-      <w:proofErr w:type="gramStart"/>
-      <w:r>
-        <w:rPr>
-          <w:sz w:val="28"/>
-        </w:rPr>
-        <w:t>7-8</w:t>
-      </w:r>
-      <w:proofErr w:type="gramEnd"/>
-      <w:r>
-        <w:rPr>
-          <w:sz w:val="28"/>
-        </w:rPr>
-        <w:t>-4-3-10-6</w:t>
+        <w:t>Последовательность смены состояний - 13-2-14-11-0-12-9-5-7-8-4-3-10-6</w:t>
       </w:r>
     </w:p>
     <w:p>
@@ -8481,32 +8374,47 @@
         <w:jc w:val="center"/>
       </w:pPr>
       <w:r>
+        <w:rPr>
+          <w:noProof/>
+        </w:rPr>
         <w:drawing>
-          <wp:inline xmlns:a="http://schemas.openxmlformats.org/drawingml/2006/main" xmlns:pic="http://schemas.openxmlformats.org/drawingml/2006/picture">
-            <wp:extent cx="5760000" cy="4532903"/>
+          <wp:inline distT="0" distB="0" distL="0" distR="0" wp14:anchorId="1B0190D6" wp14:editId="20FCD872">
+            <wp:extent cx="5759115" cy="3831530"/>
+            <wp:effectExtent l="0" t="0" r="0" b="0"/>
             <wp:docPr id="918597014" name="Picture 918597014" descr="Карты Карно D3…D0 с овальными группами"/>
             <wp:cNvGraphicFramePr>
-              <a:graphicFrameLocks noChangeAspect="1"/>
+              <a:graphicFrameLocks xmlns:a="http://schemas.openxmlformats.org/drawingml/2006/main" noChangeAspect="1"/>
             </wp:cNvGraphicFramePr>
-            <a:graphic>
+            <a:graphic xmlns:a="http://schemas.openxmlformats.org/drawingml/2006/main">
               <a:graphicData uri="http://schemas.openxmlformats.org/drawingml/2006/picture">
-                <pic:pic>
+                <pic:pic xmlns:pic="http://schemas.openxmlformats.org/drawingml/2006/picture">
                   <pic:nvPicPr>
                     <pic:cNvPr id="0" name="Карты_Карно_с_овалами_Word.png"/>
                     <pic:cNvPicPr/>
                   </pic:nvPicPr>
-                  <pic:blipFill>
-                    <a:blip r:embed="rId18"/>
+                  <pic:blipFill rotWithShape="1">
+                    <a:blip r:embed="rId15"/>
+                    <a:srcRect t="7259" b="8201"/>
                     <a:stretch>
                       <a:fillRect/>
                     </a:stretch>
                   </pic:blipFill>
-                  <pic:spPr>
+                  <pic:spPr bwMode="auto">
                     <a:xfrm>
                       <a:off x="0" y="0"/>
-                      <a:ext cx="5760000" cy="4532903"/>
+                      <a:ext cx="5760000" cy="3832118"/>
                     </a:xfrm>
-                    <a:prstGeom prst="rect"/>
+                    <a:prstGeom prst="rect">
+                      <a:avLst/>
+                    </a:prstGeom>
+                    <a:ln>
+                      <a:noFill/>
+                    </a:ln>
+                    <a:extLst>
+                      <a:ext uri="{53640926-AAD7-44D8-BBD7-CCE9431645EC}">
+                        <a14:shadowObscured xmlns:a14="http://schemas.microsoft.com/office/drawing/2010/main"/>
+                      </a:ext>
+                    </a:extLst>
                   </pic:spPr>
                 </pic:pic>
               </a:graphicData>

</xml_diff>

<commit_message>
report: add MDNF equations
</commit_message>
<xml_diff>
--- a/deliverables/Курсовая_Блинов_текущая.docx
+++ b/deliverables/Курсовая_Блинов_текущая.docx
@@ -8378,8 +8378,8 @@
           <w:noProof/>
         </w:rPr>
         <w:drawing>
-          <wp:inline distT="0" distB="0" distL="0" distR="0" wp14:anchorId="1B0190D6" wp14:editId="20FCD872">
-            <wp:extent cx="5759115" cy="3831530"/>
+          <wp:inline distT="0" distB="0" distL="0" distR="0" wp14:anchorId="1B0190D6" wp14:editId="014332EA">
+            <wp:extent cx="4766443" cy="3171106"/>
             <wp:effectExtent l="0" t="0" r="0" b="0"/>
             <wp:docPr id="918597014" name="Picture 918597014" descr="Карты Карно D3…D0 с овальными группами"/>
             <wp:cNvGraphicFramePr>
@@ -8402,7 +8402,7 @@
                   <pic:spPr bwMode="auto">
                     <a:xfrm>
                       <a:off x="0" y="0"/>
-                      <a:ext cx="5760000" cy="3832118"/>
+                      <a:ext cx="4778604" cy="3179196"/>
                     </a:xfrm>
                     <a:prstGeom prst="rect">
                       <a:avLst/>
@@ -8435,6 +8435,1581 @@
           <w:sz w:val="28"/>
         </w:rPr>
         <w:t>Рисунок 2.2 – Карты Карно: а) – для входа D3; б) – для входа D2; в) – для входа D1; г) – для входа D0</w:t>
+      </w:r>
+    </w:p>
+    <w:p>
+      <w:r>
+        <w:br w:type="page"/>
+      </w:r>
+    </w:p>
+    <w:p>
+      <w:pPr>
+        <w:keepNext/>
+        <w:spacing w:before="0" w:after="0" w:line="360" w:lineRule="auto"/>
+        <w:ind w:firstLine="709" w:left="0" w:right="0"/>
+        <w:jc w:val="both"/>
+      </w:pPr>
+      <w:r>
+        <w:rPr>
+          <w:rFonts w:ascii="Times New Roman" w:hAnsi="Times New Roman" w:eastAsia="Times New Roman" w:cs="Times New Roman"/>
+          <w:b w:val="0"/>
+          <w:i w:val="0"/>
+          <w:sz w:val="28"/>
+        </w:rPr>
+        <w:t>После минимизации по картам Карно составлены выражения входных функций в минимальной дизъюнктивной нормальной форме (МДНФ) (1.2–1.5).</w:t>
+      </w:r>
+    </w:p>
+    <w:p>
+      <w:pPr>
+        <w:keepLines/>
+        <w:tabs>
+          <w:tab w:pos="4649" w:val="center"/>
+          <w:tab w:pos="9071" w:val="right"/>
+        </w:tabs>
+        <w:spacing w:before="120" w:after="120" w:line="240" w:lineRule="auto"/>
+        <w:ind w:firstLine="0" w:left="0" w:right="0"/>
+        <w:jc w:val="left"/>
+      </w:pPr>
+      <w:r>
+        <w:rPr>
+          <w:rFonts w:ascii="Times New Roman" w:hAnsi="Times New Roman" w:eastAsia="Times New Roman" w:cs="Times New Roman"/>
+          <w:b w:val="0"/>
+          <w:i w:val="0"/>
+          <w:sz w:val="28"/>
+        </w:rPr>
+        <w:tab/>
+      </w:r>
+      <m:oMath>
+        <m:sSub>
+          <m:sSubPr/>
+          <m:e>
+            <m:r>
+              <m:rPr>
+                <m:sty m:val="i"/>
+              </m:rPr>
+              <w:rPr>
+                <w:rFonts w:ascii="Cambria Math" w:hAnsi="Cambria Math"/>
+                <w:sz w:val="28"/>
+                <w:b/>
+              </w:rPr>
+              <m:t xml:space="preserve">D</m:t>
+            </m:r>
+          </m:e>
+          <m:sub>
+            <m:r>
+              <m:rPr>
+                <m:sty m:val="p"/>
+              </m:rPr>
+              <w:rPr>
+                <w:rFonts w:ascii="Cambria Math" w:hAnsi="Cambria Math"/>
+                <w:sz w:val="28"/>
+              </w:rPr>
+              <m:t xml:space="preserve">3</m:t>
+            </m:r>
+          </m:sub>
+        </m:sSub>
+        <m:r>
+          <m:rPr>
+            <m:sty m:val="p"/>
+          </m:rPr>
+          <w:rPr>
+            <w:rFonts w:ascii="Cambria Math" w:hAnsi="Cambria Math"/>
+            <w:sz w:val="28"/>
+          </w:rPr>
+          <m:t xml:space="preserve"> = </m:t>
+        </m:r>
+        <m:bar>
+          <m:barPr>
+            <m:pos m:val="top"/>
+          </m:barPr>
+          <m:e>
+            <m:sSub>
+              <m:sSubPr/>
+              <m:e>
+                <m:r>
+                  <m:rPr>
+                    <m:sty m:val="i"/>
+                  </m:rPr>
+                  <w:rPr>
+                    <w:rFonts w:ascii="Cambria Math" w:hAnsi="Cambria Math"/>
+                    <w:sz w:val="28"/>
+                  </w:rPr>
+                  <m:t xml:space="preserve">Q</m:t>
+                </m:r>
+              </m:e>
+              <m:sub>
+                <m:r>
+                  <m:rPr>
+                    <m:sty m:val="p"/>
+                  </m:rPr>
+                  <w:rPr>
+                    <w:rFonts w:ascii="Cambria Math" w:hAnsi="Cambria Math"/>
+                    <w:sz w:val="28"/>
+                  </w:rPr>
+                  <m:t xml:space="preserve">3</m:t>
+                </m:r>
+              </m:sub>
+            </m:sSub>
+          </m:e>
+        </m:bar>
+        <m:bar>
+          <m:barPr>
+            <m:pos m:val="top"/>
+          </m:barPr>
+          <m:e>
+            <m:sSub>
+              <m:sSubPr/>
+              <m:e>
+                <m:r>
+                  <m:rPr>
+                    <m:sty m:val="i"/>
+                  </m:rPr>
+                  <w:rPr>
+                    <w:rFonts w:ascii="Cambria Math" w:hAnsi="Cambria Math"/>
+                    <w:sz w:val="28"/>
+                  </w:rPr>
+                  <m:t xml:space="preserve">Q</m:t>
+                </m:r>
+              </m:e>
+              <m:sub>
+                <m:r>
+                  <m:rPr>
+                    <m:sty m:val="p"/>
+                  </m:rPr>
+                  <w:rPr>
+                    <w:rFonts w:ascii="Cambria Math" w:hAnsi="Cambria Math"/>
+                    <w:sz w:val="28"/>
+                  </w:rPr>
+                  <m:t xml:space="preserve">2</m:t>
+                </m:r>
+              </m:sub>
+            </m:sSub>
+          </m:e>
+        </m:bar>
+        <m:r>
+          <m:rPr>
+            <m:sty m:val="p"/>
+          </m:rPr>
+          <w:rPr>
+            <w:rFonts w:ascii="Cambria Math" w:hAnsi="Cambria Math"/>
+            <w:sz w:val="28"/>
+          </w:rPr>
+          <m:t xml:space="preserve"> + </m:t>
+        </m:r>
+        <m:bar>
+          <m:barPr>
+            <m:pos m:val="top"/>
+          </m:barPr>
+          <m:e>
+            <m:sSub>
+              <m:sSubPr/>
+              <m:e>
+                <m:r>
+                  <m:rPr>
+                    <m:sty m:val="i"/>
+                  </m:rPr>
+                  <w:rPr>
+                    <w:rFonts w:ascii="Cambria Math" w:hAnsi="Cambria Math"/>
+                    <w:sz w:val="28"/>
+                  </w:rPr>
+                  <m:t xml:space="preserve">Q</m:t>
+                </m:r>
+              </m:e>
+              <m:sub>
+                <m:r>
+                  <m:rPr>
+                    <m:sty m:val="p"/>
+                  </m:rPr>
+                  <w:rPr>
+                    <w:rFonts w:ascii="Cambria Math" w:hAnsi="Cambria Math"/>
+                    <w:sz w:val="28"/>
+                  </w:rPr>
+                  <m:t xml:space="preserve">3</m:t>
+                </m:r>
+              </m:sub>
+            </m:sSub>
+          </m:e>
+        </m:bar>
+        <m:sSub>
+          <m:sSubPr/>
+          <m:e>
+            <m:r>
+              <m:rPr>
+                <m:sty m:val="i"/>
+              </m:rPr>
+              <w:rPr>
+                <w:rFonts w:ascii="Cambria Math" w:hAnsi="Cambria Math"/>
+                <w:sz w:val="28"/>
+              </w:rPr>
+              <m:t xml:space="preserve">Q</m:t>
+            </m:r>
+          </m:e>
+          <m:sub>
+            <m:r>
+              <m:rPr>
+                <m:sty m:val="p"/>
+              </m:rPr>
+              <w:rPr>
+                <w:rFonts w:ascii="Cambria Math" w:hAnsi="Cambria Math"/>
+                <w:sz w:val="28"/>
+              </w:rPr>
+              <m:t xml:space="preserve">1</m:t>
+            </m:r>
+          </m:sub>
+        </m:sSub>
+        <m:r>
+          <m:rPr>
+            <m:sty m:val="p"/>
+          </m:rPr>
+          <w:rPr>
+            <w:rFonts w:ascii="Cambria Math" w:hAnsi="Cambria Math"/>
+            <w:sz w:val="28"/>
+          </w:rPr>
+          <m:t xml:space="preserve"> + </m:t>
+        </m:r>
+        <m:sSub>
+          <m:sSubPr/>
+          <m:e>
+            <m:r>
+              <m:rPr>
+                <m:sty m:val="i"/>
+              </m:rPr>
+              <w:rPr>
+                <w:rFonts w:ascii="Cambria Math" w:hAnsi="Cambria Math"/>
+                <w:sz w:val="28"/>
+              </w:rPr>
+              <m:t xml:space="preserve">Q</m:t>
+            </m:r>
+          </m:e>
+          <m:sub>
+            <m:r>
+              <m:rPr>
+                <m:sty m:val="p"/>
+              </m:rPr>
+              <w:rPr>
+                <w:rFonts w:ascii="Cambria Math" w:hAnsi="Cambria Math"/>
+                <w:sz w:val="28"/>
+              </w:rPr>
+              <m:t xml:space="preserve">3</m:t>
+            </m:r>
+          </m:sub>
+        </m:sSub>
+        <m:sSub>
+          <m:sSubPr/>
+          <m:e>
+            <m:r>
+              <m:rPr>
+                <m:sty m:val="i"/>
+              </m:rPr>
+              <w:rPr>
+                <w:rFonts w:ascii="Cambria Math" w:hAnsi="Cambria Math"/>
+                <w:sz w:val="28"/>
+              </w:rPr>
+              <m:t xml:space="preserve">Q</m:t>
+            </m:r>
+          </m:e>
+          <m:sub>
+            <m:r>
+              <m:rPr>
+                <m:sty m:val="p"/>
+              </m:rPr>
+              <w:rPr>
+                <w:rFonts w:ascii="Cambria Math" w:hAnsi="Cambria Math"/>
+                <w:sz w:val="28"/>
+              </w:rPr>
+              <m:t xml:space="preserve">2</m:t>
+            </m:r>
+          </m:sub>
+        </m:sSub>
+        <m:bar>
+          <m:barPr>
+            <m:pos m:val="top"/>
+          </m:barPr>
+          <m:e>
+            <m:sSub>
+              <m:sSubPr/>
+              <m:e>
+                <m:r>
+                  <m:rPr>
+                    <m:sty m:val="i"/>
+                  </m:rPr>
+                  <w:rPr>
+                    <w:rFonts w:ascii="Cambria Math" w:hAnsi="Cambria Math"/>
+                    <w:sz w:val="28"/>
+                  </w:rPr>
+                  <m:t xml:space="preserve">Q</m:t>
+                </m:r>
+              </m:e>
+              <m:sub>
+                <m:r>
+                  <m:rPr>
+                    <m:sty m:val="p"/>
+                  </m:rPr>
+                  <w:rPr>
+                    <w:rFonts w:ascii="Cambria Math" w:hAnsi="Cambria Math"/>
+                    <w:sz w:val="28"/>
+                  </w:rPr>
+                  <m:t xml:space="preserve">0</m:t>
+                </m:r>
+              </m:sub>
+            </m:sSub>
+          </m:e>
+        </m:bar>
+      </m:oMath>
+      <w:r>
+        <w:rPr>
+          <w:rFonts w:ascii="Times New Roman" w:hAnsi="Times New Roman" w:eastAsia="Times New Roman" w:cs="Times New Roman"/>
+          <w:b w:val="0"/>
+          <w:i w:val="0"/>
+          <w:sz w:val="28"/>
+        </w:rPr>
+        <w:tab/>
+        <w:t>(1.2)</w:t>
+      </w:r>
+    </w:p>
+    <w:p>
+      <w:pPr>
+        <w:keepLines/>
+        <w:tabs>
+          <w:tab w:pos="4649" w:val="center"/>
+          <w:tab w:pos="9071" w:val="right"/>
+        </w:tabs>
+        <w:spacing w:before="120" w:after="120" w:line="240" w:lineRule="auto"/>
+        <w:ind w:firstLine="0" w:left="0" w:right="0"/>
+        <w:jc w:val="left"/>
+      </w:pPr>
+      <w:r>
+        <w:rPr>
+          <w:rFonts w:ascii="Times New Roman" w:hAnsi="Times New Roman" w:eastAsia="Times New Roman" w:cs="Times New Roman"/>
+          <w:b w:val="0"/>
+          <w:i w:val="0"/>
+          <w:sz w:val="28"/>
+        </w:rPr>
+        <w:tab/>
+      </w:r>
+      <m:oMath>
+        <m:sSub>
+          <m:sSubPr/>
+          <m:e>
+            <m:r>
+              <m:rPr>
+                <m:sty m:val="i"/>
+              </m:rPr>
+              <w:rPr>
+                <w:rFonts w:ascii="Cambria Math" w:hAnsi="Cambria Math"/>
+                <w:sz w:val="28"/>
+                <w:b/>
+              </w:rPr>
+              <m:t xml:space="preserve">D</m:t>
+            </m:r>
+          </m:e>
+          <m:sub>
+            <m:r>
+              <m:rPr>
+                <m:sty m:val="p"/>
+              </m:rPr>
+              <w:rPr>
+                <w:rFonts w:ascii="Cambria Math" w:hAnsi="Cambria Math"/>
+                <w:sz w:val="28"/>
+              </w:rPr>
+              <m:t xml:space="preserve">2</m:t>
+            </m:r>
+          </m:sub>
+        </m:sSub>
+        <m:r>
+          <m:rPr>
+            <m:sty m:val="p"/>
+          </m:rPr>
+          <w:rPr>
+            <w:rFonts w:ascii="Cambria Math" w:hAnsi="Cambria Math"/>
+            <w:sz w:val="28"/>
+          </w:rPr>
+          <m:t xml:space="preserve"> = </m:t>
+        </m:r>
+        <m:bar>
+          <m:barPr>
+            <m:pos m:val="top"/>
+          </m:barPr>
+          <m:e>
+            <m:sSub>
+              <m:sSubPr/>
+              <m:e>
+                <m:r>
+                  <m:rPr>
+                    <m:sty m:val="i"/>
+                  </m:rPr>
+                  <w:rPr>
+                    <w:rFonts w:ascii="Cambria Math" w:hAnsi="Cambria Math"/>
+                    <w:sz w:val="28"/>
+                  </w:rPr>
+                  <m:t xml:space="preserve">Q</m:t>
+                </m:r>
+              </m:e>
+              <m:sub>
+                <m:r>
+                  <m:rPr>
+                    <m:sty m:val="p"/>
+                  </m:rPr>
+                  <w:rPr>
+                    <w:rFonts w:ascii="Cambria Math" w:hAnsi="Cambria Math"/>
+                    <w:sz w:val="28"/>
+                  </w:rPr>
+                  <m:t xml:space="preserve">3</m:t>
+                </m:r>
+              </m:sub>
+            </m:sSub>
+          </m:e>
+        </m:bar>
+        <m:bar>
+          <m:barPr>
+            <m:pos m:val="top"/>
+          </m:barPr>
+          <m:e>
+            <m:sSub>
+              <m:sSubPr/>
+              <m:e>
+                <m:r>
+                  <m:rPr>
+                    <m:sty m:val="i"/>
+                  </m:rPr>
+                  <w:rPr>
+                    <w:rFonts w:ascii="Cambria Math" w:hAnsi="Cambria Math"/>
+                    <w:sz w:val="28"/>
+                  </w:rPr>
+                  <m:t xml:space="preserve">Q</m:t>
+                </m:r>
+              </m:e>
+              <m:sub>
+                <m:r>
+                  <m:rPr>
+                    <m:sty m:val="p"/>
+                  </m:rPr>
+                  <w:rPr>
+                    <w:rFonts w:ascii="Cambria Math" w:hAnsi="Cambria Math"/>
+                    <w:sz w:val="28"/>
+                  </w:rPr>
+                  <m:t xml:space="preserve">1</m:t>
+                </m:r>
+              </m:sub>
+            </m:sSub>
+          </m:e>
+        </m:bar>
+        <m:sSub>
+          <m:sSubPr/>
+          <m:e>
+            <m:r>
+              <m:rPr>
+                <m:sty m:val="i"/>
+              </m:rPr>
+              <w:rPr>
+                <w:rFonts w:ascii="Cambria Math" w:hAnsi="Cambria Math"/>
+                <w:sz w:val="28"/>
+              </w:rPr>
+              <m:t xml:space="preserve">Q</m:t>
+            </m:r>
+          </m:e>
+          <m:sub>
+            <m:r>
+              <m:rPr>
+                <m:sty m:val="p"/>
+              </m:rPr>
+              <w:rPr>
+                <w:rFonts w:ascii="Cambria Math" w:hAnsi="Cambria Math"/>
+                <w:sz w:val="28"/>
+              </w:rPr>
+              <m:t xml:space="preserve">0</m:t>
+            </m:r>
+          </m:sub>
+        </m:sSub>
+        <m:r>
+          <m:rPr>
+            <m:sty m:val="p"/>
+          </m:rPr>
+          <w:rPr>
+            <w:rFonts w:ascii="Cambria Math" w:hAnsi="Cambria Math"/>
+            <w:sz w:val="28"/>
+          </w:rPr>
+          <m:t xml:space="preserve"> + </m:t>
+        </m:r>
+        <m:bar>
+          <m:barPr>
+            <m:pos m:val="top"/>
+          </m:barPr>
+          <m:e>
+            <m:sSub>
+              <m:sSubPr/>
+              <m:e>
+                <m:r>
+                  <m:rPr>
+                    <m:sty m:val="i"/>
+                  </m:rPr>
+                  <w:rPr>
+                    <w:rFonts w:ascii="Cambria Math" w:hAnsi="Cambria Math"/>
+                    <w:sz w:val="28"/>
+                  </w:rPr>
+                  <m:t xml:space="preserve">Q</m:t>
+                </m:r>
+              </m:e>
+              <m:sub>
+                <m:r>
+                  <m:rPr>
+                    <m:sty m:val="p"/>
+                  </m:rPr>
+                  <w:rPr>
+                    <w:rFonts w:ascii="Cambria Math" w:hAnsi="Cambria Math"/>
+                    <w:sz w:val="28"/>
+                  </w:rPr>
+                  <m:t xml:space="preserve">3</m:t>
+                </m:r>
+              </m:sub>
+            </m:sSub>
+          </m:e>
+        </m:bar>
+        <m:sSub>
+          <m:sSubPr/>
+          <m:e>
+            <m:r>
+              <m:rPr>
+                <m:sty m:val="i"/>
+              </m:rPr>
+              <w:rPr>
+                <w:rFonts w:ascii="Cambria Math" w:hAnsi="Cambria Math"/>
+                <w:sz w:val="28"/>
+              </w:rPr>
+              <m:t xml:space="preserve">Q</m:t>
+            </m:r>
+          </m:e>
+          <m:sub>
+            <m:r>
+              <m:rPr>
+                <m:sty m:val="p"/>
+              </m:rPr>
+              <w:rPr>
+                <w:rFonts w:ascii="Cambria Math" w:hAnsi="Cambria Math"/>
+                <w:sz w:val="28"/>
+              </w:rPr>
+              <m:t xml:space="preserve">1</m:t>
+            </m:r>
+          </m:sub>
+        </m:sSub>
+        <m:bar>
+          <m:barPr>
+            <m:pos m:val="top"/>
+          </m:barPr>
+          <m:e>
+            <m:sSub>
+              <m:sSubPr/>
+              <m:e>
+                <m:r>
+                  <m:rPr>
+                    <m:sty m:val="i"/>
+                  </m:rPr>
+                  <w:rPr>
+                    <w:rFonts w:ascii="Cambria Math" w:hAnsi="Cambria Math"/>
+                    <w:sz w:val="28"/>
+                  </w:rPr>
+                  <m:t xml:space="preserve">Q</m:t>
+                </m:r>
+              </m:e>
+              <m:sub>
+                <m:r>
+                  <m:rPr>
+                    <m:sty m:val="p"/>
+                  </m:rPr>
+                  <w:rPr>
+                    <w:rFonts w:ascii="Cambria Math" w:hAnsi="Cambria Math"/>
+                    <w:sz w:val="28"/>
+                  </w:rPr>
+                  <m:t xml:space="preserve">0</m:t>
+                </m:r>
+              </m:sub>
+            </m:sSub>
+          </m:e>
+        </m:bar>
+        <m:r>
+          <m:rPr>
+            <m:sty m:val="p"/>
+          </m:rPr>
+          <w:rPr>
+            <w:rFonts w:ascii="Cambria Math" w:hAnsi="Cambria Math"/>
+            <w:sz w:val="28"/>
+          </w:rPr>
+          <m:t xml:space="preserve"> + </m:t>
+        </m:r>
+        <m:bar>
+          <m:barPr>
+            <m:pos m:val="top"/>
+          </m:barPr>
+          <m:e>
+            <m:sSub>
+              <m:sSubPr/>
+              <m:e>
+                <m:r>
+                  <m:rPr>
+                    <m:sty m:val="i"/>
+                  </m:rPr>
+                  <w:rPr>
+                    <w:rFonts w:ascii="Cambria Math" w:hAnsi="Cambria Math"/>
+                    <w:sz w:val="28"/>
+                  </w:rPr>
+                  <m:t xml:space="preserve">Q</m:t>
+                </m:r>
+              </m:e>
+              <m:sub>
+                <m:r>
+                  <m:rPr>
+                    <m:sty m:val="p"/>
+                  </m:rPr>
+                  <w:rPr>
+                    <w:rFonts w:ascii="Cambria Math" w:hAnsi="Cambria Math"/>
+                    <w:sz w:val="28"/>
+                  </w:rPr>
+                  <m:t xml:space="preserve">2</m:t>
+                </m:r>
+              </m:sub>
+            </m:sSub>
+          </m:e>
+        </m:bar>
+        <m:bar>
+          <m:barPr>
+            <m:pos m:val="top"/>
+          </m:barPr>
+          <m:e>
+            <m:sSub>
+              <m:sSubPr/>
+              <m:e>
+                <m:r>
+                  <m:rPr>
+                    <m:sty m:val="i"/>
+                  </m:rPr>
+                  <w:rPr>
+                    <w:rFonts w:ascii="Cambria Math" w:hAnsi="Cambria Math"/>
+                    <w:sz w:val="28"/>
+                  </w:rPr>
+                  <m:t xml:space="preserve">Q</m:t>
+                </m:r>
+              </m:e>
+              <m:sub>
+                <m:r>
+                  <m:rPr>
+                    <m:sty m:val="p"/>
+                  </m:rPr>
+                  <w:rPr>
+                    <w:rFonts w:ascii="Cambria Math" w:hAnsi="Cambria Math"/>
+                    <w:sz w:val="28"/>
+                  </w:rPr>
+                  <m:t xml:space="preserve">1</m:t>
+                </m:r>
+              </m:sub>
+            </m:sSub>
+          </m:e>
+        </m:bar>
+        <m:r>
+          <m:rPr>
+            <m:sty m:val="p"/>
+          </m:rPr>
+          <w:rPr>
+            <w:rFonts w:ascii="Cambria Math" w:hAnsi="Cambria Math"/>
+            <w:sz w:val="28"/>
+          </w:rPr>
+          <m:t xml:space="preserve"> + </m:t>
+        </m:r>
+        <m:bar>
+          <m:barPr>
+            <m:pos m:val="top"/>
+          </m:barPr>
+          <m:e>
+            <m:sSub>
+              <m:sSubPr/>
+              <m:e>
+                <m:r>
+                  <m:rPr>
+                    <m:sty m:val="i"/>
+                  </m:rPr>
+                  <w:rPr>
+                    <w:rFonts w:ascii="Cambria Math" w:hAnsi="Cambria Math"/>
+                    <w:sz w:val="28"/>
+                  </w:rPr>
+                  <m:t xml:space="preserve">Q</m:t>
+                </m:r>
+              </m:e>
+              <m:sub>
+                <m:r>
+                  <m:rPr>
+                    <m:sty m:val="p"/>
+                  </m:rPr>
+                  <w:rPr>
+                    <w:rFonts w:ascii="Cambria Math" w:hAnsi="Cambria Math"/>
+                    <w:sz w:val="28"/>
+                  </w:rPr>
+                  <m:t xml:space="preserve">2</m:t>
+                </m:r>
+              </m:sub>
+            </m:sSub>
+          </m:e>
+        </m:bar>
+        <m:bar>
+          <m:barPr>
+            <m:pos m:val="top"/>
+          </m:barPr>
+          <m:e>
+            <m:sSub>
+              <m:sSubPr/>
+              <m:e>
+                <m:r>
+                  <m:rPr>
+                    <m:sty m:val="i"/>
+                  </m:rPr>
+                  <w:rPr>
+                    <w:rFonts w:ascii="Cambria Math" w:hAnsi="Cambria Math"/>
+                    <w:sz w:val="28"/>
+                  </w:rPr>
+                  <m:t xml:space="preserve">Q</m:t>
+                </m:r>
+              </m:e>
+              <m:sub>
+                <m:r>
+                  <m:rPr>
+                    <m:sty m:val="p"/>
+                  </m:rPr>
+                  <w:rPr>
+                    <w:rFonts w:ascii="Cambria Math" w:hAnsi="Cambria Math"/>
+                    <w:sz w:val="28"/>
+                  </w:rPr>
+                  <m:t xml:space="preserve">0</m:t>
+                </m:r>
+              </m:sub>
+            </m:sSub>
+          </m:e>
+        </m:bar>
+      </m:oMath>
+      <w:r>
+        <w:rPr>
+          <w:rFonts w:ascii="Times New Roman" w:hAnsi="Times New Roman" w:eastAsia="Times New Roman" w:cs="Times New Roman"/>
+          <w:b w:val="0"/>
+          <w:i w:val="0"/>
+          <w:sz w:val="28"/>
+        </w:rPr>
+        <w:tab/>
+        <w:t>(1.3)</w:t>
+      </w:r>
+    </w:p>
+    <w:p>
+      <w:pPr>
+        <w:keepLines/>
+        <w:tabs>
+          <w:tab w:pos="4649" w:val="center"/>
+          <w:tab w:pos="9071" w:val="right"/>
+        </w:tabs>
+        <w:spacing w:before="120" w:after="120" w:line="240" w:lineRule="auto"/>
+        <w:ind w:firstLine="0" w:left="0" w:right="0"/>
+        <w:jc w:val="left"/>
+      </w:pPr>
+      <w:r>
+        <w:rPr>
+          <w:rFonts w:ascii="Times New Roman" w:hAnsi="Times New Roman" w:eastAsia="Times New Roman" w:cs="Times New Roman"/>
+          <w:b w:val="0"/>
+          <w:i w:val="0"/>
+          <w:sz w:val="28"/>
+        </w:rPr>
+        <w:tab/>
+      </w:r>
+      <m:oMath>
+        <m:sSub>
+          <m:sSubPr/>
+          <m:e>
+            <m:r>
+              <m:rPr>
+                <m:sty m:val="i"/>
+              </m:rPr>
+              <w:rPr>
+                <w:rFonts w:ascii="Cambria Math" w:hAnsi="Cambria Math"/>
+                <w:sz w:val="28"/>
+                <w:b/>
+              </w:rPr>
+              <m:t xml:space="preserve">D</m:t>
+            </m:r>
+          </m:e>
+          <m:sub>
+            <m:r>
+              <m:rPr>
+                <m:sty m:val="p"/>
+              </m:rPr>
+              <w:rPr>
+                <w:rFonts w:ascii="Cambria Math" w:hAnsi="Cambria Math"/>
+                <w:sz w:val="28"/>
+              </w:rPr>
+              <m:t xml:space="preserve">1</m:t>
+            </m:r>
+          </m:sub>
+        </m:sSub>
+        <m:r>
+          <m:rPr>
+            <m:sty m:val="p"/>
+          </m:rPr>
+          <w:rPr>
+            <w:rFonts w:ascii="Cambria Math" w:hAnsi="Cambria Math"/>
+            <w:sz w:val="28"/>
+          </w:rPr>
+          <m:t xml:space="preserve"> = </m:t>
+        </m:r>
+        <m:bar>
+          <m:barPr>
+            <m:pos m:val="top"/>
+          </m:barPr>
+          <m:e>
+            <m:sSub>
+              <m:sSubPr/>
+              <m:e>
+                <m:r>
+                  <m:rPr>
+                    <m:sty m:val="i"/>
+                  </m:rPr>
+                  <w:rPr>
+                    <w:rFonts w:ascii="Cambria Math" w:hAnsi="Cambria Math"/>
+                    <w:sz w:val="28"/>
+                  </w:rPr>
+                  <m:t xml:space="preserve">Q</m:t>
+                </m:r>
+              </m:e>
+              <m:sub>
+                <m:r>
+                  <m:rPr>
+                    <m:sty m:val="p"/>
+                  </m:rPr>
+                  <w:rPr>
+                    <w:rFonts w:ascii="Cambria Math" w:hAnsi="Cambria Math"/>
+                    <w:sz w:val="28"/>
+                  </w:rPr>
+                  <m:t xml:space="preserve">3</m:t>
+                </m:r>
+              </m:sub>
+            </m:sSub>
+          </m:e>
+        </m:bar>
+        <m:bar>
+          <m:barPr>
+            <m:pos m:val="top"/>
+          </m:barPr>
+          <m:e>
+            <m:sSub>
+              <m:sSubPr/>
+              <m:e>
+                <m:r>
+                  <m:rPr>
+                    <m:sty m:val="i"/>
+                  </m:rPr>
+                  <w:rPr>
+                    <w:rFonts w:ascii="Cambria Math" w:hAnsi="Cambria Math"/>
+                    <w:sz w:val="28"/>
+                  </w:rPr>
+                  <m:t xml:space="preserve">Q</m:t>
+                </m:r>
+              </m:e>
+              <m:sub>
+                <m:r>
+                  <m:rPr>
+                    <m:sty m:val="p"/>
+                  </m:rPr>
+                  <w:rPr>
+                    <w:rFonts w:ascii="Cambria Math" w:hAnsi="Cambria Math"/>
+                    <w:sz w:val="28"/>
+                  </w:rPr>
+                  <m:t xml:space="preserve">2</m:t>
+                </m:r>
+              </m:sub>
+            </m:sSub>
+          </m:e>
+        </m:bar>
+        <m:sSub>
+          <m:sSubPr/>
+          <m:e>
+            <m:r>
+              <m:rPr>
+                <m:sty m:val="i"/>
+              </m:rPr>
+              <w:rPr>
+                <w:rFonts w:ascii="Cambria Math" w:hAnsi="Cambria Math"/>
+                <w:sz w:val="28"/>
+              </w:rPr>
+              <m:t xml:space="preserve">Q</m:t>
+            </m:r>
+          </m:e>
+          <m:sub>
+            <m:r>
+              <m:rPr>
+                <m:sty m:val="p"/>
+              </m:rPr>
+              <w:rPr>
+                <w:rFonts w:ascii="Cambria Math" w:hAnsi="Cambria Math"/>
+                <w:sz w:val="28"/>
+              </w:rPr>
+              <m:t xml:space="preserve">1</m:t>
+            </m:r>
+          </m:sub>
+        </m:sSub>
+        <m:r>
+          <m:rPr>
+            <m:sty m:val="p"/>
+          </m:rPr>
+          <w:rPr>
+            <w:rFonts w:ascii="Cambria Math" w:hAnsi="Cambria Math"/>
+            <w:sz w:val="28"/>
+          </w:rPr>
+          <m:t xml:space="preserve"> + </m:t>
+        </m:r>
+        <m:bar>
+          <m:barPr>
+            <m:pos m:val="top"/>
+          </m:barPr>
+          <m:e>
+            <m:sSub>
+              <m:sSubPr/>
+              <m:e>
+                <m:r>
+                  <m:rPr>
+                    <m:sty m:val="i"/>
+                  </m:rPr>
+                  <w:rPr>
+                    <w:rFonts w:ascii="Cambria Math" w:hAnsi="Cambria Math"/>
+                    <w:sz w:val="28"/>
+                  </w:rPr>
+                  <m:t xml:space="preserve">Q</m:t>
+                </m:r>
+              </m:e>
+              <m:sub>
+                <m:r>
+                  <m:rPr>
+                    <m:sty m:val="p"/>
+                  </m:rPr>
+                  <w:rPr>
+                    <w:rFonts w:ascii="Cambria Math" w:hAnsi="Cambria Math"/>
+                    <w:sz w:val="28"/>
+                  </w:rPr>
+                  <m:t xml:space="preserve">3</m:t>
+                </m:r>
+              </m:sub>
+            </m:sSub>
+          </m:e>
+        </m:bar>
+        <m:sSub>
+          <m:sSubPr/>
+          <m:e>
+            <m:r>
+              <m:rPr>
+                <m:sty m:val="i"/>
+              </m:rPr>
+              <w:rPr>
+                <w:rFonts w:ascii="Cambria Math" w:hAnsi="Cambria Math"/>
+                <w:sz w:val="28"/>
+              </w:rPr>
+              <m:t xml:space="preserve">Q</m:t>
+            </m:r>
+          </m:e>
+          <m:sub>
+            <m:r>
+              <m:rPr>
+                <m:sty m:val="p"/>
+              </m:rPr>
+              <w:rPr>
+                <w:rFonts w:ascii="Cambria Math" w:hAnsi="Cambria Math"/>
+                <w:sz w:val="28"/>
+              </w:rPr>
+              <m:t xml:space="preserve">2</m:t>
+            </m:r>
+          </m:sub>
+        </m:sSub>
+        <m:bar>
+          <m:barPr>
+            <m:pos m:val="top"/>
+          </m:barPr>
+          <m:e>
+            <m:sSub>
+              <m:sSubPr/>
+              <m:e>
+                <m:r>
+                  <m:rPr>
+                    <m:sty m:val="i"/>
+                  </m:rPr>
+                  <w:rPr>
+                    <w:rFonts w:ascii="Cambria Math" w:hAnsi="Cambria Math"/>
+                    <w:sz w:val="28"/>
+                  </w:rPr>
+                  <m:t xml:space="preserve">Q</m:t>
+                </m:r>
+              </m:e>
+              <m:sub>
+                <m:r>
+                  <m:rPr>
+                    <m:sty m:val="p"/>
+                  </m:rPr>
+                  <w:rPr>
+                    <w:rFonts w:ascii="Cambria Math" w:hAnsi="Cambria Math"/>
+                    <w:sz w:val="28"/>
+                  </w:rPr>
+                  <m:t xml:space="preserve">1</m:t>
+                </m:r>
+              </m:sub>
+            </m:sSub>
+          </m:e>
+        </m:bar>
+        <m:r>
+          <m:rPr>
+            <m:sty m:val="p"/>
+          </m:rPr>
+          <w:rPr>
+            <w:rFonts w:ascii="Cambria Math" w:hAnsi="Cambria Math"/>
+            <w:sz w:val="28"/>
+          </w:rPr>
+          <m:t xml:space="preserve"> + </m:t>
+        </m:r>
+        <m:sSub>
+          <m:sSubPr/>
+          <m:e>
+            <m:r>
+              <m:rPr>
+                <m:sty m:val="i"/>
+              </m:rPr>
+              <w:rPr>
+                <w:rFonts w:ascii="Cambria Math" w:hAnsi="Cambria Math"/>
+                <w:sz w:val="28"/>
+              </w:rPr>
+              <m:t xml:space="preserve">Q</m:t>
+            </m:r>
+          </m:e>
+          <m:sub>
+            <m:r>
+              <m:rPr>
+                <m:sty m:val="p"/>
+              </m:rPr>
+              <w:rPr>
+                <w:rFonts w:ascii="Cambria Math" w:hAnsi="Cambria Math"/>
+                <w:sz w:val="28"/>
+              </w:rPr>
+              <m:t xml:space="preserve">3</m:t>
+            </m:r>
+          </m:sub>
+        </m:sSub>
+        <m:sSub>
+          <m:sSubPr/>
+          <m:e>
+            <m:r>
+              <m:rPr>
+                <m:sty m:val="i"/>
+              </m:rPr>
+              <w:rPr>
+                <w:rFonts w:ascii="Cambria Math" w:hAnsi="Cambria Math"/>
+                <w:sz w:val="28"/>
+              </w:rPr>
+              <m:t xml:space="preserve">Q</m:t>
+            </m:r>
+          </m:e>
+          <m:sub>
+            <m:r>
+              <m:rPr>
+                <m:sty m:val="p"/>
+              </m:rPr>
+              <w:rPr>
+                <w:rFonts w:ascii="Cambria Math" w:hAnsi="Cambria Math"/>
+                <w:sz w:val="28"/>
+              </w:rPr>
+              <m:t xml:space="preserve">2</m:t>
+            </m:r>
+          </m:sub>
+        </m:sSub>
+        <m:sSub>
+          <m:sSubPr/>
+          <m:e>
+            <m:r>
+              <m:rPr>
+                <m:sty m:val="i"/>
+              </m:rPr>
+              <w:rPr>
+                <w:rFonts w:ascii="Cambria Math" w:hAnsi="Cambria Math"/>
+                <w:sz w:val="28"/>
+              </w:rPr>
+              <m:t xml:space="preserve">Q</m:t>
+            </m:r>
+          </m:e>
+          <m:sub>
+            <m:r>
+              <m:rPr>
+                <m:sty m:val="p"/>
+              </m:rPr>
+              <w:rPr>
+                <w:rFonts w:ascii="Cambria Math" w:hAnsi="Cambria Math"/>
+                <w:sz w:val="28"/>
+              </w:rPr>
+              <m:t xml:space="preserve">0</m:t>
+            </m:r>
+          </m:sub>
+        </m:sSub>
+        <m:r>
+          <m:rPr>
+            <m:sty m:val="p"/>
+          </m:rPr>
+          <w:rPr>
+            <w:rFonts w:ascii="Cambria Math" w:hAnsi="Cambria Math"/>
+            <w:sz w:val="28"/>
+          </w:rPr>
+          <m:t xml:space="preserve"> + </m:t>
+        </m:r>
+        <m:sSub>
+          <m:sSubPr/>
+          <m:e>
+            <m:r>
+              <m:rPr>
+                <m:sty m:val="i"/>
+              </m:rPr>
+              <w:rPr>
+                <w:rFonts w:ascii="Cambria Math" w:hAnsi="Cambria Math"/>
+                <w:sz w:val="28"/>
+              </w:rPr>
+              <m:t xml:space="preserve">Q</m:t>
+            </m:r>
+          </m:e>
+          <m:sub>
+            <m:r>
+              <m:rPr>
+                <m:sty m:val="p"/>
+              </m:rPr>
+              <w:rPr>
+                <w:rFonts w:ascii="Cambria Math" w:hAnsi="Cambria Math"/>
+                <w:sz w:val="28"/>
+              </w:rPr>
+              <m:t xml:space="preserve">3</m:t>
+            </m:r>
+          </m:sub>
+        </m:sSub>
+        <m:sSub>
+          <m:sSubPr/>
+          <m:e>
+            <m:r>
+              <m:rPr>
+                <m:sty m:val="i"/>
+              </m:rPr>
+              <w:rPr>
+                <w:rFonts w:ascii="Cambria Math" w:hAnsi="Cambria Math"/>
+                <w:sz w:val="28"/>
+              </w:rPr>
+              <m:t xml:space="preserve">Q</m:t>
+            </m:r>
+          </m:e>
+          <m:sub>
+            <m:r>
+              <m:rPr>
+                <m:sty m:val="p"/>
+              </m:rPr>
+              <w:rPr>
+                <w:rFonts w:ascii="Cambria Math" w:hAnsi="Cambria Math"/>
+                <w:sz w:val="28"/>
+              </w:rPr>
+              <m:t xml:space="preserve">1</m:t>
+            </m:r>
+          </m:sub>
+        </m:sSub>
+        <m:bar>
+          <m:barPr>
+            <m:pos m:val="top"/>
+          </m:barPr>
+          <m:e>
+            <m:sSub>
+              <m:sSubPr/>
+              <m:e>
+                <m:r>
+                  <m:rPr>
+                    <m:sty m:val="i"/>
+                  </m:rPr>
+                  <w:rPr>
+                    <w:rFonts w:ascii="Cambria Math" w:hAnsi="Cambria Math"/>
+                    <w:sz w:val="28"/>
+                  </w:rPr>
+                  <m:t xml:space="preserve">Q</m:t>
+                </m:r>
+              </m:e>
+              <m:sub>
+                <m:r>
+                  <m:rPr>
+                    <m:sty m:val="p"/>
+                  </m:rPr>
+                  <w:rPr>
+                    <w:rFonts w:ascii="Cambria Math" w:hAnsi="Cambria Math"/>
+                    <w:sz w:val="28"/>
+                  </w:rPr>
+                  <m:t xml:space="preserve">0</m:t>
+                </m:r>
+              </m:sub>
+            </m:sSub>
+          </m:e>
+        </m:bar>
+      </m:oMath>
+      <w:r>
+        <w:rPr>
+          <w:rFonts w:ascii="Times New Roman" w:hAnsi="Times New Roman" w:eastAsia="Times New Roman" w:cs="Times New Roman"/>
+          <w:b w:val="0"/>
+          <w:i w:val="0"/>
+          <w:sz w:val="28"/>
+        </w:rPr>
+        <w:tab/>
+        <w:t>(1.4)</w:t>
+      </w:r>
+    </w:p>
+    <w:p>
+      <w:pPr>
+        <w:keepLines/>
+        <w:tabs>
+          <w:tab w:pos="4649" w:val="center"/>
+          <w:tab w:pos="9071" w:val="right"/>
+        </w:tabs>
+        <w:spacing w:before="120" w:after="120" w:line="240" w:lineRule="auto"/>
+        <w:ind w:firstLine="0" w:left="0" w:right="0"/>
+        <w:jc w:val="left"/>
+      </w:pPr>
+      <w:r>
+        <w:rPr>
+          <w:rFonts w:ascii="Times New Roman" w:hAnsi="Times New Roman" w:eastAsia="Times New Roman" w:cs="Times New Roman"/>
+          <w:b w:val="0"/>
+          <w:i w:val="0"/>
+          <w:sz w:val="28"/>
+        </w:rPr>
+        <w:tab/>
+      </w:r>
+      <m:oMath>
+        <m:sSub>
+          <m:sSubPr/>
+          <m:e>
+            <m:r>
+              <m:rPr>
+                <m:sty m:val="i"/>
+              </m:rPr>
+              <w:rPr>
+                <w:rFonts w:ascii="Cambria Math" w:hAnsi="Cambria Math"/>
+                <w:sz w:val="28"/>
+                <w:b/>
+              </w:rPr>
+              <m:t xml:space="preserve">D</m:t>
+            </m:r>
+          </m:e>
+          <m:sub>
+            <m:r>
+              <m:rPr>
+                <m:sty m:val="p"/>
+              </m:rPr>
+              <w:rPr>
+                <w:rFonts w:ascii="Cambria Math" w:hAnsi="Cambria Math"/>
+                <w:sz w:val="28"/>
+              </w:rPr>
+              <m:t xml:space="preserve">0</m:t>
+            </m:r>
+          </m:sub>
+        </m:sSub>
+        <m:r>
+          <m:rPr>
+            <m:sty m:val="p"/>
+          </m:rPr>
+          <w:rPr>
+            <w:rFonts w:ascii="Cambria Math" w:hAnsi="Cambria Math"/>
+            <w:sz w:val="28"/>
+          </w:rPr>
+          <m:t xml:space="preserve"> = </m:t>
+        </m:r>
+        <m:bar>
+          <m:barPr>
+            <m:pos m:val="top"/>
+          </m:barPr>
+          <m:e>
+            <m:sSub>
+              <m:sSubPr/>
+              <m:e>
+                <m:r>
+                  <m:rPr>
+                    <m:sty m:val="i"/>
+                  </m:rPr>
+                  <w:rPr>
+                    <w:rFonts w:ascii="Cambria Math" w:hAnsi="Cambria Math"/>
+                    <w:sz w:val="28"/>
+                  </w:rPr>
+                  <m:t xml:space="preserve">Q</m:t>
+                </m:r>
+              </m:e>
+              <m:sub>
+                <m:r>
+                  <m:rPr>
+                    <m:sty m:val="p"/>
+                  </m:rPr>
+                  <w:rPr>
+                    <w:rFonts w:ascii="Cambria Math" w:hAnsi="Cambria Math"/>
+                    <w:sz w:val="28"/>
+                  </w:rPr>
+                  <m:t xml:space="preserve">3</m:t>
+                </m:r>
+              </m:sub>
+            </m:sSub>
+          </m:e>
+        </m:bar>
+        <m:sSub>
+          <m:sSubPr/>
+          <m:e>
+            <m:r>
+              <m:rPr>
+                <m:sty m:val="i"/>
+              </m:rPr>
+              <w:rPr>
+                <w:rFonts w:ascii="Cambria Math" w:hAnsi="Cambria Math"/>
+                <w:sz w:val="28"/>
+              </w:rPr>
+              <m:t xml:space="preserve">Q</m:t>
+            </m:r>
+          </m:e>
+          <m:sub>
+            <m:r>
+              <m:rPr>
+                <m:sty m:val="p"/>
+              </m:rPr>
+              <w:rPr>
+                <w:rFonts w:ascii="Cambria Math" w:hAnsi="Cambria Math"/>
+                <w:sz w:val="28"/>
+              </w:rPr>
+              <m:t xml:space="preserve">2</m:t>
+            </m:r>
+          </m:sub>
+        </m:sSub>
+        <m:bar>
+          <m:barPr>
+            <m:pos m:val="top"/>
+          </m:barPr>
+          <m:e>
+            <m:sSub>
+              <m:sSubPr/>
+              <m:e>
+                <m:r>
+                  <m:rPr>
+                    <m:sty m:val="i"/>
+                  </m:rPr>
+                  <w:rPr>
+                    <w:rFonts w:ascii="Cambria Math" w:hAnsi="Cambria Math"/>
+                    <w:sz w:val="28"/>
+                  </w:rPr>
+                  <m:t xml:space="preserve">Q</m:t>
+                </m:r>
+              </m:e>
+              <m:sub>
+                <m:r>
+                  <m:rPr>
+                    <m:sty m:val="p"/>
+                  </m:rPr>
+                  <w:rPr>
+                    <w:rFonts w:ascii="Cambria Math" w:hAnsi="Cambria Math"/>
+                    <w:sz w:val="28"/>
+                  </w:rPr>
+                  <m:t xml:space="preserve">1</m:t>
+                </m:r>
+              </m:sub>
+            </m:sSub>
+          </m:e>
+        </m:bar>
+        <m:r>
+          <m:rPr>
+            <m:sty m:val="p"/>
+          </m:rPr>
+          <w:rPr>
+            <w:rFonts w:ascii="Cambria Math" w:hAnsi="Cambria Math"/>
+            <w:sz w:val="28"/>
+          </w:rPr>
+          <m:t xml:space="preserve"> + </m:t>
+        </m:r>
+        <m:bar>
+          <m:barPr>
+            <m:pos m:val="top"/>
+          </m:barPr>
+          <m:e>
+            <m:sSub>
+              <m:sSubPr/>
+              <m:e>
+                <m:r>
+                  <m:rPr>
+                    <m:sty m:val="i"/>
+                  </m:rPr>
+                  <w:rPr>
+                    <w:rFonts w:ascii="Cambria Math" w:hAnsi="Cambria Math"/>
+                    <w:sz w:val="28"/>
+                  </w:rPr>
+                  <m:t xml:space="preserve">Q</m:t>
+                </m:r>
+              </m:e>
+              <m:sub>
+                <m:r>
+                  <m:rPr>
+                    <m:sty m:val="p"/>
+                  </m:rPr>
+                  <w:rPr>
+                    <w:rFonts w:ascii="Cambria Math" w:hAnsi="Cambria Math"/>
+                    <w:sz w:val="28"/>
+                  </w:rPr>
+                  <m:t xml:space="preserve">2</m:t>
+                </m:r>
+              </m:sub>
+            </m:sSub>
+          </m:e>
+        </m:bar>
+        <m:bar>
+          <m:barPr>
+            <m:pos m:val="top"/>
+          </m:barPr>
+          <m:e>
+            <m:sSub>
+              <m:sSubPr/>
+              <m:e>
+                <m:r>
+                  <m:rPr>
+                    <m:sty m:val="i"/>
+                  </m:rPr>
+                  <w:rPr>
+                    <w:rFonts w:ascii="Cambria Math" w:hAnsi="Cambria Math"/>
+                    <w:sz w:val="28"/>
+                  </w:rPr>
+                  <m:t xml:space="preserve">Q</m:t>
+                </m:r>
+              </m:e>
+              <m:sub>
+                <m:r>
+                  <m:rPr>
+                    <m:sty m:val="p"/>
+                  </m:rPr>
+                  <w:rPr>
+                    <w:rFonts w:ascii="Cambria Math" w:hAnsi="Cambria Math"/>
+                    <w:sz w:val="28"/>
+                  </w:rPr>
+                  <m:t xml:space="preserve">1</m:t>
+                </m:r>
+              </m:sub>
+            </m:sSub>
+          </m:e>
+        </m:bar>
+        <m:sSub>
+          <m:sSubPr/>
+          <m:e>
+            <m:r>
+              <m:rPr>
+                <m:sty m:val="i"/>
+              </m:rPr>
+              <w:rPr>
+                <w:rFonts w:ascii="Cambria Math" w:hAnsi="Cambria Math"/>
+                <w:sz w:val="28"/>
+              </w:rPr>
+              <m:t xml:space="preserve">Q</m:t>
+            </m:r>
+          </m:e>
+          <m:sub>
+            <m:r>
+              <m:rPr>
+                <m:sty m:val="p"/>
+              </m:rPr>
+              <w:rPr>
+                <w:rFonts w:ascii="Cambria Math" w:hAnsi="Cambria Math"/>
+                <w:sz w:val="28"/>
+              </w:rPr>
+              <m:t xml:space="preserve">0</m:t>
+            </m:r>
+          </m:sub>
+        </m:sSub>
+        <m:r>
+          <m:rPr>
+            <m:sty m:val="p"/>
+          </m:rPr>
+          <w:rPr>
+            <w:rFonts w:ascii="Cambria Math" w:hAnsi="Cambria Math"/>
+            <w:sz w:val="28"/>
+          </w:rPr>
+          <m:t xml:space="preserve"> + </m:t>
+        </m:r>
+        <m:sSub>
+          <m:sSubPr/>
+          <m:e>
+            <m:r>
+              <m:rPr>
+                <m:sty m:val="i"/>
+              </m:rPr>
+              <w:rPr>
+                <w:rFonts w:ascii="Cambria Math" w:hAnsi="Cambria Math"/>
+                <w:sz w:val="28"/>
+              </w:rPr>
+              <m:t xml:space="preserve">Q</m:t>
+            </m:r>
+          </m:e>
+          <m:sub>
+            <m:r>
+              <m:rPr>
+                <m:sty m:val="p"/>
+              </m:rPr>
+              <w:rPr>
+                <w:rFonts w:ascii="Cambria Math" w:hAnsi="Cambria Math"/>
+                <w:sz w:val="28"/>
+              </w:rPr>
+              <m:t xml:space="preserve">2</m:t>
+            </m:r>
+          </m:sub>
+        </m:sSub>
+        <m:bar>
+          <m:barPr>
+            <m:pos m:val="top"/>
+          </m:barPr>
+          <m:e>
+            <m:sSub>
+              <m:sSubPr/>
+              <m:e>
+                <m:r>
+                  <m:rPr>
+                    <m:sty m:val="i"/>
+                  </m:rPr>
+                  <w:rPr>
+                    <w:rFonts w:ascii="Cambria Math" w:hAnsi="Cambria Math"/>
+                    <w:sz w:val="28"/>
+                  </w:rPr>
+                  <m:t xml:space="preserve">Q</m:t>
+                </m:r>
+              </m:e>
+              <m:sub>
+                <m:r>
+                  <m:rPr>
+                    <m:sty m:val="p"/>
+                  </m:rPr>
+                  <w:rPr>
+                    <w:rFonts w:ascii="Cambria Math" w:hAnsi="Cambria Math"/>
+                    <w:sz w:val="28"/>
+                  </w:rPr>
+                  <m:t xml:space="preserve">0</m:t>
+                </m:r>
+              </m:sub>
+            </m:sSub>
+          </m:e>
+        </m:bar>
+      </m:oMath>
+      <w:r>
+        <w:rPr>
+          <w:rFonts w:ascii="Times New Roman" w:hAnsi="Times New Roman" w:eastAsia="Times New Roman" w:cs="Times New Roman"/>
+          <w:b w:val="0"/>
+          <w:i w:val="0"/>
+          <w:sz w:val="28"/>
+        </w:rPr>
+        <w:tab/>
+        <w:t>(1.5)</w:t>
+      </w:r>
+    </w:p>
+    <w:p>
+      <w:pPr>
+        <w:spacing w:before="240" w:after="0" w:line="360" w:lineRule="auto"/>
+        <w:ind w:firstLine="709" w:left="0" w:right="0"/>
+        <w:jc w:val="both"/>
+      </w:pPr>
+      <w:r>
+        <w:rPr>
+          <w:rFonts w:ascii="Times New Roman" w:hAnsi="Times New Roman" w:eastAsia="Times New Roman" w:cs="Times New Roman"/>
+          <w:b w:val="0"/>
+          <w:i w:val="0"/>
+          <w:sz w:val="28"/>
+        </w:rPr>
+        <w:t>Полученные МДНФ определяют комбинационную часть ПСУ: по текущему коду состояния Q3…Q0 формируются значения D3…D0, записываемые в D-триггеры по активному фронту тактового сигнала. Проверка выражений для всех 14 рабочих состояний подтверждает заданную последовательность переходов.</w:t>
       </w:r>
     </w:p>
     <w:sectPr>

</xml_diff>

<commit_message>
report: add Logic_D diagrams and timing section
</commit_message>
<xml_diff>
--- a/deliverables/Курсовая_Блинов_текущая.docx
+++ b/deliverables/Курсовая_Блинов_текущая.docx
@@ -145,7 +145,6 @@
           <w:sz w:val="24"/>
         </w:rPr>
       </w:pPr>
-      <w:proofErr w:type="gramStart"/>
       <w:r>
         <w:rPr>
           <w:b/>
@@ -168,7 +167,6 @@
         </w:rPr>
         <w:t>Н</w:t>
       </w:r>
-      <w:proofErr w:type="gramEnd"/>
       <w:r>
         <w:rPr>
           <w:b/>
@@ -200,7 +198,6 @@
         </w:rPr>
         <w:t>У</w:t>
       </w:r>
-      <w:proofErr w:type="gramStart"/>
       <w:r>
         <w:rPr>
           <w:b/>
@@ -224,7 +221,6 @@
         </w:rPr>
         <w:t>Б</w:t>
       </w:r>
-      <w:proofErr w:type="gramEnd"/>
       <w:r>
         <w:rPr>
           <w:b/>
@@ -278,7 +274,6 @@
         </w:rPr>
         <w:t xml:space="preserve"> </w:t>
       </w:r>
-      <w:proofErr w:type="gramStart"/>
       <w:r>
         <w:rPr>
           <w:b/>
@@ -301,7 +296,6 @@
         </w:rPr>
         <w:t>»</w:t>
       </w:r>
-      <w:proofErr w:type="gramEnd"/>
       <w:r>
         <w:rPr>
           <w:b/>
@@ -1551,21 +1545,12 @@
         </w:rPr>
         <w:t xml:space="preserve"> </w:t>
       </w:r>
-      <w:proofErr w:type="spellStart"/>
       <w:r>
         <w:rPr>
           <w:spacing w:val="-2"/>
           <w:sz w:val="28"/>
         </w:rPr>
-        <w:t>Multisim</w:t>
-      </w:r>
-      <w:proofErr w:type="spellEnd"/>
-      <w:r>
-        <w:rPr>
-          <w:spacing w:val="-2"/>
-          <w:sz w:val="28"/>
-        </w:rPr>
-        <w:t>.</w:t>
+        <w:t>Multisim.</w:t>
       </w:r>
     </w:p>
     <w:p>
@@ -1738,21 +1723,12 @@
         </w:rPr>
         <w:t xml:space="preserve"> </w:t>
       </w:r>
-      <w:proofErr w:type="spellStart"/>
       <w:r>
         <w:rPr>
           <w:spacing w:val="-2"/>
           <w:sz w:val="28"/>
         </w:rPr>
-        <w:t>Multisim</w:t>
-      </w:r>
-      <w:proofErr w:type="spellEnd"/>
-      <w:r>
-        <w:rPr>
-          <w:spacing w:val="-2"/>
-          <w:sz w:val="28"/>
-        </w:rPr>
-        <w:t>.</w:t>
+        <w:t>Multisim.</w:t>
       </w:r>
     </w:p>
     <w:p>
@@ -2032,6 +2008,7 @@
           <w:docPartUnique/>
         </w:docPartObj>
       </w:sdtPr>
+      <w:sdtEndPr/>
       <w:sdtContent>
         <w:p>
           <w:pPr>
@@ -2673,14 +2650,7 @@
             <w:rPr>
               <w:sz w:val="28"/>
             </w:rPr>
-            <w:t xml:space="preserve">выполнить синтез дешифратора (DC) выходных состояний, формирующего управляющие сигналы </w:t>
-          </w:r>
-          <w:proofErr w:type="spellStart"/>
-          <w:r>
-            <w:rPr>
-              <w:sz w:val="28"/>
-            </w:rPr>
-            <w:t>Y</w:t>
+            <w:t>выполнить синтез дешифратора (DC) выходных состояний, формирующего управляющие сигналы Y</w:t>
           </w:r>
           <w:r>
             <w:rPr>
@@ -2689,7 +2659,6 @@
             </w:rPr>
             <w:t>i</w:t>
           </w:r>
-          <w:proofErr w:type="spellEnd"/>
           <w:r>
             <w:rPr>
               <w:sz w:val="28"/>
@@ -4211,23 +4180,7 @@
                 <w:rFonts w:ascii="Times New Roman" w:hAnsi="Times New Roman"/>
                 <w:sz w:val="24"/>
               </w:rPr>
-              <w:t>цифровая (шестнадцатеричный код) светодиодная (</w:t>
-            </w:r>
-            <w:proofErr w:type="spellStart"/>
-            <w:r>
-              <w:rPr>
-                <w:rFonts w:ascii="Times New Roman" w:hAnsi="Times New Roman"/>
-                <w:sz w:val="24"/>
-              </w:rPr>
-              <w:t>probes</w:t>
-            </w:r>
-            <w:proofErr w:type="spellEnd"/>
-            <w:r>
-              <w:rPr>
-                <w:rFonts w:ascii="Times New Roman" w:hAnsi="Times New Roman"/>
-                <w:sz w:val="24"/>
-              </w:rPr>
-              <w:t>)</w:t>
+              <w:t>цифровая (шестнадцатеричный код) светодиодная (probes)</w:t>
             </w:r>
           </w:p>
         </w:tc>
@@ -4671,15 +4624,7 @@
       </w:pPr>
       <w:r>
         <w:lastRenderedPageBreak/>
-        <w:t xml:space="preserve">Количество триггеров, необходимых для работы устройства, определяется разрядностью кодов состояний. Для модуля счета M = 14 необходимое число триггеров вычисляется по формуле N = </w:t>
-      </w:r>
-      <w:proofErr w:type="spellStart"/>
-      <w:r>
-        <w:t>log₂M</w:t>
-      </w:r>
-      <w:proofErr w:type="spellEnd"/>
-      <w:r>
-        <w:t>. Подставив в формулу (1.1) значение M и округлив результат вверх, рассчитаем N:</w:t>
+        <w:t>Количество триггеров, необходимых для работы устройства, определяется разрядностью кодов состояний. Для модуля счета M = 14 необходимое число триггеров вычисляется по формуле N = log₂M. Подставив в формулу (1.1) значение M и округлив результат вверх, рассчитаем N:</w:t>
       </w:r>
     </w:p>
     <w:tbl>
@@ -4761,15 +4706,7 @@
         <w:jc w:val="both"/>
       </w:pPr>
       <w:r>
-        <w:t xml:space="preserve">Микросхема 74AS74 (SN74AS74A) представляет собой два D-триггера с переключением по положительному фронту тактового сигнала. Каждый триггер имеет отдельные входы D и CLK, асинхронные входы установки PRE и сброса CLR, прямой выход Q и инверсный выход Q̅. </w:t>
-      </w:r>
-      <w:proofErr w:type="spellStart"/>
-      <w:r>
-        <w:t>Распиновка</w:t>
-      </w:r>
-      <w:proofErr w:type="spellEnd"/>
-      <w:r>
-        <w:t xml:space="preserve"> микросхемы 74AS74 представлена на рисунке 1.2.</w:t>
+        <w:t>Микросхема 74AS74 (SN74AS74A) представляет собой два D-триггера с переключением по положительному фронту тактового сигнала. Каждый триггер имеет отдельные входы D и CLK, асинхронные входы установки PRE и сброса CLR, прямой выход Q и инверсный выход Q̅. Распиновка микросхемы 74AS74 представлена на рисунке 1.2.</w:t>
       </w:r>
     </w:p>
     <w:p>
@@ -4834,15 +4771,7 @@
         <w:jc w:val="center"/>
       </w:pPr>
       <w:r>
-        <w:t xml:space="preserve">Рисунок 1.2 – </w:t>
-      </w:r>
-      <w:proofErr w:type="spellStart"/>
-      <w:r>
-        <w:t>Распиновка</w:t>
-      </w:r>
-      <w:proofErr w:type="spellEnd"/>
-      <w:r>
-        <w:t xml:space="preserve"> микросхемы 74AS74</w:t>
+        <w:t>Рисунок 1.2 – Распиновка микросхемы 74AS74</w:t>
       </w:r>
     </w:p>
     <w:p>
@@ -8445,17 +8374,15 @@
     <w:p>
       <w:pPr>
         <w:keepNext/>
-        <w:spacing w:before="0" w:after="0" w:line="360" w:lineRule="auto"/>
-        <w:ind w:firstLine="709" w:left="0" w:right="0"/>
+        <w:spacing w:line="360" w:lineRule="auto"/>
+        <w:ind w:firstLine="709"/>
         <w:jc w:val="both"/>
       </w:pPr>
       <w:r>
         <w:rPr>
-          <w:rFonts w:ascii="Times New Roman" w:hAnsi="Times New Roman" w:eastAsia="Times New Roman" w:cs="Times New Roman"/>
-          <w:b w:val="0"/>
-          <w:i w:val="0"/>
           <w:sz w:val="28"/>
         </w:rPr>
+        <w:lastRenderedPageBreak/>
         <w:t>После минимизации по картам Карно составлены выражения входных функций в минимальной дизъюнктивной нормальной форме (МДНФ) (1.2–1.5).</w:t>
       </w:r>
     </w:p>
@@ -8463,36 +8390,36 @@
       <w:pPr>
         <w:keepLines/>
         <w:tabs>
-          <w:tab w:pos="4649" w:val="center"/>
-          <w:tab w:pos="9071" w:val="right"/>
-        </w:tabs>
-        <w:spacing w:before="120" w:after="120" w:line="240" w:lineRule="auto"/>
-        <w:ind w:firstLine="0" w:left="0" w:right="0"/>
-        <w:jc w:val="left"/>
-      </w:pPr>
-      <w:r>
-        <w:rPr>
-          <w:rFonts w:ascii="Times New Roman" w:hAnsi="Times New Roman" w:eastAsia="Times New Roman" w:cs="Times New Roman"/>
-          <w:b w:val="0"/>
-          <w:i w:val="0"/>
+          <w:tab w:val="center" w:pos="4649"/>
+          <w:tab w:val="right" w:pos="9071"/>
+        </w:tabs>
+        <w:spacing w:before="120" w:after="120"/>
+      </w:pPr>
+      <w:r>
+        <w:rPr>
           <w:sz w:val="28"/>
         </w:rPr>
         <w:tab/>
       </w:r>
       <m:oMath>
         <m:sSub>
-          <m:sSubPr/>
+          <m:sSubPr>
+            <m:ctrlPr>
+              <w:rPr>
+                <w:rFonts w:ascii="Cambria Math" w:hAnsi="Cambria Math"/>
+              </w:rPr>
+            </m:ctrlPr>
+          </m:sSubPr>
           <m:e>
             <m:r>
               <m:rPr>
-                <m:sty m:val="i"/>
+                <m:sty m:val="bi"/>
               </m:rPr>
               <w:rPr>
                 <w:rFonts w:ascii="Cambria Math" w:hAnsi="Cambria Math"/>
                 <w:sz w:val="28"/>
-                <w:b/>
-              </w:rPr>
-              <m:t xml:space="preserve">D</m:t>
+              </w:rPr>
+              <m:t>D</m:t>
             </m:r>
           </m:e>
           <m:sub>
@@ -8504,7 +8431,7 @@
                 <w:rFonts w:ascii="Cambria Math" w:hAnsi="Cambria Math"/>
                 <w:sz w:val="28"/>
               </w:rPr>
-              <m:t xml:space="preserve">3</m:t>
+              <m:t>3</m:t>
             </m:r>
           </m:sub>
         </m:sSub>
@@ -8521,20 +8448,28 @@
         <m:bar>
           <m:barPr>
             <m:pos m:val="top"/>
+            <m:ctrlPr>
+              <w:rPr>
+                <w:rFonts w:ascii="Cambria Math" w:hAnsi="Cambria Math"/>
+              </w:rPr>
+            </m:ctrlPr>
           </m:barPr>
           <m:e>
             <m:sSub>
-              <m:sSubPr/>
+              <m:sSubPr>
+                <m:ctrlPr>
+                  <w:rPr>
+                    <w:rFonts w:ascii="Cambria Math" w:hAnsi="Cambria Math"/>
+                  </w:rPr>
+                </m:ctrlPr>
+              </m:sSubPr>
               <m:e>
                 <m:r>
-                  <m:rPr>
-                    <m:sty m:val="i"/>
-                  </m:rPr>
                   <w:rPr>
                     <w:rFonts w:ascii="Cambria Math" w:hAnsi="Cambria Math"/>
                     <w:sz w:val="28"/>
                   </w:rPr>
-                  <m:t xml:space="preserve">Q</m:t>
+                  <m:t>Q</m:t>
                 </m:r>
               </m:e>
               <m:sub>
@@ -8546,7 +8481,7 @@
                     <w:rFonts w:ascii="Cambria Math" w:hAnsi="Cambria Math"/>
                     <w:sz w:val="28"/>
                   </w:rPr>
-                  <m:t xml:space="preserve">3</m:t>
+                  <m:t>3</m:t>
                 </m:r>
               </m:sub>
             </m:sSub>
@@ -8555,20 +8490,28 @@
         <m:bar>
           <m:barPr>
             <m:pos m:val="top"/>
+            <m:ctrlPr>
+              <w:rPr>
+                <w:rFonts w:ascii="Cambria Math" w:hAnsi="Cambria Math"/>
+              </w:rPr>
+            </m:ctrlPr>
           </m:barPr>
           <m:e>
             <m:sSub>
-              <m:sSubPr/>
+              <m:sSubPr>
+                <m:ctrlPr>
+                  <w:rPr>
+                    <w:rFonts w:ascii="Cambria Math" w:hAnsi="Cambria Math"/>
+                  </w:rPr>
+                </m:ctrlPr>
+              </m:sSubPr>
               <m:e>
                 <m:r>
-                  <m:rPr>
-                    <m:sty m:val="i"/>
-                  </m:rPr>
                   <w:rPr>
                     <w:rFonts w:ascii="Cambria Math" w:hAnsi="Cambria Math"/>
                     <w:sz w:val="28"/>
                   </w:rPr>
-                  <m:t xml:space="preserve">Q</m:t>
+                  <m:t>Q</m:t>
                 </m:r>
               </m:e>
               <m:sub>
@@ -8580,7 +8523,7 @@
                     <w:rFonts w:ascii="Cambria Math" w:hAnsi="Cambria Math"/>
                     <w:sz w:val="28"/>
                   </w:rPr>
-                  <m:t xml:space="preserve">2</m:t>
+                  <m:t>2</m:t>
                 </m:r>
               </m:sub>
             </m:sSub>
@@ -8599,20 +8542,28 @@
         <m:bar>
           <m:barPr>
             <m:pos m:val="top"/>
+            <m:ctrlPr>
+              <w:rPr>
+                <w:rFonts w:ascii="Cambria Math" w:hAnsi="Cambria Math"/>
+              </w:rPr>
+            </m:ctrlPr>
           </m:barPr>
           <m:e>
             <m:sSub>
-              <m:sSubPr/>
+              <m:sSubPr>
+                <m:ctrlPr>
+                  <w:rPr>
+                    <w:rFonts w:ascii="Cambria Math" w:hAnsi="Cambria Math"/>
+                  </w:rPr>
+                </m:ctrlPr>
+              </m:sSubPr>
               <m:e>
                 <m:r>
-                  <m:rPr>
-                    <m:sty m:val="i"/>
-                  </m:rPr>
                   <w:rPr>
                     <w:rFonts w:ascii="Cambria Math" w:hAnsi="Cambria Math"/>
                     <w:sz w:val="28"/>
                   </w:rPr>
-                  <m:t xml:space="preserve">Q</m:t>
+                  <m:t>Q</m:t>
                 </m:r>
               </m:e>
               <m:sub>
@@ -8624,24 +8575,27 @@
                     <w:rFonts w:ascii="Cambria Math" w:hAnsi="Cambria Math"/>
                     <w:sz w:val="28"/>
                   </w:rPr>
-                  <m:t xml:space="preserve">3</m:t>
+                  <m:t>3</m:t>
                 </m:r>
               </m:sub>
             </m:sSub>
           </m:e>
         </m:bar>
         <m:sSub>
-          <m:sSubPr/>
+          <m:sSubPr>
+            <m:ctrlPr>
+              <w:rPr>
+                <w:rFonts w:ascii="Cambria Math" w:hAnsi="Cambria Math"/>
+              </w:rPr>
+            </m:ctrlPr>
+          </m:sSubPr>
           <m:e>
             <m:r>
-              <m:rPr>
-                <m:sty m:val="i"/>
-              </m:rPr>
               <w:rPr>
                 <w:rFonts w:ascii="Cambria Math" w:hAnsi="Cambria Math"/>
                 <w:sz w:val="28"/>
               </w:rPr>
-              <m:t xml:space="preserve">Q</m:t>
+              <m:t>Q</m:t>
             </m:r>
           </m:e>
           <m:sub>
@@ -8653,7 +8607,7 @@
                 <w:rFonts w:ascii="Cambria Math" w:hAnsi="Cambria Math"/>
                 <w:sz w:val="28"/>
               </w:rPr>
-              <m:t xml:space="preserve">1</m:t>
+              <m:t>1</m:t>
             </m:r>
           </m:sub>
         </m:sSub>
@@ -8668,17 +8622,20 @@
           <m:t xml:space="preserve"> + </m:t>
         </m:r>
         <m:sSub>
-          <m:sSubPr/>
+          <m:sSubPr>
+            <m:ctrlPr>
+              <w:rPr>
+                <w:rFonts w:ascii="Cambria Math" w:hAnsi="Cambria Math"/>
+              </w:rPr>
+            </m:ctrlPr>
+          </m:sSubPr>
           <m:e>
             <m:r>
-              <m:rPr>
-                <m:sty m:val="i"/>
-              </m:rPr>
               <w:rPr>
                 <w:rFonts w:ascii="Cambria Math" w:hAnsi="Cambria Math"/>
                 <w:sz w:val="28"/>
               </w:rPr>
-              <m:t xml:space="preserve">Q</m:t>
+              <m:t>Q</m:t>
             </m:r>
           </m:e>
           <m:sub>
@@ -8690,22 +8647,25 @@
                 <w:rFonts w:ascii="Cambria Math" w:hAnsi="Cambria Math"/>
                 <w:sz w:val="28"/>
               </w:rPr>
-              <m:t xml:space="preserve">3</m:t>
+              <m:t>3</m:t>
             </m:r>
           </m:sub>
         </m:sSub>
         <m:sSub>
-          <m:sSubPr/>
+          <m:sSubPr>
+            <m:ctrlPr>
+              <w:rPr>
+                <w:rFonts w:ascii="Cambria Math" w:hAnsi="Cambria Math"/>
+              </w:rPr>
+            </m:ctrlPr>
+          </m:sSubPr>
           <m:e>
             <m:r>
-              <m:rPr>
-                <m:sty m:val="i"/>
-              </m:rPr>
               <w:rPr>
                 <w:rFonts w:ascii="Cambria Math" w:hAnsi="Cambria Math"/>
                 <w:sz w:val="28"/>
               </w:rPr>
-              <m:t xml:space="preserve">Q</m:t>
+              <m:t>Q</m:t>
             </m:r>
           </m:e>
           <m:sub>
@@ -8717,27 +8677,35 @@
                 <w:rFonts w:ascii="Cambria Math" w:hAnsi="Cambria Math"/>
                 <w:sz w:val="28"/>
               </w:rPr>
-              <m:t xml:space="preserve">2</m:t>
+              <m:t>2</m:t>
             </m:r>
           </m:sub>
         </m:sSub>
         <m:bar>
           <m:barPr>
             <m:pos m:val="top"/>
+            <m:ctrlPr>
+              <w:rPr>
+                <w:rFonts w:ascii="Cambria Math" w:hAnsi="Cambria Math"/>
+              </w:rPr>
+            </m:ctrlPr>
           </m:barPr>
           <m:e>
             <m:sSub>
-              <m:sSubPr/>
+              <m:sSubPr>
+                <m:ctrlPr>
+                  <w:rPr>
+                    <w:rFonts w:ascii="Cambria Math" w:hAnsi="Cambria Math"/>
+                  </w:rPr>
+                </m:ctrlPr>
+              </m:sSubPr>
               <m:e>
                 <m:r>
-                  <m:rPr>
-                    <m:sty m:val="i"/>
-                  </m:rPr>
                   <w:rPr>
                     <w:rFonts w:ascii="Cambria Math" w:hAnsi="Cambria Math"/>
                     <w:sz w:val="28"/>
                   </w:rPr>
-                  <m:t xml:space="preserve">Q</m:t>
+                  <m:t>Q</m:t>
                 </m:r>
               </m:e>
               <m:sub>
@@ -8749,7 +8717,7 @@
                     <w:rFonts w:ascii="Cambria Math" w:hAnsi="Cambria Math"/>
                     <w:sz w:val="28"/>
                   </w:rPr>
-                  <m:t xml:space="preserve">0</m:t>
+                  <m:t>0</m:t>
                 </m:r>
               </m:sub>
             </m:sSub>
@@ -8758,9 +8726,6 @@
       </m:oMath>
       <w:r>
         <w:rPr>
-          <w:rFonts w:ascii="Times New Roman" w:hAnsi="Times New Roman" w:eastAsia="Times New Roman" w:cs="Times New Roman"/>
-          <w:b w:val="0"/>
-          <w:i w:val="0"/>
           <w:sz w:val="28"/>
         </w:rPr>
         <w:tab/>
@@ -8771,36 +8736,36 @@
       <w:pPr>
         <w:keepLines/>
         <w:tabs>
-          <w:tab w:pos="4649" w:val="center"/>
-          <w:tab w:pos="9071" w:val="right"/>
-        </w:tabs>
-        <w:spacing w:before="120" w:after="120" w:line="240" w:lineRule="auto"/>
-        <w:ind w:firstLine="0" w:left="0" w:right="0"/>
-        <w:jc w:val="left"/>
-      </w:pPr>
-      <w:r>
-        <w:rPr>
-          <w:rFonts w:ascii="Times New Roman" w:hAnsi="Times New Roman" w:eastAsia="Times New Roman" w:cs="Times New Roman"/>
-          <w:b w:val="0"/>
-          <w:i w:val="0"/>
+          <w:tab w:val="center" w:pos="4649"/>
+          <w:tab w:val="right" w:pos="9071"/>
+        </w:tabs>
+        <w:spacing w:before="120" w:after="120"/>
+      </w:pPr>
+      <w:r>
+        <w:rPr>
           <w:sz w:val="28"/>
         </w:rPr>
         <w:tab/>
       </w:r>
       <m:oMath>
         <m:sSub>
-          <m:sSubPr/>
+          <m:sSubPr>
+            <m:ctrlPr>
+              <w:rPr>
+                <w:rFonts w:ascii="Cambria Math" w:hAnsi="Cambria Math"/>
+              </w:rPr>
+            </m:ctrlPr>
+          </m:sSubPr>
           <m:e>
             <m:r>
               <m:rPr>
-                <m:sty m:val="i"/>
+                <m:sty m:val="bi"/>
               </m:rPr>
               <w:rPr>
                 <w:rFonts w:ascii="Cambria Math" w:hAnsi="Cambria Math"/>
                 <w:sz w:val="28"/>
-                <w:b/>
-              </w:rPr>
-              <m:t xml:space="preserve">D</m:t>
+              </w:rPr>
+              <m:t>D</m:t>
             </m:r>
           </m:e>
           <m:sub>
@@ -8812,7 +8777,7 @@
                 <w:rFonts w:ascii="Cambria Math" w:hAnsi="Cambria Math"/>
                 <w:sz w:val="28"/>
               </w:rPr>
-              <m:t xml:space="preserve">2</m:t>
+              <m:t>2</m:t>
             </m:r>
           </m:sub>
         </m:sSub>
@@ -8829,20 +8794,28 @@
         <m:bar>
           <m:barPr>
             <m:pos m:val="top"/>
+            <m:ctrlPr>
+              <w:rPr>
+                <w:rFonts w:ascii="Cambria Math" w:hAnsi="Cambria Math"/>
+              </w:rPr>
+            </m:ctrlPr>
           </m:barPr>
           <m:e>
             <m:sSub>
-              <m:sSubPr/>
+              <m:sSubPr>
+                <m:ctrlPr>
+                  <w:rPr>
+                    <w:rFonts w:ascii="Cambria Math" w:hAnsi="Cambria Math"/>
+                  </w:rPr>
+                </m:ctrlPr>
+              </m:sSubPr>
               <m:e>
                 <m:r>
-                  <m:rPr>
-                    <m:sty m:val="i"/>
-                  </m:rPr>
                   <w:rPr>
                     <w:rFonts w:ascii="Cambria Math" w:hAnsi="Cambria Math"/>
                     <w:sz w:val="28"/>
                   </w:rPr>
-                  <m:t xml:space="preserve">Q</m:t>
+                  <m:t>Q</m:t>
                 </m:r>
               </m:e>
               <m:sub>
@@ -8854,7 +8827,7 @@
                     <w:rFonts w:ascii="Cambria Math" w:hAnsi="Cambria Math"/>
                     <w:sz w:val="28"/>
                   </w:rPr>
-                  <m:t xml:space="preserve">3</m:t>
+                  <m:t>3</m:t>
                 </m:r>
               </m:sub>
             </m:sSub>
@@ -8863,20 +8836,28 @@
         <m:bar>
           <m:barPr>
             <m:pos m:val="top"/>
+            <m:ctrlPr>
+              <w:rPr>
+                <w:rFonts w:ascii="Cambria Math" w:hAnsi="Cambria Math"/>
+              </w:rPr>
+            </m:ctrlPr>
           </m:barPr>
           <m:e>
             <m:sSub>
-              <m:sSubPr/>
+              <m:sSubPr>
+                <m:ctrlPr>
+                  <w:rPr>
+                    <w:rFonts w:ascii="Cambria Math" w:hAnsi="Cambria Math"/>
+                  </w:rPr>
+                </m:ctrlPr>
+              </m:sSubPr>
               <m:e>
                 <m:r>
-                  <m:rPr>
-                    <m:sty m:val="i"/>
-                  </m:rPr>
                   <w:rPr>
                     <w:rFonts w:ascii="Cambria Math" w:hAnsi="Cambria Math"/>
                     <w:sz w:val="28"/>
                   </w:rPr>
-                  <m:t xml:space="preserve">Q</m:t>
+                  <m:t>Q</m:t>
                 </m:r>
               </m:e>
               <m:sub>
@@ -8888,24 +8869,27 @@
                     <w:rFonts w:ascii="Cambria Math" w:hAnsi="Cambria Math"/>
                     <w:sz w:val="28"/>
                   </w:rPr>
-                  <m:t xml:space="preserve">1</m:t>
+                  <m:t>1</m:t>
                 </m:r>
               </m:sub>
             </m:sSub>
           </m:e>
         </m:bar>
         <m:sSub>
-          <m:sSubPr/>
+          <m:sSubPr>
+            <m:ctrlPr>
+              <w:rPr>
+                <w:rFonts w:ascii="Cambria Math" w:hAnsi="Cambria Math"/>
+              </w:rPr>
+            </m:ctrlPr>
+          </m:sSubPr>
           <m:e>
             <m:r>
-              <m:rPr>
-                <m:sty m:val="i"/>
-              </m:rPr>
               <w:rPr>
                 <w:rFonts w:ascii="Cambria Math" w:hAnsi="Cambria Math"/>
                 <w:sz w:val="28"/>
               </w:rPr>
-              <m:t xml:space="preserve">Q</m:t>
+              <m:t>Q</m:t>
             </m:r>
           </m:e>
           <m:sub>
@@ -8917,7 +8901,7 @@
                 <w:rFonts w:ascii="Cambria Math" w:hAnsi="Cambria Math"/>
                 <w:sz w:val="28"/>
               </w:rPr>
-              <m:t xml:space="preserve">0</m:t>
+              <m:t>0</m:t>
             </m:r>
           </m:sub>
         </m:sSub>
@@ -8934,20 +8918,28 @@
         <m:bar>
           <m:barPr>
             <m:pos m:val="top"/>
+            <m:ctrlPr>
+              <w:rPr>
+                <w:rFonts w:ascii="Cambria Math" w:hAnsi="Cambria Math"/>
+              </w:rPr>
+            </m:ctrlPr>
           </m:barPr>
           <m:e>
             <m:sSub>
-              <m:sSubPr/>
+              <m:sSubPr>
+                <m:ctrlPr>
+                  <w:rPr>
+                    <w:rFonts w:ascii="Cambria Math" w:hAnsi="Cambria Math"/>
+                  </w:rPr>
+                </m:ctrlPr>
+              </m:sSubPr>
               <m:e>
                 <m:r>
-                  <m:rPr>
-                    <m:sty m:val="i"/>
-                  </m:rPr>
                   <w:rPr>
                     <w:rFonts w:ascii="Cambria Math" w:hAnsi="Cambria Math"/>
                     <w:sz w:val="28"/>
                   </w:rPr>
-                  <m:t xml:space="preserve">Q</m:t>
+                  <m:t>Q</m:t>
                 </m:r>
               </m:e>
               <m:sub>
@@ -8959,24 +8951,27 @@
                     <w:rFonts w:ascii="Cambria Math" w:hAnsi="Cambria Math"/>
                     <w:sz w:val="28"/>
                   </w:rPr>
-                  <m:t xml:space="preserve">3</m:t>
+                  <m:t>3</m:t>
                 </m:r>
               </m:sub>
             </m:sSub>
           </m:e>
         </m:bar>
         <m:sSub>
-          <m:sSubPr/>
+          <m:sSubPr>
+            <m:ctrlPr>
+              <w:rPr>
+                <w:rFonts w:ascii="Cambria Math" w:hAnsi="Cambria Math"/>
+              </w:rPr>
+            </m:ctrlPr>
+          </m:sSubPr>
           <m:e>
             <m:r>
-              <m:rPr>
-                <m:sty m:val="i"/>
-              </m:rPr>
               <w:rPr>
                 <w:rFonts w:ascii="Cambria Math" w:hAnsi="Cambria Math"/>
                 <w:sz w:val="28"/>
               </w:rPr>
-              <m:t xml:space="preserve">Q</m:t>
+              <m:t>Q</m:t>
             </m:r>
           </m:e>
           <m:sub>
@@ -8988,27 +8983,35 @@
                 <w:rFonts w:ascii="Cambria Math" w:hAnsi="Cambria Math"/>
                 <w:sz w:val="28"/>
               </w:rPr>
-              <m:t xml:space="preserve">1</m:t>
+              <m:t>1</m:t>
             </m:r>
           </m:sub>
         </m:sSub>
         <m:bar>
           <m:barPr>
             <m:pos m:val="top"/>
+            <m:ctrlPr>
+              <w:rPr>
+                <w:rFonts w:ascii="Cambria Math" w:hAnsi="Cambria Math"/>
+              </w:rPr>
+            </m:ctrlPr>
           </m:barPr>
           <m:e>
             <m:sSub>
-              <m:sSubPr/>
+              <m:sSubPr>
+                <m:ctrlPr>
+                  <w:rPr>
+                    <w:rFonts w:ascii="Cambria Math" w:hAnsi="Cambria Math"/>
+                  </w:rPr>
+                </m:ctrlPr>
+              </m:sSubPr>
               <m:e>
                 <m:r>
-                  <m:rPr>
-                    <m:sty m:val="i"/>
-                  </m:rPr>
                   <w:rPr>
                     <w:rFonts w:ascii="Cambria Math" w:hAnsi="Cambria Math"/>
                     <w:sz w:val="28"/>
                   </w:rPr>
-                  <m:t xml:space="preserve">Q</m:t>
+                  <m:t>Q</m:t>
                 </m:r>
               </m:e>
               <m:sub>
@@ -9020,7 +9023,7 @@
                     <w:rFonts w:ascii="Cambria Math" w:hAnsi="Cambria Math"/>
                     <w:sz w:val="28"/>
                   </w:rPr>
-                  <m:t xml:space="preserve">0</m:t>
+                  <m:t>0</m:t>
                 </m:r>
               </m:sub>
             </m:sSub>
@@ -9039,20 +9042,28 @@
         <m:bar>
           <m:barPr>
             <m:pos m:val="top"/>
+            <m:ctrlPr>
+              <w:rPr>
+                <w:rFonts w:ascii="Cambria Math" w:hAnsi="Cambria Math"/>
+              </w:rPr>
+            </m:ctrlPr>
           </m:barPr>
           <m:e>
             <m:sSub>
-              <m:sSubPr/>
+              <m:sSubPr>
+                <m:ctrlPr>
+                  <w:rPr>
+                    <w:rFonts w:ascii="Cambria Math" w:hAnsi="Cambria Math"/>
+                  </w:rPr>
+                </m:ctrlPr>
+              </m:sSubPr>
               <m:e>
                 <m:r>
-                  <m:rPr>
-                    <m:sty m:val="i"/>
-                  </m:rPr>
                   <w:rPr>
                     <w:rFonts w:ascii="Cambria Math" w:hAnsi="Cambria Math"/>
                     <w:sz w:val="28"/>
                   </w:rPr>
-                  <m:t xml:space="preserve">Q</m:t>
+                  <m:t>Q</m:t>
                 </m:r>
               </m:e>
               <m:sub>
@@ -9064,7 +9075,7 @@
                     <w:rFonts w:ascii="Cambria Math" w:hAnsi="Cambria Math"/>
                     <w:sz w:val="28"/>
                   </w:rPr>
-                  <m:t xml:space="preserve">2</m:t>
+                  <m:t>2</m:t>
                 </m:r>
               </m:sub>
             </m:sSub>
@@ -9073,20 +9084,28 @@
         <m:bar>
           <m:barPr>
             <m:pos m:val="top"/>
+            <m:ctrlPr>
+              <w:rPr>
+                <w:rFonts w:ascii="Cambria Math" w:hAnsi="Cambria Math"/>
+              </w:rPr>
+            </m:ctrlPr>
           </m:barPr>
           <m:e>
             <m:sSub>
-              <m:sSubPr/>
+              <m:sSubPr>
+                <m:ctrlPr>
+                  <w:rPr>
+                    <w:rFonts w:ascii="Cambria Math" w:hAnsi="Cambria Math"/>
+                  </w:rPr>
+                </m:ctrlPr>
+              </m:sSubPr>
               <m:e>
                 <m:r>
-                  <m:rPr>
-                    <m:sty m:val="i"/>
-                  </m:rPr>
                   <w:rPr>
                     <w:rFonts w:ascii="Cambria Math" w:hAnsi="Cambria Math"/>
                     <w:sz w:val="28"/>
                   </w:rPr>
-                  <m:t xml:space="preserve">Q</m:t>
+                  <m:t>Q</m:t>
                 </m:r>
               </m:e>
               <m:sub>
@@ -9098,7 +9117,7 @@
                     <w:rFonts w:ascii="Cambria Math" w:hAnsi="Cambria Math"/>
                     <w:sz w:val="28"/>
                   </w:rPr>
-                  <m:t xml:space="preserve">1</m:t>
+                  <m:t>1</m:t>
                 </m:r>
               </m:sub>
             </m:sSub>
@@ -9117,20 +9136,28 @@
         <m:bar>
           <m:barPr>
             <m:pos m:val="top"/>
+            <m:ctrlPr>
+              <w:rPr>
+                <w:rFonts w:ascii="Cambria Math" w:hAnsi="Cambria Math"/>
+              </w:rPr>
+            </m:ctrlPr>
           </m:barPr>
           <m:e>
             <m:sSub>
-              <m:sSubPr/>
+              <m:sSubPr>
+                <m:ctrlPr>
+                  <w:rPr>
+                    <w:rFonts w:ascii="Cambria Math" w:hAnsi="Cambria Math"/>
+                  </w:rPr>
+                </m:ctrlPr>
+              </m:sSubPr>
               <m:e>
                 <m:r>
-                  <m:rPr>
-                    <m:sty m:val="i"/>
-                  </m:rPr>
                   <w:rPr>
                     <w:rFonts w:ascii="Cambria Math" w:hAnsi="Cambria Math"/>
                     <w:sz w:val="28"/>
                   </w:rPr>
-                  <m:t xml:space="preserve">Q</m:t>
+                  <m:t>Q</m:t>
                 </m:r>
               </m:e>
               <m:sub>
@@ -9142,7 +9169,7 @@
                     <w:rFonts w:ascii="Cambria Math" w:hAnsi="Cambria Math"/>
                     <w:sz w:val="28"/>
                   </w:rPr>
-                  <m:t xml:space="preserve">2</m:t>
+                  <m:t>2</m:t>
                 </m:r>
               </m:sub>
             </m:sSub>
@@ -9151,20 +9178,28 @@
         <m:bar>
           <m:barPr>
             <m:pos m:val="top"/>
+            <m:ctrlPr>
+              <w:rPr>
+                <w:rFonts w:ascii="Cambria Math" w:hAnsi="Cambria Math"/>
+              </w:rPr>
+            </m:ctrlPr>
           </m:barPr>
           <m:e>
             <m:sSub>
-              <m:sSubPr/>
+              <m:sSubPr>
+                <m:ctrlPr>
+                  <w:rPr>
+                    <w:rFonts w:ascii="Cambria Math" w:hAnsi="Cambria Math"/>
+                  </w:rPr>
+                </m:ctrlPr>
+              </m:sSubPr>
               <m:e>
                 <m:r>
-                  <m:rPr>
-                    <m:sty m:val="i"/>
-                  </m:rPr>
                   <w:rPr>
                     <w:rFonts w:ascii="Cambria Math" w:hAnsi="Cambria Math"/>
                     <w:sz w:val="28"/>
                   </w:rPr>
-                  <m:t xml:space="preserve">Q</m:t>
+                  <m:t>Q</m:t>
                 </m:r>
               </m:e>
               <m:sub>
@@ -9176,7 +9211,7 @@
                     <w:rFonts w:ascii="Cambria Math" w:hAnsi="Cambria Math"/>
                     <w:sz w:val="28"/>
                   </w:rPr>
-                  <m:t xml:space="preserve">0</m:t>
+                  <m:t>0</m:t>
                 </m:r>
               </m:sub>
             </m:sSub>
@@ -9185,9 +9220,6 @@
       </m:oMath>
       <w:r>
         <w:rPr>
-          <w:rFonts w:ascii="Times New Roman" w:hAnsi="Times New Roman" w:eastAsia="Times New Roman" w:cs="Times New Roman"/>
-          <w:b w:val="0"/>
-          <w:i w:val="0"/>
           <w:sz w:val="28"/>
         </w:rPr>
         <w:tab/>
@@ -9198,36 +9230,36 @@
       <w:pPr>
         <w:keepLines/>
         <w:tabs>
-          <w:tab w:pos="4649" w:val="center"/>
-          <w:tab w:pos="9071" w:val="right"/>
-        </w:tabs>
-        <w:spacing w:before="120" w:after="120" w:line="240" w:lineRule="auto"/>
-        <w:ind w:firstLine="0" w:left="0" w:right="0"/>
-        <w:jc w:val="left"/>
-      </w:pPr>
-      <w:r>
-        <w:rPr>
-          <w:rFonts w:ascii="Times New Roman" w:hAnsi="Times New Roman" w:eastAsia="Times New Roman" w:cs="Times New Roman"/>
-          <w:b w:val="0"/>
-          <w:i w:val="0"/>
+          <w:tab w:val="center" w:pos="4649"/>
+          <w:tab w:val="right" w:pos="9071"/>
+        </w:tabs>
+        <w:spacing w:before="120" w:after="120"/>
+      </w:pPr>
+      <w:r>
+        <w:rPr>
           <w:sz w:val="28"/>
         </w:rPr>
         <w:tab/>
       </w:r>
       <m:oMath>
         <m:sSub>
-          <m:sSubPr/>
+          <m:sSubPr>
+            <m:ctrlPr>
+              <w:rPr>
+                <w:rFonts w:ascii="Cambria Math" w:hAnsi="Cambria Math"/>
+              </w:rPr>
+            </m:ctrlPr>
+          </m:sSubPr>
           <m:e>
             <m:r>
               <m:rPr>
-                <m:sty m:val="i"/>
+                <m:sty m:val="bi"/>
               </m:rPr>
               <w:rPr>
                 <w:rFonts w:ascii="Cambria Math" w:hAnsi="Cambria Math"/>
                 <w:sz w:val="28"/>
-                <w:b/>
-              </w:rPr>
-              <m:t xml:space="preserve">D</m:t>
+              </w:rPr>
+              <m:t>D</m:t>
             </m:r>
           </m:e>
           <m:sub>
@@ -9239,7 +9271,7 @@
                 <w:rFonts w:ascii="Cambria Math" w:hAnsi="Cambria Math"/>
                 <w:sz w:val="28"/>
               </w:rPr>
-              <m:t xml:space="preserve">1</m:t>
+              <m:t>1</m:t>
             </m:r>
           </m:sub>
         </m:sSub>
@@ -9256,20 +9288,28 @@
         <m:bar>
           <m:barPr>
             <m:pos m:val="top"/>
+            <m:ctrlPr>
+              <w:rPr>
+                <w:rFonts w:ascii="Cambria Math" w:hAnsi="Cambria Math"/>
+              </w:rPr>
+            </m:ctrlPr>
           </m:barPr>
           <m:e>
             <m:sSub>
-              <m:sSubPr/>
+              <m:sSubPr>
+                <m:ctrlPr>
+                  <w:rPr>
+                    <w:rFonts w:ascii="Cambria Math" w:hAnsi="Cambria Math"/>
+                  </w:rPr>
+                </m:ctrlPr>
+              </m:sSubPr>
               <m:e>
                 <m:r>
-                  <m:rPr>
-                    <m:sty m:val="i"/>
-                  </m:rPr>
                   <w:rPr>
                     <w:rFonts w:ascii="Cambria Math" w:hAnsi="Cambria Math"/>
                     <w:sz w:val="28"/>
                   </w:rPr>
-                  <m:t xml:space="preserve">Q</m:t>
+                  <m:t>Q</m:t>
                 </m:r>
               </m:e>
               <m:sub>
@@ -9281,7 +9321,7 @@
                     <w:rFonts w:ascii="Cambria Math" w:hAnsi="Cambria Math"/>
                     <w:sz w:val="28"/>
                   </w:rPr>
-                  <m:t xml:space="preserve">3</m:t>
+                  <m:t>3</m:t>
                 </m:r>
               </m:sub>
             </m:sSub>
@@ -9290,20 +9330,28 @@
         <m:bar>
           <m:barPr>
             <m:pos m:val="top"/>
+            <m:ctrlPr>
+              <w:rPr>
+                <w:rFonts w:ascii="Cambria Math" w:hAnsi="Cambria Math"/>
+              </w:rPr>
+            </m:ctrlPr>
           </m:barPr>
           <m:e>
             <m:sSub>
-              <m:sSubPr/>
+              <m:sSubPr>
+                <m:ctrlPr>
+                  <w:rPr>
+                    <w:rFonts w:ascii="Cambria Math" w:hAnsi="Cambria Math"/>
+                  </w:rPr>
+                </m:ctrlPr>
+              </m:sSubPr>
               <m:e>
                 <m:r>
-                  <m:rPr>
-                    <m:sty m:val="i"/>
-                  </m:rPr>
                   <w:rPr>
                     <w:rFonts w:ascii="Cambria Math" w:hAnsi="Cambria Math"/>
                     <w:sz w:val="28"/>
                   </w:rPr>
-                  <m:t xml:space="preserve">Q</m:t>
+                  <m:t>Q</m:t>
                 </m:r>
               </m:e>
               <m:sub>
@@ -9315,24 +9363,27 @@
                     <w:rFonts w:ascii="Cambria Math" w:hAnsi="Cambria Math"/>
                     <w:sz w:val="28"/>
                   </w:rPr>
-                  <m:t xml:space="preserve">2</m:t>
+                  <m:t>2</m:t>
                 </m:r>
               </m:sub>
             </m:sSub>
           </m:e>
         </m:bar>
         <m:sSub>
-          <m:sSubPr/>
+          <m:sSubPr>
+            <m:ctrlPr>
+              <w:rPr>
+                <w:rFonts w:ascii="Cambria Math" w:hAnsi="Cambria Math"/>
+              </w:rPr>
+            </m:ctrlPr>
+          </m:sSubPr>
           <m:e>
             <m:r>
-              <m:rPr>
-                <m:sty m:val="i"/>
-              </m:rPr>
               <w:rPr>
                 <w:rFonts w:ascii="Cambria Math" w:hAnsi="Cambria Math"/>
                 <w:sz w:val="28"/>
               </w:rPr>
-              <m:t xml:space="preserve">Q</m:t>
+              <m:t>Q</m:t>
             </m:r>
           </m:e>
           <m:sub>
@@ -9344,7 +9395,7 @@
                 <w:rFonts w:ascii="Cambria Math" w:hAnsi="Cambria Math"/>
                 <w:sz w:val="28"/>
               </w:rPr>
-              <m:t xml:space="preserve">1</m:t>
+              <m:t>1</m:t>
             </m:r>
           </m:sub>
         </m:sSub>
@@ -9361,20 +9412,28 @@
         <m:bar>
           <m:barPr>
             <m:pos m:val="top"/>
+            <m:ctrlPr>
+              <w:rPr>
+                <w:rFonts w:ascii="Cambria Math" w:hAnsi="Cambria Math"/>
+              </w:rPr>
+            </m:ctrlPr>
           </m:barPr>
           <m:e>
             <m:sSub>
-              <m:sSubPr/>
+              <m:sSubPr>
+                <m:ctrlPr>
+                  <w:rPr>
+                    <w:rFonts w:ascii="Cambria Math" w:hAnsi="Cambria Math"/>
+                  </w:rPr>
+                </m:ctrlPr>
+              </m:sSubPr>
               <m:e>
                 <m:r>
-                  <m:rPr>
-                    <m:sty m:val="i"/>
-                  </m:rPr>
                   <w:rPr>
                     <w:rFonts w:ascii="Cambria Math" w:hAnsi="Cambria Math"/>
                     <w:sz w:val="28"/>
                   </w:rPr>
-                  <m:t xml:space="preserve">Q</m:t>
+                  <m:t>Q</m:t>
                 </m:r>
               </m:e>
               <m:sub>
@@ -9386,24 +9445,27 @@
                     <w:rFonts w:ascii="Cambria Math" w:hAnsi="Cambria Math"/>
                     <w:sz w:val="28"/>
                   </w:rPr>
-                  <m:t xml:space="preserve">3</m:t>
+                  <m:t>3</m:t>
                 </m:r>
               </m:sub>
             </m:sSub>
           </m:e>
         </m:bar>
         <m:sSub>
-          <m:sSubPr/>
+          <m:sSubPr>
+            <m:ctrlPr>
+              <w:rPr>
+                <w:rFonts w:ascii="Cambria Math" w:hAnsi="Cambria Math"/>
+              </w:rPr>
+            </m:ctrlPr>
+          </m:sSubPr>
           <m:e>
             <m:r>
-              <m:rPr>
-                <m:sty m:val="i"/>
-              </m:rPr>
               <w:rPr>
                 <w:rFonts w:ascii="Cambria Math" w:hAnsi="Cambria Math"/>
                 <w:sz w:val="28"/>
               </w:rPr>
-              <m:t xml:space="preserve">Q</m:t>
+              <m:t>Q</m:t>
             </m:r>
           </m:e>
           <m:sub>
@@ -9415,27 +9477,35 @@
                 <w:rFonts w:ascii="Cambria Math" w:hAnsi="Cambria Math"/>
                 <w:sz w:val="28"/>
               </w:rPr>
-              <m:t xml:space="preserve">2</m:t>
+              <m:t>2</m:t>
             </m:r>
           </m:sub>
         </m:sSub>
         <m:bar>
           <m:barPr>
             <m:pos m:val="top"/>
+            <m:ctrlPr>
+              <w:rPr>
+                <w:rFonts w:ascii="Cambria Math" w:hAnsi="Cambria Math"/>
+              </w:rPr>
+            </m:ctrlPr>
           </m:barPr>
           <m:e>
             <m:sSub>
-              <m:sSubPr/>
+              <m:sSubPr>
+                <m:ctrlPr>
+                  <w:rPr>
+                    <w:rFonts w:ascii="Cambria Math" w:hAnsi="Cambria Math"/>
+                  </w:rPr>
+                </m:ctrlPr>
+              </m:sSubPr>
               <m:e>
                 <m:r>
-                  <m:rPr>
-                    <m:sty m:val="i"/>
-                  </m:rPr>
                   <w:rPr>
                     <w:rFonts w:ascii="Cambria Math" w:hAnsi="Cambria Math"/>
                     <w:sz w:val="28"/>
                   </w:rPr>
-                  <m:t xml:space="preserve">Q</m:t>
+                  <m:t>Q</m:t>
                 </m:r>
               </m:e>
               <m:sub>
@@ -9447,7 +9517,7 @@
                     <w:rFonts w:ascii="Cambria Math" w:hAnsi="Cambria Math"/>
                     <w:sz w:val="28"/>
                   </w:rPr>
-                  <m:t xml:space="preserve">1</m:t>
+                  <m:t>1</m:t>
                 </m:r>
               </m:sub>
             </m:sSub>
@@ -9464,17 +9534,20 @@
           <m:t xml:space="preserve"> + </m:t>
         </m:r>
         <m:sSub>
-          <m:sSubPr/>
+          <m:sSubPr>
+            <m:ctrlPr>
+              <w:rPr>
+                <w:rFonts w:ascii="Cambria Math" w:hAnsi="Cambria Math"/>
+              </w:rPr>
+            </m:ctrlPr>
+          </m:sSubPr>
           <m:e>
             <m:r>
-              <m:rPr>
-                <m:sty m:val="i"/>
-              </m:rPr>
               <w:rPr>
                 <w:rFonts w:ascii="Cambria Math" w:hAnsi="Cambria Math"/>
                 <w:sz w:val="28"/>
               </w:rPr>
-              <m:t xml:space="preserve">Q</m:t>
+              <m:t>Q</m:t>
             </m:r>
           </m:e>
           <m:sub>
@@ -9486,22 +9559,25 @@
                 <w:rFonts w:ascii="Cambria Math" w:hAnsi="Cambria Math"/>
                 <w:sz w:val="28"/>
               </w:rPr>
-              <m:t xml:space="preserve">3</m:t>
+              <m:t>3</m:t>
             </m:r>
           </m:sub>
         </m:sSub>
         <m:sSub>
-          <m:sSubPr/>
+          <m:sSubPr>
+            <m:ctrlPr>
+              <w:rPr>
+                <w:rFonts w:ascii="Cambria Math" w:hAnsi="Cambria Math"/>
+              </w:rPr>
+            </m:ctrlPr>
+          </m:sSubPr>
           <m:e>
             <m:r>
-              <m:rPr>
-                <m:sty m:val="i"/>
-              </m:rPr>
               <w:rPr>
                 <w:rFonts w:ascii="Cambria Math" w:hAnsi="Cambria Math"/>
                 <w:sz w:val="28"/>
               </w:rPr>
-              <m:t xml:space="preserve">Q</m:t>
+              <m:t>Q</m:t>
             </m:r>
           </m:e>
           <m:sub>
@@ -9513,22 +9589,25 @@
                 <w:rFonts w:ascii="Cambria Math" w:hAnsi="Cambria Math"/>
                 <w:sz w:val="28"/>
               </w:rPr>
-              <m:t xml:space="preserve">2</m:t>
+              <m:t>2</m:t>
             </m:r>
           </m:sub>
         </m:sSub>
         <m:sSub>
-          <m:sSubPr/>
+          <m:sSubPr>
+            <m:ctrlPr>
+              <w:rPr>
+                <w:rFonts w:ascii="Cambria Math" w:hAnsi="Cambria Math"/>
+              </w:rPr>
+            </m:ctrlPr>
+          </m:sSubPr>
           <m:e>
             <m:r>
-              <m:rPr>
-                <m:sty m:val="i"/>
-              </m:rPr>
               <w:rPr>
                 <w:rFonts w:ascii="Cambria Math" w:hAnsi="Cambria Math"/>
                 <w:sz w:val="28"/>
               </w:rPr>
-              <m:t xml:space="preserve">Q</m:t>
+              <m:t>Q</m:t>
             </m:r>
           </m:e>
           <m:sub>
@@ -9540,7 +9619,7 @@
                 <w:rFonts w:ascii="Cambria Math" w:hAnsi="Cambria Math"/>
                 <w:sz w:val="28"/>
               </w:rPr>
-              <m:t xml:space="preserve">0</m:t>
+              <m:t>0</m:t>
             </m:r>
           </m:sub>
         </m:sSub>
@@ -9555,17 +9634,20 @@
           <m:t xml:space="preserve"> + </m:t>
         </m:r>
         <m:sSub>
-          <m:sSubPr/>
+          <m:sSubPr>
+            <m:ctrlPr>
+              <w:rPr>
+                <w:rFonts w:ascii="Cambria Math" w:hAnsi="Cambria Math"/>
+              </w:rPr>
+            </m:ctrlPr>
+          </m:sSubPr>
           <m:e>
             <m:r>
-              <m:rPr>
-                <m:sty m:val="i"/>
-              </m:rPr>
               <w:rPr>
                 <w:rFonts w:ascii="Cambria Math" w:hAnsi="Cambria Math"/>
                 <w:sz w:val="28"/>
               </w:rPr>
-              <m:t xml:space="preserve">Q</m:t>
+              <m:t>Q</m:t>
             </m:r>
           </m:e>
           <m:sub>
@@ -9577,22 +9659,25 @@
                 <w:rFonts w:ascii="Cambria Math" w:hAnsi="Cambria Math"/>
                 <w:sz w:val="28"/>
               </w:rPr>
-              <m:t xml:space="preserve">3</m:t>
+              <m:t>3</m:t>
             </m:r>
           </m:sub>
         </m:sSub>
         <m:sSub>
-          <m:sSubPr/>
+          <m:sSubPr>
+            <m:ctrlPr>
+              <w:rPr>
+                <w:rFonts w:ascii="Cambria Math" w:hAnsi="Cambria Math"/>
+              </w:rPr>
+            </m:ctrlPr>
+          </m:sSubPr>
           <m:e>
             <m:r>
-              <m:rPr>
-                <m:sty m:val="i"/>
-              </m:rPr>
               <w:rPr>
                 <w:rFonts w:ascii="Cambria Math" w:hAnsi="Cambria Math"/>
                 <w:sz w:val="28"/>
               </w:rPr>
-              <m:t xml:space="preserve">Q</m:t>
+              <m:t>Q</m:t>
             </m:r>
           </m:e>
           <m:sub>
@@ -9604,27 +9689,35 @@
                 <w:rFonts w:ascii="Cambria Math" w:hAnsi="Cambria Math"/>
                 <w:sz w:val="28"/>
               </w:rPr>
-              <m:t xml:space="preserve">1</m:t>
+              <m:t>1</m:t>
             </m:r>
           </m:sub>
         </m:sSub>
         <m:bar>
           <m:barPr>
             <m:pos m:val="top"/>
+            <m:ctrlPr>
+              <w:rPr>
+                <w:rFonts w:ascii="Cambria Math" w:hAnsi="Cambria Math"/>
+              </w:rPr>
+            </m:ctrlPr>
           </m:barPr>
           <m:e>
             <m:sSub>
-              <m:sSubPr/>
+              <m:sSubPr>
+                <m:ctrlPr>
+                  <w:rPr>
+                    <w:rFonts w:ascii="Cambria Math" w:hAnsi="Cambria Math"/>
+                  </w:rPr>
+                </m:ctrlPr>
+              </m:sSubPr>
               <m:e>
                 <m:r>
-                  <m:rPr>
-                    <m:sty m:val="i"/>
-                  </m:rPr>
                   <w:rPr>
                     <w:rFonts w:ascii="Cambria Math" w:hAnsi="Cambria Math"/>
                     <w:sz w:val="28"/>
                   </w:rPr>
-                  <m:t xml:space="preserve">Q</m:t>
+                  <m:t>Q</m:t>
                 </m:r>
               </m:e>
               <m:sub>
@@ -9636,7 +9729,7 @@
                     <w:rFonts w:ascii="Cambria Math" w:hAnsi="Cambria Math"/>
                     <w:sz w:val="28"/>
                   </w:rPr>
-                  <m:t xml:space="preserve">0</m:t>
+                  <m:t>0</m:t>
                 </m:r>
               </m:sub>
             </m:sSub>
@@ -9645,9 +9738,6 @@
       </m:oMath>
       <w:r>
         <w:rPr>
-          <w:rFonts w:ascii="Times New Roman" w:hAnsi="Times New Roman" w:eastAsia="Times New Roman" w:cs="Times New Roman"/>
-          <w:b w:val="0"/>
-          <w:i w:val="0"/>
           <w:sz w:val="28"/>
         </w:rPr>
         <w:tab/>
@@ -9658,36 +9748,36 @@
       <w:pPr>
         <w:keepLines/>
         <w:tabs>
-          <w:tab w:pos="4649" w:val="center"/>
-          <w:tab w:pos="9071" w:val="right"/>
-        </w:tabs>
-        <w:spacing w:before="120" w:after="120" w:line="240" w:lineRule="auto"/>
-        <w:ind w:firstLine="0" w:left="0" w:right="0"/>
-        <w:jc w:val="left"/>
-      </w:pPr>
-      <w:r>
-        <w:rPr>
-          <w:rFonts w:ascii="Times New Roman" w:hAnsi="Times New Roman" w:eastAsia="Times New Roman" w:cs="Times New Roman"/>
-          <w:b w:val="0"/>
-          <w:i w:val="0"/>
+          <w:tab w:val="center" w:pos="4649"/>
+          <w:tab w:val="right" w:pos="9071"/>
+        </w:tabs>
+        <w:spacing w:before="120" w:after="120"/>
+      </w:pPr>
+      <w:r>
+        <w:rPr>
           <w:sz w:val="28"/>
         </w:rPr>
         <w:tab/>
       </w:r>
       <m:oMath>
         <m:sSub>
-          <m:sSubPr/>
+          <m:sSubPr>
+            <m:ctrlPr>
+              <w:rPr>
+                <w:rFonts w:ascii="Cambria Math" w:hAnsi="Cambria Math"/>
+              </w:rPr>
+            </m:ctrlPr>
+          </m:sSubPr>
           <m:e>
             <m:r>
               <m:rPr>
-                <m:sty m:val="i"/>
+                <m:sty m:val="bi"/>
               </m:rPr>
               <w:rPr>
                 <w:rFonts w:ascii="Cambria Math" w:hAnsi="Cambria Math"/>
                 <w:sz w:val="28"/>
-                <w:b/>
-              </w:rPr>
-              <m:t xml:space="preserve">D</m:t>
+              </w:rPr>
+              <m:t>D</m:t>
             </m:r>
           </m:e>
           <m:sub>
@@ -9699,7 +9789,7 @@
                 <w:rFonts w:ascii="Cambria Math" w:hAnsi="Cambria Math"/>
                 <w:sz w:val="28"/>
               </w:rPr>
-              <m:t xml:space="preserve">0</m:t>
+              <m:t>0</m:t>
             </m:r>
           </m:sub>
         </m:sSub>
@@ -9716,20 +9806,28 @@
         <m:bar>
           <m:barPr>
             <m:pos m:val="top"/>
+            <m:ctrlPr>
+              <w:rPr>
+                <w:rFonts w:ascii="Cambria Math" w:hAnsi="Cambria Math"/>
+              </w:rPr>
+            </m:ctrlPr>
           </m:barPr>
           <m:e>
             <m:sSub>
-              <m:sSubPr/>
+              <m:sSubPr>
+                <m:ctrlPr>
+                  <w:rPr>
+                    <w:rFonts w:ascii="Cambria Math" w:hAnsi="Cambria Math"/>
+                  </w:rPr>
+                </m:ctrlPr>
+              </m:sSubPr>
               <m:e>
                 <m:r>
-                  <m:rPr>
-                    <m:sty m:val="i"/>
-                  </m:rPr>
                   <w:rPr>
                     <w:rFonts w:ascii="Cambria Math" w:hAnsi="Cambria Math"/>
                     <w:sz w:val="28"/>
                   </w:rPr>
-                  <m:t xml:space="preserve">Q</m:t>
+                  <m:t>Q</m:t>
                 </m:r>
               </m:e>
               <m:sub>
@@ -9741,24 +9839,27 @@
                     <w:rFonts w:ascii="Cambria Math" w:hAnsi="Cambria Math"/>
                     <w:sz w:val="28"/>
                   </w:rPr>
-                  <m:t xml:space="preserve">3</m:t>
+                  <m:t>3</m:t>
                 </m:r>
               </m:sub>
             </m:sSub>
           </m:e>
         </m:bar>
         <m:sSub>
-          <m:sSubPr/>
+          <m:sSubPr>
+            <m:ctrlPr>
+              <w:rPr>
+                <w:rFonts w:ascii="Cambria Math" w:hAnsi="Cambria Math"/>
+              </w:rPr>
+            </m:ctrlPr>
+          </m:sSubPr>
           <m:e>
             <m:r>
-              <m:rPr>
-                <m:sty m:val="i"/>
-              </m:rPr>
               <w:rPr>
                 <w:rFonts w:ascii="Cambria Math" w:hAnsi="Cambria Math"/>
                 <w:sz w:val="28"/>
               </w:rPr>
-              <m:t xml:space="preserve">Q</m:t>
+              <m:t>Q</m:t>
             </m:r>
           </m:e>
           <m:sub>
@@ -9770,27 +9871,35 @@
                 <w:rFonts w:ascii="Cambria Math" w:hAnsi="Cambria Math"/>
                 <w:sz w:val="28"/>
               </w:rPr>
-              <m:t xml:space="preserve">2</m:t>
+              <m:t>2</m:t>
             </m:r>
           </m:sub>
         </m:sSub>
         <m:bar>
           <m:barPr>
             <m:pos m:val="top"/>
+            <m:ctrlPr>
+              <w:rPr>
+                <w:rFonts w:ascii="Cambria Math" w:hAnsi="Cambria Math"/>
+              </w:rPr>
+            </m:ctrlPr>
           </m:barPr>
           <m:e>
             <m:sSub>
-              <m:sSubPr/>
+              <m:sSubPr>
+                <m:ctrlPr>
+                  <w:rPr>
+                    <w:rFonts w:ascii="Cambria Math" w:hAnsi="Cambria Math"/>
+                  </w:rPr>
+                </m:ctrlPr>
+              </m:sSubPr>
               <m:e>
                 <m:r>
-                  <m:rPr>
-                    <m:sty m:val="i"/>
-                  </m:rPr>
                   <w:rPr>
                     <w:rFonts w:ascii="Cambria Math" w:hAnsi="Cambria Math"/>
                     <w:sz w:val="28"/>
                   </w:rPr>
-                  <m:t xml:space="preserve">Q</m:t>
+                  <m:t>Q</m:t>
                 </m:r>
               </m:e>
               <m:sub>
@@ -9802,7 +9911,7 @@
                     <w:rFonts w:ascii="Cambria Math" w:hAnsi="Cambria Math"/>
                     <w:sz w:val="28"/>
                   </w:rPr>
-                  <m:t xml:space="preserve">1</m:t>
+                  <m:t>1</m:t>
                 </m:r>
               </m:sub>
             </m:sSub>
@@ -9821,20 +9930,28 @@
         <m:bar>
           <m:barPr>
             <m:pos m:val="top"/>
+            <m:ctrlPr>
+              <w:rPr>
+                <w:rFonts w:ascii="Cambria Math" w:hAnsi="Cambria Math"/>
+              </w:rPr>
+            </m:ctrlPr>
           </m:barPr>
           <m:e>
             <m:sSub>
-              <m:sSubPr/>
+              <m:sSubPr>
+                <m:ctrlPr>
+                  <w:rPr>
+                    <w:rFonts w:ascii="Cambria Math" w:hAnsi="Cambria Math"/>
+                  </w:rPr>
+                </m:ctrlPr>
+              </m:sSubPr>
               <m:e>
                 <m:r>
-                  <m:rPr>
-                    <m:sty m:val="i"/>
-                  </m:rPr>
                   <w:rPr>
                     <w:rFonts w:ascii="Cambria Math" w:hAnsi="Cambria Math"/>
                     <w:sz w:val="28"/>
                   </w:rPr>
-                  <m:t xml:space="preserve">Q</m:t>
+                  <m:t>Q</m:t>
                 </m:r>
               </m:e>
               <m:sub>
@@ -9846,7 +9963,7 @@
                     <w:rFonts w:ascii="Cambria Math" w:hAnsi="Cambria Math"/>
                     <w:sz w:val="28"/>
                   </w:rPr>
-                  <m:t xml:space="preserve">2</m:t>
+                  <m:t>2</m:t>
                 </m:r>
               </m:sub>
             </m:sSub>
@@ -9855,20 +9972,28 @@
         <m:bar>
           <m:barPr>
             <m:pos m:val="top"/>
+            <m:ctrlPr>
+              <w:rPr>
+                <w:rFonts w:ascii="Cambria Math" w:hAnsi="Cambria Math"/>
+              </w:rPr>
+            </m:ctrlPr>
           </m:barPr>
           <m:e>
             <m:sSub>
-              <m:sSubPr/>
+              <m:sSubPr>
+                <m:ctrlPr>
+                  <w:rPr>
+                    <w:rFonts w:ascii="Cambria Math" w:hAnsi="Cambria Math"/>
+                  </w:rPr>
+                </m:ctrlPr>
+              </m:sSubPr>
               <m:e>
                 <m:r>
-                  <m:rPr>
-                    <m:sty m:val="i"/>
-                  </m:rPr>
                   <w:rPr>
                     <w:rFonts w:ascii="Cambria Math" w:hAnsi="Cambria Math"/>
                     <w:sz w:val="28"/>
                   </w:rPr>
-                  <m:t xml:space="preserve">Q</m:t>
+                  <m:t>Q</m:t>
                 </m:r>
               </m:e>
               <m:sub>
@@ -9880,24 +10005,27 @@
                     <w:rFonts w:ascii="Cambria Math" w:hAnsi="Cambria Math"/>
                     <w:sz w:val="28"/>
                   </w:rPr>
-                  <m:t xml:space="preserve">1</m:t>
+                  <m:t>1</m:t>
                 </m:r>
               </m:sub>
             </m:sSub>
           </m:e>
         </m:bar>
         <m:sSub>
-          <m:sSubPr/>
+          <m:sSubPr>
+            <m:ctrlPr>
+              <w:rPr>
+                <w:rFonts w:ascii="Cambria Math" w:hAnsi="Cambria Math"/>
+              </w:rPr>
+            </m:ctrlPr>
+          </m:sSubPr>
           <m:e>
             <m:r>
-              <m:rPr>
-                <m:sty m:val="i"/>
-              </m:rPr>
               <w:rPr>
                 <w:rFonts w:ascii="Cambria Math" w:hAnsi="Cambria Math"/>
                 <w:sz w:val="28"/>
               </w:rPr>
-              <m:t xml:space="preserve">Q</m:t>
+              <m:t>Q</m:t>
             </m:r>
           </m:e>
           <m:sub>
@@ -9909,7 +10037,7 @@
                 <w:rFonts w:ascii="Cambria Math" w:hAnsi="Cambria Math"/>
                 <w:sz w:val="28"/>
               </w:rPr>
-              <m:t xml:space="preserve">0</m:t>
+              <m:t>0</m:t>
             </m:r>
           </m:sub>
         </m:sSub>
@@ -9924,17 +10052,20 @@
           <m:t xml:space="preserve"> + </m:t>
         </m:r>
         <m:sSub>
-          <m:sSubPr/>
+          <m:sSubPr>
+            <m:ctrlPr>
+              <w:rPr>
+                <w:rFonts w:ascii="Cambria Math" w:hAnsi="Cambria Math"/>
+              </w:rPr>
+            </m:ctrlPr>
+          </m:sSubPr>
           <m:e>
             <m:r>
-              <m:rPr>
-                <m:sty m:val="i"/>
-              </m:rPr>
               <w:rPr>
                 <w:rFonts w:ascii="Cambria Math" w:hAnsi="Cambria Math"/>
                 <w:sz w:val="28"/>
               </w:rPr>
-              <m:t xml:space="preserve">Q</m:t>
+              <m:t>Q</m:t>
             </m:r>
           </m:e>
           <m:sub>
@@ -9946,27 +10077,35 @@
                 <w:rFonts w:ascii="Cambria Math" w:hAnsi="Cambria Math"/>
                 <w:sz w:val="28"/>
               </w:rPr>
-              <m:t xml:space="preserve">2</m:t>
+              <m:t>2</m:t>
             </m:r>
           </m:sub>
         </m:sSub>
         <m:bar>
           <m:barPr>
             <m:pos m:val="top"/>
+            <m:ctrlPr>
+              <w:rPr>
+                <w:rFonts w:ascii="Cambria Math" w:hAnsi="Cambria Math"/>
+              </w:rPr>
+            </m:ctrlPr>
           </m:barPr>
           <m:e>
             <m:sSub>
-              <m:sSubPr/>
+              <m:sSubPr>
+                <m:ctrlPr>
+                  <w:rPr>
+                    <w:rFonts w:ascii="Cambria Math" w:hAnsi="Cambria Math"/>
+                  </w:rPr>
+                </m:ctrlPr>
+              </m:sSubPr>
               <m:e>
                 <m:r>
-                  <m:rPr>
-                    <m:sty m:val="i"/>
-                  </m:rPr>
                   <w:rPr>
                     <w:rFonts w:ascii="Cambria Math" w:hAnsi="Cambria Math"/>
                     <w:sz w:val="28"/>
                   </w:rPr>
-                  <m:t xml:space="preserve">Q</m:t>
+                  <m:t>Q</m:t>
                 </m:r>
               </m:e>
               <m:sub>
@@ -9978,7 +10117,7 @@
                     <w:rFonts w:ascii="Cambria Math" w:hAnsi="Cambria Math"/>
                     <w:sz w:val="28"/>
                   </w:rPr>
-                  <m:t xml:space="preserve">0</m:t>
+                  <m:t>0</m:t>
                 </m:r>
               </m:sub>
             </m:sSub>
@@ -9987,9 +10126,6 @@
       </m:oMath>
       <w:r>
         <w:rPr>
-          <w:rFonts w:ascii="Times New Roman" w:hAnsi="Times New Roman" w:eastAsia="Times New Roman" w:cs="Times New Roman"/>
-          <w:b w:val="0"/>
-          <w:i w:val="0"/>
           <w:sz w:val="28"/>
         </w:rPr>
         <w:tab/>
@@ -9998,18 +10134,421 @@
     </w:p>
     <w:p>
       <w:pPr>
-        <w:spacing w:before="240" w:after="0" w:line="360" w:lineRule="auto"/>
-        <w:ind w:firstLine="709" w:left="0" w:right="0"/>
+        <w:spacing w:before="240" w:line="360" w:lineRule="auto"/>
+        <w:ind w:firstLine="709"/>
         <w:jc w:val="both"/>
       </w:pPr>
       <w:r>
         <w:rPr>
-          <w:rFonts w:ascii="Times New Roman" w:hAnsi="Times New Roman" w:eastAsia="Times New Roman" w:cs="Times New Roman"/>
-          <w:b w:val="0"/>
-          <w:i w:val="0"/>
           <w:sz w:val="28"/>
         </w:rPr>
         <w:t>Полученные МДНФ определяют комбинационную часть ПСУ: по текущему коду состояния Q3…Q0 формируются значения D3…D0, записываемые в D-триггеры по активному фронту тактового сигнала. Проверка выражений для всех 14 рабочих состояний подтверждает заданную последовательность переходов.</w:t>
+      </w:r>
+    </w:p>
+    <w:p>
+      <w:r>
+        <w:br w:type="page"/>
+      </w:r>
+    </w:p>
+    <w:p>
+      <w:pPr>
+        <w:pStyle w:val="1"/>
+        <w:keepNext/>
+        <w:spacing w:before="240" w:after="120"/>
+        <w:ind w:left="0"/>
+      </w:pPr>
+      <w:r>
+        <w:rPr>
+          <w:sz w:val="32"/>
+        </w:rPr>
+        <w:lastRenderedPageBreak/>
+        <w:t>2.1.2 Функциональная схема пересчетного устройства (ПСУ)</w:t>
+      </w:r>
+    </w:p>
+    <w:p>
+      <w:pPr>
+        <w:spacing w:line="360" w:lineRule="auto"/>
+        <w:ind w:firstLine="709"/>
+        <w:jc w:val="both"/>
+      </w:pPr>
+      <w:r>
+        <w:rPr>
+          <w:sz w:val="28"/>
+        </w:rPr>
+        <w:t>Для схемной реализации минимизированные функции D3…D0 представлены в базисе И–ИЛИ. Отдельные инверторы для формирования сигналов /Q3…/Q0 не требуются, поскольку каждый D-триггер микросхемы 74AS74 имеет прямой Q и инверсный /Q выходы.</w:t>
+      </w:r>
+    </w:p>
+    <w:p>
+      <w:pPr>
+        <w:spacing w:line="360" w:lineRule="auto"/>
+        <w:ind w:firstLine="709"/>
+        <w:jc w:val="both"/>
+      </w:pPr>
+      <w:r>
+        <w:rPr>
+          <w:sz w:val="28"/>
+        </w:rPr>
+        <w:t>На рисунке 2.3 представлена функциональная схема блока Logic_D, реализованная по выражениям (1.2)–(1.5). Элементы И формируют конъюнктивные члены МДНФ, а элементы ИЛИ объединяют их и формируют сигналы D3…D0 для входов регистра состояния.</w:t>
+      </w:r>
+    </w:p>
+    <w:p>
+      <w:pPr>
+        <w:keepNext/>
+        <w:spacing w:before="120" w:after="60"/>
+        <w:jc w:val="center"/>
+      </w:pPr>
+      <w:r>
+        <w:rPr>
+          <w:noProof/>
+        </w:rPr>
+        <w:drawing>
+          <wp:inline distT="0" distB="0" distL="0" distR="0" wp14:anchorId="7D9EE627" wp14:editId="53F066D2">
+            <wp:extent cx="5760000" cy="3584000"/>
+            <wp:effectExtent l="0" t="0" r="0" b="0"/>
+            <wp:docPr id="918597015" name="Picture 918597015"/>
+            <wp:cNvGraphicFramePr>
+              <a:graphicFrameLocks xmlns:a="http://schemas.openxmlformats.org/drawingml/2006/main" noChangeAspect="1"/>
+            </wp:cNvGraphicFramePr>
+            <a:graphic xmlns:a="http://schemas.openxmlformats.org/drawingml/2006/main">
+              <a:graphicData uri="http://schemas.openxmlformats.org/drawingml/2006/picture">
+                <pic:pic xmlns:pic="http://schemas.openxmlformats.org/drawingml/2006/picture">
+                  <pic:nvPicPr>
+                    <pic:cNvPr id="0" name="logic_d_functional.png"/>
+                    <pic:cNvPicPr/>
+                  </pic:nvPicPr>
+                  <pic:blipFill>
+                    <a:blip r:embed="rId16"/>
+                    <a:stretch>
+                      <a:fillRect/>
+                    </a:stretch>
+                  </pic:blipFill>
+                  <pic:spPr>
+                    <a:xfrm>
+                      <a:off x="0" y="0"/>
+                      <a:ext cx="5760000" cy="3584000"/>
+                    </a:xfrm>
+                    <a:prstGeom prst="rect">
+                      <a:avLst/>
+                    </a:prstGeom>
+                  </pic:spPr>
+                </pic:pic>
+              </a:graphicData>
+            </a:graphic>
+          </wp:inline>
+        </w:drawing>
+      </w:r>
+    </w:p>
+    <w:p>
+      <w:pPr>
+        <w:keepLines/>
+        <w:spacing w:before="60" w:after="120"/>
+        <w:ind w:right="283"/>
+        <w:jc w:val="center"/>
+      </w:pPr>
+      <w:r>
+        <w:rPr>
+          <w:sz w:val="28"/>
+        </w:rPr>
+        <w:t>Рисунок 2.3 – Функциональная схема блока Logic_D</w:t>
+      </w:r>
+    </w:p>
+    <w:p>
+      <w:r>
+        <w:br w:type="page"/>
+      </w:r>
+    </w:p>
+    <w:p>
+      <w:pPr>
+        <w:spacing w:line="360" w:lineRule="auto"/>
+        <w:ind w:firstLine="709"/>
+        <w:jc w:val="both"/>
+      </w:pPr>
+      <w:r>
+        <w:rPr>
+          <w:sz w:val="28"/>
+        </w:rPr>
+        <w:lastRenderedPageBreak/>
+        <w:t>Сигналы D3…D0 подаются на входы четырех D-триггеров, размещенных в двух микросхемах 74AS74. Тактовые входы CLK объединены, поэтому все разряды состояния изменяются одновременно по положительному фронту сигнала синхронизации. В нормальном режиме асинхронные входы /PRE и /CLR удерживаются в неактивном состоянии логической единицы.</w:t>
+      </w:r>
+    </w:p>
+    <w:p>
+      <w:pPr>
+        <w:keepNext/>
+        <w:spacing w:before="120" w:after="60"/>
+        <w:jc w:val="center"/>
+      </w:pPr>
+      <w:r>
+        <w:rPr>
+          <w:noProof/>
+        </w:rPr>
+        <w:drawing>
+          <wp:inline distT="0" distB="0" distL="0" distR="0" wp14:anchorId="48A55B7B" wp14:editId="0AB36BAF">
+            <wp:extent cx="5652000" cy="3705200"/>
+            <wp:effectExtent l="0" t="0" r="0" b="0"/>
+            <wp:docPr id="918597016" name="Picture 918597016"/>
+            <wp:cNvGraphicFramePr>
+              <a:graphicFrameLocks xmlns:a="http://schemas.openxmlformats.org/drawingml/2006/main" noChangeAspect="1"/>
+            </wp:cNvGraphicFramePr>
+            <a:graphic xmlns:a="http://schemas.openxmlformats.org/drawingml/2006/main">
+              <a:graphicData uri="http://schemas.openxmlformats.org/drawingml/2006/picture">
+                <pic:pic xmlns:pic="http://schemas.openxmlformats.org/drawingml/2006/picture">
+                  <pic:nvPicPr>
+                    <pic:cNvPr id="0" name="d_counter_functional.png"/>
+                    <pic:cNvPicPr/>
+                  </pic:nvPicPr>
+                  <pic:blipFill>
+                    <a:blip r:embed="rId17"/>
+                    <a:stretch>
+                      <a:fillRect/>
+                    </a:stretch>
+                  </pic:blipFill>
+                  <pic:spPr>
+                    <a:xfrm>
+                      <a:off x="0" y="0"/>
+                      <a:ext cx="5652000" cy="3705200"/>
+                    </a:xfrm>
+                    <a:prstGeom prst="rect">
+                      <a:avLst/>
+                    </a:prstGeom>
+                  </pic:spPr>
+                </pic:pic>
+              </a:graphicData>
+            </a:graphic>
+          </wp:inline>
+        </w:drawing>
+      </w:r>
+    </w:p>
+    <w:p>
+      <w:pPr>
+        <w:keepLines/>
+        <w:spacing w:before="60" w:after="120"/>
+        <w:ind w:right="283"/>
+        <w:jc w:val="center"/>
+      </w:pPr>
+      <w:r>
+        <w:rPr>
+          <w:sz w:val="28"/>
+        </w:rPr>
+        <w:t>Рисунок 2.4 – Функциональная схема блока D_Counter</w:t>
+      </w:r>
+    </w:p>
+    <w:p>
+      <w:pPr>
+        <w:spacing w:line="360" w:lineRule="auto"/>
+        <w:ind w:firstLine="709"/>
+        <w:jc w:val="both"/>
+      </w:pPr>
+      <w:r>
+        <w:rPr>
+          <w:sz w:val="28"/>
+        </w:rPr>
+        <w:t>Обратные связи с выходов Q3…Q0 и /Q3…/Q0 возвращаются на вход блока Logic_D. В результате перед каждым активным фронтом вычисляется код следующего состояния, который затем одновременно записывается во все четыре D-триггера.</w:t>
+      </w:r>
+    </w:p>
+    <w:p>
+      <w:r>
+        <w:br w:type="page"/>
+      </w:r>
+    </w:p>
+    <w:p>
+      <w:pPr>
+        <w:pStyle w:val="1"/>
+        <w:keepNext/>
+        <w:spacing w:before="240" w:after="120"/>
+        <w:ind w:left="0"/>
+      </w:pPr>
+      <w:r>
+        <w:rPr>
+          <w:sz w:val="32"/>
+        </w:rPr>
+        <w:lastRenderedPageBreak/>
+        <w:t>2.1.3 Временные диаграммы сигнала синхронизации и выходных сигналов D-триггеров</w:t>
+      </w:r>
+    </w:p>
+    <w:p>
+      <w:pPr>
+        <w:spacing w:line="360" w:lineRule="auto"/>
+        <w:ind w:firstLine="709"/>
+        <w:jc w:val="both"/>
+      </w:pPr>
+      <w:r>
+        <w:rPr>
+          <w:sz w:val="28"/>
+        </w:rPr>
+        <w:t>Расчетная временная диаграмма сигнала синхронизации CLK и выходов Q3…Q0 приведена на рисунке 2.5. Изменение кода состояния происходит только по положительному фронту CLK; между фронтами выходные сигналы D-триггеров сохраняют установившиеся значения.</w:t>
+      </w:r>
+    </w:p>
+    <w:p>
+      <w:pPr>
+        <w:keepNext/>
+        <w:spacing w:before="120" w:after="60"/>
+        <w:jc w:val="center"/>
+      </w:pPr>
+      <w:r>
+        <w:rPr>
+          <w:noProof/>
+        </w:rPr>
+        <w:drawing>
+          <wp:inline distT="0" distB="0" distL="0" distR="0" wp14:anchorId="2036BE91" wp14:editId="6F3977AC">
+            <wp:extent cx="5760000" cy="3351273"/>
+            <wp:effectExtent l="0" t="0" r="0" b="0"/>
+            <wp:docPr id="918597017" name="Picture 918597017"/>
+            <wp:cNvGraphicFramePr>
+              <a:graphicFrameLocks xmlns:a="http://schemas.openxmlformats.org/drawingml/2006/main" noChangeAspect="1"/>
+            </wp:cNvGraphicFramePr>
+            <a:graphic xmlns:a="http://schemas.openxmlformats.org/drawingml/2006/main">
+              <a:graphicData uri="http://schemas.openxmlformats.org/drawingml/2006/picture">
+                <pic:pic xmlns:pic="http://schemas.openxmlformats.org/drawingml/2006/picture">
+                  <pic:nvPicPr>
+                    <pic:cNvPr id="0" name="timing_d_calculated.png"/>
+                    <pic:cNvPicPr/>
+                  </pic:nvPicPr>
+                  <pic:blipFill>
+                    <a:blip r:embed="rId18"/>
+                    <a:stretch>
+                      <a:fillRect/>
+                    </a:stretch>
+                  </pic:blipFill>
+                  <pic:spPr>
+                    <a:xfrm>
+                      <a:off x="0" y="0"/>
+                      <a:ext cx="5760000" cy="3351273"/>
+                    </a:xfrm>
+                    <a:prstGeom prst="rect">
+                      <a:avLst/>
+                    </a:prstGeom>
+                  </pic:spPr>
+                </pic:pic>
+              </a:graphicData>
+            </a:graphic>
+          </wp:inline>
+        </w:drawing>
+      </w:r>
+    </w:p>
+    <w:p>
+      <w:pPr>
+        <w:keepLines/>
+        <w:spacing w:before="60" w:after="120"/>
+        <w:ind w:right="283"/>
+        <w:jc w:val="center"/>
+      </w:pPr>
+      <w:r>
+        <w:rPr>
+          <w:sz w:val="28"/>
+        </w:rPr>
+        <w:t>Рисунок 2.5 – Расчетная временная диаграмма сигнала синхронизации и выходов Q3…Q0</w:t>
+      </w:r>
+    </w:p>
+    <w:p>
+      <w:pPr>
+        <w:spacing w:line="360" w:lineRule="auto"/>
+        <w:ind w:firstLine="709"/>
+        <w:jc w:val="both"/>
+      </w:pPr>
+      <w:r>
+        <w:rPr>
+          <w:sz w:val="28"/>
+        </w:rPr>
+        <w:t>Диаграмма подтверждает последовательность 13–2–14–11–0–12–9–5–7–8–4–3–10–6. После четырнадцатого активного фронта устройство возвращается в состояние 13, и цикл пересчета повторяется.</w:t>
+      </w:r>
+    </w:p>
+    <w:p>
+      <w:r>
+        <w:br w:type="page"/>
+      </w:r>
+    </w:p>
+    <w:p>
+      <w:pPr>
+        <w:keepNext/>
+        <w:spacing w:before="240" w:after="120"/>
+      </w:pPr>
+      <w:r>
+        <w:rPr>
+          <w:b/>
+          <w:sz w:val="32"/>
+        </w:rPr>
+        <w:lastRenderedPageBreak/>
+        <w:t>Порядок ручной проверки в NI Multisim</w:t>
+      </w:r>
+    </w:p>
+    <w:p>
+      <w:pPr>
+        <w:spacing w:line="360" w:lineRule="auto"/>
+        <w:ind w:firstLine="709"/>
+        <w:jc w:val="both"/>
+      </w:pPr>
+      <w:r>
+        <w:rPr>
+          <w:b/>
+          <w:sz w:val="28"/>
+        </w:rPr>
+        <w:t xml:space="preserve">Сборка схемы. </w:t>
+      </w:r>
+      <w:r>
+        <w:rPr>
+          <w:sz w:val="28"/>
+        </w:rPr>
+        <w:t>Соединить блок Logic_D с четырьмя D-триггерами 74AS74 по рисункам 2.3 и 2.4. Выходы D3…D0 подключить к одноименным входам триггеров, выходы Q3…Q0 и /Q3…/Q0 вернуть на входы Logic_D, а все входы CLK объединить.</w:t>
+      </w:r>
+    </w:p>
+    <w:p>
+      <w:pPr>
+        <w:spacing w:line="360" w:lineRule="auto"/>
+        <w:ind w:firstLine="709"/>
+        <w:jc w:val="both"/>
+      </w:pPr>
+      <w:r>
+        <w:rPr>
+          <w:b/>
+          <w:sz w:val="28"/>
+        </w:rPr>
+        <w:t xml:space="preserve">Начальная установка. </w:t>
+      </w:r>
+      <w:r>
+        <w:rPr>
+          <w:sz w:val="28"/>
+        </w:rPr>
+        <w:t>До начала счета установить регистр в код 1101: кратковременно подать низкий уровень на /PRE разрядов Q3, Q2 и Q0, а для разряда Q1 – на /CLR. После установки вернуть все входы /PRE и /CLR в неактивное состояние логической единицы.</w:t>
+      </w:r>
+    </w:p>
+    <w:p>
+      <w:pPr>
+        <w:spacing w:line="360" w:lineRule="auto"/>
+        <w:ind w:firstLine="709"/>
+        <w:jc w:val="both"/>
+      </w:pPr>
+      <w:r>
+        <w:rPr>
+          <w:b/>
+          <w:sz w:val="28"/>
+        </w:rPr>
+        <w:t xml:space="preserve">Подключение анализатора. </w:t>
+      </w:r>
+      <w:r>
+        <w:rPr>
+          <w:sz w:val="28"/>
+        </w:rPr>
+        <w:t>Подать Q3, Q2, Q1, Q0 и CLK на отдельные каналы логического анализатора. В качестве условия запуска выбрать положительный фронт CLK; развертку установить так, чтобы были видны не менее 15 тактов.</w:t>
+      </w:r>
+    </w:p>
+    <w:p>
+      <w:pPr>
+        <w:spacing w:line="360" w:lineRule="auto"/>
+        <w:ind w:firstLine="709"/>
+        <w:jc w:val="both"/>
+      </w:pPr>
+      <w:r>
+        <w:rPr>
+          <w:b/>
+          <w:sz w:val="28"/>
+        </w:rPr>
+        <w:t xml:space="preserve">Проверка результата. </w:t>
+      </w:r>
+      <w:r>
+        <w:rPr>
+          <w:sz w:val="28"/>
+        </w:rPr>
+        <w:t>После запуска сравнить коды между соседними положительными фронтами с последовательностью 13–2–14–11–0–12–9–5–7–8–4–3–10–6–13. Снимок окна логического анализатора использовать как экспериментальное подтверждение правильности синтеза после ручного моделирования схемы.</w:t>
       </w:r>
     </w:p>
     <w:sectPr>

</xml_diff>

<commit_message>
report: redraw PSU schematics in Multisim style
</commit_message>
<xml_diff>
--- a/deliverables/Курсовая_Блинов_текущая.docx
+++ b/deliverables/Курсовая_Блинов_текущая.docx
@@ -145,6 +145,7 @@
           <w:sz w:val="24"/>
         </w:rPr>
       </w:pPr>
+      <w:proofErr w:type="gramStart"/>
       <w:r>
         <w:rPr>
           <w:b/>
@@ -167,6 +168,7 @@
         </w:rPr>
         <w:t>Н</w:t>
       </w:r>
+      <w:proofErr w:type="gramEnd"/>
       <w:r>
         <w:rPr>
           <w:b/>
@@ -198,6 +200,7 @@
         </w:rPr>
         <w:t>У</w:t>
       </w:r>
+      <w:proofErr w:type="gramStart"/>
       <w:r>
         <w:rPr>
           <w:b/>
@@ -221,6 +224,7 @@
         </w:rPr>
         <w:t>Б</w:t>
       </w:r>
+      <w:proofErr w:type="gramEnd"/>
       <w:r>
         <w:rPr>
           <w:b/>
@@ -274,6 +278,7 @@
         </w:rPr>
         <w:t xml:space="preserve"> </w:t>
       </w:r>
+      <w:proofErr w:type="gramStart"/>
       <w:r>
         <w:rPr>
           <w:b/>
@@ -296,6 +301,7 @@
         </w:rPr>
         <w:t>»</w:t>
       </w:r>
+      <w:proofErr w:type="gramEnd"/>
       <w:r>
         <w:rPr>
           <w:b/>
@@ -388,6 +394,7 @@
         <w:ind w:right="285"/>
         <w:jc w:val="center"/>
       </w:pPr>
+      <w:proofErr w:type="gramStart"/>
       <w:r>
         <w:rPr>
           <w:b/>
@@ -414,6 +421,7 @@
         </w:rPr>
         <w:t>информационных</w:t>
       </w:r>
+      <w:proofErr w:type="gramEnd"/>
       <w:r>
         <w:rPr>
           <w:spacing w:val="-5"/>
@@ -483,7 +491,23 @@
         <w:jc w:val="center"/>
       </w:pPr>
       <w:r>
-        <w:t>СИНТЕЗ ПЕРЕСЧЕТНОГО УСТРОЙСТВА 13-2-14-11-0-12-9-5-7-8-4-3-10-6 НА ТРИГГЕРАХ 74AS74</w:t>
+        <w:t>СИНТЕЗ ПЕРЕСЧЕТНОГО УСТРОЙСТВА 13-2-14-</w:t>
+      </w:r>
+      <w:proofErr w:type="gramStart"/>
+      <w:r>
+        <w:t>11-0</w:t>
+      </w:r>
+      <w:proofErr w:type="gramEnd"/>
+      <w:r>
+        <w:t>-12-9-5-</w:t>
+      </w:r>
+      <w:proofErr w:type="gramStart"/>
+      <w:r>
+        <w:t>7-8</w:t>
+      </w:r>
+      <w:proofErr w:type="gramEnd"/>
+      <w:r>
+        <w:t>-4-3-10-6 НА ТРИГГЕРАХ 74AS74</w:t>
       </w:r>
     </w:p>
     <w:p>
@@ -1298,7 +1322,23 @@
         <w:jc w:val="center"/>
       </w:pPr>
       <w:r>
-        <w:t>на тему «Синтез пересчетного устройства 13-2-14-11-0-12-9-5-7-8-4-3-10-6 на триггерах 74AS74»</w:t>
+        <w:t>на тему «Синтез пересчетного устройства 13-2-14-</w:t>
+      </w:r>
+      <w:proofErr w:type="gramStart"/>
+      <w:r>
+        <w:t>11-0</w:t>
+      </w:r>
+      <w:proofErr w:type="gramEnd"/>
+      <w:r>
+        <w:t>-12-9-5-</w:t>
+      </w:r>
+      <w:proofErr w:type="gramStart"/>
+      <w:r>
+        <w:t>7-8</w:t>
+      </w:r>
+      <w:proofErr w:type="gramEnd"/>
+      <w:r>
+        <w:t>-4-3-10-6 на триггерах 74AS74»</w:t>
       </w:r>
     </w:p>
     <w:p>
@@ -1545,12 +1585,21 @@
         </w:rPr>
         <w:t xml:space="preserve"> </w:t>
       </w:r>
+      <w:proofErr w:type="spellStart"/>
       <w:r>
         <w:rPr>
           <w:spacing w:val="-2"/>
           <w:sz w:val="28"/>
         </w:rPr>
-        <w:t>Multisim.</w:t>
+        <w:t>Multisim</w:t>
+      </w:r>
+      <w:proofErr w:type="spellEnd"/>
+      <w:r>
+        <w:rPr>
+          <w:spacing w:val="-2"/>
+          <w:sz w:val="28"/>
+        </w:rPr>
+        <w:t>.</w:t>
       </w:r>
     </w:p>
     <w:p>
@@ -1723,12 +1772,21 @@
         </w:rPr>
         <w:t xml:space="preserve"> </w:t>
       </w:r>
+      <w:proofErr w:type="spellStart"/>
       <w:r>
         <w:rPr>
           <w:spacing w:val="-2"/>
           <w:sz w:val="28"/>
         </w:rPr>
-        <w:t>Multisim.</w:t>
+        <w:t>Multisim</w:t>
+      </w:r>
+      <w:proofErr w:type="spellEnd"/>
+      <w:r>
+        <w:rPr>
+          <w:spacing w:val="-2"/>
+          <w:sz w:val="28"/>
+        </w:rPr>
+        <w:t>.</w:t>
       </w:r>
     </w:p>
     <w:p>
@@ -1868,8 +1926,17 @@
                 <w:rFonts w:ascii="Times New Roman" w:hAnsi="Times New Roman"/>
                 <w:sz w:val="28"/>
               </w:rPr>
-              <w:t>Блинов К.И.</w:t>
-            </w:r>
+              <w:t xml:space="preserve">Блинов </w:t>
+            </w:r>
+            <w:proofErr w:type="gramStart"/>
+            <w:r>
+              <w:rPr>
+                <w:rFonts w:ascii="Times New Roman" w:hAnsi="Times New Roman"/>
+                <w:sz w:val="28"/>
+              </w:rPr>
+              <w:t>К.И.</w:t>
+            </w:r>
+            <w:proofErr w:type="gramEnd"/>
           </w:p>
         </w:tc>
       </w:tr>
@@ -2008,7 +2075,6 @@
           <w:docPartUnique/>
         </w:docPartObj>
       </w:sdtPr>
-      <w:sdtEndPr/>
       <w:sdtContent>
         <w:p>
           <w:pPr>
@@ -2650,7 +2716,14 @@
             <w:rPr>
               <w:sz w:val="28"/>
             </w:rPr>
-            <w:t>выполнить синтез дешифратора (DC) выходных состояний, формирующего управляющие сигналы Y</w:t>
+            <w:t xml:space="preserve">выполнить синтез дешифратора (DC) выходных состояний, формирующего управляющие сигналы </w:t>
+          </w:r>
+          <w:proofErr w:type="spellStart"/>
+          <w:r>
+            <w:rPr>
+              <w:sz w:val="28"/>
+            </w:rPr>
+            <w:t>Y</w:t>
           </w:r>
           <w:r>
             <w:rPr>
@@ -2659,6 +2732,7 @@
             </w:rPr>
             <w:t>i</w:t>
           </w:r>
+          <w:proofErr w:type="spellEnd"/>
           <w:r>
             <w:rPr>
               <w:sz w:val="28"/>
@@ -3251,7 +3325,43 @@
                 <w:spacing w:val="-2"/>
                 <w:sz w:val="24"/>
               </w:rPr>
-              <w:t>13-2-14-11-0-12-9-5-7-8-4-3-10-6</w:t>
+              <w:t>13-2-14-</w:t>
+            </w:r>
+            <w:proofErr w:type="gramStart"/>
+            <w:r>
+              <w:rPr>
+                <w:rFonts w:ascii="Times New Roman" w:hAnsi="Times New Roman"/>
+                <w:spacing w:val="-2"/>
+                <w:sz w:val="24"/>
+              </w:rPr>
+              <w:t>11-0</w:t>
+            </w:r>
+            <w:proofErr w:type="gramEnd"/>
+            <w:r>
+              <w:rPr>
+                <w:rFonts w:ascii="Times New Roman" w:hAnsi="Times New Roman"/>
+                <w:spacing w:val="-2"/>
+                <w:sz w:val="24"/>
+              </w:rPr>
+              <w:t>-12-9-5-</w:t>
+            </w:r>
+            <w:proofErr w:type="gramStart"/>
+            <w:r>
+              <w:rPr>
+                <w:rFonts w:ascii="Times New Roman" w:hAnsi="Times New Roman"/>
+                <w:spacing w:val="-2"/>
+                <w:sz w:val="24"/>
+              </w:rPr>
+              <w:t>7-8</w:t>
+            </w:r>
+            <w:proofErr w:type="gramEnd"/>
+            <w:r>
+              <w:rPr>
+                <w:rFonts w:ascii="Times New Roman" w:hAnsi="Times New Roman"/>
+                <w:spacing w:val="-2"/>
+                <w:sz w:val="24"/>
+              </w:rPr>
+              <w:t>-4-3-10-6</w:t>
             </w:r>
           </w:p>
         </w:tc>
@@ -4180,7 +4290,23 @@
                 <w:rFonts w:ascii="Times New Roman" w:hAnsi="Times New Roman"/>
                 <w:sz w:val="24"/>
               </w:rPr>
-              <w:t>цифровая (шестнадцатеричный код) светодиодная (probes)</w:t>
+              <w:t>цифровая (шестнадцатеричный код) светодиодная (</w:t>
+            </w:r>
+            <w:proofErr w:type="spellStart"/>
+            <w:r>
+              <w:rPr>
+                <w:rFonts w:ascii="Times New Roman" w:hAnsi="Times New Roman"/>
+                <w:sz w:val="24"/>
+              </w:rPr>
+              <w:t>probes</w:t>
+            </w:r>
+            <w:proofErr w:type="spellEnd"/>
+            <w:r>
+              <w:rPr>
+                <w:rFonts w:ascii="Times New Roman" w:hAnsi="Times New Roman"/>
+                <w:sz w:val="24"/>
+              </w:rPr>
+              <w:t>)</w:t>
             </w:r>
           </w:p>
         </w:tc>
@@ -4376,7 +4502,35 @@
         <w:rPr>
           <w:sz w:val="28"/>
         </w:rPr>
-        <w:t>Последовательность смены состояний - 13-2-14-11-0-12-9-5-7-8-4-3-10-6</w:t>
+        <w:t>Последовательность смены состояний - 13-2-14-</w:t>
+      </w:r>
+      <w:proofErr w:type="gramStart"/>
+      <w:r>
+        <w:rPr>
+          <w:sz w:val="28"/>
+        </w:rPr>
+        <w:t>11-0</w:t>
+      </w:r>
+      <w:proofErr w:type="gramEnd"/>
+      <w:r>
+        <w:rPr>
+          <w:sz w:val="28"/>
+        </w:rPr>
+        <w:t>-12-9-5-</w:t>
+      </w:r>
+      <w:proofErr w:type="gramStart"/>
+      <w:r>
+        <w:rPr>
+          <w:sz w:val="28"/>
+        </w:rPr>
+        <w:t>7-8</w:t>
+      </w:r>
+      <w:proofErr w:type="gramEnd"/>
+      <w:r>
+        <w:rPr>
+          <w:sz w:val="28"/>
+        </w:rPr>
+        <w:t>-4-3-10-6</w:t>
       </w:r>
     </w:p>
     <w:p>
@@ -4624,7 +4778,15 @@
       </w:pPr>
       <w:r>
         <w:lastRenderedPageBreak/>
-        <w:t>Количество триггеров, необходимых для работы устройства, определяется разрядностью кодов состояний. Для модуля счета M = 14 необходимое число триггеров вычисляется по формуле N = log₂M. Подставив в формулу (1.1) значение M и округлив результат вверх, рассчитаем N:</w:t>
+        <w:t xml:space="preserve">Количество триггеров, необходимых для работы устройства, определяется разрядностью кодов состояний. Для модуля счета M = 14 необходимое число триггеров вычисляется по формуле N = </w:t>
+      </w:r>
+      <w:proofErr w:type="spellStart"/>
+      <w:r>
+        <w:t>log₂M</w:t>
+      </w:r>
+      <w:proofErr w:type="spellEnd"/>
+      <w:r>
+        <w:t>. Подставив в формулу (1.1) значение M и округлив результат вверх, рассчитаем N:</w:t>
       </w:r>
     </w:p>
     <w:tbl>
@@ -4706,7 +4868,15 @@
         <w:jc w:val="both"/>
       </w:pPr>
       <w:r>
-        <w:t>Микросхема 74AS74 (SN74AS74A) представляет собой два D-триггера с переключением по положительному фронту тактового сигнала. Каждый триггер имеет отдельные входы D и CLK, асинхронные входы установки PRE и сброса CLR, прямой выход Q и инверсный выход Q̅. Распиновка микросхемы 74AS74 представлена на рисунке 1.2.</w:t>
+        <w:t xml:space="preserve">Микросхема 74AS74 (SN74AS74A) представляет собой два D-триггера с переключением по положительному фронту тактового сигнала. Каждый триггер имеет отдельные входы D и CLK, асинхронные входы установки PRE и сброса CLR, прямой выход Q и инверсный выход Q̅. </w:t>
+      </w:r>
+      <w:proofErr w:type="spellStart"/>
+      <w:r>
+        <w:t>Распиновка</w:t>
+      </w:r>
+      <w:proofErr w:type="spellEnd"/>
+      <w:r>
+        <w:t xml:space="preserve"> микросхемы 74AS74 представлена на рисунке 1.2.</w:t>
       </w:r>
     </w:p>
     <w:p>
@@ -4771,7 +4941,15 @@
         <w:jc w:val="center"/>
       </w:pPr>
       <w:r>
-        <w:t>Рисунок 1.2 – Распиновка микросхемы 74AS74</w:t>
+        <w:t xml:space="preserve">Рисунок 1.2 – </w:t>
+      </w:r>
+      <w:proofErr w:type="spellStart"/>
+      <w:r>
+        <w:t>Распиновка</w:t>
+      </w:r>
+      <w:proofErr w:type="spellEnd"/>
+      <w:r>
+        <w:t xml:space="preserve"> микросхемы 74AS74</w:t>
       </w:r>
     </w:p>
     <w:p>
@@ -8367,33 +8545,36 @@
       </w:r>
     </w:p>
     <w:p>
-      <w:r>
-        <w:br w:type="page"/>
-      </w:r>
-    </w:p>
-    <w:p>
       <w:pPr>
         <w:keepNext/>
         <w:spacing w:line="360" w:lineRule="auto"/>
         <w:ind w:firstLine="709"/>
         <w:jc w:val="both"/>
       </w:pPr>
-      <w:r>
-        <w:rPr>
-          <w:sz w:val="28"/>
-        </w:rPr>
-        <w:lastRenderedPageBreak/>
-        <w:t>После минимизации по картам Карно составлены выражения входных функций в минимальной дизъюнктивной нормальной форме (МДНФ) (1.2–1.5).</w:t>
-      </w:r>
     </w:p>
     <w:p>
       <w:pPr>
+        <w:keepNext/>
+        <w:spacing w:line="360" w:lineRule="auto"/>
+        <w:ind w:right="283" w:firstLine="709"/>
+        <w:jc w:val="both"/>
+      </w:pPr>
+      <w:r>
+        <w:rPr>
+          <w:sz w:val="28"/>
+        </w:rPr>
+        <w:t>После минимизации по картам Карно составлены выражения входных функций в минимальной дизъюнктивной нормальной форме (МДНФ) (1.2–1.5).</w:t>
+      </w:r>
+    </w:p>
+    <w:p>
+      <w:pPr>
         <w:keepLines/>
         <w:tabs>
           <w:tab w:val="center" w:pos="4649"/>
-          <w:tab w:val="right" w:pos="9071"/>
+          <w:tab w:val="right" w:pos="9923"/>
         </w:tabs>
         <w:spacing w:before="120" w:after="120"/>
+        <w:ind w:right="283"/>
       </w:pPr>
       <w:r>
         <w:rPr>
@@ -8737,9 +8918,10 @@
         <w:keepLines/>
         <w:tabs>
           <w:tab w:val="center" w:pos="4649"/>
-          <w:tab w:val="right" w:pos="9071"/>
+          <w:tab w:val="right" w:pos="9923"/>
         </w:tabs>
         <w:spacing w:before="120" w:after="120"/>
+        <w:ind w:right="283"/>
       </w:pPr>
       <w:r>
         <w:rPr>
@@ -9231,9 +9413,10 @@
         <w:keepLines/>
         <w:tabs>
           <w:tab w:val="center" w:pos="4649"/>
-          <w:tab w:val="right" w:pos="9071"/>
+          <w:tab w:val="right" w:pos="9923"/>
         </w:tabs>
         <w:spacing w:before="120" w:after="120"/>
+        <w:ind w:right="283"/>
       </w:pPr>
       <w:r>
         <w:rPr>
@@ -9749,9 +9932,10 @@
         <w:keepLines/>
         <w:tabs>
           <w:tab w:val="center" w:pos="4649"/>
-          <w:tab w:val="right" w:pos="9071"/>
+          <w:tab w:val="right" w:pos="9923"/>
         </w:tabs>
         <w:spacing w:before="120" w:after="120"/>
+        <w:ind w:right="283"/>
       </w:pPr>
       <w:r>
         <w:rPr>
@@ -10135,89 +10319,90 @@
     <w:p>
       <w:pPr>
         <w:spacing w:before="240" w:line="360" w:lineRule="auto"/>
-        <w:ind w:firstLine="709"/>
+        <w:ind w:right="283" w:firstLine="709"/>
         <w:jc w:val="both"/>
-      </w:pPr>
-      <w:r>
         <w:rPr>
           <w:sz w:val="28"/>
         </w:rPr>
-        <w:t>Полученные МДНФ определяют комбинационную часть ПСУ: по текущему коду состояния Q3…Q0 формируются значения D3…D0, записываемые в D-триггеры по активному фронту тактового сигнала. Проверка выражений для всех 14 рабочих состояний подтверждает заданную последовательность переходов.</w:t>
+      </w:pPr>
+      <w:r>
+        <w:rPr>
+          <w:sz w:val="28"/>
+        </w:rPr>
+        <w:t xml:space="preserve">Полученные МДНФ определяют комбинационную часть ПСУ: по текущему коду состояния Q3…Q0 формируются значения D3…D0, записываемые в D-триггеры по активному фронту тактового сигнала. Проверка выражений для всех </w:t>
+      </w:r>
+      <w:r>
+        <w:rPr>
+          <w:sz w:val="28"/>
+        </w:rPr>
+        <w:lastRenderedPageBreak/>
+        <w:t>14 рабочих состояний подтверждает заданную последовательность переходов.</w:t>
       </w:r>
     </w:p>
     <w:p>
-      <w:r>
-        <w:br w:type="page"/>
+      <w:pPr>
+        <w:spacing w:line="360" w:lineRule="auto"/>
+        <w:ind w:right="283" w:firstLine="709"/>
+        <w:jc w:val="both"/>
+      </w:pPr>
+      <w:r>
+        <w:rPr>
+          <w:sz w:val="28"/>
+        </w:rPr>
+        <w:t>Для схемной реализации минимизированные функции D3…D0 представлены в базисе И–ИЛИ. Отдельные инверторы для формирования сигналов /Q3…/Q0 не требуются, поскольку каждый D-триггер микросхемы 74AS74 имеет прямой Q и инверсный /Q выходы.</w:t>
       </w:r>
     </w:p>
     <w:p>
       <w:pPr>
-        <w:pStyle w:val="1"/>
-        <w:keepNext/>
-        <w:spacing w:before="240" w:after="120"/>
-        <w:ind w:left="0"/>
-      </w:pPr>
-      <w:r>
-        <w:rPr>
-          <w:sz w:val="32"/>
-        </w:rPr>
-        <w:lastRenderedPageBreak/>
-        <w:t>2.1.2 Функциональная схема пересчетного устройства (ПСУ)</w:t>
+        <w:spacing w:line="360" w:lineRule="auto"/>
+        <w:ind w:right="283" w:firstLine="709"/>
+        <w:jc w:val="both"/>
+      </w:pPr>
+      <w:r>
+        <w:rPr>
+          <w:sz w:val="28"/>
+        </w:rPr>
+        <w:t xml:space="preserve">На рисунке 2.3 представлена функциональная схема блока </w:t>
+      </w:r>
+      <w:proofErr w:type="spellStart"/>
+      <w:r>
+        <w:rPr>
+          <w:sz w:val="28"/>
+        </w:rPr>
+        <w:t>Logic_D</w:t>
+      </w:r>
+      <w:proofErr w:type="spellEnd"/>
+      <w:r>
+        <w:rPr>
+          <w:sz w:val="28"/>
+        </w:rPr>
+        <w:t>, реализованная по выражениям (1.2)–(1.5). Элементы И формируют конъюнктивные члены МДНФ, а элементы ИЛИ объединяют их и формируют сигналы D3…D0 для входов регистра состояния.</w:t>
       </w:r>
     </w:p>
     <w:p>
       <w:pPr>
-        <w:spacing w:line="360" w:lineRule="auto"/>
-        <w:ind w:firstLine="709"/>
-        <w:jc w:val="both"/>
-      </w:pPr>
-      <w:r>
-        <w:rPr>
-          <w:sz w:val="28"/>
-        </w:rPr>
-        <w:t>Для схемной реализации минимизированные функции D3…D0 представлены в базисе И–ИЛИ. Отдельные инверторы для формирования сигналов /Q3…/Q0 не требуются, поскольку каждый D-триггер микросхемы 74AS74 имеет прямой Q и инверсный /Q выходы.</w:t>
-      </w:r>
-    </w:p>
-    <w:p>
-      <w:pPr>
-        <w:spacing w:line="360" w:lineRule="auto"/>
-        <w:ind w:firstLine="709"/>
-        <w:jc w:val="both"/>
-      </w:pPr>
-      <w:r>
-        <w:rPr>
-          <w:sz w:val="28"/>
-        </w:rPr>
-        <w:t>На рисунке 2.3 представлена функциональная схема блока Logic_D, реализованная по выражениям (1.2)–(1.5). Элементы И формируют конъюнктивные члены МДНФ, а элементы ИЛИ объединяют их и формируют сигналы D3…D0 для входов регистра состояния.</w:t>
-      </w:r>
-    </w:p>
-    <w:p>
-      <w:pPr>
         <w:keepNext/>
-        <w:spacing w:before="120" w:after="60"/>
+        <w:spacing w:before="0" w:after="0"/>
+        <w:ind w:right="283"/>
         <w:jc w:val="center"/>
       </w:pPr>
       <w:r>
-        <w:rPr>
-          <w:noProof/>
-        </w:rPr>
         <w:drawing>
-          <wp:inline distT="0" distB="0" distL="0" distR="0" wp14:anchorId="7D9EE627" wp14:editId="53F066D2">
-            <wp:extent cx="5760000" cy="3584000"/>
-            <wp:effectExtent l="0" t="0" r="0" b="0"/>
-            <wp:docPr id="918597015" name="Picture 918597015"/>
+          <wp:inline xmlns:a="http://schemas.openxmlformats.org/drawingml/2006/main" xmlns:pic="http://schemas.openxmlformats.org/drawingml/2006/picture">
+            <wp:extent cx="5760000" cy="3323077"/>
+            <wp:docPr id="918597018" name="Picture 918597018"/>
             <wp:cNvGraphicFramePr>
-              <a:graphicFrameLocks xmlns:a="http://schemas.openxmlformats.org/drawingml/2006/main" noChangeAspect="1"/>
+              <a:graphicFrameLocks noChangeAspect="1"/>
             </wp:cNvGraphicFramePr>
-            <a:graphic xmlns:a="http://schemas.openxmlformats.org/drawingml/2006/main">
+            <a:graphic>
               <a:graphicData uri="http://schemas.openxmlformats.org/drawingml/2006/picture">
-                <pic:pic xmlns:pic="http://schemas.openxmlformats.org/drawingml/2006/picture">
+                <pic:pic>
                   <pic:nvPicPr>
-                    <pic:cNvPr id="0" name="logic_d_functional.png"/>
+                    <pic:cNvPr id="0" name="logic_d_multisim_style.png"/>
                     <pic:cNvPicPr/>
                   </pic:nvPicPr>
                   <pic:blipFill>
-                    <a:blip r:embed="rId16"/>
+                    <a:blip r:embed="rId21"/>
                     <a:stretch>
                       <a:fillRect/>
                     </a:stretch>
@@ -10225,11 +10410,9 @@
                   <pic:spPr>
                     <a:xfrm>
                       <a:off x="0" y="0"/>
-                      <a:ext cx="5760000" cy="3584000"/>
+                      <a:ext cx="5760000" cy="3323077"/>
                     </a:xfrm>
-                    <a:prstGeom prst="rect">
-                      <a:avLst/>
-                    </a:prstGeom>
+                    <a:prstGeom prst="rect"/>
                   </pic:spPr>
                 </pic:pic>
               </a:graphicData>
@@ -10249,10 +10432,21 @@
         <w:rPr>
           <w:sz w:val="28"/>
         </w:rPr>
-        <w:t>Рисунок 2.3 – Функциональная схема блока Logic_D</w:t>
-      </w:r>
+        <w:t xml:space="preserve">Рисунок 2.3 – Функциональная схема блока </w:t>
+      </w:r>
+      <w:proofErr w:type="spellStart"/>
+      <w:r>
+        <w:rPr>
+          <w:sz w:val="28"/>
+        </w:rPr>
+        <w:t>Logic_D</w:t>
+      </w:r>
+      <w:proofErr w:type="spellEnd"/>
     </w:p>
     <w:p>
+      <w:pPr>
+        <w:ind w:right="283"/>
+      </w:pPr>
       <w:r>
         <w:br w:type="page"/>
       </w:r>
@@ -10260,7 +10454,7 @@
     <w:p>
       <w:pPr>
         <w:spacing w:line="360" w:lineRule="auto"/>
-        <w:ind w:firstLine="709"/>
+        <w:ind w:right="283" w:firstLine="709"/>
         <w:jc w:val="both"/>
       </w:pPr>
       <w:r>
@@ -10274,30 +10468,27 @@
     <w:p>
       <w:pPr>
         <w:keepNext/>
-        <w:spacing w:before="120" w:after="60"/>
+        <w:spacing w:before="0" w:after="0"/>
+        <w:ind w:right="283"/>
         <w:jc w:val="center"/>
       </w:pPr>
       <w:r>
-        <w:rPr>
-          <w:noProof/>
-        </w:rPr>
         <w:drawing>
-          <wp:inline distT="0" distB="0" distL="0" distR="0" wp14:anchorId="48A55B7B" wp14:editId="0AB36BAF">
-            <wp:extent cx="5652000" cy="3705200"/>
-            <wp:effectExtent l="0" t="0" r="0" b="0"/>
-            <wp:docPr id="918597016" name="Picture 918597016"/>
+          <wp:inline xmlns:a="http://schemas.openxmlformats.org/drawingml/2006/main" xmlns:pic="http://schemas.openxmlformats.org/drawingml/2006/picture">
+            <wp:extent cx="5652000" cy="3526848"/>
+            <wp:docPr id="918597019" name="Picture 918597019"/>
             <wp:cNvGraphicFramePr>
-              <a:graphicFrameLocks xmlns:a="http://schemas.openxmlformats.org/drawingml/2006/main" noChangeAspect="1"/>
+              <a:graphicFrameLocks noChangeAspect="1"/>
             </wp:cNvGraphicFramePr>
-            <a:graphic xmlns:a="http://schemas.openxmlformats.org/drawingml/2006/main">
+            <a:graphic>
               <a:graphicData uri="http://schemas.openxmlformats.org/drawingml/2006/picture">
-                <pic:pic xmlns:pic="http://schemas.openxmlformats.org/drawingml/2006/picture">
+                <pic:pic>
                   <pic:nvPicPr>
-                    <pic:cNvPr id="0" name="d_counter_functional.png"/>
+                    <pic:cNvPr id="0" name="d_counter_multisim_style.png"/>
                     <pic:cNvPicPr/>
                   </pic:nvPicPr>
                   <pic:blipFill>
-                    <a:blip r:embed="rId17"/>
+                    <a:blip r:embed="rId22"/>
                     <a:stretch>
                       <a:fillRect/>
                     </a:stretch>
@@ -10305,11 +10496,9 @@
                   <pic:spPr>
                     <a:xfrm>
                       <a:off x="0" y="0"/>
-                      <a:ext cx="5652000" cy="3705200"/>
+                      <a:ext cx="5652000" cy="3526848"/>
                     </a:xfrm>
-                    <a:prstGeom prst="rect">
-                      <a:avLst/>
-                    </a:prstGeom>
+                    <a:prstGeom prst="rect"/>
                   </pic:spPr>
                 </pic:pic>
               </a:graphicData>
@@ -10329,20 +10518,52 @@
         <w:rPr>
           <w:sz w:val="28"/>
         </w:rPr>
-        <w:t>Рисунок 2.4 – Функциональная схема блока D_Counter</w:t>
-      </w:r>
+        <w:t xml:space="preserve">Рисунок 2.4 – Функциональная схема блока </w:t>
+      </w:r>
+      <w:proofErr w:type="spellStart"/>
+      <w:r>
+        <w:rPr>
+          <w:sz w:val="28"/>
+        </w:rPr>
+        <w:t>D_Counter</w:t>
+      </w:r>
+      <w:proofErr w:type="spellEnd"/>
     </w:p>
     <w:p>
       <w:pPr>
         <w:spacing w:line="360" w:lineRule="auto"/>
-        <w:ind w:firstLine="709"/>
+        <w:ind w:right="283" w:firstLine="709"/>
         <w:jc w:val="both"/>
-      </w:pPr>
-      <w:r>
         <w:rPr>
           <w:sz w:val="28"/>
         </w:rPr>
-        <w:t>Обратные связи с выходов Q3…Q0 и /Q3…/Q0 возвращаются на вход блока Logic_D. В результате перед каждым активным фронтом вычисляется код следующего состояния, который затем одновременно записывается во все четыре D-триггера.</w:t>
+      </w:pPr>
+    </w:p>
+    <w:p>
+      <w:pPr>
+        <w:spacing w:line="360" w:lineRule="auto"/>
+        <w:ind w:right="283" w:firstLine="709"/>
+        <w:jc w:val="both"/>
+      </w:pPr>
+      <w:r>
+        <w:rPr>
+          <w:sz w:val="28"/>
+        </w:rPr>
+        <w:t xml:space="preserve">Обратные связи с выходов Q3…Q0 и /Q3…/Q0 возвращаются на вход блока </w:t>
+      </w:r>
+      <w:proofErr w:type="spellStart"/>
+      <w:r>
+        <w:rPr>
+          <w:sz w:val="28"/>
+        </w:rPr>
+        <w:t>Logic_D</w:t>
+      </w:r>
+      <w:proofErr w:type="spellEnd"/>
+      <w:r>
+        <w:rPr>
+          <w:sz w:val="28"/>
+        </w:rPr>
+        <w:t>. В результате перед каждым активным фронтом вычисляется код следующего состояния, который затем одновременно записывается во все четыре D-триггера.</w:t>
       </w:r>
     </w:p>
     <w:p>
@@ -10355,7 +10576,8 @@
         <w:pStyle w:val="1"/>
         <w:keepNext/>
         <w:spacing w:before="240" w:after="120"/>
-        <w:ind w:left="0"/>
+        <w:ind w:left="0" w:right="283" w:firstLine="709"/>
+        <w:jc w:val="both"/>
       </w:pPr>
       <w:r>
         <w:rPr>
@@ -10368,20 +10590,31 @@
     <w:p>
       <w:pPr>
         <w:spacing w:line="360" w:lineRule="auto"/>
-        <w:ind w:firstLine="709"/>
+        <w:ind w:right="283" w:firstLine="709"/>
         <w:jc w:val="both"/>
-      </w:pPr>
-      <w:r>
         <w:rPr>
           <w:sz w:val="28"/>
         </w:rPr>
-        <w:t>Расчетная временная диаграмма сигнала синхронизации CLK и выходов Q3…Q0 приведена на рисунке 2.5. Изменение кода состояния происходит только по положительному фронту CLK; между фронтами выходные сигналы D-триггеров сохраняют установившиеся значения.</w:t>
-      </w:r>
+      </w:pPr>
     </w:p>
     <w:p>
       <w:pPr>
+        <w:spacing w:line="360" w:lineRule="auto"/>
+        <w:ind w:right="283" w:firstLine="709"/>
+        <w:jc w:val="both"/>
+      </w:pPr>
+      <w:r>
+        <w:rPr>
+          <w:sz w:val="28"/>
+        </w:rPr>
+        <w:t>Расчетная временная диаграмма сигнала синхронизации CLK и выходов Q3…Q0 приведена на рисунке 2.5. Изменение кода состояния происходит только по положительному фронту CLK; между фронтами выходные сигналы D-триггеров сохраняют установившиеся значения.</w:t>
+      </w:r>
+    </w:p>
+    <w:p>
+      <w:pPr>
         <w:keepNext/>
         <w:spacing w:before="120" w:after="60"/>
+        <w:ind w:right="283"/>
         <w:jc w:val="center"/>
       </w:pPr>
       <w:r>
@@ -10442,7 +10675,7 @@
     <w:p>
       <w:pPr>
         <w:spacing w:line="360" w:lineRule="auto"/>
-        <w:ind w:firstLine="709"/>
+        <w:ind w:right="283" w:firstLine="709"/>
         <w:jc w:val="both"/>
       </w:pPr>
       <w:r>
@@ -10468,8 +10701,17 @@
           <w:sz w:val="32"/>
         </w:rPr>
         <w:lastRenderedPageBreak/>
-        <w:t>Порядок ручной проверки в NI Multisim</w:t>
-      </w:r>
+        <w:t xml:space="preserve">Порядок ручной проверки в NI </w:t>
+      </w:r>
+      <w:proofErr w:type="spellStart"/>
+      <w:r>
+        <w:rPr>
+          <w:b/>
+          <w:sz w:val="32"/>
+        </w:rPr>
+        <w:t>Multisim</w:t>
+      </w:r>
+      <w:proofErr w:type="spellEnd"/>
     </w:p>
     <w:p>
       <w:pPr>
@@ -10488,7 +10730,35 @@
         <w:rPr>
           <w:sz w:val="28"/>
         </w:rPr>
-        <w:t>Соединить блок Logic_D с четырьмя D-триггерами 74AS74 по рисункам 2.3 и 2.4. Выходы D3…D0 подключить к одноименным входам триггеров, выходы Q3…Q0 и /Q3…/Q0 вернуть на входы Logic_D, а все входы CLK объединить.</w:t>
+        <w:t xml:space="preserve">Соединить блок </w:t>
+      </w:r>
+      <w:proofErr w:type="spellStart"/>
+      <w:r>
+        <w:rPr>
+          <w:sz w:val="28"/>
+        </w:rPr>
+        <w:t>Logic_D</w:t>
+      </w:r>
+      <w:proofErr w:type="spellEnd"/>
+      <w:r>
+        <w:rPr>
+          <w:sz w:val="28"/>
+        </w:rPr>
+        <w:t xml:space="preserve"> с четырьмя D-триггерами 74AS74 по рисункам 2.3 и 2.4. Выходы D3…D0 подключить к одноименным входам триггеров, выходы Q3…Q0 и /Q3…/Q0 вернуть на входы </w:t>
+      </w:r>
+      <w:proofErr w:type="spellStart"/>
+      <w:r>
+        <w:rPr>
+          <w:sz w:val="28"/>
+        </w:rPr>
+        <w:t>Logic_D</w:t>
+      </w:r>
+      <w:proofErr w:type="spellEnd"/>
+      <w:r>
+        <w:rPr>
+          <w:sz w:val="28"/>
+        </w:rPr>
+        <w:t>, а все входы CLK объединить.</w:t>
       </w:r>
     </w:p>
     <w:p>

</xml_diff>

<commit_message>
report: add PSU observation schematic
</commit_message>
<xml_diff>
--- a/deliverables/Курсовая_Блинов_текущая.docx
+++ b/deliverables/Курсовая_Блинов_текущая.docx
@@ -10567,6 +10567,79 @@
       </w:r>
     </w:p>
     <w:p>
+      <w:pPr>
+        <w:keepNext/>
+        <w:spacing w:line="360" w:lineRule="auto" w:before="0" w:after="0"/>
+        <w:ind w:right="283" w:firstLine="709"/>
+        <w:jc w:val="both"/>
+      </w:pPr>
+      <w:r>
+        <w:rPr>
+          <w:rFonts w:ascii="Times New Roman" w:hAnsi="Times New Roman" w:eastAsia="Times New Roman" w:cs="Times New Roman"/>
+          <w:b w:val="0"/>
+          <w:sz w:val="28"/>
+        </w:rPr>
+        <w:t>Далее блоки Logic_D и D_Counter объединяются шинами обратной связи. Для наблюдения за работой ПСУ входные сигналы D3…D0 контролируются светодиодными индикаторами, текущий код Q3…Q0 отображается шестнадцатеричным индикатором, а сигналы Q3…Q0 и CLK подаются на логический анализатор. На рисунке 2.6 представлена функциональная схема ПСУ для наблюдения переключения состояний.</w:t>
+      </w:r>
+    </w:p>
+    <w:p>
+      <w:pPr>
+        <w:keepNext/>
+        <w:spacing w:before="120" w:after="0"/>
+        <w:jc w:val="center"/>
+      </w:pPr>
+      <w:r>
+        <w:drawing>
+          <wp:inline xmlns:a="http://schemas.openxmlformats.org/drawingml/2006/main" xmlns:pic="http://schemas.openxmlformats.org/drawingml/2006/picture">
+            <wp:extent cx="5760000" cy="3340800"/>
+            <wp:docPr id="918597020" name="Picture 918597020"/>
+            <wp:cNvGraphicFramePr>
+              <a:graphicFrameLocks noChangeAspect="1"/>
+            </wp:cNvGraphicFramePr>
+            <a:graphic>
+              <a:graphicData uri="http://schemas.openxmlformats.org/drawingml/2006/picture">
+                <pic:pic>
+                  <pic:nvPicPr>
+                    <pic:cNvPr id="0" name="psu_observation_multisim_style.png"/>
+                    <pic:cNvPicPr/>
+                  </pic:nvPicPr>
+                  <pic:blipFill>
+                    <a:blip r:embed="rId23"/>
+                    <a:stretch>
+                      <a:fillRect/>
+                    </a:stretch>
+                  </pic:blipFill>
+                  <pic:spPr>
+                    <a:xfrm>
+                      <a:off x="0" y="0"/>
+                      <a:ext cx="5760000" cy="3340800"/>
+                    </a:xfrm>
+                    <a:prstGeom prst="rect"/>
+                  </pic:spPr>
+                </pic:pic>
+              </a:graphicData>
+            </a:graphic>
+          </wp:inline>
+        </w:drawing>
+      </w:r>
+    </w:p>
+    <w:p>
+      <w:pPr>
+        <w:keepLines/>
+        <w:spacing w:before="60" w:after="120"/>
+        <w:ind w:right="283"/>
+        <w:jc w:val="center"/>
+      </w:pPr>
+      <w:r>
+        <w:rPr>
+          <w:rFonts w:ascii="Times New Roman" w:hAnsi="Times New Roman" w:eastAsia="Times New Roman" w:cs="Times New Roman"/>
+          <w:b w:val="0"/>
+          <w:sz w:val="28"/>
+        </w:rPr>
+        <w:t>Рисунок 2.6 – Функциональная схема ПСУ для наблюдения переключения состояний</w:t>
+      </w:r>
+    </w:p>
+    <w:p>
       <w:r>
         <w:br w:type="page"/>
       </w:r>
@@ -10607,7 +10680,7 @@
         <w:rPr>
           <w:sz w:val="28"/>
         </w:rPr>
-        <w:t>Расчетная временная диаграмма сигнала синхронизации CLK и выходов Q3…Q0 приведена на рисунке 2.5. Изменение кода состояния происходит только по положительному фронту CLK; между фронтами выходные сигналы D-триггеров сохраняют установившиеся значения.</w:t>
+        <w:t>Расчетная временная диаграмма сигнала синхронизации CLK и выходов Q3…Q0 приведена на рисунке 2.7. Изменение кода состояния происходит только по положительному фронту CLK; между фронтами выходные сигналы D-триггеров сохраняют установившиеся значения.</w:t>
       </w:r>
     </w:p>
     <w:p>
@@ -10669,7 +10742,7 @@
         <w:rPr>
           <w:sz w:val="28"/>
         </w:rPr>
-        <w:t>Рисунок 2.5 – Расчетная временная диаграмма сигнала синхронизации и выходов Q3…Q0</w:t>
+        <w:t>Рисунок 2.7 – Расчетная временная диаграмма сигнала синхронизации и выходов Q3…Q0</w:t>
       </w:r>
     </w:p>
     <w:p>
@@ -10744,7 +10817,7 @@
         <w:rPr>
           <w:sz w:val="28"/>
         </w:rPr>
-        <w:t xml:space="preserve"> с четырьмя D-триггерами 74AS74 по рисункам 2.3 и 2.4. Выходы D3…D0 подключить к одноименным входам триггеров, выходы Q3…Q0 и /Q3…/Q0 вернуть на входы </w:t>
+        <w:t xml:space="preserve"> с четырьмя D-триггерами 74AS74 по рисункам 2.3, 2.4 и 2.6. Выходы D3…D0 подключить к одноименным входам триггеров, выходы Q3…Q0 и /Q3…/Q0 вернуть на входы </w:t>
       </w:r>
       <w:proofErr w:type="spellStart"/>
       <w:r>

</xml_diff>

<commit_message>
project: save Multisim model with sequence issue
</commit_message>
<xml_diff>
--- a/deliverables/Курсовая_Блинов_текущая.docx
+++ b/deliverables/Курсовая_Блинов_текущая.docx
@@ -10382,27 +10382,30 @@
     <w:p>
       <w:pPr>
         <w:keepNext/>
-        <w:spacing w:before="0" w:after="0"/>
         <w:ind w:right="283"/>
         <w:jc w:val="center"/>
       </w:pPr>
       <w:r>
+        <w:rPr>
+          <w:noProof/>
+        </w:rPr>
         <w:drawing>
-          <wp:inline xmlns:a="http://schemas.openxmlformats.org/drawingml/2006/main" xmlns:pic="http://schemas.openxmlformats.org/drawingml/2006/picture">
+          <wp:inline distT="0" distB="0" distL="0" distR="0" wp14:anchorId="00491F83" wp14:editId="104A8D6E">
             <wp:extent cx="5760000" cy="3323077"/>
+            <wp:effectExtent l="0" t="0" r="0" b="0"/>
             <wp:docPr id="918597018" name="Picture 918597018"/>
             <wp:cNvGraphicFramePr>
-              <a:graphicFrameLocks noChangeAspect="1"/>
+              <a:graphicFrameLocks xmlns:a="http://schemas.openxmlformats.org/drawingml/2006/main" noChangeAspect="1"/>
             </wp:cNvGraphicFramePr>
-            <a:graphic>
+            <a:graphic xmlns:a="http://schemas.openxmlformats.org/drawingml/2006/main">
               <a:graphicData uri="http://schemas.openxmlformats.org/drawingml/2006/picture">
-                <pic:pic>
+                <pic:pic xmlns:pic="http://schemas.openxmlformats.org/drawingml/2006/picture">
                   <pic:nvPicPr>
                     <pic:cNvPr id="0" name="logic_d_multisim_style.png"/>
                     <pic:cNvPicPr/>
                   </pic:nvPicPr>
                   <pic:blipFill>
-                    <a:blip r:embed="rId21"/>
+                    <a:blip r:embed="rId16"/>
                     <a:stretch>
                       <a:fillRect/>
                     </a:stretch>
@@ -10412,7 +10415,9 @@
                       <a:off x="0" y="0"/>
                       <a:ext cx="5760000" cy="3323077"/>
                     </a:xfrm>
-                    <a:prstGeom prst="rect"/>
+                    <a:prstGeom prst="rect">
+                      <a:avLst/>
+                    </a:prstGeom>
                   </pic:spPr>
                 </pic:pic>
               </a:graphicData>
@@ -10434,14 +10439,6 @@
         </w:rPr>
         <w:t xml:space="preserve">Рисунок 2.3 – Функциональная схема блока </w:t>
       </w:r>
-      <w:proofErr w:type="spellStart"/>
-      <w:r>
-        <w:rPr>
-          <w:sz w:val="28"/>
-        </w:rPr>
-        <w:t>Logic_D</w:t>
-      </w:r>
-      <w:proofErr w:type="spellEnd"/>
     </w:p>
     <w:p>
       <w:pPr>
@@ -10468,27 +10465,30 @@
     <w:p>
       <w:pPr>
         <w:keepNext/>
-        <w:spacing w:before="0" w:after="0"/>
         <w:ind w:right="283"/>
         <w:jc w:val="center"/>
       </w:pPr>
       <w:r>
+        <w:rPr>
+          <w:noProof/>
+        </w:rPr>
         <w:drawing>
-          <wp:inline xmlns:a="http://schemas.openxmlformats.org/drawingml/2006/main" xmlns:pic="http://schemas.openxmlformats.org/drawingml/2006/picture">
+          <wp:inline distT="0" distB="0" distL="0" distR="0" wp14:anchorId="17206837" wp14:editId="514AD11D">
             <wp:extent cx="5652000" cy="3526848"/>
+            <wp:effectExtent l="0" t="0" r="0" b="0"/>
             <wp:docPr id="918597019" name="Picture 918597019"/>
             <wp:cNvGraphicFramePr>
-              <a:graphicFrameLocks noChangeAspect="1"/>
+              <a:graphicFrameLocks xmlns:a="http://schemas.openxmlformats.org/drawingml/2006/main" noChangeAspect="1"/>
             </wp:cNvGraphicFramePr>
-            <a:graphic>
+            <a:graphic xmlns:a="http://schemas.openxmlformats.org/drawingml/2006/main">
               <a:graphicData uri="http://schemas.openxmlformats.org/drawingml/2006/picture">
-                <pic:pic>
+                <pic:pic xmlns:pic="http://schemas.openxmlformats.org/drawingml/2006/picture">
                   <pic:nvPicPr>
                     <pic:cNvPr id="0" name="d_counter_multisim_style.png"/>
                     <pic:cNvPicPr/>
                   </pic:nvPicPr>
                   <pic:blipFill>
-                    <a:blip r:embed="rId22"/>
+                    <a:blip r:embed="rId17"/>
                     <a:stretch>
                       <a:fillRect/>
                     </a:stretch>
@@ -10498,7 +10498,9 @@
                       <a:off x="0" y="0"/>
                       <a:ext cx="5652000" cy="3526848"/>
                     </a:xfrm>
-                    <a:prstGeom prst="rect"/>
+                    <a:prstGeom prst="rect">
+                      <a:avLst/>
+                    </a:prstGeom>
                   </pic:spPr>
                 </pic:pic>
               </a:graphicData>
@@ -10569,42 +10571,45 @@
     <w:p>
       <w:pPr>
         <w:keepNext/>
-        <w:spacing w:line="360" w:lineRule="auto" w:before="0" w:after="0"/>
+        <w:spacing w:line="360" w:lineRule="auto"/>
         <w:ind w:right="283" w:firstLine="709"/>
         <w:jc w:val="both"/>
       </w:pPr>
       <w:r>
         <w:rPr>
-          <w:rFonts w:ascii="Times New Roman" w:hAnsi="Times New Roman" w:eastAsia="Times New Roman" w:cs="Times New Roman"/>
-          <w:b w:val="0"/>
           <w:sz w:val="28"/>
         </w:rPr>
+        <w:lastRenderedPageBreak/>
         <w:t>Далее блоки Logic_D и D_Counter объединяются шинами обратной связи. Для наблюдения за работой ПСУ входные сигналы D3…D0 контролируются светодиодными индикаторами, текущий код Q3…Q0 отображается шестнадцатеричным индикатором, а сигналы Q3…Q0 и CLK подаются на логический анализатор. На рисунке 2.6 представлена функциональная схема ПСУ для наблюдения переключения состояний.</w:t>
       </w:r>
     </w:p>
     <w:p>
       <w:pPr>
         <w:keepNext/>
-        <w:spacing w:before="120" w:after="0"/>
+        <w:spacing w:before="120"/>
         <w:jc w:val="center"/>
       </w:pPr>
       <w:r>
+        <w:rPr>
+          <w:noProof/>
+        </w:rPr>
         <w:drawing>
-          <wp:inline xmlns:a="http://schemas.openxmlformats.org/drawingml/2006/main" xmlns:pic="http://schemas.openxmlformats.org/drawingml/2006/picture">
+          <wp:inline distT="0" distB="0" distL="0" distR="0" wp14:anchorId="3E452E57" wp14:editId="7F0FA5BB">
             <wp:extent cx="5760000" cy="3340800"/>
+            <wp:effectExtent l="0" t="0" r="0" b="0"/>
             <wp:docPr id="918597020" name="Picture 918597020"/>
             <wp:cNvGraphicFramePr>
-              <a:graphicFrameLocks noChangeAspect="1"/>
+              <a:graphicFrameLocks xmlns:a="http://schemas.openxmlformats.org/drawingml/2006/main" noChangeAspect="1"/>
             </wp:cNvGraphicFramePr>
-            <a:graphic>
+            <a:graphic xmlns:a="http://schemas.openxmlformats.org/drawingml/2006/main">
               <a:graphicData uri="http://schemas.openxmlformats.org/drawingml/2006/picture">
-                <pic:pic>
+                <pic:pic xmlns:pic="http://schemas.openxmlformats.org/drawingml/2006/picture">
                   <pic:nvPicPr>
                     <pic:cNvPr id="0" name="psu_observation_multisim_style.png"/>
                     <pic:cNvPicPr/>
                   </pic:nvPicPr>
                   <pic:blipFill>
-                    <a:blip r:embed="rId24"/>
+                    <a:blip r:embed="rId18"/>
                     <a:stretch>
                       <a:fillRect/>
                     </a:stretch>
@@ -10614,7 +10619,9 @@
                       <a:off x="0" y="0"/>
                       <a:ext cx="5760000" cy="3340800"/>
                     </a:xfrm>
-                    <a:prstGeom prst="rect"/>
+                    <a:prstGeom prst="rect">
+                      <a:avLst/>
+                    </a:prstGeom>
                   </pic:spPr>
                 </pic:pic>
               </a:graphicData>
@@ -10632,8 +10639,6 @@
       </w:pPr>
       <w:r>
         <w:rPr>
-          <w:rFonts w:ascii="Times New Roman" w:hAnsi="Times New Roman" w:eastAsia="Times New Roman" w:cs="Times New Roman"/>
-          <w:b w:val="0"/>
           <w:sz w:val="28"/>
         </w:rPr>
         <w:t>Рисунок 2.6 – Функциональная схема ПСУ для наблюдения переключения состояний</w:t>
@@ -10710,7 +10715,7 @@
                     <pic:cNvPicPr/>
                   </pic:nvPicPr>
                   <pic:blipFill>
-                    <a:blip r:embed="rId18"/>
+                    <a:blip r:embed="rId19"/>
                     <a:stretch>
                       <a:fillRect/>
                     </a:stretch>
@@ -10759,139 +10764,13 @@
       </w:r>
     </w:p>
     <w:p>
+      <w:pPr>
+        <w:rPr>
+          <w:lang w:val="en-US"/>
+        </w:rPr>
+      </w:pPr>
       <w:r>
         <w:br w:type="page"/>
-      </w:r>
-    </w:p>
-    <w:p>
-      <w:pPr>
-        <w:keepNext/>
-        <w:spacing w:before="240" w:after="120"/>
-      </w:pPr>
-      <w:r>
-        <w:rPr>
-          <w:b/>
-          <w:sz w:val="32"/>
-        </w:rPr>
-        <w:lastRenderedPageBreak/>
-        <w:t xml:space="preserve">Порядок ручной проверки в NI </w:t>
-      </w:r>
-      <w:proofErr w:type="spellStart"/>
-      <w:r>
-        <w:rPr>
-          <w:b/>
-          <w:sz w:val="32"/>
-        </w:rPr>
-        <w:t>Multisim</w:t>
-      </w:r>
-      <w:proofErr w:type="spellEnd"/>
-    </w:p>
-    <w:p>
-      <w:pPr>
-        <w:spacing w:line="360" w:lineRule="auto"/>
-        <w:ind w:firstLine="709"/>
-        <w:jc w:val="both"/>
-      </w:pPr>
-      <w:r>
-        <w:rPr>
-          <w:b/>
-          <w:sz w:val="28"/>
-        </w:rPr>
-        <w:t xml:space="preserve">Сборка схемы. </w:t>
-      </w:r>
-      <w:r>
-        <w:rPr>
-          <w:sz w:val="28"/>
-        </w:rPr>
-        <w:t xml:space="preserve">Соединить блок </w:t>
-      </w:r>
-      <w:proofErr w:type="spellStart"/>
-      <w:r>
-        <w:rPr>
-          <w:sz w:val="28"/>
-        </w:rPr>
-        <w:t>Logic_D</w:t>
-      </w:r>
-      <w:proofErr w:type="spellEnd"/>
-      <w:r>
-        <w:rPr>
-          <w:sz w:val="28"/>
-        </w:rPr>
-        <w:t xml:space="preserve"> с четырьмя D-триггерами 74AS74 по рисункам 2.3, 2.4 и 2.6. Выходы D3…D0 подключить к одноименным входам триггеров, выходы Q3…Q0 и /Q3…/Q0 вернуть на входы </w:t>
-      </w:r>
-      <w:proofErr w:type="spellStart"/>
-      <w:r>
-        <w:rPr>
-          <w:sz w:val="28"/>
-        </w:rPr>
-        <w:t>Logic_D</w:t>
-      </w:r>
-      <w:proofErr w:type="spellEnd"/>
-      <w:r>
-        <w:rPr>
-          <w:sz w:val="28"/>
-        </w:rPr>
-        <w:t>, а все входы CLK объединить.</w:t>
-      </w:r>
-    </w:p>
-    <w:p>
-      <w:pPr>
-        <w:spacing w:line="360" w:lineRule="auto"/>
-        <w:ind w:firstLine="709"/>
-        <w:jc w:val="both"/>
-      </w:pPr>
-      <w:r>
-        <w:rPr>
-          <w:b/>
-          <w:sz w:val="28"/>
-        </w:rPr>
-        <w:t xml:space="preserve">Начальная установка. </w:t>
-      </w:r>
-      <w:r>
-        <w:rPr>
-          <w:sz w:val="28"/>
-        </w:rPr>
-        <w:t>До начала счета установить регистр в код 1101: кратковременно подать низкий уровень на /PRE разрядов Q3, Q2 и Q0, а для разряда Q1 – на /CLR. После установки вернуть все входы /PRE и /CLR в неактивное состояние логической единицы.</w:t>
-      </w:r>
-    </w:p>
-    <w:p>
-      <w:pPr>
-        <w:spacing w:line="360" w:lineRule="auto"/>
-        <w:ind w:firstLine="709"/>
-        <w:jc w:val="both"/>
-      </w:pPr>
-      <w:r>
-        <w:rPr>
-          <w:b/>
-          <w:sz w:val="28"/>
-        </w:rPr>
-        <w:t xml:space="preserve">Подключение анализатора. </w:t>
-      </w:r>
-      <w:r>
-        <w:rPr>
-          <w:sz w:val="28"/>
-        </w:rPr>
-        <w:t>Подать Q3, Q2, Q1, Q0 и CLK на отдельные каналы логического анализатора. В качестве условия запуска выбрать положительный фронт CLK; развертку установить так, чтобы были видны не менее 15 тактов.</w:t>
-      </w:r>
-    </w:p>
-    <w:p>
-      <w:pPr>
-        <w:spacing w:line="360" w:lineRule="auto"/>
-        <w:ind w:firstLine="709"/>
-        <w:jc w:val="both"/>
-      </w:pPr>
-      <w:r>
-        <w:rPr>
-          <w:b/>
-          <w:sz w:val="28"/>
-        </w:rPr>
-        <w:t xml:space="preserve">Проверка результата. </w:t>
-      </w:r>
-      <w:r>
-        <w:rPr>
-          <w:sz w:val="28"/>
-        </w:rPr>
-        <w:t>После запуска сравнить коды между соседними положительными фронтами с последовательностью 13–2–14–11–0–12–9–5–7–8–4–3–10–6–13. Снимок окна логического анализатора использовать как экспериментальное подтверждение правильности синтеза после ручного моделирования схемы.</w:t>
       </w:r>
     </w:p>
     <w:sectPr>

</xml_diff>

<commit_message>
report: add verified Multisim captures
</commit_message>
<xml_diff>
--- a/deliverables/Курсовая_Блинов_текущая.docx
+++ b/deliverables/Курсовая_Блинов_текущая.docx
@@ -1,6 +1,6 @@
 
 <file path=word/document.xml><?xml version="1.0" encoding="utf-8"?>
-<w:document xmlns:wpc="http://schemas.microsoft.com/office/word/2010/wordprocessingCanvas" xmlns:cx="http://schemas.microsoft.com/office/drawing/2014/chartex" xmlns:cx1="http://schemas.microsoft.com/office/drawing/2015/9/8/chartex" xmlns:cx2="http://schemas.microsoft.com/office/drawing/2015/10/21/chartex" xmlns:cx3="http://schemas.microsoft.com/office/drawing/2016/5/9/chartex" xmlns:cx4="http://schemas.microsoft.com/office/drawing/2016/5/10/chartex" xmlns:cx5="http://schemas.microsoft.com/office/drawing/2016/5/11/chartex" xmlns:cx6="http://schemas.microsoft.com/office/drawing/2016/5/12/chartex" xmlns:cx7="http://schemas.microsoft.com/office/drawing/2016/5/13/chartex" xmlns:cx8="http://schemas.microsoft.com/office/drawing/2016/5/14/chartex" xmlns:mc="http://schemas.openxmlformats.org/markup-compatibility/2006" xmlns:aink="http://schemas.microsoft.com/office/drawing/2016/ink" xmlns:am3d="http://schemas.microsoft.com/office/drawing/2017/model3d" xmlns:o="urn:schemas-microsoft-com:office:office" xmlns:oel="http://schemas.microsoft.com/office/2019/extlst" xmlns:r="http://schemas.openxmlformats.org/officeDocument/2006/relationships" xmlns:m="http://schemas.openxmlformats.org/officeDocument/2006/math" xmlns:v="urn:schemas-microsoft-com:vml" xmlns:wp14="http://schemas.microsoft.com/office/word/2010/wordprocessingDrawing" xmlns:wp="http://schemas.openxmlformats.org/drawingml/2006/wordprocessingDrawing" xmlns:w10="urn:schemas-microsoft-com:office:word" xmlns:w="http://schemas.openxmlformats.org/wordprocessingml/2006/main" xmlns:w14="http://schemas.microsoft.com/office/word/2010/wordml" xmlns:w15="http://schemas.microsoft.com/office/word/2012/wordml" xmlns:w16cex="http://schemas.microsoft.com/office/word/2018/wordml/cex" xmlns:w16cid="http://schemas.microsoft.com/office/word/2016/wordml/cid" xmlns:w16="http://schemas.microsoft.com/office/word/2018/wordml" xmlns:w16du="http://schemas.microsoft.com/office/word/2023/wordml/word16du" xmlns:w16sdtdh="http://schemas.microsoft.com/office/word/2020/wordml/sdtdatahash" xmlns:w16sdtfl="http://schemas.microsoft.com/office/word/2024/wordml/sdtformatlock" xmlns:w16se="http://schemas.microsoft.com/office/word/2015/wordml/symex" xmlns:wpg="http://schemas.microsoft.com/office/word/2010/wordprocessingGroup" xmlns:wpi="http://schemas.microsoft.com/office/word/2010/wordprocessingInk" xmlns:wne="http://schemas.microsoft.com/office/word/2006/wordml" xmlns:wps="http://schemas.microsoft.com/office/word/2010/wordprocessingShape" mc:Ignorable="w14 w15 w16se w16cid w16 w16cex w16sdtdh w16sdtfl w16du wp14">
+<w:document xmlns:wpc="http://schemas.microsoft.com/office/word/2010/wordprocessingCanvas" xmlns:cx="http://schemas.microsoft.com/office/drawing/2014/chartex" xmlns:cx1="http://schemas.microsoft.com/office/drawing/2015/9/8/chartex" xmlns:cx2="http://schemas.microsoft.com/office/drawing/2015/10/21/chartex" xmlns:cx3="http://schemas.microsoft.com/office/drawing/2016/5/9/chartex" xmlns:cx4="http://schemas.microsoft.com/office/drawing/2016/5/10/chartex" xmlns:cx5="http://schemas.microsoft.com/office/drawing/2016/5/11/chartex" xmlns:cx6="http://schemas.microsoft.com/office/drawing/2016/5/12/chartex" xmlns:cx7="http://schemas.microsoft.com/office/drawing/2016/5/13/chartex" xmlns:cx8="http://schemas.microsoft.com/office/drawing/2016/5/14/chartex" xmlns:mc="http://schemas.openxmlformats.org/markup-compatibility/2006" xmlns:aink="http://schemas.microsoft.com/office/drawing/2016/ink" xmlns:am3d="http://schemas.microsoft.com/office/drawing/2017/model3d" xmlns:o="urn:schemas-microsoft-com:office:office" xmlns:r="http://schemas.openxmlformats.org/officeDocument/2006/relationships" xmlns:m="http://schemas.openxmlformats.org/officeDocument/2006/math" xmlns:v="urn:schemas-microsoft-com:vml" xmlns:wp14="http://schemas.microsoft.com/office/word/2010/wordprocessingDrawing" xmlns:wp="http://schemas.openxmlformats.org/drawingml/2006/wordprocessingDrawing" xmlns:w10="urn:schemas-microsoft-com:office:word" xmlns:w="http://schemas.openxmlformats.org/wordprocessingml/2006/main" xmlns:w14="http://schemas.microsoft.com/office/word/2010/wordml" xmlns:w15="http://schemas.microsoft.com/office/word/2012/wordml" xmlns:w16cex="http://schemas.microsoft.com/office/word/2018/wordml/cex" xmlns:w16cid="http://schemas.microsoft.com/office/word/2016/wordml/cid" xmlns:w16="http://schemas.microsoft.com/office/word/2018/wordml" xmlns:w16sdtdh="http://schemas.microsoft.com/office/word/2020/wordml/sdtdatahash" xmlns:w16se="http://schemas.microsoft.com/office/word/2015/wordml/symex" xmlns:wpg="http://schemas.microsoft.com/office/word/2010/wordprocessingGroup" xmlns:wpi="http://schemas.microsoft.com/office/word/2010/wordprocessingInk" xmlns:wne="http://schemas.microsoft.com/office/word/2006/wordml" xmlns:wps="http://schemas.microsoft.com/office/word/2010/wordprocessingShape" mc:Ignorable="w14 w15 w16se w16cid w16 w16cex w16sdtdh wp14">
   <w:body>
     <w:p>
       <w:pPr>
@@ -200,7 +200,6 @@
         </w:rPr>
         <w:t>У</w:t>
       </w:r>
-      <w:proofErr w:type="gramStart"/>
       <w:r>
         <w:rPr>
           <w:b/>
@@ -224,7 +223,6 @@
         </w:rPr>
         <w:t>Б</w:t>
       </w:r>
-      <w:proofErr w:type="gramEnd"/>
       <w:r>
         <w:rPr>
           <w:b/>
@@ -278,7 +276,6 @@
         </w:rPr>
         <w:t xml:space="preserve"> </w:t>
       </w:r>
-      <w:proofErr w:type="gramStart"/>
       <w:r>
         <w:rPr>
           <w:b/>
@@ -301,7 +298,6 @@
         </w:rPr>
         <w:t>»</w:t>
       </w:r>
-      <w:proofErr w:type="gramEnd"/>
       <w:r>
         <w:rPr>
           <w:b/>
@@ -491,23 +487,7 @@
         <w:jc w:val="center"/>
       </w:pPr>
       <w:r>
-        <w:t>СИНТЕЗ ПЕРЕСЧЕТНОГО УСТРОЙСТВА 13-2-14-</w:t>
-      </w:r>
-      <w:proofErr w:type="gramStart"/>
-      <w:r>
-        <w:t>11-0</w:t>
-      </w:r>
-      <w:proofErr w:type="gramEnd"/>
-      <w:r>
-        <w:t>-12-9-5-</w:t>
-      </w:r>
-      <w:proofErr w:type="gramStart"/>
-      <w:r>
-        <w:t>7-8</w:t>
-      </w:r>
-      <w:proofErr w:type="gramEnd"/>
-      <w:r>
-        <w:t>-4-3-10-6 НА ТРИГГЕРАХ 74AS74</w:t>
+        <w:t>СИНТЕЗ ПЕРЕСЧЕТНОГО УСТРОЙСТВА 13-2-14-11-0-12-9-5-7-8-4-3-10-6 НА ТРИГГЕРАХ 74AS74</w:t>
       </w:r>
     </w:p>
     <w:p>
@@ -1322,23 +1302,7 @@
         <w:jc w:val="center"/>
       </w:pPr>
       <w:r>
-        <w:t>на тему «Синтез пересчетного устройства 13-2-14-</w:t>
-      </w:r>
-      <w:proofErr w:type="gramStart"/>
-      <w:r>
-        <w:t>11-0</w:t>
-      </w:r>
-      <w:proofErr w:type="gramEnd"/>
-      <w:r>
-        <w:t>-12-9-5-</w:t>
-      </w:r>
-      <w:proofErr w:type="gramStart"/>
-      <w:r>
-        <w:t>7-8</w:t>
-      </w:r>
-      <w:proofErr w:type="gramEnd"/>
-      <w:r>
-        <w:t>-4-3-10-6 на триггерах 74AS74»</w:t>
+        <w:t>на тему «Синтез пересчетного устройства 13-2-14-11-0-12-9-5-7-8-4-3-10-6 на триггерах 74AS74»</w:t>
       </w:r>
     </w:p>
     <w:p>
@@ -1926,17 +1890,8 @@
                 <w:rFonts w:ascii="Times New Roman" w:hAnsi="Times New Roman"/>
                 <w:sz w:val="28"/>
               </w:rPr>
-              <w:t xml:space="preserve">Блинов </w:t>
-            </w:r>
-            <w:proofErr w:type="gramStart"/>
-            <w:r>
-              <w:rPr>
-                <w:rFonts w:ascii="Times New Roman" w:hAnsi="Times New Roman"/>
-                <w:sz w:val="28"/>
-              </w:rPr>
-              <w:t>К.И.</w:t>
-            </w:r>
-            <w:proofErr w:type="gramEnd"/>
+              <w:t>Блинов К.И.</w:t>
+            </w:r>
           </w:p>
         </w:tc>
       </w:tr>
@@ -2075,6 +2030,7 @@
           <w:docPartUnique/>
         </w:docPartObj>
       </w:sdtPr>
+      <w:sdtEndPr/>
       <w:sdtContent>
         <w:p>
           <w:pPr>
@@ -3325,43 +3281,7 @@
                 <w:spacing w:val="-2"/>
                 <w:sz w:val="24"/>
               </w:rPr>
-              <w:t>13-2-14-</w:t>
-            </w:r>
-            <w:proofErr w:type="gramStart"/>
-            <w:r>
-              <w:rPr>
-                <w:rFonts w:ascii="Times New Roman" w:hAnsi="Times New Roman"/>
-                <w:spacing w:val="-2"/>
-                <w:sz w:val="24"/>
-              </w:rPr>
-              <w:t>11-0</w:t>
-            </w:r>
-            <w:proofErr w:type="gramEnd"/>
-            <w:r>
-              <w:rPr>
-                <w:rFonts w:ascii="Times New Roman" w:hAnsi="Times New Roman"/>
-                <w:spacing w:val="-2"/>
-                <w:sz w:val="24"/>
-              </w:rPr>
-              <w:t>-12-9-5-</w:t>
-            </w:r>
-            <w:proofErr w:type="gramStart"/>
-            <w:r>
-              <w:rPr>
-                <w:rFonts w:ascii="Times New Roman" w:hAnsi="Times New Roman"/>
-                <w:spacing w:val="-2"/>
-                <w:sz w:val="24"/>
-              </w:rPr>
-              <w:t>7-8</w:t>
-            </w:r>
-            <w:proofErr w:type="gramEnd"/>
-            <w:r>
-              <w:rPr>
-                <w:rFonts w:ascii="Times New Roman" w:hAnsi="Times New Roman"/>
-                <w:spacing w:val="-2"/>
-                <w:sz w:val="24"/>
-              </w:rPr>
-              <w:t>-4-3-10-6</w:t>
+              <w:t>13-2-14-11-0-12-9-5-7-8-4-3-10-6</w:t>
             </w:r>
           </w:p>
         </w:tc>
@@ -4502,35 +4422,7 @@
         <w:rPr>
           <w:sz w:val="28"/>
         </w:rPr>
-        <w:t>Последовательность смены состояний - 13-2-14-</w:t>
-      </w:r>
-      <w:proofErr w:type="gramStart"/>
-      <w:r>
-        <w:rPr>
-          <w:sz w:val="28"/>
-        </w:rPr>
-        <w:t>11-0</w:t>
-      </w:r>
-      <w:proofErr w:type="gramEnd"/>
-      <w:r>
-        <w:rPr>
-          <w:sz w:val="28"/>
-        </w:rPr>
-        <w:t>-12-9-5-</w:t>
-      </w:r>
-      <w:proofErr w:type="gramStart"/>
-      <w:r>
-        <w:rPr>
-          <w:sz w:val="28"/>
-        </w:rPr>
-        <w:t>7-8</w:t>
-      </w:r>
-      <w:proofErr w:type="gramEnd"/>
-      <w:r>
-        <w:rPr>
-          <w:sz w:val="28"/>
-        </w:rPr>
-        <w:t>-4-3-10-6</w:t>
+        <w:t>Последовательность смены состояний - 13-2-14-11-0-12-9-5-7-8-4-3-10-6</w:t>
       </w:r>
     </w:p>
     <w:p>
@@ -10357,11 +10249,14 @@
         <w:spacing w:line="360" w:lineRule="auto"/>
         <w:ind w:right="283" w:firstLine="709"/>
         <w:jc w:val="both"/>
-      </w:pPr>
-      <w:r>
         <w:rPr>
           <w:sz w:val="28"/>
         </w:rPr>
+      </w:pPr>
+      <w:r>
+        <w:rPr>
+          <w:sz w:val="28"/>
+        </w:rPr>
         <w:t xml:space="preserve">На рисунке 2.3 представлена функциональная схема блока </w:t>
       </w:r>
       <w:proofErr w:type="spellStart"/>
@@ -10378,6 +10273,13 @@
         </w:rPr>
         <w:t>, реализованная по выражениям (1.2)–(1.5). Элементы И формируют конъюнктивные члены МДНФ, а элементы ИЛИ объединяют их и формируют сигналы D3…D0 для входов регистра состояния.</w:t>
       </w:r>
+    </w:p>
+    <w:p>
+      <w:pPr>
+        <w:spacing w:line="360" w:lineRule="auto"/>
+        <w:ind w:right="283" w:firstLine="709"/>
+        <w:jc w:val="both"/>
+      </w:pPr>
     </w:p>
     <w:p>
       <w:pPr>
@@ -10390,10 +10292,10 @@
           <w:noProof/>
         </w:rPr>
         <w:drawing>
-          <wp:inline distT="0" distB="0" distL="0" distR="0" wp14:anchorId="00491F83" wp14:editId="104A8D6E">
-            <wp:extent cx="5760000" cy="3323077"/>
-            <wp:effectExtent l="0" t="0" r="0" b="0"/>
-            <wp:docPr id="918597018" name="Picture 918597018"/>
+          <wp:inline distT="0" distB="0" distL="0" distR="0" wp14:anchorId="0BFED2C6" wp14:editId="49E8A9EE">
+            <wp:extent cx="6019800" cy="4791075"/>
+            <wp:effectExtent l="0" t="0" r="0" b="9525"/>
+            <wp:docPr id="9" name="Рисунок 9"/>
             <wp:cNvGraphicFramePr>
               <a:graphicFrameLocks xmlns:a="http://schemas.openxmlformats.org/drawingml/2006/main" noChangeAspect="1"/>
             </wp:cNvGraphicFramePr>
@@ -10401,7 +10303,7 @@
               <a:graphicData uri="http://schemas.openxmlformats.org/drawingml/2006/picture">
                 <pic:pic xmlns:pic="http://schemas.openxmlformats.org/drawingml/2006/picture">
                   <pic:nvPicPr>
-                    <pic:cNvPr id="0" name="logic_d_multisim_style.png"/>
+                    <pic:cNvPr id="1" name=""/>
                     <pic:cNvPicPr/>
                   </pic:nvPicPr>
                   <pic:blipFill>
@@ -10413,7 +10315,7 @@
                   <pic:spPr>
                     <a:xfrm>
                       <a:off x="0" y="0"/>
-                      <a:ext cx="5760000" cy="3323077"/>
+                      <a:ext cx="6019800" cy="4791075"/>
                     </a:xfrm>
                     <a:prstGeom prst="rect">
                       <a:avLst/>
@@ -10453,6 +10355,9 @@
         <w:spacing w:line="360" w:lineRule="auto"/>
         <w:ind w:right="283" w:firstLine="709"/>
         <w:jc w:val="both"/>
+        <w:rPr>
+          <w:sz w:val="28"/>
+        </w:rPr>
       </w:pPr>
       <w:r>
         <w:rPr>
@@ -10461,6 +10366,13 @@
         <w:lastRenderedPageBreak/>
         <w:t>Сигналы D3…D0 подаются на входы четырех D-триггеров, размещенных в двух микросхемах 74AS74. Тактовые входы CLK объединены, поэтому все разряды состояния изменяются одновременно по положительному фронту сигнала синхронизации. В нормальном режиме асинхронные входы /PRE и /CLR удерживаются в неактивном состоянии логической единицы.</w:t>
       </w:r>
+    </w:p>
+    <w:p>
+      <w:pPr>
+        <w:spacing w:line="360" w:lineRule="auto"/>
+        <w:ind w:right="283" w:firstLine="709"/>
+        <w:jc w:val="both"/>
+      </w:pPr>
     </w:p>
     <w:p>
       <w:pPr>
@@ -10473,10 +10385,10 @@
           <w:noProof/>
         </w:rPr>
         <w:drawing>
-          <wp:inline distT="0" distB="0" distL="0" distR="0" wp14:anchorId="17206837" wp14:editId="514AD11D">
-            <wp:extent cx="5652000" cy="3526848"/>
-            <wp:effectExtent l="0" t="0" r="0" b="0"/>
-            <wp:docPr id="918597019" name="Picture 918597019"/>
+          <wp:inline distT="0" distB="0" distL="0" distR="0" wp14:anchorId="683B722C" wp14:editId="57D6EC7D">
+            <wp:extent cx="6242632" cy="5128182"/>
+            <wp:effectExtent l="0" t="0" r="6350" b="0"/>
+            <wp:docPr id="8" name="Рисунок 8"/>
             <wp:cNvGraphicFramePr>
               <a:graphicFrameLocks xmlns:a="http://schemas.openxmlformats.org/drawingml/2006/main" noChangeAspect="1"/>
             </wp:cNvGraphicFramePr>
@@ -10484,7 +10396,7 @@
               <a:graphicData uri="http://schemas.openxmlformats.org/drawingml/2006/picture">
                 <pic:pic xmlns:pic="http://schemas.openxmlformats.org/drawingml/2006/picture">
                   <pic:nvPicPr>
-                    <pic:cNvPr id="0" name="d_counter_multisim_style.png"/>
+                    <pic:cNvPr id="1" name=""/>
                     <pic:cNvPicPr/>
                   </pic:nvPicPr>
                   <pic:blipFill>
@@ -10496,7 +10408,7 @@
                   <pic:spPr>
                     <a:xfrm>
                       <a:off x="0" y="0"/>
-                      <a:ext cx="5652000" cy="3526848"/>
+                      <a:ext cx="6262290" cy="5144331"/>
                     </a:xfrm>
                     <a:prstGeom prst="rect">
                       <a:avLst/>
@@ -10580,7 +10492,19 @@
           <w:sz w:val="28"/>
         </w:rPr>
         <w:lastRenderedPageBreak/>
-        <w:t>Далее блоки Logic_D и D_Counter объединяются шинами обратной связи. Для наблюдения за работой ПСУ входные сигналы D3…D0 контролируются светодиодными индикаторами, текущий код Q3…Q0 отображается шестнадцатеричным индикатором, а сигналы Q3…Q0 и CLK подаются на логический анализатор. На рисунке 2.6 представлена функциональная схема ПСУ для наблюдения переключения состояний.</w:t>
+        <w:t xml:space="preserve">Далее блоки Logic_D и D_Counter </w:t>
+      </w:r>
+      <w:r>
+        <w:rPr>
+          <w:sz w:val="28"/>
+        </w:rPr>
+        <w:t>объединяются шинами обратной связи. Для наблюдения за работой ПСУ входные сигналы D3…D0 контролируются светодиодными индикаторами, текущий код Q3…Q0 отображается шестнадцатеричным индикатором, а сигналы Q3…Q0 и CLK подаются на логический анализатор. На рис</w:t>
+      </w:r>
+      <w:r>
+        <w:rPr>
+          <w:sz w:val="28"/>
+        </w:rPr>
+        <w:t>унке 2.6 представлена функциональная схема ПСУ для наблюдения переключения состояний.</w:t>
       </w:r>
     </w:p>
     <w:p>
@@ -10594,10 +10518,10 @@
           <w:noProof/>
         </w:rPr>
         <w:drawing>
-          <wp:inline distT="0" distB="0" distL="0" distR="0" wp14:anchorId="3E452E57" wp14:editId="7F0FA5BB">
-            <wp:extent cx="5760000" cy="3340800"/>
+          <wp:inline distT="0" distB="0" distL="0" distR="0" wp14:anchorId="17126BA4" wp14:editId="7FD925C6">
+            <wp:extent cx="6004875" cy="3584333"/>
             <wp:effectExtent l="0" t="0" r="0" b="0"/>
-            <wp:docPr id="918597020" name="Picture 918597020"/>
+            <wp:docPr id="7" name="Рисунок 7"/>
             <wp:cNvGraphicFramePr>
               <a:graphicFrameLocks xmlns:a="http://schemas.openxmlformats.org/drawingml/2006/main" noChangeAspect="1"/>
             </wp:cNvGraphicFramePr>
@@ -10605,7 +10529,7 @@
               <a:graphicData uri="http://schemas.openxmlformats.org/drawingml/2006/picture">
                 <pic:pic xmlns:pic="http://schemas.openxmlformats.org/drawingml/2006/picture">
                   <pic:nvPicPr>
-                    <pic:cNvPr id="0" name="psu_observation_multisim_style.png"/>
+                    <pic:cNvPr id="1" name=""/>
                     <pic:cNvPicPr/>
                   </pic:nvPicPr>
                   <pic:blipFill>
@@ -10617,7 +10541,7 @@
                   <pic:spPr>
                     <a:xfrm>
                       <a:off x="0" y="0"/>
-                      <a:ext cx="5760000" cy="3340800"/>
+                      <a:ext cx="6006430" cy="3585261"/>
                     </a:xfrm>
                     <a:prstGeom prst="rect">
                       <a:avLst/>
@@ -10700,10 +10624,10 @@
           <w:noProof/>
         </w:rPr>
         <w:drawing>
-          <wp:inline distT="0" distB="0" distL="0" distR="0" wp14:anchorId="2036BE91" wp14:editId="6F3977AC">
-            <wp:extent cx="5760000" cy="3351273"/>
+          <wp:inline distT="0" distB="0" distL="0" distR="0" wp14:anchorId="63A204F4" wp14:editId="12C3F5DB">
+            <wp:extent cx="5316718" cy="4734307"/>
             <wp:effectExtent l="0" t="0" r="0" b="0"/>
-            <wp:docPr id="918597017" name="Picture 918597017"/>
+            <wp:docPr id="3" name="Рисунок 3"/>
             <wp:cNvGraphicFramePr>
               <a:graphicFrameLocks xmlns:a="http://schemas.openxmlformats.org/drawingml/2006/main" noChangeAspect="1"/>
             </wp:cNvGraphicFramePr>
@@ -10711,7 +10635,7 @@
               <a:graphicData uri="http://schemas.openxmlformats.org/drawingml/2006/picture">
                 <pic:pic xmlns:pic="http://schemas.openxmlformats.org/drawingml/2006/picture">
                   <pic:nvPicPr>
-                    <pic:cNvPr id="0" name="timing_d_calculated.png"/>
+                    <pic:cNvPr id="1" name=""/>
                     <pic:cNvPicPr/>
                   </pic:nvPicPr>
                   <pic:blipFill>
@@ -10723,7 +10647,7 @@
                   <pic:spPr>
                     <a:xfrm>
                       <a:off x="0" y="0"/>
-                      <a:ext cx="5760000" cy="3351273"/>
+                      <a:ext cx="5319901" cy="4737142"/>
                     </a:xfrm>
                     <a:prstGeom prst="rect">
                       <a:avLst/>
@@ -10742,13 +10666,24 @@
         <w:spacing w:before="60" w:after="120"/>
         <w:ind w:right="283"/>
         <w:jc w:val="center"/>
-      </w:pPr>
-      <w:r>
         <w:rPr>
           <w:sz w:val="28"/>
         </w:rPr>
+      </w:pPr>
+      <w:r>
+        <w:rPr>
+          <w:sz w:val="28"/>
+        </w:rPr>
         <w:t>Рисунок 2.7 – Расчетная временная диаграмма сигнала синхронизации и выходов Q3…Q0</w:t>
       </w:r>
+    </w:p>
+    <w:p>
+      <w:pPr>
+        <w:keepLines/>
+        <w:spacing w:before="60" w:after="120"/>
+        <w:ind w:right="283"/>
+        <w:jc w:val="center"/>
+      </w:pPr>
     </w:p>
     <w:p>
       <w:pPr>
@@ -10763,16 +10698,7 @@
         <w:t>Диаграмма подтверждает последовательность 13–2–14–11–0–12–9–5–7–8–4–3–10–6. После четырнадцатого активного фронта устройство возвращается в состояние 13, и цикл пересчета повторяется.</w:t>
       </w:r>
     </w:p>
-    <w:p>
-      <w:pPr>
-        <w:rPr>
-          <w:lang w:val="en-US"/>
-        </w:rPr>
-      </w:pPr>
-      <w:r>
-        <w:br w:type="page"/>
-      </w:r>
-    </w:p>
+    <w:p/>
     <w:sectPr>
       <w:type w:val="continuous"/>
       <w:pgSz w:w="11906" w:h="16838"/>
@@ -10786,7 +10712,7 @@
 </file>
 
 <file path=word/endnotes.xml><?xml version="1.0" encoding="utf-8"?>
-<w:endnotes xmlns:wpc="http://schemas.microsoft.com/office/word/2010/wordprocessingCanvas" xmlns:cx="http://schemas.microsoft.com/office/drawing/2014/chartex" xmlns:cx1="http://schemas.microsoft.com/office/drawing/2015/9/8/chartex" xmlns:cx2="http://schemas.microsoft.com/office/drawing/2015/10/21/chartex" xmlns:cx3="http://schemas.microsoft.com/office/drawing/2016/5/9/chartex" xmlns:cx4="http://schemas.microsoft.com/office/drawing/2016/5/10/chartex" xmlns:cx5="http://schemas.microsoft.com/office/drawing/2016/5/11/chartex" xmlns:cx6="http://schemas.microsoft.com/office/drawing/2016/5/12/chartex" xmlns:cx7="http://schemas.microsoft.com/office/drawing/2016/5/13/chartex" xmlns:cx8="http://schemas.microsoft.com/office/drawing/2016/5/14/chartex" xmlns:mc="http://schemas.openxmlformats.org/markup-compatibility/2006" xmlns:aink="http://schemas.microsoft.com/office/drawing/2016/ink" xmlns:am3d="http://schemas.microsoft.com/office/drawing/2017/model3d" xmlns:o="urn:schemas-microsoft-com:office:office" xmlns:oel="http://schemas.microsoft.com/office/2019/extlst" xmlns:r="http://schemas.openxmlformats.org/officeDocument/2006/relationships" xmlns:m="http://schemas.openxmlformats.org/officeDocument/2006/math" xmlns:v="urn:schemas-microsoft-com:vml" xmlns:wp14="http://schemas.microsoft.com/office/word/2010/wordprocessingDrawing" xmlns:wp="http://schemas.openxmlformats.org/drawingml/2006/wordprocessingDrawing" xmlns:w10="urn:schemas-microsoft-com:office:word" xmlns:w="http://schemas.openxmlformats.org/wordprocessingml/2006/main" xmlns:w14="http://schemas.microsoft.com/office/word/2010/wordml" xmlns:w15="http://schemas.microsoft.com/office/word/2012/wordml" xmlns:w16cex="http://schemas.microsoft.com/office/word/2018/wordml/cex" xmlns:w16cid="http://schemas.microsoft.com/office/word/2016/wordml/cid" xmlns:w16="http://schemas.microsoft.com/office/word/2018/wordml" xmlns:w16du="http://schemas.microsoft.com/office/word/2023/wordml/word16du" xmlns:w16sdtdh="http://schemas.microsoft.com/office/word/2020/wordml/sdtdatahash" xmlns:w16sdtfl="http://schemas.microsoft.com/office/word/2024/wordml/sdtformatlock" xmlns:w16se="http://schemas.microsoft.com/office/word/2015/wordml/symex" xmlns:wpg="http://schemas.microsoft.com/office/word/2010/wordprocessingGroup" xmlns:wpi="http://schemas.microsoft.com/office/word/2010/wordprocessingInk" xmlns:wne="http://schemas.microsoft.com/office/word/2006/wordml" xmlns:wps="http://schemas.microsoft.com/office/word/2010/wordprocessingShape" mc:Ignorable="w14 w15 w16se w16cid w16 w16cex w16sdtdh w16sdtfl w16du wp14">
+<w:endnotes xmlns:wpc="http://schemas.microsoft.com/office/word/2010/wordprocessingCanvas" xmlns:cx="http://schemas.microsoft.com/office/drawing/2014/chartex" xmlns:cx1="http://schemas.microsoft.com/office/drawing/2015/9/8/chartex" xmlns:cx2="http://schemas.microsoft.com/office/drawing/2015/10/21/chartex" xmlns:cx3="http://schemas.microsoft.com/office/drawing/2016/5/9/chartex" xmlns:cx4="http://schemas.microsoft.com/office/drawing/2016/5/10/chartex" xmlns:cx5="http://schemas.microsoft.com/office/drawing/2016/5/11/chartex" xmlns:cx6="http://schemas.microsoft.com/office/drawing/2016/5/12/chartex" xmlns:cx7="http://schemas.microsoft.com/office/drawing/2016/5/13/chartex" xmlns:cx8="http://schemas.microsoft.com/office/drawing/2016/5/14/chartex" xmlns:mc="http://schemas.openxmlformats.org/markup-compatibility/2006" xmlns:aink="http://schemas.microsoft.com/office/drawing/2016/ink" xmlns:am3d="http://schemas.microsoft.com/office/drawing/2017/model3d" xmlns:o="urn:schemas-microsoft-com:office:office" xmlns:r="http://schemas.openxmlformats.org/officeDocument/2006/relationships" xmlns:m="http://schemas.openxmlformats.org/officeDocument/2006/math" xmlns:v="urn:schemas-microsoft-com:vml" xmlns:wp14="http://schemas.microsoft.com/office/word/2010/wordprocessingDrawing" xmlns:wp="http://schemas.openxmlformats.org/drawingml/2006/wordprocessingDrawing" xmlns:w10="urn:schemas-microsoft-com:office:word" xmlns:w="http://schemas.openxmlformats.org/wordprocessingml/2006/main" xmlns:w14="http://schemas.microsoft.com/office/word/2010/wordml" xmlns:w15="http://schemas.microsoft.com/office/word/2012/wordml" xmlns:w16cex="http://schemas.microsoft.com/office/word/2018/wordml/cex" xmlns:w16cid="http://schemas.microsoft.com/office/word/2016/wordml/cid" xmlns:w16="http://schemas.microsoft.com/office/word/2018/wordml" xmlns:w16sdtdh="http://schemas.microsoft.com/office/word/2020/wordml/sdtdatahash" xmlns:w16se="http://schemas.microsoft.com/office/word/2015/wordml/symex" xmlns:wpg="http://schemas.microsoft.com/office/word/2010/wordprocessingGroup" xmlns:wpi="http://schemas.microsoft.com/office/word/2010/wordprocessingInk" xmlns:wne="http://schemas.microsoft.com/office/word/2006/wordml" xmlns:wps="http://schemas.microsoft.com/office/word/2010/wordprocessingShape" mc:Ignorable="w14 w15 w16se w16cid w16 w16cex w16sdtdh wp14">
   <w:endnote w:type="separator" w:id="-1">
     <w:p>
       <w:r>
@@ -10805,7 +10731,7 @@
 </file>
 
 <file path=word/footer1.xml><?xml version="1.0" encoding="utf-8"?>
-<w:ftr xmlns:wpc="http://schemas.microsoft.com/office/word/2010/wordprocessingCanvas" xmlns:cx="http://schemas.microsoft.com/office/drawing/2014/chartex" xmlns:cx1="http://schemas.microsoft.com/office/drawing/2015/9/8/chartex" xmlns:cx2="http://schemas.microsoft.com/office/drawing/2015/10/21/chartex" xmlns:cx3="http://schemas.microsoft.com/office/drawing/2016/5/9/chartex" xmlns:cx4="http://schemas.microsoft.com/office/drawing/2016/5/10/chartex" xmlns:cx5="http://schemas.microsoft.com/office/drawing/2016/5/11/chartex" xmlns:cx6="http://schemas.microsoft.com/office/drawing/2016/5/12/chartex" xmlns:cx7="http://schemas.microsoft.com/office/drawing/2016/5/13/chartex" xmlns:cx8="http://schemas.microsoft.com/office/drawing/2016/5/14/chartex" xmlns:mc="http://schemas.openxmlformats.org/markup-compatibility/2006" xmlns:aink="http://schemas.microsoft.com/office/drawing/2016/ink" xmlns:am3d="http://schemas.microsoft.com/office/drawing/2017/model3d" xmlns:o="urn:schemas-microsoft-com:office:office" xmlns:oel="http://schemas.microsoft.com/office/2019/extlst" xmlns:r="http://schemas.openxmlformats.org/officeDocument/2006/relationships" xmlns:m="http://schemas.openxmlformats.org/officeDocument/2006/math" xmlns:v="urn:schemas-microsoft-com:vml" xmlns:wp14="http://schemas.microsoft.com/office/word/2010/wordprocessingDrawing" xmlns:wp="http://schemas.openxmlformats.org/drawingml/2006/wordprocessingDrawing" xmlns:w10="urn:schemas-microsoft-com:office:word" xmlns:w="http://schemas.openxmlformats.org/wordprocessingml/2006/main" xmlns:w14="http://schemas.microsoft.com/office/word/2010/wordml" xmlns:w15="http://schemas.microsoft.com/office/word/2012/wordml" xmlns:w16cex="http://schemas.microsoft.com/office/word/2018/wordml/cex" xmlns:w16cid="http://schemas.microsoft.com/office/word/2016/wordml/cid" xmlns:w16="http://schemas.microsoft.com/office/word/2018/wordml" xmlns:w16du="http://schemas.microsoft.com/office/word/2023/wordml/word16du" xmlns:w16sdtdh="http://schemas.microsoft.com/office/word/2020/wordml/sdtdatahash" xmlns:w16sdtfl="http://schemas.microsoft.com/office/word/2024/wordml/sdtformatlock" xmlns:w16se="http://schemas.microsoft.com/office/word/2015/wordml/symex" xmlns:wpg="http://schemas.microsoft.com/office/word/2010/wordprocessingGroup" xmlns:wpi="http://schemas.microsoft.com/office/word/2010/wordprocessingInk" xmlns:wne="http://schemas.microsoft.com/office/word/2006/wordml" xmlns:wps="http://schemas.microsoft.com/office/word/2010/wordprocessingShape" mc:Ignorable="w14 w15 w16se w16cid w16 w16cex w16sdtdh w16sdtfl w16du wp14">
+<w:ftr xmlns:wpc="http://schemas.microsoft.com/office/word/2010/wordprocessingCanvas" xmlns:cx="http://schemas.microsoft.com/office/drawing/2014/chartex" xmlns:cx1="http://schemas.microsoft.com/office/drawing/2015/9/8/chartex" xmlns:cx2="http://schemas.microsoft.com/office/drawing/2015/10/21/chartex" xmlns:cx3="http://schemas.microsoft.com/office/drawing/2016/5/9/chartex" xmlns:cx4="http://schemas.microsoft.com/office/drawing/2016/5/10/chartex" xmlns:cx5="http://schemas.microsoft.com/office/drawing/2016/5/11/chartex" xmlns:cx6="http://schemas.microsoft.com/office/drawing/2016/5/12/chartex" xmlns:cx7="http://schemas.microsoft.com/office/drawing/2016/5/13/chartex" xmlns:cx8="http://schemas.microsoft.com/office/drawing/2016/5/14/chartex" xmlns:mc="http://schemas.openxmlformats.org/markup-compatibility/2006" xmlns:aink="http://schemas.microsoft.com/office/drawing/2016/ink" xmlns:am3d="http://schemas.microsoft.com/office/drawing/2017/model3d" xmlns:o="urn:schemas-microsoft-com:office:office" xmlns:r="http://schemas.openxmlformats.org/officeDocument/2006/relationships" xmlns:m="http://schemas.openxmlformats.org/officeDocument/2006/math" xmlns:v="urn:schemas-microsoft-com:vml" xmlns:wp14="http://schemas.microsoft.com/office/word/2010/wordprocessingDrawing" xmlns:wp="http://schemas.openxmlformats.org/drawingml/2006/wordprocessingDrawing" xmlns:w10="urn:schemas-microsoft-com:office:word" xmlns:w="http://schemas.openxmlformats.org/wordprocessingml/2006/main" xmlns:w14="http://schemas.microsoft.com/office/word/2010/wordml" xmlns:w15="http://schemas.microsoft.com/office/word/2012/wordml" xmlns:w16cex="http://schemas.microsoft.com/office/word/2018/wordml/cex" xmlns:w16cid="http://schemas.microsoft.com/office/word/2016/wordml/cid" xmlns:w16="http://schemas.microsoft.com/office/word/2018/wordml" xmlns:w16sdtdh="http://schemas.microsoft.com/office/word/2020/wordml/sdtdatahash" xmlns:w16se="http://schemas.microsoft.com/office/word/2015/wordml/symex" xmlns:wpg="http://schemas.microsoft.com/office/word/2010/wordprocessingGroup" xmlns:wpi="http://schemas.microsoft.com/office/word/2010/wordprocessingInk" xmlns:wne="http://schemas.microsoft.com/office/word/2006/wordml" xmlns:wps="http://schemas.microsoft.com/office/word/2010/wordprocessingShape" mc:Ignorable="w14 w15 w16se w16cid w16 w16cex w16sdtdh wp14">
   <w:p>
     <w:pPr>
       <w:pStyle w:val="a8"/>
@@ -10815,7 +10741,7 @@
 </file>
 
 <file path=word/footer2.xml><?xml version="1.0" encoding="utf-8"?>
-<w:ftr xmlns:wpc="http://schemas.microsoft.com/office/word/2010/wordprocessingCanvas" xmlns:cx="http://schemas.microsoft.com/office/drawing/2014/chartex" xmlns:cx1="http://schemas.microsoft.com/office/drawing/2015/9/8/chartex" xmlns:cx2="http://schemas.microsoft.com/office/drawing/2015/10/21/chartex" xmlns:cx3="http://schemas.microsoft.com/office/drawing/2016/5/9/chartex" xmlns:cx4="http://schemas.microsoft.com/office/drawing/2016/5/10/chartex" xmlns:cx5="http://schemas.microsoft.com/office/drawing/2016/5/11/chartex" xmlns:cx6="http://schemas.microsoft.com/office/drawing/2016/5/12/chartex" xmlns:cx7="http://schemas.microsoft.com/office/drawing/2016/5/13/chartex" xmlns:cx8="http://schemas.microsoft.com/office/drawing/2016/5/14/chartex" xmlns:mc="http://schemas.openxmlformats.org/markup-compatibility/2006" xmlns:aink="http://schemas.microsoft.com/office/drawing/2016/ink" xmlns:am3d="http://schemas.microsoft.com/office/drawing/2017/model3d" xmlns:o="urn:schemas-microsoft-com:office:office" xmlns:oel="http://schemas.microsoft.com/office/2019/extlst" xmlns:r="http://schemas.openxmlformats.org/officeDocument/2006/relationships" xmlns:m="http://schemas.openxmlformats.org/officeDocument/2006/math" xmlns:v="urn:schemas-microsoft-com:vml" xmlns:wp14="http://schemas.microsoft.com/office/word/2010/wordprocessingDrawing" xmlns:wp="http://schemas.openxmlformats.org/drawingml/2006/wordprocessingDrawing" xmlns:w10="urn:schemas-microsoft-com:office:word" xmlns:w="http://schemas.openxmlformats.org/wordprocessingml/2006/main" xmlns:w14="http://schemas.microsoft.com/office/word/2010/wordml" xmlns:w15="http://schemas.microsoft.com/office/word/2012/wordml" xmlns:w16cex="http://schemas.microsoft.com/office/word/2018/wordml/cex" xmlns:w16cid="http://schemas.microsoft.com/office/word/2016/wordml/cid" xmlns:w16="http://schemas.microsoft.com/office/word/2018/wordml" xmlns:w16du="http://schemas.microsoft.com/office/word/2023/wordml/word16du" xmlns:w16sdtdh="http://schemas.microsoft.com/office/word/2020/wordml/sdtdatahash" xmlns:w16sdtfl="http://schemas.microsoft.com/office/word/2024/wordml/sdtformatlock" xmlns:w16se="http://schemas.microsoft.com/office/word/2015/wordml/symex" xmlns:wpg="http://schemas.microsoft.com/office/word/2010/wordprocessingGroup" xmlns:wpi="http://schemas.microsoft.com/office/word/2010/wordprocessingInk" xmlns:wne="http://schemas.microsoft.com/office/word/2006/wordml" xmlns:wps="http://schemas.microsoft.com/office/word/2010/wordprocessingShape" mc:Ignorable="w14 w15 w16se w16cid w16 w16cex w16sdtdh w16sdtfl w16du wp14">
+<w:ftr xmlns:wpc="http://schemas.microsoft.com/office/word/2010/wordprocessingCanvas" xmlns:cx="http://schemas.microsoft.com/office/drawing/2014/chartex" xmlns:cx1="http://schemas.microsoft.com/office/drawing/2015/9/8/chartex" xmlns:cx2="http://schemas.microsoft.com/office/drawing/2015/10/21/chartex" xmlns:cx3="http://schemas.microsoft.com/office/drawing/2016/5/9/chartex" xmlns:cx4="http://schemas.microsoft.com/office/drawing/2016/5/10/chartex" xmlns:cx5="http://schemas.microsoft.com/office/drawing/2016/5/11/chartex" xmlns:cx6="http://schemas.microsoft.com/office/drawing/2016/5/12/chartex" xmlns:cx7="http://schemas.microsoft.com/office/drawing/2016/5/13/chartex" xmlns:cx8="http://schemas.microsoft.com/office/drawing/2016/5/14/chartex" xmlns:mc="http://schemas.openxmlformats.org/markup-compatibility/2006" xmlns:aink="http://schemas.microsoft.com/office/drawing/2016/ink" xmlns:am3d="http://schemas.microsoft.com/office/drawing/2017/model3d" xmlns:o="urn:schemas-microsoft-com:office:office" xmlns:r="http://schemas.openxmlformats.org/officeDocument/2006/relationships" xmlns:m="http://schemas.openxmlformats.org/officeDocument/2006/math" xmlns:v="urn:schemas-microsoft-com:vml" xmlns:wp14="http://schemas.microsoft.com/office/word/2010/wordprocessingDrawing" xmlns:wp="http://schemas.openxmlformats.org/drawingml/2006/wordprocessingDrawing" xmlns:w10="urn:schemas-microsoft-com:office:word" xmlns:w="http://schemas.openxmlformats.org/wordprocessingml/2006/main" xmlns:w14="http://schemas.microsoft.com/office/word/2010/wordml" xmlns:w15="http://schemas.microsoft.com/office/word/2012/wordml" xmlns:w16cex="http://schemas.microsoft.com/office/word/2018/wordml/cex" xmlns:w16cid="http://schemas.microsoft.com/office/word/2016/wordml/cid" xmlns:w16="http://schemas.microsoft.com/office/word/2018/wordml" xmlns:w16sdtdh="http://schemas.microsoft.com/office/word/2020/wordml/sdtdatahash" xmlns:w16se="http://schemas.microsoft.com/office/word/2015/wordml/symex" xmlns:wpg="http://schemas.microsoft.com/office/word/2010/wordprocessingGroup" xmlns:wpi="http://schemas.microsoft.com/office/word/2010/wordprocessingInk" xmlns:wne="http://schemas.microsoft.com/office/word/2006/wordml" xmlns:wps="http://schemas.microsoft.com/office/word/2010/wordprocessingShape" mc:Ignorable="w14 w15 w16se w16cid w16 w16cex w16sdtdh wp14">
   <w:p>
     <w:pPr>
       <w:pStyle w:val="a4"/>
@@ -10931,7 +10857,7 @@
         </mc:Choice>
         <mc:Fallback>
           <w:pict>
-            <v:rect w14:anchorId="76B83B2D" id="Textbox 1" o:spid="_x0000_s1026" style="position:absolute;margin-left:319.6pt;margin-top:756.05pt;width:13.05pt;height:14.25pt;z-index:-251660288;visibility:visible;mso-wrap-style:square;mso-wrap-distance-left:0;mso-wrap-distance-top:0;mso-wrap-distance-right:0;mso-wrap-distance-bottom:0;mso-position-horizontal:absolute;mso-position-horizontal-relative:page;mso-position-vertical:absolute;mso-position-vertical-relative:page;v-text-anchor:top" o:gfxdata="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" o:allowincell="f" filled="f" stroked="f" strokeweight="0">
+            <v:rect w14:anchorId="76B83B2D" id="Textbox 1" o:spid="_x0000_s1026" style="position:absolute;margin-left:319.6pt;margin-top:756.05pt;width:13.05pt;height:14.25pt;z-index:-251660288;visibility:visible;mso-wrap-style:square;mso-wrap-distance-left:0;mso-wrap-distance-top:0;mso-wrap-distance-right:0;mso-wrap-distance-bottom:0;mso-position-horizontal:absolute;mso-position-horizontal-relative:page;mso-position-vertical:absolute;mso-position-vertical-relative:page;v-text-anchor:top" o:gfxdata="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" o:allowincell="f" filled="f" stroked="f" strokeweight="0">
               <v:textbox inset="0,0,0,0">
                 <w:txbxContent>
                   <w:p>
@@ -10989,7 +10915,7 @@
 </file>
 
 <file path=word/footer3.xml><?xml version="1.0" encoding="utf-8"?>
-<w:ftr xmlns:wpc="http://schemas.microsoft.com/office/word/2010/wordprocessingCanvas" xmlns:cx="http://schemas.microsoft.com/office/drawing/2014/chartex" xmlns:cx1="http://schemas.microsoft.com/office/drawing/2015/9/8/chartex" xmlns:cx2="http://schemas.microsoft.com/office/drawing/2015/10/21/chartex" xmlns:cx3="http://schemas.microsoft.com/office/drawing/2016/5/9/chartex" xmlns:cx4="http://schemas.microsoft.com/office/drawing/2016/5/10/chartex" xmlns:cx5="http://schemas.microsoft.com/office/drawing/2016/5/11/chartex" xmlns:cx6="http://schemas.microsoft.com/office/drawing/2016/5/12/chartex" xmlns:cx7="http://schemas.microsoft.com/office/drawing/2016/5/13/chartex" xmlns:cx8="http://schemas.microsoft.com/office/drawing/2016/5/14/chartex" xmlns:mc="http://schemas.openxmlformats.org/markup-compatibility/2006" xmlns:aink="http://schemas.microsoft.com/office/drawing/2016/ink" xmlns:am3d="http://schemas.microsoft.com/office/drawing/2017/model3d" xmlns:o="urn:schemas-microsoft-com:office:office" xmlns:oel="http://schemas.microsoft.com/office/2019/extlst" xmlns:r="http://schemas.openxmlformats.org/officeDocument/2006/relationships" xmlns:m="http://schemas.openxmlformats.org/officeDocument/2006/math" xmlns:v="urn:schemas-microsoft-com:vml" xmlns:wp14="http://schemas.microsoft.com/office/word/2010/wordprocessingDrawing" xmlns:wp="http://schemas.openxmlformats.org/drawingml/2006/wordprocessingDrawing" xmlns:w10="urn:schemas-microsoft-com:office:word" xmlns:w="http://schemas.openxmlformats.org/wordprocessingml/2006/main" xmlns:w14="http://schemas.microsoft.com/office/word/2010/wordml" xmlns:w15="http://schemas.microsoft.com/office/word/2012/wordml" xmlns:w16cex="http://schemas.microsoft.com/office/word/2018/wordml/cex" xmlns:w16cid="http://schemas.microsoft.com/office/word/2016/wordml/cid" xmlns:w16="http://schemas.microsoft.com/office/word/2018/wordml" xmlns:w16du="http://schemas.microsoft.com/office/word/2023/wordml/word16du" xmlns:w16sdtdh="http://schemas.microsoft.com/office/word/2020/wordml/sdtdatahash" xmlns:w16sdtfl="http://schemas.microsoft.com/office/word/2024/wordml/sdtformatlock" xmlns:w16se="http://schemas.microsoft.com/office/word/2015/wordml/symex" xmlns:wpg="http://schemas.microsoft.com/office/word/2010/wordprocessingGroup" xmlns:wpi="http://schemas.microsoft.com/office/word/2010/wordprocessingInk" xmlns:wne="http://schemas.microsoft.com/office/word/2006/wordml" xmlns:wps="http://schemas.microsoft.com/office/word/2010/wordprocessingShape" mc:Ignorable="w14 w15 w16se w16cid w16 w16cex w16sdtdh w16sdtfl w16du wp14">
+<w:ftr xmlns:wpc="http://schemas.microsoft.com/office/word/2010/wordprocessingCanvas" xmlns:cx="http://schemas.microsoft.com/office/drawing/2014/chartex" xmlns:cx1="http://schemas.microsoft.com/office/drawing/2015/9/8/chartex" xmlns:cx2="http://schemas.microsoft.com/office/drawing/2015/10/21/chartex" xmlns:cx3="http://schemas.microsoft.com/office/drawing/2016/5/9/chartex" xmlns:cx4="http://schemas.microsoft.com/office/drawing/2016/5/10/chartex" xmlns:cx5="http://schemas.microsoft.com/office/drawing/2016/5/11/chartex" xmlns:cx6="http://schemas.microsoft.com/office/drawing/2016/5/12/chartex" xmlns:cx7="http://schemas.microsoft.com/office/drawing/2016/5/13/chartex" xmlns:cx8="http://schemas.microsoft.com/office/drawing/2016/5/14/chartex" xmlns:mc="http://schemas.openxmlformats.org/markup-compatibility/2006" xmlns:aink="http://schemas.microsoft.com/office/drawing/2016/ink" xmlns:am3d="http://schemas.microsoft.com/office/drawing/2017/model3d" xmlns:o="urn:schemas-microsoft-com:office:office" xmlns:r="http://schemas.openxmlformats.org/officeDocument/2006/relationships" xmlns:m="http://schemas.openxmlformats.org/officeDocument/2006/math" xmlns:v="urn:schemas-microsoft-com:vml" xmlns:wp14="http://schemas.microsoft.com/office/word/2010/wordprocessingDrawing" xmlns:wp="http://schemas.openxmlformats.org/drawingml/2006/wordprocessingDrawing" xmlns:w10="urn:schemas-microsoft-com:office:word" xmlns:w="http://schemas.openxmlformats.org/wordprocessingml/2006/main" xmlns:w14="http://schemas.microsoft.com/office/word/2010/wordml" xmlns:w15="http://schemas.microsoft.com/office/word/2012/wordml" xmlns:w16cex="http://schemas.microsoft.com/office/word/2018/wordml/cex" xmlns:w16cid="http://schemas.microsoft.com/office/word/2016/wordml/cid" xmlns:w16="http://schemas.microsoft.com/office/word/2018/wordml" xmlns:w16sdtdh="http://schemas.microsoft.com/office/word/2020/wordml/sdtdatahash" xmlns:w16se="http://schemas.microsoft.com/office/word/2015/wordml/symex" xmlns:wpg="http://schemas.microsoft.com/office/word/2010/wordprocessingGroup" xmlns:wpi="http://schemas.microsoft.com/office/word/2010/wordprocessingInk" xmlns:wne="http://schemas.microsoft.com/office/word/2006/wordml" xmlns:wps="http://schemas.microsoft.com/office/word/2010/wordprocessingShape" mc:Ignorable="w14 w15 w16se w16cid w16 w16cex w16sdtdh wp14">
   <w:p>
     <w:pPr>
       <w:pStyle w:val="a4"/>
@@ -11105,7 +11031,7 @@
         </mc:Choice>
         <mc:Fallback>
           <w:pict>
-            <v:rect w14:anchorId="1AF1776D" id="_x0000_s1027" style="position:absolute;margin-left:319.6pt;margin-top:756.05pt;width:13.05pt;height:14.25pt;z-index:-251659264;visibility:visible;mso-wrap-style:square;mso-wrap-distance-left:0;mso-wrap-distance-top:0;mso-wrap-distance-right:0;mso-wrap-distance-bottom:0;mso-position-horizontal:absolute;mso-position-horizontal-relative:page;mso-position-vertical:absolute;mso-position-vertical-relative:page;v-text-anchor:top" o:gfxdata="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" o:allowincell="f" filled="f" stroked="f" strokeweight="0">
+            <v:rect w14:anchorId="1AF1776D" id="_x0000_s1027" style="position:absolute;margin-left:319.6pt;margin-top:756.05pt;width:13.05pt;height:14.25pt;z-index:-251659264;visibility:visible;mso-wrap-style:square;mso-wrap-distance-left:0;mso-wrap-distance-top:0;mso-wrap-distance-right:0;mso-wrap-distance-bottom:0;mso-position-horizontal:absolute;mso-position-horizontal-relative:page;mso-position-vertical:absolute;mso-position-vertical-relative:page;v-text-anchor:top" o:gfxdata="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" o:allowincell="f" filled="f" stroked="f" strokeweight="0">
               <v:textbox inset="0,0,0,0">
                 <w:txbxContent>
                   <w:p>
@@ -11163,7 +11089,7 @@
 </file>
 
 <file path=word/footer4.xml><?xml version="1.0" encoding="utf-8"?>
-<w:ftr xmlns:wpc="http://schemas.microsoft.com/office/word/2010/wordprocessingCanvas" xmlns:cx="http://schemas.microsoft.com/office/drawing/2014/chartex" xmlns:cx1="http://schemas.microsoft.com/office/drawing/2015/9/8/chartex" xmlns:cx2="http://schemas.microsoft.com/office/drawing/2015/10/21/chartex" xmlns:cx3="http://schemas.microsoft.com/office/drawing/2016/5/9/chartex" xmlns:cx4="http://schemas.microsoft.com/office/drawing/2016/5/10/chartex" xmlns:cx5="http://schemas.microsoft.com/office/drawing/2016/5/11/chartex" xmlns:cx6="http://schemas.microsoft.com/office/drawing/2016/5/12/chartex" xmlns:cx7="http://schemas.microsoft.com/office/drawing/2016/5/13/chartex" xmlns:cx8="http://schemas.microsoft.com/office/drawing/2016/5/14/chartex" xmlns:mc="http://schemas.openxmlformats.org/markup-compatibility/2006" xmlns:aink="http://schemas.microsoft.com/office/drawing/2016/ink" xmlns:am3d="http://schemas.microsoft.com/office/drawing/2017/model3d" xmlns:o="urn:schemas-microsoft-com:office:office" xmlns:oel="http://schemas.microsoft.com/office/2019/extlst" xmlns:r="http://schemas.openxmlformats.org/officeDocument/2006/relationships" xmlns:m="http://schemas.openxmlformats.org/officeDocument/2006/math" xmlns:v="urn:schemas-microsoft-com:vml" xmlns:wp14="http://schemas.microsoft.com/office/word/2010/wordprocessingDrawing" xmlns:wp="http://schemas.openxmlformats.org/drawingml/2006/wordprocessingDrawing" xmlns:w10="urn:schemas-microsoft-com:office:word" xmlns:w="http://schemas.openxmlformats.org/wordprocessingml/2006/main" xmlns:w14="http://schemas.microsoft.com/office/word/2010/wordml" xmlns:w15="http://schemas.microsoft.com/office/word/2012/wordml" xmlns:w16cex="http://schemas.microsoft.com/office/word/2018/wordml/cex" xmlns:w16cid="http://schemas.microsoft.com/office/word/2016/wordml/cid" xmlns:w16="http://schemas.microsoft.com/office/word/2018/wordml" xmlns:w16du="http://schemas.microsoft.com/office/word/2023/wordml/word16du" xmlns:w16sdtdh="http://schemas.microsoft.com/office/word/2020/wordml/sdtdatahash" xmlns:w16sdtfl="http://schemas.microsoft.com/office/word/2024/wordml/sdtformatlock" xmlns:w16se="http://schemas.microsoft.com/office/word/2015/wordml/symex" xmlns:wpg="http://schemas.microsoft.com/office/word/2010/wordprocessingGroup" xmlns:wpi="http://schemas.microsoft.com/office/word/2010/wordprocessingInk" xmlns:wne="http://schemas.microsoft.com/office/word/2006/wordml" xmlns:wps="http://schemas.microsoft.com/office/word/2010/wordprocessingShape" mc:Ignorable="w14 w15 w16se w16cid w16 w16cex w16sdtdh w16sdtfl w16du wp14">
+<w:ftr xmlns:wpc="http://schemas.microsoft.com/office/word/2010/wordprocessingCanvas" xmlns:cx="http://schemas.microsoft.com/office/drawing/2014/chartex" xmlns:cx1="http://schemas.microsoft.com/office/drawing/2015/9/8/chartex" xmlns:cx2="http://schemas.microsoft.com/office/drawing/2015/10/21/chartex" xmlns:cx3="http://schemas.microsoft.com/office/drawing/2016/5/9/chartex" xmlns:cx4="http://schemas.microsoft.com/office/drawing/2016/5/10/chartex" xmlns:cx5="http://schemas.microsoft.com/office/drawing/2016/5/11/chartex" xmlns:cx6="http://schemas.microsoft.com/office/drawing/2016/5/12/chartex" xmlns:cx7="http://schemas.microsoft.com/office/drawing/2016/5/13/chartex" xmlns:cx8="http://schemas.microsoft.com/office/drawing/2016/5/14/chartex" xmlns:mc="http://schemas.openxmlformats.org/markup-compatibility/2006" xmlns:aink="http://schemas.microsoft.com/office/drawing/2016/ink" xmlns:am3d="http://schemas.microsoft.com/office/drawing/2017/model3d" xmlns:o="urn:schemas-microsoft-com:office:office" xmlns:r="http://schemas.openxmlformats.org/officeDocument/2006/relationships" xmlns:m="http://schemas.openxmlformats.org/officeDocument/2006/math" xmlns:v="urn:schemas-microsoft-com:vml" xmlns:wp14="http://schemas.microsoft.com/office/word/2010/wordprocessingDrawing" xmlns:wp="http://schemas.openxmlformats.org/drawingml/2006/wordprocessingDrawing" xmlns:w10="urn:schemas-microsoft-com:office:word" xmlns:w="http://schemas.openxmlformats.org/wordprocessingml/2006/main" xmlns:w14="http://schemas.microsoft.com/office/word/2010/wordml" xmlns:w15="http://schemas.microsoft.com/office/word/2012/wordml" xmlns:w16cex="http://schemas.microsoft.com/office/word/2018/wordml/cex" xmlns:w16cid="http://schemas.microsoft.com/office/word/2016/wordml/cid" xmlns:w16="http://schemas.microsoft.com/office/word/2018/wordml" xmlns:w16sdtdh="http://schemas.microsoft.com/office/word/2020/wordml/sdtdatahash" xmlns:w16se="http://schemas.microsoft.com/office/word/2015/wordml/symex" xmlns:wpg="http://schemas.microsoft.com/office/word/2010/wordprocessingGroup" xmlns:wpi="http://schemas.microsoft.com/office/word/2010/wordprocessingInk" xmlns:wne="http://schemas.microsoft.com/office/word/2006/wordml" xmlns:wps="http://schemas.microsoft.com/office/word/2010/wordprocessingShape" mc:Ignorable="w14 w15 w16se w16cid w16 w16cex w16sdtdh wp14">
   <w:p>
     <w:pPr>
       <w:pStyle w:val="a8"/>
@@ -11173,7 +11099,7 @@
 </file>
 
 <file path=word/footer5.xml><?xml version="1.0" encoding="utf-8"?>
-<w:ftr xmlns:wpc="http://schemas.microsoft.com/office/word/2010/wordprocessingCanvas" xmlns:cx="http://schemas.microsoft.com/office/drawing/2014/chartex" xmlns:cx1="http://schemas.microsoft.com/office/drawing/2015/9/8/chartex" xmlns:cx2="http://schemas.microsoft.com/office/drawing/2015/10/21/chartex" xmlns:cx3="http://schemas.microsoft.com/office/drawing/2016/5/9/chartex" xmlns:cx4="http://schemas.microsoft.com/office/drawing/2016/5/10/chartex" xmlns:cx5="http://schemas.microsoft.com/office/drawing/2016/5/11/chartex" xmlns:cx6="http://schemas.microsoft.com/office/drawing/2016/5/12/chartex" xmlns:cx7="http://schemas.microsoft.com/office/drawing/2016/5/13/chartex" xmlns:cx8="http://schemas.microsoft.com/office/drawing/2016/5/14/chartex" xmlns:mc="http://schemas.openxmlformats.org/markup-compatibility/2006" xmlns:aink="http://schemas.microsoft.com/office/drawing/2016/ink" xmlns:am3d="http://schemas.microsoft.com/office/drawing/2017/model3d" xmlns:o="urn:schemas-microsoft-com:office:office" xmlns:oel="http://schemas.microsoft.com/office/2019/extlst" xmlns:r="http://schemas.openxmlformats.org/officeDocument/2006/relationships" xmlns:m="http://schemas.openxmlformats.org/officeDocument/2006/math" xmlns:v="urn:schemas-microsoft-com:vml" xmlns:wp14="http://schemas.microsoft.com/office/word/2010/wordprocessingDrawing" xmlns:wp="http://schemas.openxmlformats.org/drawingml/2006/wordprocessingDrawing" xmlns:w10="urn:schemas-microsoft-com:office:word" xmlns:w="http://schemas.openxmlformats.org/wordprocessingml/2006/main" xmlns:w14="http://schemas.microsoft.com/office/word/2010/wordml" xmlns:w15="http://schemas.microsoft.com/office/word/2012/wordml" xmlns:w16cex="http://schemas.microsoft.com/office/word/2018/wordml/cex" xmlns:w16cid="http://schemas.microsoft.com/office/word/2016/wordml/cid" xmlns:w16="http://schemas.microsoft.com/office/word/2018/wordml" xmlns:w16du="http://schemas.microsoft.com/office/word/2023/wordml/word16du" xmlns:w16sdtdh="http://schemas.microsoft.com/office/word/2020/wordml/sdtdatahash" xmlns:w16sdtfl="http://schemas.microsoft.com/office/word/2024/wordml/sdtformatlock" xmlns:w16se="http://schemas.microsoft.com/office/word/2015/wordml/symex" xmlns:wpg="http://schemas.microsoft.com/office/word/2010/wordprocessingGroup" xmlns:wpi="http://schemas.microsoft.com/office/word/2010/wordprocessingInk" xmlns:wne="http://schemas.microsoft.com/office/word/2006/wordml" xmlns:wps="http://schemas.microsoft.com/office/word/2010/wordprocessingShape" mc:Ignorable="w14 w15 w16se w16cid w16 w16cex w16sdtdh w16sdtfl w16du wp14">
+<w:ftr xmlns:wpc="http://schemas.microsoft.com/office/word/2010/wordprocessingCanvas" xmlns:cx="http://schemas.microsoft.com/office/drawing/2014/chartex" xmlns:cx1="http://schemas.microsoft.com/office/drawing/2015/9/8/chartex" xmlns:cx2="http://schemas.microsoft.com/office/drawing/2015/10/21/chartex" xmlns:cx3="http://schemas.microsoft.com/office/drawing/2016/5/9/chartex" xmlns:cx4="http://schemas.microsoft.com/office/drawing/2016/5/10/chartex" xmlns:cx5="http://schemas.microsoft.com/office/drawing/2016/5/11/chartex" xmlns:cx6="http://schemas.microsoft.com/office/drawing/2016/5/12/chartex" xmlns:cx7="http://schemas.microsoft.com/office/drawing/2016/5/13/chartex" xmlns:cx8="http://schemas.microsoft.com/office/drawing/2016/5/14/chartex" xmlns:mc="http://schemas.openxmlformats.org/markup-compatibility/2006" xmlns:aink="http://schemas.microsoft.com/office/drawing/2016/ink" xmlns:am3d="http://schemas.microsoft.com/office/drawing/2017/model3d" xmlns:o="urn:schemas-microsoft-com:office:office" xmlns:r="http://schemas.openxmlformats.org/officeDocument/2006/relationships" xmlns:m="http://schemas.openxmlformats.org/officeDocument/2006/math" xmlns:v="urn:schemas-microsoft-com:vml" xmlns:wp14="http://schemas.microsoft.com/office/word/2010/wordprocessingDrawing" xmlns:wp="http://schemas.openxmlformats.org/drawingml/2006/wordprocessingDrawing" xmlns:w10="urn:schemas-microsoft-com:office:word" xmlns:w="http://schemas.openxmlformats.org/wordprocessingml/2006/main" xmlns:w14="http://schemas.microsoft.com/office/word/2010/wordml" xmlns:w15="http://schemas.microsoft.com/office/word/2012/wordml" xmlns:w16cex="http://schemas.microsoft.com/office/word/2018/wordml/cex" xmlns:w16cid="http://schemas.microsoft.com/office/word/2016/wordml/cid" xmlns:w16="http://schemas.microsoft.com/office/word/2018/wordml" xmlns:w16sdtdh="http://schemas.microsoft.com/office/word/2020/wordml/sdtdatahash" xmlns:w16se="http://schemas.microsoft.com/office/word/2015/wordml/symex" xmlns:wpg="http://schemas.microsoft.com/office/word/2010/wordprocessingGroup" xmlns:wpi="http://schemas.microsoft.com/office/word/2010/wordprocessingInk" xmlns:wne="http://schemas.microsoft.com/office/word/2006/wordml" xmlns:wps="http://schemas.microsoft.com/office/word/2010/wordprocessingShape" mc:Ignorable="w14 w15 w16se w16cid w16 w16cex w16sdtdh wp14">
   <w:p>
     <w:pPr>
       <w:pStyle w:val="a4"/>
@@ -11289,7 +11215,7 @@
         </mc:Choice>
         <mc:Fallback>
           <w:pict>
-            <v:rect w14:anchorId="7AE76D1D" id="Textbox 3" o:spid="_x0000_s1028" style="position:absolute;margin-left:319.6pt;margin-top:756.05pt;width:13.05pt;height:14.25pt;z-index:-251658240;visibility:visible;mso-wrap-style:square;mso-wrap-distance-left:0;mso-wrap-distance-top:0;mso-wrap-distance-right:0;mso-wrap-distance-bottom:0;mso-position-horizontal:absolute;mso-position-horizontal-relative:page;mso-position-vertical:absolute;mso-position-vertical-relative:page;v-text-anchor:top" o:gfxdata="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" o:allowincell="f" filled="f" stroked="f" strokeweight="0">
+            <v:rect w14:anchorId="7AE76D1D" id="Textbox 3" o:spid="_x0000_s1028" style="position:absolute;margin-left:319.6pt;margin-top:756.05pt;width:13.05pt;height:14.25pt;z-index:-251658240;visibility:visible;mso-wrap-style:square;mso-wrap-distance-left:0;mso-wrap-distance-top:0;mso-wrap-distance-right:0;mso-wrap-distance-bottom:0;mso-position-horizontal:absolute;mso-position-horizontal-relative:page;mso-position-vertical:absolute;mso-position-vertical-relative:page;v-text-anchor:top" o:gfxdata="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" o:allowincell="f" filled="f" stroked="f" strokeweight="0">
               <v:textbox inset="0,0,0,0">
                 <w:txbxContent>
                   <w:p>
@@ -11347,7 +11273,7 @@
 </file>
 
 <file path=word/footer6.xml><?xml version="1.0" encoding="utf-8"?>
-<w:ftr xmlns:wpc="http://schemas.microsoft.com/office/word/2010/wordprocessingCanvas" xmlns:cx="http://schemas.microsoft.com/office/drawing/2014/chartex" xmlns:cx1="http://schemas.microsoft.com/office/drawing/2015/9/8/chartex" xmlns:cx2="http://schemas.microsoft.com/office/drawing/2015/10/21/chartex" xmlns:cx3="http://schemas.microsoft.com/office/drawing/2016/5/9/chartex" xmlns:cx4="http://schemas.microsoft.com/office/drawing/2016/5/10/chartex" xmlns:cx5="http://schemas.microsoft.com/office/drawing/2016/5/11/chartex" xmlns:cx6="http://schemas.microsoft.com/office/drawing/2016/5/12/chartex" xmlns:cx7="http://schemas.microsoft.com/office/drawing/2016/5/13/chartex" xmlns:cx8="http://schemas.microsoft.com/office/drawing/2016/5/14/chartex" xmlns:mc="http://schemas.openxmlformats.org/markup-compatibility/2006" xmlns:aink="http://schemas.microsoft.com/office/drawing/2016/ink" xmlns:am3d="http://schemas.microsoft.com/office/drawing/2017/model3d" xmlns:o="urn:schemas-microsoft-com:office:office" xmlns:oel="http://schemas.microsoft.com/office/2019/extlst" xmlns:r="http://schemas.openxmlformats.org/officeDocument/2006/relationships" xmlns:m="http://schemas.openxmlformats.org/officeDocument/2006/math" xmlns:v="urn:schemas-microsoft-com:vml" xmlns:wp14="http://schemas.microsoft.com/office/word/2010/wordprocessingDrawing" xmlns:wp="http://schemas.openxmlformats.org/drawingml/2006/wordprocessingDrawing" xmlns:w10="urn:schemas-microsoft-com:office:word" xmlns:w="http://schemas.openxmlformats.org/wordprocessingml/2006/main" xmlns:w14="http://schemas.microsoft.com/office/word/2010/wordml" xmlns:w15="http://schemas.microsoft.com/office/word/2012/wordml" xmlns:w16cex="http://schemas.microsoft.com/office/word/2018/wordml/cex" xmlns:w16cid="http://schemas.microsoft.com/office/word/2016/wordml/cid" xmlns:w16="http://schemas.microsoft.com/office/word/2018/wordml" xmlns:w16du="http://schemas.microsoft.com/office/word/2023/wordml/word16du" xmlns:w16sdtdh="http://schemas.microsoft.com/office/word/2020/wordml/sdtdatahash" xmlns:w16sdtfl="http://schemas.microsoft.com/office/word/2024/wordml/sdtformatlock" xmlns:w16se="http://schemas.microsoft.com/office/word/2015/wordml/symex" xmlns:wpg="http://schemas.microsoft.com/office/word/2010/wordprocessingGroup" xmlns:wpi="http://schemas.microsoft.com/office/word/2010/wordprocessingInk" xmlns:wne="http://schemas.microsoft.com/office/word/2006/wordml" xmlns:wps="http://schemas.microsoft.com/office/word/2010/wordprocessingShape" mc:Ignorable="w14 w15 w16se w16cid w16 w16cex w16sdtdh w16sdtfl w16du wp14">
+<w:ftr xmlns:wpc="http://schemas.microsoft.com/office/word/2010/wordprocessingCanvas" xmlns:cx="http://schemas.microsoft.com/office/drawing/2014/chartex" xmlns:cx1="http://schemas.microsoft.com/office/drawing/2015/9/8/chartex" xmlns:cx2="http://schemas.microsoft.com/office/drawing/2015/10/21/chartex" xmlns:cx3="http://schemas.microsoft.com/office/drawing/2016/5/9/chartex" xmlns:cx4="http://schemas.microsoft.com/office/drawing/2016/5/10/chartex" xmlns:cx5="http://schemas.microsoft.com/office/drawing/2016/5/11/chartex" xmlns:cx6="http://schemas.microsoft.com/office/drawing/2016/5/12/chartex" xmlns:cx7="http://schemas.microsoft.com/office/drawing/2016/5/13/chartex" xmlns:cx8="http://schemas.microsoft.com/office/drawing/2016/5/14/chartex" xmlns:mc="http://schemas.openxmlformats.org/markup-compatibility/2006" xmlns:aink="http://schemas.microsoft.com/office/drawing/2016/ink" xmlns:am3d="http://schemas.microsoft.com/office/drawing/2017/model3d" xmlns:o="urn:schemas-microsoft-com:office:office" xmlns:r="http://schemas.openxmlformats.org/officeDocument/2006/relationships" xmlns:m="http://schemas.openxmlformats.org/officeDocument/2006/math" xmlns:v="urn:schemas-microsoft-com:vml" xmlns:wp14="http://schemas.microsoft.com/office/word/2010/wordprocessingDrawing" xmlns:wp="http://schemas.openxmlformats.org/drawingml/2006/wordprocessingDrawing" xmlns:w10="urn:schemas-microsoft-com:office:word" xmlns:w="http://schemas.openxmlformats.org/wordprocessingml/2006/main" xmlns:w14="http://schemas.microsoft.com/office/word/2010/wordml" xmlns:w15="http://schemas.microsoft.com/office/word/2012/wordml" xmlns:w16cex="http://schemas.microsoft.com/office/word/2018/wordml/cex" xmlns:w16cid="http://schemas.microsoft.com/office/word/2016/wordml/cid" xmlns:w16="http://schemas.microsoft.com/office/word/2018/wordml" xmlns:w16sdtdh="http://schemas.microsoft.com/office/word/2020/wordml/sdtdatahash" xmlns:w16se="http://schemas.microsoft.com/office/word/2015/wordml/symex" xmlns:wpg="http://schemas.microsoft.com/office/word/2010/wordprocessingGroup" xmlns:wpi="http://schemas.microsoft.com/office/word/2010/wordprocessingInk" xmlns:wne="http://schemas.microsoft.com/office/word/2006/wordml" xmlns:wps="http://schemas.microsoft.com/office/word/2010/wordprocessingShape" mc:Ignorable="w14 w15 w16se w16cid w16 w16cex w16sdtdh wp14">
   <w:p>
     <w:pPr>
       <w:pStyle w:val="a4"/>
@@ -11463,7 +11389,7 @@
         </mc:Choice>
         <mc:Fallback>
           <w:pict>
-            <v:rect w14:anchorId="2EBFB359" id="_x0000_s1029" style="position:absolute;margin-left:319.6pt;margin-top:756.05pt;width:13.05pt;height:14.25pt;z-index:-251657216;visibility:visible;mso-wrap-style:square;mso-wrap-distance-left:0;mso-wrap-distance-top:0;mso-wrap-distance-right:0;mso-wrap-distance-bottom:0;mso-position-horizontal:absolute;mso-position-horizontal-relative:page;mso-position-vertical:absolute;mso-position-vertical-relative:page;v-text-anchor:top" o:gfxdata="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" o:allowincell="f" filled="f" stroked="f" strokeweight="0">
+            <v:rect w14:anchorId="2EBFB359" id="_x0000_s1029" style="position:absolute;margin-left:319.6pt;margin-top:756.05pt;width:13.05pt;height:14.25pt;z-index:-251657216;visibility:visible;mso-wrap-style:square;mso-wrap-distance-left:0;mso-wrap-distance-top:0;mso-wrap-distance-right:0;mso-wrap-distance-bottom:0;mso-position-horizontal:absolute;mso-position-horizontal-relative:page;mso-position-vertical:absolute;mso-position-vertical-relative:page;v-text-anchor:top" o:gfxdata="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" o:allowincell="f" filled="f" stroked="f" strokeweight="0">
               <v:textbox inset="0,0,0,0">
                 <w:txbxContent>
                   <w:p>
@@ -11521,7 +11447,7 @@
 </file>
 
 <file path=word/footnotes.xml><?xml version="1.0" encoding="utf-8"?>
-<w:footnotes xmlns:wpc="http://schemas.microsoft.com/office/word/2010/wordprocessingCanvas" xmlns:cx="http://schemas.microsoft.com/office/drawing/2014/chartex" xmlns:cx1="http://schemas.microsoft.com/office/drawing/2015/9/8/chartex" xmlns:cx2="http://schemas.microsoft.com/office/drawing/2015/10/21/chartex" xmlns:cx3="http://schemas.microsoft.com/office/drawing/2016/5/9/chartex" xmlns:cx4="http://schemas.microsoft.com/office/drawing/2016/5/10/chartex" xmlns:cx5="http://schemas.microsoft.com/office/drawing/2016/5/11/chartex" xmlns:cx6="http://schemas.microsoft.com/office/drawing/2016/5/12/chartex" xmlns:cx7="http://schemas.microsoft.com/office/drawing/2016/5/13/chartex" xmlns:cx8="http://schemas.microsoft.com/office/drawing/2016/5/14/chartex" xmlns:mc="http://schemas.openxmlformats.org/markup-compatibility/2006" xmlns:aink="http://schemas.microsoft.com/office/drawing/2016/ink" xmlns:am3d="http://schemas.microsoft.com/office/drawing/2017/model3d" xmlns:o="urn:schemas-microsoft-com:office:office" xmlns:oel="http://schemas.microsoft.com/office/2019/extlst" xmlns:r="http://schemas.openxmlformats.org/officeDocument/2006/relationships" xmlns:m="http://schemas.openxmlformats.org/officeDocument/2006/math" xmlns:v="urn:schemas-microsoft-com:vml" xmlns:wp14="http://schemas.microsoft.com/office/word/2010/wordprocessingDrawing" xmlns:wp="http://schemas.openxmlformats.org/drawingml/2006/wordprocessingDrawing" xmlns:w10="urn:schemas-microsoft-com:office:word" xmlns:w="http://schemas.openxmlformats.org/wordprocessingml/2006/main" xmlns:w14="http://schemas.microsoft.com/office/word/2010/wordml" xmlns:w15="http://schemas.microsoft.com/office/word/2012/wordml" xmlns:w16cex="http://schemas.microsoft.com/office/word/2018/wordml/cex" xmlns:w16cid="http://schemas.microsoft.com/office/word/2016/wordml/cid" xmlns:w16="http://schemas.microsoft.com/office/word/2018/wordml" xmlns:w16du="http://schemas.microsoft.com/office/word/2023/wordml/word16du" xmlns:w16sdtdh="http://schemas.microsoft.com/office/word/2020/wordml/sdtdatahash" xmlns:w16sdtfl="http://schemas.microsoft.com/office/word/2024/wordml/sdtformatlock" xmlns:w16se="http://schemas.microsoft.com/office/word/2015/wordml/symex" xmlns:wpg="http://schemas.microsoft.com/office/word/2010/wordprocessingGroup" xmlns:wpi="http://schemas.microsoft.com/office/word/2010/wordprocessingInk" xmlns:wne="http://schemas.microsoft.com/office/word/2006/wordml" xmlns:wps="http://schemas.microsoft.com/office/word/2010/wordprocessingShape" mc:Ignorable="w14 w15 w16se w16cid w16 w16cex w16sdtdh w16sdtfl w16du wp14">
+<w:footnotes xmlns:wpc="http://schemas.microsoft.com/office/word/2010/wordprocessingCanvas" xmlns:cx="http://schemas.microsoft.com/office/drawing/2014/chartex" xmlns:cx1="http://schemas.microsoft.com/office/drawing/2015/9/8/chartex" xmlns:cx2="http://schemas.microsoft.com/office/drawing/2015/10/21/chartex" xmlns:cx3="http://schemas.microsoft.com/office/drawing/2016/5/9/chartex" xmlns:cx4="http://schemas.microsoft.com/office/drawing/2016/5/10/chartex" xmlns:cx5="http://schemas.microsoft.com/office/drawing/2016/5/11/chartex" xmlns:cx6="http://schemas.microsoft.com/office/drawing/2016/5/12/chartex" xmlns:cx7="http://schemas.microsoft.com/office/drawing/2016/5/13/chartex" xmlns:cx8="http://schemas.microsoft.com/office/drawing/2016/5/14/chartex" xmlns:mc="http://schemas.openxmlformats.org/markup-compatibility/2006" xmlns:aink="http://schemas.microsoft.com/office/drawing/2016/ink" xmlns:am3d="http://schemas.microsoft.com/office/drawing/2017/model3d" xmlns:o="urn:schemas-microsoft-com:office:office" xmlns:r="http://schemas.openxmlformats.org/officeDocument/2006/relationships" xmlns:m="http://schemas.openxmlformats.org/officeDocument/2006/math" xmlns:v="urn:schemas-microsoft-com:vml" xmlns:wp14="http://schemas.microsoft.com/office/word/2010/wordprocessingDrawing" xmlns:wp="http://schemas.openxmlformats.org/drawingml/2006/wordprocessingDrawing" xmlns:w10="urn:schemas-microsoft-com:office:word" xmlns:w="http://schemas.openxmlformats.org/wordprocessingml/2006/main" xmlns:w14="http://schemas.microsoft.com/office/word/2010/wordml" xmlns:w15="http://schemas.microsoft.com/office/word/2012/wordml" xmlns:w16cex="http://schemas.microsoft.com/office/word/2018/wordml/cex" xmlns:w16cid="http://schemas.microsoft.com/office/word/2016/wordml/cid" xmlns:w16="http://schemas.microsoft.com/office/word/2018/wordml" xmlns:w16sdtdh="http://schemas.microsoft.com/office/word/2020/wordml/sdtdatahash" xmlns:w16se="http://schemas.microsoft.com/office/word/2015/wordml/symex" xmlns:wpg="http://schemas.microsoft.com/office/word/2010/wordprocessingGroup" xmlns:wpi="http://schemas.microsoft.com/office/word/2010/wordprocessingInk" xmlns:wne="http://schemas.microsoft.com/office/word/2006/wordml" xmlns:wps="http://schemas.microsoft.com/office/word/2010/wordprocessingShape" mc:Ignorable="w14 w15 w16se w16cid w16 w16cex w16sdtdh wp14">
   <w:footnote w:type="separator" w:id="-1">
     <w:p>
       <w:r>
@@ -11540,7 +11466,7 @@
 </file>
 
 <file path=word/numbering.xml><?xml version="1.0" encoding="utf-8"?>
-<w:numbering xmlns:wpc="http://schemas.microsoft.com/office/word/2010/wordprocessingCanvas" xmlns:cx="http://schemas.microsoft.com/office/drawing/2014/chartex" xmlns:cx1="http://schemas.microsoft.com/office/drawing/2015/9/8/chartex" xmlns:cx2="http://schemas.microsoft.com/office/drawing/2015/10/21/chartex" xmlns:cx3="http://schemas.microsoft.com/office/drawing/2016/5/9/chartex" xmlns:cx4="http://schemas.microsoft.com/office/drawing/2016/5/10/chartex" xmlns:cx5="http://schemas.microsoft.com/office/drawing/2016/5/11/chartex" xmlns:cx6="http://schemas.microsoft.com/office/drawing/2016/5/12/chartex" xmlns:cx7="http://schemas.microsoft.com/office/drawing/2016/5/13/chartex" xmlns:cx8="http://schemas.microsoft.com/office/drawing/2016/5/14/chartex" xmlns:mc="http://schemas.openxmlformats.org/markup-compatibility/2006" xmlns:aink="http://schemas.microsoft.com/office/drawing/2016/ink" xmlns:am3d="http://schemas.microsoft.com/office/drawing/2017/model3d" xmlns:o="urn:schemas-microsoft-com:office:office" xmlns:oel="http://schemas.microsoft.com/office/2019/extlst" xmlns:r="http://schemas.openxmlformats.org/officeDocument/2006/relationships" xmlns:m="http://schemas.openxmlformats.org/officeDocument/2006/math" xmlns:v="urn:schemas-microsoft-com:vml" xmlns:wp14="http://schemas.microsoft.com/office/word/2010/wordprocessingDrawing" xmlns:wp="http://schemas.openxmlformats.org/drawingml/2006/wordprocessingDrawing" xmlns:w10="urn:schemas-microsoft-com:office:word" xmlns:w="http://schemas.openxmlformats.org/wordprocessingml/2006/main" xmlns:w14="http://schemas.microsoft.com/office/word/2010/wordml" xmlns:w15="http://schemas.microsoft.com/office/word/2012/wordml" xmlns:w16cex="http://schemas.microsoft.com/office/word/2018/wordml/cex" xmlns:w16cid="http://schemas.microsoft.com/office/word/2016/wordml/cid" xmlns:w16="http://schemas.microsoft.com/office/word/2018/wordml" xmlns:w16du="http://schemas.microsoft.com/office/word/2023/wordml/word16du" xmlns:w16sdtdh="http://schemas.microsoft.com/office/word/2020/wordml/sdtdatahash" xmlns:w16sdtfl="http://schemas.microsoft.com/office/word/2024/wordml/sdtformatlock" xmlns:w16se="http://schemas.microsoft.com/office/word/2015/wordml/symex" xmlns:wpg="http://schemas.microsoft.com/office/word/2010/wordprocessingGroup" xmlns:wpi="http://schemas.microsoft.com/office/word/2010/wordprocessingInk" xmlns:wne="http://schemas.microsoft.com/office/word/2006/wordml" xmlns:wps="http://schemas.microsoft.com/office/word/2010/wordprocessingShape" mc:Ignorable="w14 w15 w16se w16cid w16 w16cex w16sdtdh w16sdtfl w16du wp14">
+<w:numbering xmlns:wpc="http://schemas.microsoft.com/office/word/2010/wordprocessingCanvas" xmlns:cx="http://schemas.microsoft.com/office/drawing/2014/chartex" xmlns:cx1="http://schemas.microsoft.com/office/drawing/2015/9/8/chartex" xmlns:cx2="http://schemas.microsoft.com/office/drawing/2015/10/21/chartex" xmlns:cx3="http://schemas.microsoft.com/office/drawing/2016/5/9/chartex" xmlns:cx4="http://schemas.microsoft.com/office/drawing/2016/5/10/chartex" xmlns:cx5="http://schemas.microsoft.com/office/drawing/2016/5/11/chartex" xmlns:cx6="http://schemas.microsoft.com/office/drawing/2016/5/12/chartex" xmlns:cx7="http://schemas.microsoft.com/office/drawing/2016/5/13/chartex" xmlns:cx8="http://schemas.microsoft.com/office/drawing/2016/5/14/chartex" xmlns:mc="http://schemas.openxmlformats.org/markup-compatibility/2006" xmlns:aink="http://schemas.microsoft.com/office/drawing/2016/ink" xmlns:am3d="http://schemas.microsoft.com/office/drawing/2017/model3d" xmlns:o="urn:schemas-microsoft-com:office:office" xmlns:r="http://schemas.openxmlformats.org/officeDocument/2006/relationships" xmlns:m="http://schemas.openxmlformats.org/officeDocument/2006/math" xmlns:v="urn:schemas-microsoft-com:vml" xmlns:wp14="http://schemas.microsoft.com/office/word/2010/wordprocessingDrawing" xmlns:wp="http://schemas.openxmlformats.org/drawingml/2006/wordprocessingDrawing" xmlns:w10="urn:schemas-microsoft-com:office:word" xmlns:w="http://schemas.openxmlformats.org/wordprocessingml/2006/main" xmlns:w14="http://schemas.microsoft.com/office/word/2010/wordml" xmlns:w15="http://schemas.microsoft.com/office/word/2012/wordml" xmlns:w16cex="http://schemas.microsoft.com/office/word/2018/wordml/cex" xmlns:w16cid="http://schemas.microsoft.com/office/word/2016/wordml/cid" xmlns:w16="http://schemas.microsoft.com/office/word/2018/wordml" xmlns:w16sdtdh="http://schemas.microsoft.com/office/word/2020/wordml/sdtdatahash" xmlns:w16se="http://schemas.microsoft.com/office/word/2015/wordml/symex" xmlns:wpg="http://schemas.microsoft.com/office/word/2010/wordprocessingGroup" xmlns:wpi="http://schemas.microsoft.com/office/word/2010/wordprocessingInk" xmlns:wne="http://schemas.microsoft.com/office/word/2006/wordml" xmlns:wps="http://schemas.microsoft.com/office/word/2010/wordprocessingShape" mc:Ignorable="w14 w15 w16se w16cid w16 w16cex w16sdtdh wp14">
   <w:abstractNum w:abstractNumId="0" w15:restartNumberingAfterBreak="0">
     <w:nsid w:val="02EC3D9D"/>
     <w:multiLevelType w:val="multilevel"/>
@@ -13947,59 +13873,59 @@
       </w:rPr>
     </w:lvl>
   </w:abstractNum>
-  <w:num w:numId="1" w16cid:durableId="69040484">
+  <w:num w:numId="1">
     <w:abstractNumId w:val="9"/>
   </w:num>
-  <w:num w:numId="2" w16cid:durableId="888227925">
+  <w:num w:numId="2">
     <w:abstractNumId w:val="15"/>
   </w:num>
-  <w:num w:numId="3" w16cid:durableId="1885633296">
+  <w:num w:numId="3">
     <w:abstractNumId w:val="3"/>
   </w:num>
-  <w:num w:numId="4" w16cid:durableId="600066213">
+  <w:num w:numId="4">
     <w:abstractNumId w:val="10"/>
   </w:num>
-  <w:num w:numId="5" w16cid:durableId="822892450">
+  <w:num w:numId="5">
     <w:abstractNumId w:val="8"/>
   </w:num>
-  <w:num w:numId="6" w16cid:durableId="966663712">
+  <w:num w:numId="6">
     <w:abstractNumId w:val="6"/>
   </w:num>
-  <w:num w:numId="7" w16cid:durableId="95711607">
+  <w:num w:numId="7">
     <w:abstractNumId w:val="0"/>
   </w:num>
-  <w:num w:numId="8" w16cid:durableId="131950488">
+  <w:num w:numId="8">
     <w:abstractNumId w:val="7"/>
   </w:num>
-  <w:num w:numId="9" w16cid:durableId="112557366">
+  <w:num w:numId="9">
     <w:abstractNumId w:val="12"/>
   </w:num>
-  <w:num w:numId="10" w16cid:durableId="1589801874">
+  <w:num w:numId="10">
     <w:abstractNumId w:val="2"/>
   </w:num>
-  <w:num w:numId="11" w16cid:durableId="59913142">
+  <w:num w:numId="11">
     <w:abstractNumId w:val="4"/>
   </w:num>
-  <w:num w:numId="12" w16cid:durableId="361056240">
+  <w:num w:numId="12">
     <w:abstractNumId w:val="1"/>
   </w:num>
-  <w:num w:numId="13" w16cid:durableId="2118206795">
+  <w:num w:numId="13">
     <w:abstractNumId w:val="11"/>
   </w:num>
-  <w:num w:numId="14" w16cid:durableId="1491478052">
+  <w:num w:numId="14">
     <w:abstractNumId w:val="14"/>
   </w:num>
-  <w:num w:numId="15" w16cid:durableId="581333293">
+  <w:num w:numId="15">
     <w:abstractNumId w:val="5"/>
   </w:num>
-  <w:num w:numId="16" w16cid:durableId="275217575">
+  <w:num w:numId="16">
     <w:abstractNumId w:val="13"/>
   </w:num>
 </w:numbering>
 </file>
 
 <file path=word/styles.xml><?xml version="1.0" encoding="utf-8"?>
-<w:styles xmlns:mc="http://schemas.openxmlformats.org/markup-compatibility/2006" xmlns:r="http://schemas.openxmlformats.org/officeDocument/2006/relationships" xmlns:w="http://schemas.openxmlformats.org/wordprocessingml/2006/main" xmlns:w14="http://schemas.microsoft.com/office/word/2010/wordml" xmlns:w15="http://schemas.microsoft.com/office/word/2012/wordml" xmlns:w16cex="http://schemas.microsoft.com/office/word/2018/wordml/cex" xmlns:w16cid="http://schemas.microsoft.com/office/word/2016/wordml/cid" xmlns:w16="http://schemas.microsoft.com/office/word/2018/wordml" xmlns:w16du="http://schemas.microsoft.com/office/word/2023/wordml/word16du" xmlns:w16sdtdh="http://schemas.microsoft.com/office/word/2020/wordml/sdtdatahash" xmlns:w16sdtfl="http://schemas.microsoft.com/office/word/2024/wordml/sdtformatlock" xmlns:w16se="http://schemas.microsoft.com/office/word/2015/wordml/symex" mc:Ignorable="w14 w15 w16se w16cid w16 w16cex w16sdtdh w16sdtfl w16du">
+<w:styles xmlns:mc="http://schemas.openxmlformats.org/markup-compatibility/2006" xmlns:r="http://schemas.openxmlformats.org/officeDocument/2006/relationships" xmlns:w="http://schemas.openxmlformats.org/wordprocessingml/2006/main" xmlns:w14="http://schemas.microsoft.com/office/word/2010/wordml" xmlns:w15="http://schemas.microsoft.com/office/word/2012/wordml" xmlns:w16cex="http://schemas.microsoft.com/office/word/2018/wordml/cex" xmlns:w16cid="http://schemas.microsoft.com/office/word/2016/wordml/cid" xmlns:w16="http://schemas.microsoft.com/office/word/2018/wordml" xmlns:w16sdtdh="http://schemas.microsoft.com/office/word/2020/wordml/sdtdatahash" xmlns:w16se="http://schemas.microsoft.com/office/word/2015/wordml/symex" mc:Ignorable="w14 w15 w16se w16cid w16 w16cex w16sdtdh">
   <w:docDefaults>
     <w:rPrDefault>
       <w:rPr>

</xml_diff>